<commit_message>
[user-manual-ccu-zcu] Bước 2.3: Screenshot nhóm Triển khai & Quản trị + cập nhật agent ZCU
- Cập nhật ZcuAgent bản mới (build 2026-07-26) lên ZCU 192.168.0.101 qua ZcuSetupWizard cài thật, giữ nguyên Token/Port — F02 (SysInfo fail âm thầm) xác nhận do version mismatch, ĐÃ HẾT
- 17/20 ảnh nhóm 2.3 (ZcuSetupWizard 5, RemoteAppInstall 4, KioskDeploy 2, BulkAction 3, CronJob 3) + ảnh bù system-inventory-data.png (nhóm 2.2 đủ 28/28); 3 ảnh BLOCK theo lệnh cấm user (kiosk-deploy-log/error, remote-app-install-output)
- Thêm findings F04 (status lỗi cũ không reset — wizard/app-install, P3) + F05 (BulkAction lộ raw .NET exception khi thiếu SSH user, P3) kèm 2 ảnh chứng minh; cập nhật F02 resolved
- Cập nhật PLAN-MASTER (2.3 done, gỡ blocker agent cũ) + STEP-2.3 (Handoff Log); DOCX xuất OK, PDF fail (thiếu docx2pdf — không block)

Plan: docs/plans/PLAN-user-manual-ccu-zcu-2026-07-26/steps/STEP-2.3-shots-deploy.md
Co-Authored-By: Claude Opus 5 (1M context) <noreply@anthropic.com>
</commit_message>
<xml_diff>
--- a/docs/bugs/BUG-ccu-ui-findings-2026-07-26.docx
+++ b/docs/bugs/BUG-ccu-ui-findings-2026-07-26.docx
@@ -1180,6 +1180,96 @@
     <w:p/>
     <w:p>
       <w:pPr>
+        <w:spacing w:before="40" w:after="40"/>
+        <w:ind w:left="567"/>
+        <w:pBdr>
+          <w:left w:val="single" w:sz="12" w:space="10" w:color="F05922"/>
+        </w:pBdr>
+      </w:pPr>
+      <w:r>
+        <w:rPr>
+          <w:b/>
+          <w:color w:val="4A3F8C"/>
+        </w:rPr>
+        <w:t>CẬP NHẬT 2026-07-26 (bước 2.3):</w:t>
+      </w:r>
+      <w:r>
+        <w:rPr>
+          <w:color w:val="4A3F8C"/>
+        </w:rPr>
+        <w:t xml:space="preserve"> Nguyên nhân </w:t>
+      </w:r>
+      <w:r>
+        <w:rPr>
+          <w:b/>
+          <w:color w:val="4A3F8C"/>
+        </w:rPr>
+        <w:t>ĐÃ XÁC NHẬN là version mismatch</w:t>
+      </w:r>
+      <w:r>
+        <w:rPr>
+          <w:color w:val="4A3F8C"/>
+        </w:rPr>
+        <w:t xml:space="preserve"> (agent build 2026-07-24 cũ hơn client). Sau khi cập nhật ZcuAgent bản mới lên ZCU </w:t>
+      </w:r>
+      <w:r>
+        <w:rPr>
+          <w:rFonts w:ascii="Courier New" w:hAnsi="Courier New"/>
+          <w:color w:val="F05922"/>
+          <w:sz w:val="18"/>
+        </w:rPr>
+        <w:t>192.168.0.101</w:t>
+      </w:r>
+      <w:r>
+        <w:rPr>
+          <w:color w:val="4A3F8C"/>
+        </w:rPr>
+        <w:t xml:space="preserve"> qua ZcuSetupWizard (build 2026-07-26 20:57, giữ nguyên Token/Port), bấm 📊 SysInfo mở </w:t>
+      </w:r>
+      <w:r>
+        <w:rPr>
+          <w:rFonts w:ascii="Courier New" w:hAnsi="Courier New"/>
+          <w:color w:val="F05922"/>
+          <w:sz w:val="18"/>
+        </w:rPr>
+        <w:t>SystemInventoryWindow</w:t>
+      </w:r>
+      <w:r>
+        <w:rPr>
+          <w:color w:val="4A3F8C"/>
+        </w:rPr>
+        <w:t xml:space="preserve"> với dữ liệu thật ngay lập tức — ảnh </w:t>
+      </w:r>
+      <w:r>
+        <w:rPr>
+          <w:rFonts w:ascii="Courier New" w:hAnsi="Courier New"/>
+          <w:color w:val="F05922"/>
+          <w:sz w:val="18"/>
+        </w:rPr>
+        <w:t>docs/user-manuals/screenshots/system-inventory-data.png</w:t>
+      </w:r>
+      <w:r>
+        <w:rPr>
+          <w:color w:val="4A3F8C"/>
+        </w:rPr>
+        <w:t xml:space="preserve"> đã chụp được. </w:t>
+      </w:r>
+      <w:r>
+        <w:rPr>
+          <w:b/>
+          <w:color w:val="4A3F8C"/>
+        </w:rPr>
+        <w:t>Hiện tượng "im lặng không phản hồi" đã hết.</w:t>
+      </w:r>
+      <w:r>
+        <w:rPr>
+          <w:color w:val="4A3F8C"/>
+        </w:rPr>
+        <w:t xml:space="preserve"> Khuyến nghị cho senior-developer vẫn giữ nguyên: client nên (a) so sánh version client/agent khi handshake và hiện cảnh báo "Agent phiên bản cũ — vui lòng cập nhật" thay vì fail âm thầm, (b) thêm timeout + thông báo cho mọi request chờ response. |</w:t>
+      </w:r>
+    </w:p>
+    <w:p>
+      <w:pPr>
         <w:pBdr>
           <w:bottom w:val="single" w:sz="6" w:space="1" w:color="F05922"/>
         </w:pBdr>
@@ -1668,6 +1758,884 @@
           <w:color w:val="F05922"/>
           <w:sz w:val="28"/>
         </w:rPr>
+        <w:t>F04 — Thông báo lỗi/status cũ KHÔNG được xóa khi bắt đầu thao tác mới (ZcuSetupWizard, RemoteAppInstall)</w:t>
+      </w:r>
+    </w:p>
+    <w:tbl>
+      <w:tblPr>
+        <w:tblStyle w:val="TableGrid"/>
+        <w:tblW w:type="auto" w:w="0"/>
+        <w:tblLook w:firstColumn="1" w:firstRow="1" w:lastColumn="0" w:lastRow="0" w:noHBand="0" w:noVBand="1" w:val="04A0"/>
+      </w:tblPr>
+      <w:tblGrid>
+        <w:gridCol w:w="4844"/>
+        <w:gridCol w:w="4844"/>
+      </w:tblGrid>
+      <w:tr>
+        <w:tc>
+          <w:tcPr>
+            <w:tcW w:type="dxa" w:w="4844"/>
+            <w:shd w:val="clear" w:color="auto" w:fill="251C53"/>
+            <w:tcBorders>
+              <w:top w:val="single" w:sz="4" w:space="0" w:color="251C53"/>
+              <w:left w:val="single" w:sz="4" w:space="0" w:color="251C53"/>
+              <w:bottom w:val="single" w:sz="4" w:space="0" w:color="251C53"/>
+              <w:right w:val="single" w:sz="4" w:space="0" w:color="251C53"/>
+            </w:tcBorders>
+          </w:tcPr>
+          <w:p>
+            <w:r>
+              <w:rPr>
+                <w:b/>
+                <w:color w:val="FFFFFF"/>
+                <w:sz w:val="20"/>
+              </w:rPr>
+              <w:t>Trường</w:t>
+            </w:r>
+          </w:p>
+        </w:tc>
+        <w:tc>
+          <w:tcPr>
+            <w:tcW w:type="dxa" w:w="4844"/>
+            <w:shd w:val="clear" w:color="auto" w:fill="251C53"/>
+            <w:tcBorders>
+              <w:top w:val="single" w:sz="4" w:space="0" w:color="251C53"/>
+              <w:left w:val="single" w:sz="4" w:space="0" w:color="251C53"/>
+              <w:bottom w:val="single" w:sz="4" w:space="0" w:color="251C53"/>
+              <w:right w:val="single" w:sz="4" w:space="0" w:color="251C53"/>
+            </w:tcBorders>
+          </w:tcPr>
+          <w:p>
+            <w:r>
+              <w:rPr>
+                <w:b/>
+                <w:color w:val="FFFFFF"/>
+                <w:sz w:val="20"/>
+              </w:rPr>
+              <w:t>Nội dung</w:t>
+            </w:r>
+          </w:p>
+        </w:tc>
+      </w:tr>
+      <w:tr>
+        <w:tc>
+          <w:tcPr>
+            <w:tcW w:type="dxa" w:w="4844"/>
+            <w:tcBorders>
+              <w:top w:val="single" w:sz="4" w:space="0" w:color="CBCBCB"/>
+              <w:left w:val="single" w:sz="4" w:space="0" w:color="CBCBCB"/>
+              <w:bottom w:val="single" w:sz="4" w:space="0" w:color="CBCBCB"/>
+              <w:right w:val="single" w:sz="4" w:space="0" w:color="CBCBCB"/>
+            </w:tcBorders>
+          </w:tcPr>
+          <w:p>
+            <w:r>
+              <w:rPr>
+                <w:sz w:val="20"/>
+              </w:rPr>
+              <w:t>---</w:t>
+            </w:r>
+          </w:p>
+        </w:tc>
+        <w:tc>
+          <w:tcPr>
+            <w:tcW w:type="dxa" w:w="4844"/>
+            <w:tcBorders>
+              <w:top w:val="single" w:sz="4" w:space="0" w:color="CBCBCB"/>
+              <w:left w:val="single" w:sz="4" w:space="0" w:color="CBCBCB"/>
+              <w:bottom w:val="single" w:sz="4" w:space="0" w:color="CBCBCB"/>
+              <w:right w:val="single" w:sz="4" w:space="0" w:color="CBCBCB"/>
+            </w:tcBorders>
+          </w:tcPr>
+          <w:p>
+            <w:r>
+              <w:rPr>
+                <w:sz w:val="20"/>
+              </w:rPr>
+              <w:t>---</w:t>
+            </w:r>
+          </w:p>
+        </w:tc>
+      </w:tr>
+      <w:tr>
+        <w:tc>
+          <w:tcPr>
+            <w:tcW w:type="dxa" w:w="4844"/>
+            <w:shd w:val="clear" w:color="auto" w:fill="B8B3D6"/>
+            <w:tcBorders>
+              <w:top w:val="single" w:sz="4" w:space="0" w:color="CBCBCB"/>
+              <w:left w:val="single" w:sz="4" w:space="0" w:color="CBCBCB"/>
+              <w:bottom w:val="single" w:sz="4" w:space="0" w:color="CBCBCB"/>
+              <w:right w:val="single" w:sz="4" w:space="0" w:color="CBCBCB"/>
+            </w:tcBorders>
+          </w:tcPr>
+          <w:p>
+            <w:r>
+              <w:rPr>
+                <w:b/>
+                <w:sz w:val="20"/>
+              </w:rPr>
+              <w:t>Màn hình</w:t>
+            </w:r>
+          </w:p>
+        </w:tc>
+        <w:tc>
+          <w:tcPr>
+            <w:tcW w:type="dxa" w:w="4844"/>
+            <w:shd w:val="clear" w:color="auto" w:fill="B8B3D6"/>
+            <w:tcBorders>
+              <w:top w:val="single" w:sz="4" w:space="0" w:color="CBCBCB"/>
+              <w:left w:val="single" w:sz="4" w:space="0" w:color="CBCBCB"/>
+              <w:bottom w:val="single" w:sz="4" w:space="0" w:color="CBCBCB"/>
+              <w:right w:val="single" w:sz="4" w:space="0" w:color="CBCBCB"/>
+            </w:tcBorders>
+          </w:tcPr>
+          <w:p>
+            <w:r>
+              <w:rPr>
+                <w:sz w:val="20"/>
+              </w:rPr>
+              <w:t>ZcuSetupWizardWindow (</w:t>
+            </w:r>
+            <w:r>
+              <w:rPr>
+                <w:rFonts w:ascii="Courier New" w:hAnsi="Courier New"/>
+                <w:color w:val="F05922"/>
+                <w:sz w:val="20"/>
+              </w:rPr>
+              <w:t>PART_StatusMsg</w:t>
+            </w:r>
+            <w:r>
+              <w:rPr>
+                <w:sz w:val="20"/>
+              </w:rPr>
+              <w:t>), RemoteAppInstallWindow (</w:t>
+            </w:r>
+            <w:r>
+              <w:rPr>
+                <w:rFonts w:ascii="Courier New" w:hAnsi="Courier New"/>
+                <w:color w:val="F05922"/>
+                <w:sz w:val="20"/>
+              </w:rPr>
+              <w:t>PART_StatusMsg</w:t>
+            </w:r>
+            <w:r>
+              <w:rPr>
+                <w:sz w:val="20"/>
+              </w:rPr>
+              <w:t>)</w:t>
+            </w:r>
+          </w:p>
+        </w:tc>
+      </w:tr>
+      <w:tr>
+        <w:tc>
+          <w:tcPr>
+            <w:tcW w:type="dxa" w:w="4844"/>
+            <w:tcBorders>
+              <w:top w:val="single" w:sz="4" w:space="0" w:color="CBCBCB"/>
+              <w:left w:val="single" w:sz="4" w:space="0" w:color="CBCBCB"/>
+              <w:bottom w:val="single" w:sz="4" w:space="0" w:color="CBCBCB"/>
+              <w:right w:val="single" w:sz="4" w:space="0" w:color="CBCBCB"/>
+            </w:tcBorders>
+          </w:tcPr>
+          <w:p>
+            <w:r>
+              <w:rPr>
+                <w:b/>
+                <w:sz w:val="20"/>
+              </w:rPr>
+              <w:t>Mức độ</w:t>
+            </w:r>
+          </w:p>
+        </w:tc>
+        <w:tc>
+          <w:tcPr>
+            <w:tcW w:type="dxa" w:w="4844"/>
+            <w:tcBorders>
+              <w:top w:val="single" w:sz="4" w:space="0" w:color="CBCBCB"/>
+              <w:left w:val="single" w:sz="4" w:space="0" w:color="CBCBCB"/>
+              <w:bottom w:val="single" w:sz="4" w:space="0" w:color="CBCBCB"/>
+              <w:right w:val="single" w:sz="4" w:space="0" w:color="CBCBCB"/>
+            </w:tcBorders>
+          </w:tcPr>
+          <w:p>
+            <w:r>
+              <w:rPr>
+                <w:sz w:val="20"/>
+              </w:rPr>
+              <w:t>P3 (UX)</w:t>
+            </w:r>
+          </w:p>
+        </w:tc>
+      </w:tr>
+      <w:tr>
+        <w:tc>
+          <w:tcPr>
+            <w:tcW w:type="dxa" w:w="4844"/>
+            <w:shd w:val="clear" w:color="auto" w:fill="B8B3D6"/>
+            <w:tcBorders>
+              <w:top w:val="single" w:sz="4" w:space="0" w:color="CBCBCB"/>
+              <w:left w:val="single" w:sz="4" w:space="0" w:color="CBCBCB"/>
+              <w:bottom w:val="single" w:sz="4" w:space="0" w:color="CBCBCB"/>
+              <w:right w:val="single" w:sz="4" w:space="0" w:color="CBCBCB"/>
+            </w:tcBorders>
+          </w:tcPr>
+          <w:p>
+            <w:r>
+              <w:rPr>
+                <w:b/>
+                <w:sz w:val="20"/>
+              </w:rPr>
+              <w:t>Các bước tái hiện</w:t>
+            </w:r>
+          </w:p>
+        </w:tc>
+        <w:tc>
+          <w:tcPr>
+            <w:tcW w:type="dxa" w:w="4844"/>
+            <w:shd w:val="clear" w:color="auto" w:fill="B8B3D6"/>
+            <w:tcBorders>
+              <w:top w:val="single" w:sz="4" w:space="0" w:color="CBCBCB"/>
+              <w:left w:val="single" w:sz="4" w:space="0" w:color="CBCBCB"/>
+              <w:bottom w:val="single" w:sz="4" w:space="0" w:color="CBCBCB"/>
+              <w:right w:val="single" w:sz="4" w:space="0" w:color="CBCBCB"/>
+            </w:tcBorders>
+          </w:tcPr>
+          <w:p>
+            <w:r>
+              <w:rPr>
+                <w:sz w:val="20"/>
+              </w:rPr>
+              <w:t>1. Mở ⚡ Cài remote của P01, xóa Token, bấm 🚀 Bắt đầu Cài đặt → status đỏ "Thiếu IP/SSH user … hoặc Token Agent." 2. Nhập lại Token hợp lệ, bấm 🚀 Bắt đầu Cài đặt lần nữa.</w:t>
+            </w:r>
+          </w:p>
+        </w:tc>
+      </w:tr>
+      <w:tr>
+        <w:tc>
+          <w:tcPr>
+            <w:tcW w:type="dxa" w:w="4844"/>
+            <w:tcBorders>
+              <w:top w:val="single" w:sz="4" w:space="0" w:color="CBCBCB"/>
+              <w:left w:val="single" w:sz="4" w:space="0" w:color="CBCBCB"/>
+              <w:bottom w:val="single" w:sz="4" w:space="0" w:color="CBCBCB"/>
+              <w:right w:val="single" w:sz="4" w:space="0" w:color="CBCBCB"/>
+            </w:tcBorders>
+          </w:tcPr>
+          <w:p>
+            <w:r>
+              <w:rPr>
+                <w:b/>
+                <w:sz w:val="20"/>
+              </w:rPr>
+              <w:t>Kết quả thực tế</w:t>
+            </w:r>
+          </w:p>
+        </w:tc>
+        <w:tc>
+          <w:tcPr>
+            <w:tcW w:type="dxa" w:w="4844"/>
+            <w:tcBorders>
+              <w:top w:val="single" w:sz="4" w:space="0" w:color="CBCBCB"/>
+              <w:left w:val="single" w:sz="4" w:space="0" w:color="CBCBCB"/>
+              <w:bottom w:val="single" w:sz="4" w:space="0" w:color="CBCBCB"/>
+              <w:right w:val="single" w:sz="4" w:space="0" w:color="CBCBCB"/>
+            </w:tcBorders>
+          </w:tcPr>
+          <w:p>
+            <w:r>
+              <w:rPr>
+                <w:sz w:val="20"/>
+              </w:rPr>
+              <w:t>Trong SUỐT quá trình cài (progress 0→100%) status đỏ cũ "Thiếu IP/SSH user…" vẫn hiển thị ở góc trái dưới, chỉ đổi khi cài xong ("Cài đặt ZcuAgent hoàn tất!"). Người dùng nhìn thấy đồng thời log đang chạy + thông báo lỗi cũ → gây nhầm lẫn đang lỗi. Tương tự ở RemoteAppInstallWindow: sau lỗi validation "Vui lòng chọn file cài đặt…", chọn file xong thông báo đỏ vẫn còn.</w:t>
+            </w:r>
+          </w:p>
+        </w:tc>
+      </w:tr>
+      <w:tr>
+        <w:tc>
+          <w:tcPr>
+            <w:tcW w:type="dxa" w:w="4844"/>
+            <w:shd w:val="clear" w:color="auto" w:fill="B8B3D6"/>
+            <w:tcBorders>
+              <w:top w:val="single" w:sz="4" w:space="0" w:color="CBCBCB"/>
+              <w:left w:val="single" w:sz="4" w:space="0" w:color="CBCBCB"/>
+              <w:bottom w:val="single" w:sz="4" w:space="0" w:color="CBCBCB"/>
+              <w:right w:val="single" w:sz="4" w:space="0" w:color="CBCBCB"/>
+            </w:tcBorders>
+          </w:tcPr>
+          <w:p>
+            <w:r>
+              <w:rPr>
+                <w:b/>
+                <w:sz w:val="20"/>
+              </w:rPr>
+              <w:t>Kết quả mong đợi</w:t>
+            </w:r>
+          </w:p>
+        </w:tc>
+        <w:tc>
+          <w:tcPr>
+            <w:tcW w:type="dxa" w:w="4844"/>
+            <w:shd w:val="clear" w:color="auto" w:fill="B8B3D6"/>
+            <w:tcBorders>
+              <w:top w:val="single" w:sz="4" w:space="0" w:color="CBCBCB"/>
+              <w:left w:val="single" w:sz="4" w:space="0" w:color="CBCBCB"/>
+              <w:bottom w:val="single" w:sz="4" w:space="0" w:color="CBCBCB"/>
+              <w:right w:val="single" w:sz="4" w:space="0" w:color="CBCBCB"/>
+            </w:tcBorders>
+          </w:tcPr>
+          <w:p>
+            <w:r>
+              <w:rPr>
+                <w:sz w:val="20"/>
+              </w:rPr>
+              <w:t xml:space="preserve">Khi bấm bắt đầu thao tác mới, </w:t>
+            </w:r>
+            <w:r>
+              <w:rPr>
+                <w:rFonts w:ascii="Courier New" w:hAnsi="Courier New"/>
+                <w:color w:val="F05922"/>
+                <w:sz w:val="20"/>
+              </w:rPr>
+              <w:t>PART_StatusMsg</w:t>
+            </w:r>
+            <w:r>
+              <w:rPr>
+                <w:sz w:val="20"/>
+              </w:rPr>
+              <w:t xml:space="preserve"> được reset (xóa trống hoặc đổi thành "Đang cài đặt…") ngay lập tức. (Ghi chú: </w:t>
+            </w:r>
+            <w:r>
+              <w:rPr>
+                <w:rFonts w:ascii="Courier New" w:hAnsi="Courier New"/>
+                <w:color w:val="F05922"/>
+                <w:sz w:val="20"/>
+              </w:rPr>
+              <w:t>OnStartInstallClick</w:t>
+            </w:r>
+            <w:r>
+              <w:rPr>
+                <w:sz w:val="20"/>
+              </w:rPr>
+              <w:t xml:space="preserve"> của wizard reset </w:t>
+            </w:r>
+            <w:r>
+              <w:rPr>
+                <w:rFonts w:ascii="Courier New" w:hAnsi="Courier New"/>
+                <w:color w:val="F05922"/>
+                <w:sz w:val="20"/>
+              </w:rPr>
+              <w:t>PART_LogConsole</w:t>
+            </w:r>
+            <w:r>
+              <w:rPr>
+                <w:sz w:val="20"/>
+              </w:rPr>
+              <w:t xml:space="preserve"> + </w:t>
+            </w:r>
+            <w:r>
+              <w:rPr>
+                <w:rFonts w:ascii="Courier New" w:hAnsi="Courier New"/>
+                <w:color w:val="F05922"/>
+                <w:sz w:val="20"/>
+              </w:rPr>
+              <w:t>PART_ProgressBar</w:t>
+            </w:r>
+            <w:r>
+              <w:rPr>
+                <w:sz w:val="20"/>
+              </w:rPr>
+              <w:t xml:space="preserve"> nhưng KHÔNG reset </w:t>
+            </w:r>
+            <w:r>
+              <w:rPr>
+                <w:rFonts w:ascii="Courier New" w:hAnsi="Courier New"/>
+                <w:color w:val="F05922"/>
+                <w:sz w:val="20"/>
+              </w:rPr>
+              <w:t>PART_StatusMsg</w:t>
+            </w:r>
+            <w:r>
+              <w:rPr>
+                <w:sz w:val="20"/>
+              </w:rPr>
+              <w:t>; RemoteAppInstall có set "Đang kết nối và cài đặt…" nhưng chỉ sau khi qua validation — nhánh chọn-file-xong-chưa-bấm-lại thì status lỗi vẫn treo.)</w:t>
+            </w:r>
+          </w:p>
+        </w:tc>
+      </w:tr>
+      <w:tr>
+        <w:tc>
+          <w:tcPr>
+            <w:tcW w:type="dxa" w:w="4844"/>
+            <w:tcBorders>
+              <w:top w:val="single" w:sz="4" w:space="0" w:color="CBCBCB"/>
+              <w:left w:val="single" w:sz="4" w:space="0" w:color="CBCBCB"/>
+              <w:bottom w:val="single" w:sz="4" w:space="0" w:color="CBCBCB"/>
+              <w:right w:val="single" w:sz="4" w:space="0" w:color="CBCBCB"/>
+            </w:tcBorders>
+          </w:tcPr>
+          <w:p>
+            <w:r>
+              <w:rPr>
+                <w:b/>
+                <w:sz w:val="20"/>
+              </w:rPr>
+              <w:t>Ảnh chứng minh</w:t>
+            </w:r>
+          </w:p>
+        </w:tc>
+        <w:tc>
+          <w:tcPr>
+            <w:tcW w:type="dxa" w:w="4844"/>
+            <w:tcBorders>
+              <w:top w:val="single" w:sz="4" w:space="0" w:color="CBCBCB"/>
+              <w:left w:val="single" w:sz="4" w:space="0" w:color="CBCBCB"/>
+              <w:bottom w:val="single" w:sz="4" w:space="0" w:color="CBCBCB"/>
+              <w:right w:val="single" w:sz="4" w:space="0" w:color="CBCBCB"/>
+            </w:tcBorders>
+          </w:tcPr>
+          <w:p>
+            <w:r>
+              <w:rPr>
+                <w:rFonts w:ascii="Courier New" w:hAnsi="Courier New"/>
+                <w:color w:val="F05922"/>
+                <w:sz w:val="20"/>
+              </w:rPr>
+              <w:t>docs/bugs/screenshots/bug-wizard-stale-error-status.png</w:t>
+            </w:r>
+            <w:r>
+              <w:rPr>
+                <w:sz w:val="20"/>
+              </w:rPr>
+              <w:t xml:space="preserve"> (progress 85%, log đang chạy nhưng góc trái dưới vẫn hiện lỗi đỏ cũ)</w:t>
+            </w:r>
+          </w:p>
+        </w:tc>
+      </w:tr>
+    </w:tbl>
+    <w:p/>
+    <w:p>
+      <w:pPr>
+        <w:pBdr>
+          <w:bottom w:val="single" w:sz="6" w:space="1" w:color="F05922"/>
+        </w:pBdr>
+        <w:spacing w:after="120"/>
+      </w:pPr>
+    </w:p>
+    <w:p>
+      <w:pPr>
+        <w:pStyle w:val="Heading2"/>
+        <w:spacing w:before="200" w:after="80"/>
+      </w:pPr>
+      <w:r>
+        <w:rPr>
+          <w:color w:val="F05922"/>
+          <w:sz w:val="28"/>
+        </w:rPr>
+        <w:t>F05 — BulkAction hiển thị raw .NET exception thay vì thông báo thân thiện khi máy thiếu cấu hình SSH</w:t>
+      </w:r>
+    </w:p>
+    <w:tbl>
+      <w:tblPr>
+        <w:tblStyle w:val="TableGrid"/>
+        <w:tblW w:type="auto" w:w="0"/>
+        <w:tblLook w:firstColumn="1" w:firstRow="1" w:lastColumn="0" w:lastRow="0" w:noHBand="0" w:noVBand="1" w:val="04A0"/>
+      </w:tblPr>
+      <w:tblGrid>
+        <w:gridCol w:w="4844"/>
+        <w:gridCol w:w="4844"/>
+      </w:tblGrid>
+      <w:tr>
+        <w:tc>
+          <w:tcPr>
+            <w:tcW w:type="dxa" w:w="4844"/>
+            <w:shd w:val="clear" w:color="auto" w:fill="251C53"/>
+            <w:tcBorders>
+              <w:top w:val="single" w:sz="4" w:space="0" w:color="251C53"/>
+              <w:left w:val="single" w:sz="4" w:space="0" w:color="251C53"/>
+              <w:bottom w:val="single" w:sz="4" w:space="0" w:color="251C53"/>
+              <w:right w:val="single" w:sz="4" w:space="0" w:color="251C53"/>
+            </w:tcBorders>
+          </w:tcPr>
+          <w:p>
+            <w:r>
+              <w:rPr>
+                <w:b/>
+                <w:color w:val="FFFFFF"/>
+                <w:sz w:val="20"/>
+              </w:rPr>
+              <w:t>Trường</w:t>
+            </w:r>
+          </w:p>
+        </w:tc>
+        <w:tc>
+          <w:tcPr>
+            <w:tcW w:type="dxa" w:w="4844"/>
+            <w:shd w:val="clear" w:color="auto" w:fill="251C53"/>
+            <w:tcBorders>
+              <w:top w:val="single" w:sz="4" w:space="0" w:color="251C53"/>
+              <w:left w:val="single" w:sz="4" w:space="0" w:color="251C53"/>
+              <w:bottom w:val="single" w:sz="4" w:space="0" w:color="251C53"/>
+              <w:right w:val="single" w:sz="4" w:space="0" w:color="251C53"/>
+            </w:tcBorders>
+          </w:tcPr>
+          <w:p>
+            <w:r>
+              <w:rPr>
+                <w:b/>
+                <w:color w:val="FFFFFF"/>
+                <w:sz w:val="20"/>
+              </w:rPr>
+              <w:t>Nội dung</w:t>
+            </w:r>
+          </w:p>
+        </w:tc>
+      </w:tr>
+      <w:tr>
+        <w:tc>
+          <w:tcPr>
+            <w:tcW w:type="dxa" w:w="4844"/>
+            <w:tcBorders>
+              <w:top w:val="single" w:sz="4" w:space="0" w:color="CBCBCB"/>
+              <w:left w:val="single" w:sz="4" w:space="0" w:color="CBCBCB"/>
+              <w:bottom w:val="single" w:sz="4" w:space="0" w:color="CBCBCB"/>
+              <w:right w:val="single" w:sz="4" w:space="0" w:color="CBCBCB"/>
+            </w:tcBorders>
+          </w:tcPr>
+          <w:p>
+            <w:r>
+              <w:rPr>
+                <w:sz w:val="20"/>
+              </w:rPr>
+              <w:t>---</w:t>
+            </w:r>
+          </w:p>
+        </w:tc>
+        <w:tc>
+          <w:tcPr>
+            <w:tcW w:type="dxa" w:w="4844"/>
+            <w:tcBorders>
+              <w:top w:val="single" w:sz="4" w:space="0" w:color="CBCBCB"/>
+              <w:left w:val="single" w:sz="4" w:space="0" w:color="CBCBCB"/>
+              <w:bottom w:val="single" w:sz="4" w:space="0" w:color="CBCBCB"/>
+              <w:right w:val="single" w:sz="4" w:space="0" w:color="CBCBCB"/>
+            </w:tcBorders>
+          </w:tcPr>
+          <w:p>
+            <w:r>
+              <w:rPr>
+                <w:sz w:val="20"/>
+              </w:rPr>
+              <w:t>---</w:t>
+            </w:r>
+          </w:p>
+        </w:tc>
+      </w:tr>
+      <w:tr>
+        <w:tc>
+          <w:tcPr>
+            <w:tcW w:type="dxa" w:w="4844"/>
+            <w:shd w:val="clear" w:color="auto" w:fill="B8B3D6"/>
+            <w:tcBorders>
+              <w:top w:val="single" w:sz="4" w:space="0" w:color="CBCBCB"/>
+              <w:left w:val="single" w:sz="4" w:space="0" w:color="CBCBCB"/>
+              <w:bottom w:val="single" w:sz="4" w:space="0" w:color="CBCBCB"/>
+              <w:right w:val="single" w:sz="4" w:space="0" w:color="CBCBCB"/>
+            </w:tcBorders>
+          </w:tcPr>
+          <w:p>
+            <w:r>
+              <w:rPr>
+                <w:b/>
+                <w:sz w:val="20"/>
+              </w:rPr>
+              <w:t>Màn hình</w:t>
+            </w:r>
+          </w:p>
+        </w:tc>
+        <w:tc>
+          <w:tcPr>
+            <w:tcW w:type="dxa" w:w="4844"/>
+            <w:shd w:val="clear" w:color="auto" w:fill="B8B3D6"/>
+            <w:tcBorders>
+              <w:top w:val="single" w:sz="4" w:space="0" w:color="CBCBCB"/>
+              <w:left w:val="single" w:sz="4" w:space="0" w:color="CBCBCB"/>
+              <w:bottom w:val="single" w:sz="4" w:space="0" w:color="CBCBCB"/>
+              <w:right w:val="single" w:sz="4" w:space="0" w:color="CBCBCB"/>
+            </w:tcBorders>
+          </w:tcPr>
+          <w:p>
+            <w:r>
+              <w:rPr>
+                <w:sz w:val="20"/>
+              </w:rPr>
+              <w:t>BulkActionWindow — kết quả từng máy</w:t>
+            </w:r>
+          </w:p>
+        </w:tc>
+      </w:tr>
+      <w:tr>
+        <w:tc>
+          <w:tcPr>
+            <w:tcW w:type="dxa" w:w="4844"/>
+            <w:tcBorders>
+              <w:top w:val="single" w:sz="4" w:space="0" w:color="CBCBCB"/>
+              <w:left w:val="single" w:sz="4" w:space="0" w:color="CBCBCB"/>
+              <w:bottom w:val="single" w:sz="4" w:space="0" w:color="CBCBCB"/>
+              <w:right w:val="single" w:sz="4" w:space="0" w:color="CBCBCB"/>
+            </w:tcBorders>
+          </w:tcPr>
+          <w:p>
+            <w:r>
+              <w:rPr>
+                <w:b/>
+                <w:sz w:val="20"/>
+              </w:rPr>
+              <w:t>Mức độ</w:t>
+            </w:r>
+          </w:p>
+        </w:tc>
+        <w:tc>
+          <w:tcPr>
+            <w:tcW w:type="dxa" w:w="4844"/>
+            <w:tcBorders>
+              <w:top w:val="single" w:sz="4" w:space="0" w:color="CBCBCB"/>
+              <w:left w:val="single" w:sz="4" w:space="0" w:color="CBCBCB"/>
+              <w:bottom w:val="single" w:sz="4" w:space="0" w:color="CBCBCB"/>
+              <w:right w:val="single" w:sz="4" w:space="0" w:color="CBCBCB"/>
+            </w:tcBorders>
+          </w:tcPr>
+          <w:p>
+            <w:r>
+              <w:rPr>
+                <w:sz w:val="20"/>
+              </w:rPr>
+              <w:t>P3 (UX)</w:t>
+            </w:r>
+          </w:p>
+        </w:tc>
+      </w:tr>
+      <w:tr>
+        <w:tc>
+          <w:tcPr>
+            <w:tcW w:type="dxa" w:w="4844"/>
+            <w:shd w:val="clear" w:color="auto" w:fill="B8B3D6"/>
+            <w:tcBorders>
+              <w:top w:val="single" w:sz="4" w:space="0" w:color="CBCBCB"/>
+              <w:left w:val="single" w:sz="4" w:space="0" w:color="CBCBCB"/>
+              <w:bottom w:val="single" w:sz="4" w:space="0" w:color="CBCBCB"/>
+              <w:right w:val="single" w:sz="4" w:space="0" w:color="CBCBCB"/>
+            </w:tcBorders>
+          </w:tcPr>
+          <w:p>
+            <w:r>
+              <w:rPr>
+                <w:b/>
+                <w:sz w:val="20"/>
+              </w:rPr>
+              <w:t>Các bước tái hiện</w:t>
+            </w:r>
+          </w:p>
+        </w:tc>
+        <w:tc>
+          <w:tcPr>
+            <w:tcW w:type="dxa" w:w="4844"/>
+            <w:shd w:val="clear" w:color="auto" w:fill="B8B3D6"/>
+            <w:tcBorders>
+              <w:top w:val="single" w:sz="4" w:space="0" w:color="CBCBCB"/>
+              <w:left w:val="single" w:sz="4" w:space="0" w:color="CBCBCB"/>
+              <w:bottom w:val="single" w:sz="4" w:space="0" w:color="CBCBCB"/>
+              <w:right w:val="single" w:sz="4" w:space="0" w:color="CBCBCB"/>
+            </w:tcBorders>
+          </w:tcPr>
+          <w:p>
+            <w:r>
+              <w:rPr>
+                <w:sz w:val="20"/>
+              </w:rPr>
+              <w:t xml:space="preserve">1. Tick chọn P01 (đủ SSH) + P02 (KHÔNG có SSH username). 2. Bấm 🚀 Gửi lệnh / Upload File Hàng Loạt, nhập </w:t>
+            </w:r>
+            <w:r>
+              <w:rPr>
+                <w:rFonts w:ascii="Courier New" w:hAnsi="Courier New"/>
+                <w:color w:val="F05922"/>
+                <w:sz w:val="20"/>
+              </w:rPr>
+              <w:t>uname -a</w:t>
+            </w:r>
+            <w:r>
+              <w:rPr>
+                <w:sz w:val="20"/>
+              </w:rPr>
+              <w:t>, bấm 🚀 Chạy lệnh.</w:t>
+            </w:r>
+          </w:p>
+        </w:tc>
+      </w:tr>
+      <w:tr>
+        <w:tc>
+          <w:tcPr>
+            <w:tcW w:type="dxa" w:w="4844"/>
+            <w:tcBorders>
+              <w:top w:val="single" w:sz="4" w:space="0" w:color="CBCBCB"/>
+              <w:left w:val="single" w:sz="4" w:space="0" w:color="CBCBCB"/>
+              <w:bottom w:val="single" w:sz="4" w:space="0" w:color="CBCBCB"/>
+              <w:right w:val="single" w:sz="4" w:space="0" w:color="CBCBCB"/>
+            </w:tcBorders>
+          </w:tcPr>
+          <w:p>
+            <w:r>
+              <w:rPr>
+                <w:b/>
+                <w:sz w:val="20"/>
+              </w:rPr>
+              <w:t>Kết quả thực tế</w:t>
+            </w:r>
+          </w:p>
+        </w:tc>
+        <w:tc>
+          <w:tcPr>
+            <w:tcW w:type="dxa" w:w="4844"/>
+            <w:tcBorders>
+              <w:top w:val="single" w:sz="4" w:space="0" w:color="CBCBCB"/>
+              <w:left w:val="single" w:sz="4" w:space="0" w:color="CBCBCB"/>
+              <w:bottom w:val="single" w:sz="4" w:space="0" w:color="CBCBCB"/>
+              <w:right w:val="single" w:sz="4" w:space="0" w:color="CBCBCB"/>
+            </w:tcBorders>
+          </w:tcPr>
+          <w:p>
+            <w:r>
+              <w:rPr>
+                <w:sz w:val="20"/>
+              </w:rPr>
+              <w:t xml:space="preserve">P02 báo Lỗi với nguyên văn exception .NET: </w:t>
+            </w:r>
+            <w:r>
+              <w:rPr>
+                <w:rFonts w:ascii="Courier New" w:hAnsi="Courier New"/>
+                <w:color w:val="F05922"/>
+                <w:sz w:val="20"/>
+              </w:rPr>
+              <w:t>The value cannot be an empty string or composed entirely of whitespace. (Parameter 'username')</w:t>
+            </w:r>
+            <w:r>
+              <w:rPr>
+                <w:sz w:val="20"/>
+              </w:rPr>
+              <w:t xml:space="preserve"> — người dùng cuối không hiểu nguyên nhân là máy chưa khai báo SSH user.</w:t>
+            </w:r>
+          </w:p>
+        </w:tc>
+      </w:tr>
+      <w:tr>
+        <w:tc>
+          <w:tcPr>
+            <w:tcW w:type="dxa" w:w="4844"/>
+            <w:shd w:val="clear" w:color="auto" w:fill="B8B3D6"/>
+            <w:tcBorders>
+              <w:top w:val="single" w:sz="4" w:space="0" w:color="CBCBCB"/>
+              <w:left w:val="single" w:sz="4" w:space="0" w:color="CBCBCB"/>
+              <w:bottom w:val="single" w:sz="4" w:space="0" w:color="CBCBCB"/>
+              <w:right w:val="single" w:sz="4" w:space="0" w:color="CBCBCB"/>
+            </w:tcBorders>
+          </w:tcPr>
+          <w:p>
+            <w:r>
+              <w:rPr>
+                <w:b/>
+                <w:sz w:val="20"/>
+              </w:rPr>
+              <w:t>Kết quả mong đợi</w:t>
+            </w:r>
+          </w:p>
+        </w:tc>
+        <w:tc>
+          <w:tcPr>
+            <w:tcW w:type="dxa" w:w="4844"/>
+            <w:shd w:val="clear" w:color="auto" w:fill="B8B3D6"/>
+            <w:tcBorders>
+              <w:top w:val="single" w:sz="4" w:space="0" w:color="CBCBCB"/>
+              <w:left w:val="single" w:sz="4" w:space="0" w:color="CBCBCB"/>
+              <w:bottom w:val="single" w:sz="4" w:space="0" w:color="CBCBCB"/>
+              <w:right w:val="single" w:sz="4" w:space="0" w:color="CBCBCB"/>
+            </w:tcBorders>
+          </w:tcPr>
+          <w:p>
+            <w:r>
+              <w:rPr>
+                <w:sz w:val="20"/>
+              </w:rPr>
+              <w:t>Thông báo tiếng Việt rõ ràng, VD: "Máy chưa cấu hình SSH user — vào 'Sửa' máy tính để bổ sung", hoặc loại máy thiếu SSH khỏi danh sách chạy kèm cảnh báo trước khi thực thi.</w:t>
+            </w:r>
+          </w:p>
+        </w:tc>
+      </w:tr>
+      <w:tr>
+        <w:tc>
+          <w:tcPr>
+            <w:tcW w:type="dxa" w:w="4844"/>
+            <w:tcBorders>
+              <w:top w:val="single" w:sz="4" w:space="0" w:color="CBCBCB"/>
+              <w:left w:val="single" w:sz="4" w:space="0" w:color="CBCBCB"/>
+              <w:bottom w:val="single" w:sz="4" w:space="0" w:color="CBCBCB"/>
+              <w:right w:val="single" w:sz="4" w:space="0" w:color="CBCBCB"/>
+            </w:tcBorders>
+          </w:tcPr>
+          <w:p>
+            <w:r>
+              <w:rPr>
+                <w:b/>
+                <w:sz w:val="20"/>
+              </w:rPr>
+              <w:t>Ảnh chứng minh</w:t>
+            </w:r>
+          </w:p>
+        </w:tc>
+        <w:tc>
+          <w:tcPr>
+            <w:tcW w:type="dxa" w:w="4844"/>
+            <w:tcBorders>
+              <w:top w:val="single" w:sz="4" w:space="0" w:color="CBCBCB"/>
+              <w:left w:val="single" w:sz="4" w:space="0" w:color="CBCBCB"/>
+              <w:bottom w:val="single" w:sz="4" w:space="0" w:color="CBCBCB"/>
+              <w:right w:val="single" w:sz="4" w:space="0" w:color="CBCBCB"/>
+            </w:tcBorders>
+          </w:tcPr>
+          <w:p>
+            <w:r>
+              <w:rPr>
+                <w:rFonts w:ascii="Courier New" w:hAnsi="Courier New"/>
+                <w:color w:val="F05922"/>
+                <w:sz w:val="20"/>
+              </w:rPr>
+              <w:t>docs/bugs/screenshots/bug-bulk-raw-exception.png</w:t>
+            </w:r>
+          </w:p>
+        </w:tc>
+      </w:tr>
+    </w:tbl>
+    <w:p/>
+    <w:p>
+      <w:pPr>
+        <w:pBdr>
+          <w:bottom w:val="single" w:sz="6" w:space="1" w:color="F05922"/>
+        </w:pBdr>
+        <w:spacing w:after="120"/>
+      </w:pPr>
+    </w:p>
+    <w:p>
+      <w:pPr>
+        <w:pStyle w:val="Heading2"/>
+        <w:spacing w:before="200" w:after="80"/>
+      </w:pPr>
+      <w:r>
+        <w:rPr>
+          <w:color w:val="F05922"/>
+          <w:sz w:val="28"/>
+        </w:rPr>
         <w:t>Ghi chú tổng hợp cho senior-developer</w:t>
       </w:r>
     </w:p>
@@ -1735,6 +2703,40 @@
           <w:sz w:val="21"/>
         </w:rPr>
         <w:t>Không phát hiện lỗi ở: NetworkScan, ConnectionEntry, MultiRemote (grid/custom/tab), FileManager (duyệt/lọc/upload/sync/xóa/dir-warning/lỗi-quyền), ConfirmDelete, RemoteCommand Console (chạy lệnh + báo lỗi command-not-found) — tất cả hoạt động đúng như mong đợi.</w:t>
+      </w:r>
+    </w:p>
+    <w:p>
+      <w:pPr>
+        <w:pStyle w:val="ListBullet"/>
+        <w:spacing w:after="20"/>
+        <w:ind w:left="283"/>
+      </w:pPr>
+      <w:r>
+        <w:rPr>
+          <w:b/>
+          <w:sz w:val="21"/>
+        </w:rPr>
+        <w:t>Bổ sung bước 2.3 (2026-07-26, ZCU tại IP mới `192.168.0.101`):</w:t>
+      </w:r>
+      <w:r>
+        <w:rPr>
+          <w:sz w:val="21"/>
+        </w:rPr>
+        <w:t xml:space="preserve"> F02 đã hết sau khi cập nhật agent (xem cập nhật trong F02). Thêm F04 (status cũ không reset — ZcuSetupWizard/RemoteAppInstall) và F05 (BulkAction lộ raw exception). Hoạt động đúng: ZcuSetupWizard cài đặt 7/7 bước thành công (~10s, agent tự restart, stream + SysInfo hoạt động ngay); RemoteAppInstall dropdown danh sách package (nút ▼) mở và lọc đúng (kztek-*, agent, kiosk…); KioskDeploy 2 tab hiển thị đủ checkbox; BulkAction chạy </w:t>
+      </w:r>
+      <w:r>
+        <w:rPr>
+          <w:rFonts w:ascii="Courier New" w:hAnsi="Courier New"/>
+          <w:color w:val="F05922"/>
+          <w:sz w:val="21"/>
+        </w:rPr>
+        <w:t>uname -a</w:t>
+      </w:r>
+      <w:r>
+        <w:rPr>
+          <w:sz w:val="21"/>
+        </w:rPr>
+        <w:t xml:space="preserve"> song song P01 thành công/P02 lỗi đúng như thiết kế; CronJob (đã chụp trước) thêm/xóa job bình thường.</w:t>
       </w:r>
     </w:p>
     <w:sectPr>

</xml_diff>

<commit_message>
[user-manual-ccu-zcu] Bước 2.4: Screenshot nhóm Giám sát & Hệ thống + terminal ZCU
- 14/15 ảnh nhóm 2.4: HealthMonitor (2), License (4 qua harness dev tạm), KeyGen (1 che private key), terminal ZCU (7 qua SSH thật); verify từng ảnh bằng Read
- BLOCK 1 ảnh zcu-terminal-setup-script (chạy lại setup ghi đè agent — ngoài scope đọc)
- Đổi tên 3 file khớp marker MANUAL (keygen-output, zcu-terminal-session-x11, zcu-terminal-service-status)
- Thêm F06 (P2 bảo mật: backdoor ANHNV + agent AllowedClientIPs 0.0.0.0/0 + ufw inactive) vào file BUG
- Phase 2 hoàn tất; tổng 75 ảnh PNG, 57/61 marker MANUAL có file khớp
- Cập nhật STEP-2.4 + PLAN-MASTER (2.4 ✅, Blockers Phase 2 xong)

Plan: docs/plans/PLAN-user-manual-ccu-zcu-2026-07-26/steps/STEP-2.4-shots-monitor.md
Co-Authored-By: Claude Opus 5 (1M context) <noreply@anthropic.com>
</commit_message>
<xml_diff>
--- a/docs/bugs/BUG-ccu-ui-findings-2026-07-26.docx
+++ b/docs/bugs/BUG-ccu-ui-findings-2026-07-26.docx
@@ -2636,6 +2636,631 @@
           <w:color w:val="F05922"/>
           <w:sz w:val="28"/>
         </w:rPr>
+        <w:t>F06 — Backdoor cứng "ANHNV" + agent mở cho mọi IP (rủi ro bảo mật)</w:t>
+      </w:r>
+    </w:p>
+    <w:tbl>
+      <w:tblPr>
+        <w:tblStyle w:val="TableGrid"/>
+        <w:tblW w:type="auto" w:w="0"/>
+        <w:tblLook w:firstColumn="1" w:firstRow="1" w:lastColumn="0" w:lastRow="0" w:noHBand="0" w:noVBand="1" w:val="04A0"/>
+      </w:tblPr>
+      <w:tblGrid>
+        <w:gridCol w:w="4844"/>
+        <w:gridCol w:w="4844"/>
+      </w:tblGrid>
+      <w:tr>
+        <w:tc>
+          <w:tcPr>
+            <w:tcW w:type="dxa" w:w="4844"/>
+            <w:shd w:val="clear" w:color="auto" w:fill="251C53"/>
+            <w:tcBorders>
+              <w:top w:val="single" w:sz="4" w:space="0" w:color="251C53"/>
+              <w:left w:val="single" w:sz="4" w:space="0" w:color="251C53"/>
+              <w:bottom w:val="single" w:sz="4" w:space="0" w:color="251C53"/>
+              <w:right w:val="single" w:sz="4" w:space="0" w:color="251C53"/>
+            </w:tcBorders>
+          </w:tcPr>
+          <w:p>
+            <w:r>
+              <w:rPr>
+                <w:b/>
+                <w:color w:val="FFFFFF"/>
+                <w:sz w:val="20"/>
+              </w:rPr>
+              <w:t>Trường</w:t>
+            </w:r>
+          </w:p>
+        </w:tc>
+        <w:tc>
+          <w:tcPr>
+            <w:tcW w:type="dxa" w:w="4844"/>
+            <w:shd w:val="clear" w:color="auto" w:fill="251C53"/>
+            <w:tcBorders>
+              <w:top w:val="single" w:sz="4" w:space="0" w:color="251C53"/>
+              <w:left w:val="single" w:sz="4" w:space="0" w:color="251C53"/>
+              <w:bottom w:val="single" w:sz="4" w:space="0" w:color="251C53"/>
+              <w:right w:val="single" w:sz="4" w:space="0" w:color="251C53"/>
+            </w:tcBorders>
+          </w:tcPr>
+          <w:p>
+            <w:r>
+              <w:rPr>
+                <w:b/>
+                <w:color w:val="FFFFFF"/>
+                <w:sz w:val="20"/>
+              </w:rPr>
+              <w:t>Nội dung</w:t>
+            </w:r>
+          </w:p>
+        </w:tc>
+      </w:tr>
+      <w:tr>
+        <w:tc>
+          <w:tcPr>
+            <w:tcW w:type="dxa" w:w="4844"/>
+            <w:tcBorders>
+              <w:top w:val="single" w:sz="4" w:space="0" w:color="CBCBCB"/>
+              <w:left w:val="single" w:sz="4" w:space="0" w:color="CBCBCB"/>
+              <w:bottom w:val="single" w:sz="4" w:space="0" w:color="CBCBCB"/>
+              <w:right w:val="single" w:sz="4" w:space="0" w:color="CBCBCB"/>
+            </w:tcBorders>
+          </w:tcPr>
+          <w:p>
+            <w:r>
+              <w:rPr>
+                <w:sz w:val="20"/>
+              </w:rPr>
+              <w:t>---</w:t>
+            </w:r>
+          </w:p>
+        </w:tc>
+        <w:tc>
+          <w:tcPr>
+            <w:tcW w:type="dxa" w:w="4844"/>
+            <w:tcBorders>
+              <w:top w:val="single" w:sz="4" w:space="0" w:color="CBCBCB"/>
+              <w:left w:val="single" w:sz="4" w:space="0" w:color="CBCBCB"/>
+              <w:bottom w:val="single" w:sz="4" w:space="0" w:color="CBCBCB"/>
+              <w:right w:val="single" w:sz="4" w:space="0" w:color="CBCBCB"/>
+            </w:tcBorders>
+          </w:tcPr>
+          <w:p>
+            <w:r>
+              <w:rPr>
+                <w:sz w:val="20"/>
+              </w:rPr>
+              <w:t>---</w:t>
+            </w:r>
+          </w:p>
+        </w:tc>
+      </w:tr>
+      <w:tr>
+        <w:tc>
+          <w:tcPr>
+            <w:tcW w:type="dxa" w:w="4844"/>
+            <w:shd w:val="clear" w:color="auto" w:fill="B8B3D6"/>
+            <w:tcBorders>
+              <w:top w:val="single" w:sz="4" w:space="0" w:color="CBCBCB"/>
+              <w:left w:val="single" w:sz="4" w:space="0" w:color="CBCBCB"/>
+              <w:bottom w:val="single" w:sz="4" w:space="0" w:color="CBCBCB"/>
+              <w:right w:val="single" w:sz="4" w:space="0" w:color="CBCBCB"/>
+            </w:tcBorders>
+          </w:tcPr>
+          <w:p>
+            <w:r>
+              <w:rPr>
+                <w:b/>
+                <w:sz w:val="20"/>
+              </w:rPr>
+              <w:t>Màn hình / Thành phần</w:t>
+            </w:r>
+          </w:p>
+        </w:tc>
+        <w:tc>
+          <w:tcPr>
+            <w:tcW w:type="dxa" w:w="4844"/>
+            <w:shd w:val="clear" w:color="auto" w:fill="B8B3D6"/>
+            <w:tcBorders>
+              <w:top w:val="single" w:sz="4" w:space="0" w:color="CBCBCB"/>
+              <w:left w:val="single" w:sz="4" w:space="0" w:color="CBCBCB"/>
+              <w:bottom w:val="single" w:sz="4" w:space="0" w:color="CBCBCB"/>
+              <w:right w:val="single" w:sz="4" w:space="0" w:color="CBCBCB"/>
+            </w:tcBorders>
+          </w:tcPr>
+          <w:p>
+            <w:r>
+              <w:rPr>
+                <w:rFonts w:ascii="Courier New" w:hAnsi="Courier New"/>
+                <w:color w:val="F05922"/>
+                <w:sz w:val="20"/>
+              </w:rPr>
+              <w:t>LicenseManagerService.ValidateLicenseKey</w:t>
+            </w:r>
+            <w:r>
+              <w:rPr>
+                <w:sz w:val="20"/>
+              </w:rPr>
+              <w:t xml:space="preserve"> (CcuUI) + </w:t>
+            </w:r>
+            <w:r>
+              <w:rPr>
+                <w:rFonts w:ascii="Courier New" w:hAnsi="Courier New"/>
+                <w:color w:val="F05922"/>
+                <w:sz w:val="20"/>
+              </w:rPr>
+              <w:t>appsettings.json</w:t>
+            </w:r>
+            <w:r>
+              <w:rPr>
+                <w:sz w:val="20"/>
+              </w:rPr>
+              <w:t xml:space="preserve"> của ZcuAgent</w:t>
+            </w:r>
+          </w:p>
+        </w:tc>
+      </w:tr>
+      <w:tr>
+        <w:tc>
+          <w:tcPr>
+            <w:tcW w:type="dxa" w:w="4844"/>
+            <w:tcBorders>
+              <w:top w:val="single" w:sz="4" w:space="0" w:color="CBCBCB"/>
+              <w:left w:val="single" w:sz="4" w:space="0" w:color="CBCBCB"/>
+              <w:bottom w:val="single" w:sz="4" w:space="0" w:color="CBCBCB"/>
+              <w:right w:val="single" w:sz="4" w:space="0" w:color="CBCBCB"/>
+            </w:tcBorders>
+          </w:tcPr>
+          <w:p>
+            <w:r>
+              <w:rPr>
+                <w:b/>
+                <w:sz w:val="20"/>
+              </w:rPr>
+              <w:t>Mức độ</w:t>
+            </w:r>
+          </w:p>
+        </w:tc>
+        <w:tc>
+          <w:tcPr>
+            <w:tcW w:type="dxa" w:w="4844"/>
+            <w:tcBorders>
+              <w:top w:val="single" w:sz="4" w:space="0" w:color="CBCBCB"/>
+              <w:left w:val="single" w:sz="4" w:space="0" w:color="CBCBCB"/>
+              <w:bottom w:val="single" w:sz="4" w:space="0" w:color="CBCBCB"/>
+              <w:right w:val="single" w:sz="4" w:space="0" w:color="CBCBCB"/>
+            </w:tcBorders>
+          </w:tcPr>
+          <w:p>
+            <w:r>
+              <w:rPr>
+                <w:sz w:val="20"/>
+              </w:rPr>
+              <w:t>P2 (bảo mật)</w:t>
+            </w:r>
+          </w:p>
+        </w:tc>
+      </w:tr>
+      <w:tr>
+        <w:tc>
+          <w:tcPr>
+            <w:tcW w:type="dxa" w:w="4844"/>
+            <w:shd w:val="clear" w:color="auto" w:fill="B8B3D6"/>
+            <w:tcBorders>
+              <w:top w:val="single" w:sz="4" w:space="0" w:color="CBCBCB"/>
+              <w:left w:val="single" w:sz="4" w:space="0" w:color="CBCBCB"/>
+              <w:bottom w:val="single" w:sz="4" w:space="0" w:color="CBCBCB"/>
+              <w:right w:val="single" w:sz="4" w:space="0" w:color="CBCBCB"/>
+            </w:tcBorders>
+          </w:tcPr>
+          <w:p>
+            <w:r>
+              <w:rPr>
+                <w:b/>
+                <w:sz w:val="20"/>
+              </w:rPr>
+              <w:t>Các bước tái hiện</w:t>
+            </w:r>
+          </w:p>
+        </w:tc>
+        <w:tc>
+          <w:tcPr>
+            <w:tcW w:type="dxa" w:w="4844"/>
+            <w:shd w:val="clear" w:color="auto" w:fill="B8B3D6"/>
+            <w:tcBorders>
+              <w:top w:val="single" w:sz="4" w:space="0" w:color="CBCBCB"/>
+              <w:left w:val="single" w:sz="4" w:space="0" w:color="CBCBCB"/>
+              <w:bottom w:val="single" w:sz="4" w:space="0" w:color="CBCBCB"/>
+              <w:right w:val="single" w:sz="4" w:space="0" w:color="CBCBCB"/>
+            </w:tcBorders>
+          </w:tcPr>
+          <w:p>
+            <w:r>
+              <w:rPr>
+                <w:sz w:val="20"/>
+              </w:rPr>
+              <w:t xml:space="preserve">1. Mở LicenseWindow (qua harness doc), nhập đúng chuỗi </w:t>
+            </w:r>
+            <w:r>
+              <w:rPr>
+                <w:rFonts w:ascii="Courier New" w:hAnsi="Courier New"/>
+                <w:color w:val="F05922"/>
+                <w:sz w:val="20"/>
+              </w:rPr>
+              <w:t>ANHNV</w:t>
+            </w:r>
+            <w:r>
+              <w:rPr>
+                <w:sz w:val="20"/>
+              </w:rPr>
+              <w:t xml:space="preserve"> vào ô License Key → bấm Kích hoạt → "Kích hoạt thành công" bất kể Hardware ID. 2. Trên ZCU đọc </w:t>
+            </w:r>
+            <w:r>
+              <w:rPr>
+                <w:rFonts w:ascii="Courier New" w:hAnsi="Courier New"/>
+                <w:color w:val="F05922"/>
+                <w:sz w:val="20"/>
+              </w:rPr>
+              <w:t>~/ipgs/remote-agent/appsettings.json</w:t>
+            </w:r>
+            <w:r>
+              <w:rPr>
+                <w:sz w:val="20"/>
+              </w:rPr>
+              <w:t xml:space="preserve"> → </w:t>
+            </w:r>
+            <w:r>
+              <w:rPr>
+                <w:rFonts w:ascii="Courier New" w:hAnsi="Courier New"/>
+                <w:color w:val="F05922"/>
+                <w:sz w:val="20"/>
+              </w:rPr>
+              <w:t>Token: "ANHNV"</w:t>
+            </w:r>
+            <w:r>
+              <w:rPr>
+                <w:sz w:val="20"/>
+              </w:rPr>
+              <w:t xml:space="preserve">, </w:t>
+            </w:r>
+            <w:r>
+              <w:rPr>
+                <w:rFonts w:ascii="Courier New" w:hAnsi="Courier New"/>
+                <w:color w:val="F05922"/>
+                <w:sz w:val="20"/>
+              </w:rPr>
+              <w:t>AllowedClientIPs: ["0.0.0.0/0"]</w:t>
+            </w:r>
+            <w:r>
+              <w:rPr>
+                <w:sz w:val="20"/>
+              </w:rPr>
+              <w:t>.</w:t>
+            </w:r>
+          </w:p>
+        </w:tc>
+      </w:tr>
+      <w:tr>
+        <w:tc>
+          <w:tcPr>
+            <w:tcW w:type="dxa" w:w="4844"/>
+            <w:tcBorders>
+              <w:top w:val="single" w:sz="4" w:space="0" w:color="CBCBCB"/>
+              <w:left w:val="single" w:sz="4" w:space="0" w:color="CBCBCB"/>
+              <w:bottom w:val="single" w:sz="4" w:space="0" w:color="CBCBCB"/>
+              <w:right w:val="single" w:sz="4" w:space="0" w:color="CBCBCB"/>
+            </w:tcBorders>
+          </w:tcPr>
+          <w:p>
+            <w:r>
+              <w:rPr>
+                <w:b/>
+                <w:sz w:val="20"/>
+              </w:rPr>
+              <w:t>Kết quả thực tế</w:t>
+            </w:r>
+          </w:p>
+        </w:tc>
+        <w:tc>
+          <w:tcPr>
+            <w:tcW w:type="dxa" w:w="4844"/>
+            <w:tcBorders>
+              <w:top w:val="single" w:sz="4" w:space="0" w:color="CBCBCB"/>
+              <w:left w:val="single" w:sz="4" w:space="0" w:color="CBCBCB"/>
+              <w:bottom w:val="single" w:sz="4" w:space="0" w:color="CBCBCB"/>
+              <w:right w:val="single" w:sz="4" w:space="0" w:color="CBCBCB"/>
+            </w:tcBorders>
+          </w:tcPr>
+          <w:p>
+            <w:r>
+              <w:rPr>
+                <w:sz w:val="20"/>
+              </w:rPr>
+              <w:t xml:space="preserve">(a) Chuỗi </w:t>
+            </w:r>
+            <w:r>
+              <w:rPr>
+                <w:rFonts w:ascii="Courier New" w:hAnsi="Courier New"/>
+                <w:color w:val="F05922"/>
+                <w:sz w:val="20"/>
+              </w:rPr>
+              <w:t>ANHNV</w:t>
+            </w:r>
+            <w:r>
+              <w:rPr>
+                <w:sz w:val="20"/>
+              </w:rPr>
+              <w:t xml:space="preserve"> là superadmin backdoor hardcode trong source — bỏ qua toàn bộ kiểm tra chữ ký số + hết hạn + Hardware ID, cho phép kích hoạt vĩnh viễn trên mọi máy. (b) Agent chấp nhận kết nối từ </w:t>
+            </w:r>
+            <w:r>
+              <w:rPr>
+                <w:b/>
+                <w:sz w:val="20"/>
+              </w:rPr>
+              <w:t>mọi IP</w:t>
+            </w:r>
+            <w:r>
+              <w:rPr>
+                <w:sz w:val="20"/>
+              </w:rPr>
+              <w:t xml:space="preserve"> (</w:t>
+            </w:r>
+            <w:r>
+              <w:rPr>
+                <w:rFonts w:ascii="Courier New" w:hAnsi="Courier New"/>
+                <w:color w:val="F05922"/>
+                <w:sz w:val="20"/>
+              </w:rPr>
+              <w:t>0.0.0.0/0</w:t>
+            </w:r>
+            <w:r>
+              <w:rPr>
+                <w:sz w:val="20"/>
+              </w:rPr>
+              <w:t xml:space="preserve">) với token đoán được </w:t>
+            </w:r>
+            <w:r>
+              <w:rPr>
+                <w:rFonts w:ascii="Courier New" w:hAnsi="Courier New"/>
+                <w:color w:val="F05922"/>
+                <w:sz w:val="20"/>
+              </w:rPr>
+              <w:t>ANHNV</w:t>
+            </w:r>
+            <w:r>
+              <w:rPr>
+                <w:sz w:val="20"/>
+              </w:rPr>
+              <w:t xml:space="preserve"> (trùng tên user git </w:t>
+            </w:r>
+            <w:r>
+              <w:rPr>
+                <w:rFonts w:ascii="Courier New" w:hAnsi="Courier New"/>
+                <w:color w:val="F05922"/>
+                <w:sz w:val="20"/>
+              </w:rPr>
+              <w:t>ANHNV_2025</w:t>
+            </w:r>
+            <w:r>
+              <w:rPr>
+                <w:sz w:val="20"/>
+              </w:rPr>
+              <w:t>, trùng license backdoor).</w:t>
+            </w:r>
+          </w:p>
+        </w:tc>
+      </w:tr>
+      <w:tr>
+        <w:tc>
+          <w:tcPr>
+            <w:tcW w:type="dxa" w:w="4844"/>
+            <w:shd w:val="clear" w:color="auto" w:fill="B8B3D6"/>
+            <w:tcBorders>
+              <w:top w:val="single" w:sz="4" w:space="0" w:color="CBCBCB"/>
+              <w:left w:val="single" w:sz="4" w:space="0" w:color="CBCBCB"/>
+              <w:bottom w:val="single" w:sz="4" w:space="0" w:color="CBCBCB"/>
+              <w:right w:val="single" w:sz="4" w:space="0" w:color="CBCBCB"/>
+            </w:tcBorders>
+          </w:tcPr>
+          <w:p>
+            <w:r>
+              <w:rPr>
+                <w:b/>
+                <w:sz w:val="20"/>
+              </w:rPr>
+              <w:t>Kết quả mong đợi</w:t>
+            </w:r>
+          </w:p>
+        </w:tc>
+        <w:tc>
+          <w:tcPr>
+            <w:tcW w:type="dxa" w:w="4844"/>
+            <w:shd w:val="clear" w:color="auto" w:fill="B8B3D6"/>
+            <w:tcBorders>
+              <w:top w:val="single" w:sz="4" w:space="0" w:color="CBCBCB"/>
+              <w:left w:val="single" w:sz="4" w:space="0" w:color="CBCBCB"/>
+              <w:bottom w:val="single" w:sz="4" w:space="0" w:color="CBCBCB"/>
+              <w:right w:val="single" w:sz="4" w:space="0" w:color="CBCBCB"/>
+            </w:tcBorders>
+          </w:tcPr>
+          <w:p>
+            <w:r>
+              <w:rPr>
+                <w:sz w:val="20"/>
+              </w:rPr>
+              <w:t xml:space="preserve">(a) Không nhúng backdoor cứng trong bản phát hành, hoặc ít nhất chuyển sang cơ chế ký/kiểm tra không hardcode chuỗi tĩnh trong mã nguồn. (b) </w:t>
+            </w:r>
+            <w:r>
+              <w:rPr>
+                <w:rFonts w:ascii="Courier New" w:hAnsi="Courier New"/>
+                <w:color w:val="F05922"/>
+                <w:sz w:val="20"/>
+              </w:rPr>
+              <w:t>AllowedClientIPs</w:t>
+            </w:r>
+            <w:r>
+              <w:rPr>
+                <w:sz w:val="20"/>
+              </w:rPr>
+              <w:t xml:space="preserve"> mặc định giới hạn dải LAN quản trị, token sinh ngẫu nhiên mạnh (không phải chuỗi từ điển ngắn 5 ký tự) — ZcuSetupWizard đã có nút 🎲 Sinh Token, nên bỏ default </w:t>
+            </w:r>
+            <w:r>
+              <w:rPr>
+                <w:rFonts w:ascii="Courier New" w:hAnsi="Courier New"/>
+                <w:color w:val="F05922"/>
+                <w:sz w:val="20"/>
+              </w:rPr>
+              <w:t>ANHNV</w:t>
+            </w:r>
+            <w:r>
+              <w:rPr>
+                <w:sz w:val="20"/>
+              </w:rPr>
+              <w:t>.</w:t>
+            </w:r>
+          </w:p>
+        </w:tc>
+      </w:tr>
+      <w:tr>
+        <w:tc>
+          <w:tcPr>
+            <w:tcW w:type="dxa" w:w="4844"/>
+            <w:tcBorders>
+              <w:top w:val="single" w:sz="4" w:space="0" w:color="CBCBCB"/>
+              <w:left w:val="single" w:sz="4" w:space="0" w:color="CBCBCB"/>
+              <w:bottom w:val="single" w:sz="4" w:space="0" w:color="CBCBCB"/>
+              <w:right w:val="single" w:sz="4" w:space="0" w:color="CBCBCB"/>
+            </w:tcBorders>
+          </w:tcPr>
+          <w:p>
+            <w:r>
+              <w:rPr>
+                <w:b/>
+                <w:sz w:val="20"/>
+              </w:rPr>
+              <w:t>Ảnh liên quan</w:t>
+            </w:r>
+          </w:p>
+        </w:tc>
+        <w:tc>
+          <w:tcPr>
+            <w:tcW w:type="dxa" w:w="4844"/>
+            <w:tcBorders>
+              <w:top w:val="single" w:sz="4" w:space="0" w:color="CBCBCB"/>
+              <w:left w:val="single" w:sz="4" w:space="0" w:color="CBCBCB"/>
+              <w:bottom w:val="single" w:sz="4" w:space="0" w:color="CBCBCB"/>
+              <w:right w:val="single" w:sz="4" w:space="0" w:color="CBCBCB"/>
+            </w:tcBorders>
+          </w:tcPr>
+          <w:p>
+            <w:r>
+              <w:rPr>
+                <w:rFonts w:ascii="Courier New" w:hAnsi="Courier New"/>
+                <w:color w:val="F05922"/>
+                <w:sz w:val="20"/>
+              </w:rPr>
+              <w:t>docs/user-manuals/screenshots/license-success.png</w:t>
+            </w:r>
+            <w:r>
+              <w:rPr>
+                <w:sz w:val="20"/>
+              </w:rPr>
+              <w:t xml:space="preserve"> (kích hoạt bằng backdoor, đã che), </w:t>
+            </w:r>
+            <w:r>
+              <w:rPr>
+                <w:rFonts w:ascii="Courier New" w:hAnsi="Courier New"/>
+                <w:color w:val="F05922"/>
+                <w:sz w:val="20"/>
+              </w:rPr>
+              <w:t>docs/user-manuals/screenshots/zcu-terminal-appsettings.png</w:t>
+            </w:r>
+            <w:r>
+              <w:rPr>
+                <w:sz w:val="20"/>
+              </w:rPr>
+              <w:t xml:space="preserve"> (Token đã che, thấy </w:t>
+            </w:r>
+            <w:r>
+              <w:rPr>
+                <w:rFonts w:ascii="Courier New" w:hAnsi="Courier New"/>
+                <w:color w:val="F05922"/>
+                <w:sz w:val="20"/>
+              </w:rPr>
+              <w:t>AllowedClientIPs: 0.0.0.0/0</w:t>
+            </w:r>
+            <w:r>
+              <w:rPr>
+                <w:sz w:val="20"/>
+              </w:rPr>
+              <w:t>)</w:t>
+            </w:r>
+          </w:p>
+        </w:tc>
+      </w:tr>
+      <w:tr>
+        <w:tc>
+          <w:tcPr>
+            <w:tcW w:type="dxa" w:w="4844"/>
+            <w:shd w:val="clear" w:color="auto" w:fill="B8B3D6"/>
+            <w:tcBorders>
+              <w:top w:val="single" w:sz="4" w:space="0" w:color="CBCBCB"/>
+              <w:left w:val="single" w:sz="4" w:space="0" w:color="CBCBCB"/>
+              <w:bottom w:val="single" w:sz="4" w:space="0" w:color="CBCBCB"/>
+              <w:right w:val="single" w:sz="4" w:space="0" w:color="CBCBCB"/>
+            </w:tcBorders>
+          </w:tcPr>
+          <w:p>
+            <w:r>
+              <w:rPr>
+                <w:b/>
+                <w:sz w:val="20"/>
+              </w:rPr>
+              <w:t>Ghi chú</w:t>
+            </w:r>
+          </w:p>
+        </w:tc>
+        <w:tc>
+          <w:tcPr>
+            <w:tcW w:type="dxa" w:w="4844"/>
+            <w:shd w:val="clear" w:color="auto" w:fill="B8B3D6"/>
+            <w:tcBorders>
+              <w:top w:val="single" w:sz="4" w:space="0" w:color="CBCBCB"/>
+              <w:left w:val="single" w:sz="4" w:space="0" w:color="CBCBCB"/>
+              <w:bottom w:val="single" w:sz="4" w:space="0" w:color="CBCBCB"/>
+              <w:right w:val="single" w:sz="4" w:space="0" w:color="CBCBCB"/>
+            </w:tcBorders>
+          </w:tcPr>
+          <w:p>
+            <w:r>
+              <w:rPr>
+                <w:sz w:val="20"/>
+              </w:rPr>
+              <w:t>Documentation Writer CHỈ ghi nhận, KHÔNG sửa. Thuộc phạm vi security-audit-stride của senior-developer/Tech Lead. Chuỗi backdoor thực tế KHÔNG được ghi vào tài liệu người dùng; ảnh success đã che ô key.</w:t>
+            </w:r>
+          </w:p>
+        </w:tc>
+      </w:tr>
+    </w:tbl>
+    <w:p/>
+    <w:p>
+      <w:pPr>
+        <w:pBdr>
+          <w:bottom w:val="single" w:sz="6" w:space="1" w:color="F05922"/>
+        </w:pBdr>
+        <w:spacing w:after="120"/>
+      </w:pPr>
+    </w:p>
+    <w:p>
+      <w:pPr>
+        <w:pStyle w:val="Heading2"/>
+        <w:spacing w:before="200" w:after="80"/>
+      </w:pPr>
+      <w:r>
+        <w:rPr>
+          <w:color w:val="F05922"/>
+          <w:sz w:val="28"/>
+        </w:rPr>
         <w:t>Ghi chú tổng hợp cho senior-developer</w:t>
       </w:r>
     </w:p>

</xml_diff>

<commit_message>
[bugfix-ccu-findings] Tech Lead review fix F01-F06
- APPROVE-WITH-COMMENT toàn bộ — cho phép chuyển QA verify (Bước 4 WF-BUGFIX)
- F01/F02/F06: APPROVE-WITH-COMMENT (root cause đúng, backward compat protocol
  + config cũ đã kiểm chứng 2 chiều; kèm Nit: volatile W/H, IRemoteControlClient.ServerName,
  CTS dispose, IFS ';' trong setup-zcu-agent.sh — giao Senior vòng sau, không chặn)
- F03/F04/F05 + docs sync: APPROVE; tự build lại CcuUI/ZcuAgent Release xác nhận 0 error
- Tech Lead tự sửa 1 dòng hiển nhiên: MANUAL 9.1 thêm lưu ý VPN/CGNAT ngoài RFC 1918
  phải tự thêm dải vào AllowedClientIPs (tránh mất kết nối sau cài với default mới)
- ⚠️ BUG report PDF xuất thất bại (Word COM RPC lỗi tạm thời, retry 3 lần) — DOCX OK,
  MANUAL PDF OK; theo §19 không block

Refs: docs/bugs/BUG-ccu-ui-findings-2026-07-26.md
Co-Authored-By: Claude Opus 5 (1M context) <noreply@anthropic.com>
</commit_message>
<xml_diff>
--- a/docs/bugs/BUG-ccu-ui-findings-2026-07-26.docx
+++ b/docs/bugs/BUG-ccu-ui-findings-2026-07-26.docx
@@ -5657,6 +5657,1939 @@
         <w:t xml:space="preserve"> song song P01 thành công/P02 lỗi đúng như thiết kế; CronJob (đã chụp trước) thêm/xóa job bình thường.</w:t>
       </w:r>
     </w:p>
+    <w:p>
+      <w:pPr>
+        <w:pBdr>
+          <w:bottom w:val="single" w:sz="6" w:space="1" w:color="F05922"/>
+        </w:pBdr>
+        <w:spacing w:after="120"/>
+      </w:pPr>
+    </w:p>
+    <w:p>
+      <w:pPr>
+        <w:pStyle w:val="Heading2"/>
+        <w:spacing w:before="200" w:after="80"/>
+      </w:pPr>
+      <w:r>
+        <w:rPr>
+          <w:color w:val="F05922"/>
+          <w:sz w:val="28"/>
+        </w:rPr>
+        <w:t>Review của Tech Lead — 2026-07-26 22:17</w:t>
+      </w:r>
+    </w:p>
+    <w:p>
+      <w:pPr>
+        <w:spacing w:after="80"/>
+      </w:pPr>
+      <w:r>
+        <w:rPr>
+          <w:b/>
+          <w:sz w:val="21"/>
+        </w:rPr>
+        <w:t>Phạm vi:</w:t>
+      </w:r>
+      <w:r>
+        <w:rPr>
+          <w:sz w:val="21"/>
+        </w:rPr>
+        <w:t xml:space="preserve"> commit </w:t>
+      </w:r>
+      <w:r>
+        <w:rPr>
+          <w:rFonts w:ascii="Courier New" w:hAnsi="Courier New"/>
+          <w:color w:val="F05922"/>
+          <w:sz w:val="18"/>
+        </w:rPr>
+        <w:t>b5b8033</w:t>
+      </w:r>
+      <w:r>
+        <w:rPr>
+          <w:sz w:val="21"/>
+        </w:rPr>
+        <w:t xml:space="preserve"> (fix F01–F06 phần agent) + </w:t>
+      </w:r>
+      <w:r>
+        <w:rPr>
+          <w:rFonts w:ascii="Courier New" w:hAnsi="Courier New"/>
+          <w:color w:val="F05922"/>
+          <w:sz w:val="18"/>
+        </w:rPr>
+        <w:t>6e5084d</w:t>
+      </w:r>
+      <w:r>
+        <w:rPr>
+          <w:sz w:val="21"/>
+        </w:rPr>
+        <w:t xml:space="preserve"> (GOTCHAS G018). Đã đọc TOÀN BỘ diff, đối chiếu code liên quan ngoài diff (</w:t>
+      </w:r>
+      <w:r>
+        <w:rPr>
+          <w:rFonts w:ascii="Courier New" w:hAnsi="Courier New"/>
+          <w:color w:val="F05922"/>
+          <w:sz w:val="18"/>
+        </w:rPr>
+        <w:t>AuthManager.IsInRange</w:t>
+      </w:r>
+      <w:r>
+        <w:rPr>
+          <w:sz w:val="21"/>
+        </w:rPr>
+        <w:t xml:space="preserve">, </w:t>
+      </w:r>
+      <w:r>
+        <w:rPr>
+          <w:rFonts w:ascii="Courier New" w:hAnsi="Courier New"/>
+          <w:color w:val="F05922"/>
+          <w:sz w:val="18"/>
+        </w:rPr>
+        <w:t>SessionRecorder</w:t>
+      </w:r>
+      <w:r>
+        <w:rPr>
+          <w:sz w:val="21"/>
+        </w:rPr>
+        <w:t xml:space="preserve"> flow trong </w:t>
+      </w:r>
+      <w:r>
+        <w:rPr>
+          <w:rFonts w:ascii="Courier New" w:hAnsi="Courier New"/>
+          <w:color w:val="F05922"/>
+          <w:sz w:val="18"/>
+        </w:rPr>
+        <w:t>RemoteScreenWindow.OnFrameReceived</w:t>
+      </w:r>
+      <w:r>
+        <w:rPr>
+          <w:sz w:val="21"/>
+        </w:rPr>
+        <w:t>/</w:t>
+      </w:r>
+      <w:r>
+        <w:rPr>
+          <w:rFonts w:ascii="Courier New" w:hAnsi="Courier New"/>
+          <w:color w:val="F05922"/>
+          <w:sz w:val="18"/>
+        </w:rPr>
+        <w:t>OnRecordClick</w:t>
+      </w:r>
+      <w:r>
+        <w:rPr>
+          <w:sz w:val="21"/>
+        </w:rPr>
+        <w:t xml:space="preserve">, </w:t>
+      </w:r>
+      <w:r>
+        <w:rPr>
+          <w:rFonts w:ascii="Courier New" w:hAnsi="Courier New"/>
+          <w:color w:val="F05922"/>
+          <w:sz w:val="18"/>
+        </w:rPr>
+        <w:t>MessageCodec.DecodeHelloAck/DecodeFrameJpeg</w:t>
+      </w:r>
+      <w:r>
+        <w:rPr>
+          <w:sz w:val="21"/>
+        </w:rPr>
+        <w:t xml:space="preserve">, </w:t>
+      </w:r>
+      <w:r>
+        <w:rPr>
+          <w:rFonts w:ascii="Courier New" w:hAnsi="Courier New"/>
+          <w:color w:val="F05922"/>
+          <w:sz w:val="18"/>
+        </w:rPr>
+        <w:t>IRemoteControlClient</w:t>
+      </w:r>
+      <w:r>
+        <w:rPr>
+          <w:sz w:val="21"/>
+        </w:rPr>
+        <w:t xml:space="preserve">), và </w:t>
+      </w:r>
+      <w:r>
+        <w:rPr>
+          <w:b/>
+          <w:sz w:val="21"/>
+        </w:rPr>
+        <w:t>tự build lại</w:t>
+      </w:r>
+      <w:r>
+        <w:rPr>
+          <w:sz w:val="21"/>
+        </w:rPr>
+        <w:t xml:space="preserve"> để kiểm chứng (không tin báo cáo suông): CcuUI Release </w:t>
+      </w:r>
+      <w:r>
+        <w:rPr>
+          <w:b/>
+          <w:sz w:val="21"/>
+        </w:rPr>
+        <w:t>0 Error</w:t>
+      </w:r>
+      <w:r>
+        <w:rPr>
+          <w:sz w:val="21"/>
+        </w:rPr>
+        <w:t xml:space="preserve"> (456 warnings = baseline full-rebuild), ZcuAgent Release </w:t>
+      </w:r>
+      <w:r>
+        <w:rPr>
+          <w:b/>
+          <w:sz w:val="21"/>
+        </w:rPr>
+        <w:t>0 Warning 0 Error</w:t>
+      </w:r>
+      <w:r>
+        <w:rPr>
+          <w:sz w:val="21"/>
+        </w:rPr>
+        <w:t xml:space="preserve"> — khớp báo cáo Senior Developer.</w:t>
+      </w:r>
+    </w:p>
+    <w:p>
+      <w:pPr>
+        <w:pStyle w:val="Heading3"/>
+        <w:spacing w:before="160" w:after="60"/>
+      </w:pPr>
+      <w:r>
+        <w:rPr>
+          <w:color w:val="4A3F8C"/>
+          <w:sz w:val="24"/>
+        </w:rPr>
+        <w:t>Bảng verdict từng finding</w:t>
+      </w:r>
+    </w:p>
+    <w:tbl>
+      <w:tblPr>
+        <w:tblStyle w:val="TableGrid"/>
+        <w:tblW w:type="auto" w:w="0"/>
+        <w:tblLook w:firstColumn="1" w:firstRow="1" w:lastColumn="0" w:lastRow="0" w:noHBand="0" w:noVBand="1" w:val="04A0"/>
+      </w:tblPr>
+      <w:tblGrid>
+        <w:gridCol w:w="3230"/>
+        <w:gridCol w:w="3230"/>
+        <w:gridCol w:w="3230"/>
+      </w:tblGrid>
+      <w:tr>
+        <w:tc>
+          <w:tcPr>
+            <w:tcW w:type="dxa" w:w="3230"/>
+            <w:shd w:val="clear" w:color="auto" w:fill="251C53"/>
+            <w:tcBorders>
+              <w:top w:val="single" w:sz="4" w:space="0" w:color="251C53"/>
+              <w:left w:val="single" w:sz="4" w:space="0" w:color="251C53"/>
+              <w:bottom w:val="single" w:sz="4" w:space="0" w:color="251C53"/>
+              <w:right w:val="single" w:sz="4" w:space="0" w:color="251C53"/>
+            </w:tcBorders>
+          </w:tcPr>
+          <w:p>
+            <w:r>
+              <w:rPr>
+                <w:b/>
+                <w:color w:val="FFFFFF"/>
+                <w:sz w:val="20"/>
+              </w:rPr>
+              <w:t>Finding</w:t>
+            </w:r>
+          </w:p>
+        </w:tc>
+        <w:tc>
+          <w:tcPr>
+            <w:tcW w:type="dxa" w:w="3230"/>
+            <w:shd w:val="clear" w:color="auto" w:fill="251C53"/>
+            <w:tcBorders>
+              <w:top w:val="single" w:sz="4" w:space="0" w:color="251C53"/>
+              <w:left w:val="single" w:sz="4" w:space="0" w:color="251C53"/>
+              <w:bottom w:val="single" w:sz="4" w:space="0" w:color="251C53"/>
+              <w:right w:val="single" w:sz="4" w:space="0" w:color="251C53"/>
+            </w:tcBorders>
+          </w:tcPr>
+          <w:p>
+            <w:r>
+              <w:rPr>
+                <w:b/>
+                <w:color w:val="FFFFFF"/>
+                <w:sz w:val="20"/>
+              </w:rPr>
+              <w:t>Verdict</w:t>
+            </w:r>
+          </w:p>
+        </w:tc>
+        <w:tc>
+          <w:tcPr>
+            <w:tcW w:type="dxa" w:w="3230"/>
+            <w:shd w:val="clear" w:color="auto" w:fill="251C53"/>
+            <w:tcBorders>
+              <w:top w:val="single" w:sz="4" w:space="0" w:color="251C53"/>
+              <w:left w:val="single" w:sz="4" w:space="0" w:color="251C53"/>
+              <w:bottom w:val="single" w:sz="4" w:space="0" w:color="251C53"/>
+              <w:right w:val="single" w:sz="4" w:space="0" w:color="251C53"/>
+            </w:tcBorders>
+          </w:tcPr>
+          <w:p>
+            <w:r>
+              <w:rPr>
+                <w:b/>
+                <w:color w:val="FFFFFF"/>
+                <w:sz w:val="20"/>
+              </w:rPr>
+              <w:t>Lý do / bằng chứng</w:t>
+            </w:r>
+          </w:p>
+        </w:tc>
+      </w:tr>
+      <w:tr>
+        <w:tc>
+          <w:tcPr>
+            <w:tcW w:type="dxa" w:w="3230"/>
+            <w:tcBorders>
+              <w:top w:val="single" w:sz="4" w:space="0" w:color="CBCBCB"/>
+              <w:left w:val="single" w:sz="4" w:space="0" w:color="CBCBCB"/>
+              <w:bottom w:val="single" w:sz="4" w:space="0" w:color="CBCBCB"/>
+              <w:right w:val="single" w:sz="4" w:space="0" w:color="CBCBCB"/>
+            </w:tcBorders>
+          </w:tcPr>
+          <w:p>
+            <w:r>
+              <w:rPr>
+                <w:sz w:val="20"/>
+              </w:rPr>
+              <w:t>---</w:t>
+            </w:r>
+          </w:p>
+        </w:tc>
+        <w:tc>
+          <w:tcPr>
+            <w:tcW w:type="dxa" w:w="3230"/>
+            <w:tcBorders>
+              <w:top w:val="single" w:sz="4" w:space="0" w:color="CBCBCB"/>
+              <w:left w:val="single" w:sz="4" w:space="0" w:color="CBCBCB"/>
+              <w:bottom w:val="single" w:sz="4" w:space="0" w:color="CBCBCB"/>
+              <w:right w:val="single" w:sz="4" w:space="0" w:color="CBCBCB"/>
+            </w:tcBorders>
+          </w:tcPr>
+          <w:p>
+            <w:r>
+              <w:rPr>
+                <w:sz w:val="20"/>
+              </w:rPr>
+              <w:t>---</w:t>
+            </w:r>
+          </w:p>
+        </w:tc>
+        <w:tc>
+          <w:tcPr>
+            <w:tcW w:type="dxa" w:w="3230"/>
+            <w:tcBorders>
+              <w:top w:val="single" w:sz="4" w:space="0" w:color="CBCBCB"/>
+              <w:left w:val="single" w:sz="4" w:space="0" w:color="CBCBCB"/>
+              <w:bottom w:val="single" w:sz="4" w:space="0" w:color="CBCBCB"/>
+              <w:right w:val="single" w:sz="4" w:space="0" w:color="CBCBCB"/>
+            </w:tcBorders>
+          </w:tcPr>
+          <w:p>
+            <w:r>
+              <w:rPr>
+                <w:sz w:val="20"/>
+              </w:rPr>
+              <w:t>---</w:t>
+            </w:r>
+          </w:p>
+        </w:tc>
+      </w:tr>
+      <w:tr>
+        <w:tc>
+          <w:tcPr>
+            <w:tcW w:type="dxa" w:w="3230"/>
+            <w:shd w:val="clear" w:color="auto" w:fill="B8B3D6"/>
+            <w:tcBorders>
+              <w:top w:val="single" w:sz="4" w:space="0" w:color="CBCBCB"/>
+              <w:left w:val="single" w:sz="4" w:space="0" w:color="CBCBCB"/>
+              <w:bottom w:val="single" w:sz="4" w:space="0" w:color="CBCBCB"/>
+              <w:right w:val="single" w:sz="4" w:space="0" w:color="CBCBCB"/>
+            </w:tcBorders>
+          </w:tcPr>
+          <w:p>
+            <w:r>
+              <w:rPr>
+                <w:b/>
+                <w:sz w:val="20"/>
+              </w:rPr>
+              <w:t>F01</w:t>
+            </w:r>
+            <w:r>
+              <w:rPr>
+                <w:sz w:val="20"/>
+              </w:rPr>
+              <w:t xml:space="preserve"> — resolution theo frame</w:t>
+            </w:r>
+          </w:p>
+        </w:tc>
+        <w:tc>
+          <w:tcPr>
+            <w:tcW w:type="dxa" w:w="3230"/>
+            <w:shd w:val="clear" w:color="auto" w:fill="B8B3D6"/>
+            <w:tcBorders>
+              <w:top w:val="single" w:sz="4" w:space="0" w:color="CBCBCB"/>
+              <w:left w:val="single" w:sz="4" w:space="0" w:color="CBCBCB"/>
+              <w:bottom w:val="single" w:sz="4" w:space="0" w:color="CBCBCB"/>
+              <w:right w:val="single" w:sz="4" w:space="0" w:color="CBCBCB"/>
+            </w:tcBorders>
+          </w:tcPr>
+          <w:p>
+            <w:r>
+              <w:rPr>
+                <w:b/>
+                <w:sz w:val="20"/>
+              </w:rPr>
+              <w:t>APPROVE-WITH-COMMENT</w:t>
+            </w:r>
+          </w:p>
+        </w:tc>
+        <w:tc>
+          <w:tcPr>
+            <w:tcW w:type="dxa" w:w="3230"/>
+            <w:shd w:val="clear" w:color="auto" w:fill="B8B3D6"/>
+            <w:tcBorders>
+              <w:top w:val="single" w:sz="4" w:space="0" w:color="CBCBCB"/>
+              <w:left w:val="single" w:sz="4" w:space="0" w:color="CBCBCB"/>
+              <w:bottom w:val="single" w:sz="4" w:space="0" w:color="CBCBCB"/>
+              <w:right w:val="single" w:sz="4" w:space="0" w:color="CBCBCB"/>
+            </w:tcBorders>
+          </w:tcPr>
+          <w:p>
+            <w:r>
+              <w:rPr>
+                <w:sz w:val="20"/>
+              </w:rPr>
+              <w:t xml:space="preserve">Đúng root cause: </w:t>
+            </w:r>
+            <w:r>
+              <w:rPr>
+                <w:rFonts w:ascii="Courier New" w:hAnsi="Courier New"/>
+                <w:color w:val="F05922"/>
+                <w:sz w:val="20"/>
+              </w:rPr>
+              <w:t>OnRecordClick</w:t>
+            </w:r>
+            <w:r>
+              <w:rPr>
+                <w:sz w:val="20"/>
+              </w:rPr>
+              <w:t xml:space="preserve"> (</w:t>
+            </w:r>
+            <w:r>
+              <w:rPr>
+                <w:rFonts w:ascii="Courier New" w:hAnsi="Courier New"/>
+                <w:color w:val="F05922"/>
+                <w:sz w:val="20"/>
+              </w:rPr>
+              <w:t>RemoteScreenWindow.axaml.cs:263</w:t>
+            </w:r>
+            <w:r>
+              <w:rPr>
+                <w:sz w:val="20"/>
+              </w:rPr>
+              <w:t xml:space="preserve">) đọc </w:t>
+            </w:r>
+            <w:r>
+              <w:rPr>
+                <w:rFonts w:ascii="Courier New" w:hAnsi="Courier New"/>
+                <w:color w:val="F05922"/>
+                <w:sz w:val="20"/>
+              </w:rPr>
+              <w:t>Client.ScreenWidth/Height</w:t>
+            </w:r>
+            <w:r>
+              <w:rPr>
+                <w:sz w:val="20"/>
+              </w:rPr>
+              <w:t xml:space="preserve"> vốn chỉ set 1 lần lúc HELLO_ACK; nay </w:t>
+            </w:r>
+            <w:r>
+              <w:rPr>
+                <w:rFonts w:ascii="Courier New" w:hAnsi="Courier New"/>
+                <w:color w:val="F05922"/>
+                <w:sz w:val="20"/>
+              </w:rPr>
+              <w:t>HandleFrameJpeg</w:t>
+            </w:r>
+            <w:r>
+              <w:rPr>
+                <w:sz w:val="20"/>
+              </w:rPr>
+              <w:t xml:space="preserve"> (</w:t>
+            </w:r>
+            <w:r>
+              <w:rPr>
+                <w:rFonts w:ascii="Courier New" w:hAnsi="Courier New"/>
+                <w:color w:val="F05922"/>
+                <w:sz w:val="20"/>
+              </w:rPr>
+              <w:t>RemoteControlClient.cs:381-386</w:t>
+            </w:r>
+            <w:r>
+              <w:rPr>
+                <w:sz w:val="20"/>
+              </w:rPr>
+              <w:t xml:space="preserve">) cập nhật theo từng frame có guard </w:t>
+            </w:r>
+            <w:r>
+              <w:rPr>
+                <w:rFonts w:ascii="Courier New" w:hAnsi="Courier New"/>
+                <w:color w:val="F05922"/>
+                <w:sz w:val="20"/>
+              </w:rPr>
+              <w:t>&gt; 0</w:t>
+            </w:r>
+            <w:r>
+              <w:rPr>
+                <w:sz w:val="20"/>
+              </w:rPr>
+              <w:t xml:space="preserve"> (chặn frame lỗi decode). Case "đổi độ phân giải GIỮA lúc đang record" vẫn được guard cũ tại </w:t>
+            </w:r>
+            <w:r>
+              <w:rPr>
+                <w:rFonts w:ascii="Courier New" w:hAnsi="Courier New"/>
+                <w:color w:val="F05922"/>
+                <w:sz w:val="20"/>
+              </w:rPr>
+              <w:t>RemoteScreenWindow.axaml.cs:111-126</w:t>
+            </w:r>
+            <w:r>
+              <w:rPr>
+                <w:sz w:val="20"/>
+              </w:rPr>
+              <w:t xml:space="preserve"> xử lý đúng (dừng ghi, báo user — AVI header cố định, không thể ghi tiếp). </w:t>
+            </w:r>
+            <w:r>
+              <w:rPr>
+                <w:b/>
+                <w:sz w:val="20"/>
+              </w:rPr>
+              <w:t>Nit:</w:t>
+            </w:r>
+            <w:r>
+              <w:rPr>
+                <w:sz w:val="20"/>
+              </w:rPr>
+              <w:t xml:space="preserve"> </w:t>
+            </w:r>
+            <w:r>
+              <w:rPr>
+                <w:rFonts w:ascii="Courier New" w:hAnsi="Courier New"/>
+                <w:color w:val="F05922"/>
+                <w:sz w:val="20"/>
+              </w:rPr>
+              <w:t>_screenWidth/_screenHeight</w:t>
+            </w:r>
+            <w:r>
+              <w:rPr>
+                <w:sz w:val="20"/>
+              </w:rPr>
+              <w:t xml:space="preserve"> không </w:t>
+            </w:r>
+            <w:r>
+              <w:rPr>
+                <w:rFonts w:ascii="Courier New" w:hAnsi="Courier New"/>
+                <w:color w:val="F05922"/>
+                <w:sz w:val="20"/>
+              </w:rPr>
+              <w:t>volatile</w:t>
+            </w:r>
+            <w:r>
+              <w:rPr>
+                <w:sz w:val="20"/>
+              </w:rPr>
+              <w:t xml:space="preserve"> và cặp W/H có thể tearing lý thuyết giữa receive-thread (ghi) và UI thread (đọc lúc tạo recorder) — hậu quả tối đa là recorder bị guard dừng ngay ở frame kế (hành vi an toàn), chấp nhận được; ghi chú để cân nhắc gom W×H vào 1 struct/long atomic khi refactor.</w:t>
+            </w:r>
+          </w:p>
+        </w:tc>
+      </w:tr>
+      <w:tr>
+        <w:tc>
+          <w:tcPr>
+            <w:tcW w:type="dxa" w:w="3230"/>
+            <w:tcBorders>
+              <w:top w:val="single" w:sz="4" w:space="0" w:color="CBCBCB"/>
+              <w:left w:val="single" w:sz="4" w:space="0" w:color="CBCBCB"/>
+              <w:bottom w:val="single" w:sz="4" w:space="0" w:color="CBCBCB"/>
+              <w:right w:val="single" w:sz="4" w:space="0" w:color="CBCBCB"/>
+            </w:tcBorders>
+          </w:tcPr>
+          <w:p>
+            <w:r>
+              <w:rPr>
+                <w:b/>
+                <w:sz w:val="20"/>
+              </w:rPr>
+              <w:t>F02</w:t>
+            </w:r>
+            <w:r>
+              <w:rPr>
+                <w:sz w:val="20"/>
+              </w:rPr>
+              <w:t xml:space="preserve"> — version 1.1 + timeout SysInfo</w:t>
+            </w:r>
+          </w:p>
+        </w:tc>
+        <w:tc>
+          <w:tcPr>
+            <w:tcW w:type="dxa" w:w="3230"/>
+            <w:tcBorders>
+              <w:top w:val="single" w:sz="4" w:space="0" w:color="CBCBCB"/>
+              <w:left w:val="single" w:sz="4" w:space="0" w:color="CBCBCB"/>
+              <w:bottom w:val="single" w:sz="4" w:space="0" w:color="CBCBCB"/>
+              <w:right w:val="single" w:sz="4" w:space="0" w:color="CBCBCB"/>
+            </w:tcBorders>
+          </w:tcPr>
+          <w:p>
+            <w:r>
+              <w:rPr>
+                <w:b/>
+                <w:sz w:val="20"/>
+              </w:rPr>
+              <w:t>APPROVE-WITH-COMMENT</w:t>
+            </w:r>
+          </w:p>
+        </w:tc>
+        <w:tc>
+          <w:tcPr>
+            <w:tcW w:type="dxa" w:w="3230"/>
+            <w:tcBorders>
+              <w:top w:val="single" w:sz="4" w:space="0" w:color="CBCBCB"/>
+              <w:left w:val="single" w:sz="4" w:space="0" w:color="CBCBCB"/>
+              <w:bottom w:val="single" w:sz="4" w:space="0" w:color="CBCBCB"/>
+              <w:right w:val="single" w:sz="4" w:space="0" w:color="CBCBCB"/>
+            </w:tcBorders>
+          </w:tcPr>
+          <w:p>
+            <w:r>
+              <w:rPr>
+                <w:b/>
+                <w:sz w:val="20"/>
+              </w:rPr>
+              <w:t>Backward compat 2 chiều đã kiểm chứng:</w:t>
+            </w:r>
+            <w:r>
+              <w:rPr>
+                <w:sz w:val="20"/>
+              </w:rPr>
+              <w:t xml:space="preserve"> (1) client CŨ + agent MỚI — client cũ chỉ log </w:t>
+            </w:r>
+            <w:r>
+              <w:rPr>
+                <w:rFonts w:ascii="Courier New" w:hAnsi="Courier New"/>
+                <w:color w:val="F05922"/>
+                <w:sz w:val="20"/>
+              </w:rPr>
+              <w:t>serverName</w:t>
+            </w:r>
+            <w:r>
+              <w:rPr>
+                <w:sz w:val="20"/>
+              </w:rPr>
+              <w:t xml:space="preserve"> (</w:t>
+            </w:r>
+            <w:r>
+              <w:rPr>
+                <w:rFonts w:ascii="Courier New" w:hAnsi="Courier New"/>
+                <w:color w:val="F05922"/>
+                <w:sz w:val="20"/>
+              </w:rPr>
+              <w:t>RemoteControlClient.cs:261</w:t>
+            </w:r>
+            <w:r>
+              <w:rPr>
+                <w:sz w:val="20"/>
+              </w:rPr>
+              <w:t xml:space="preserve">), chuỗi "ZcuAgent/1.1" không được parse ở client cũ → không crash; (2) client MỚI + agent CŨ — </w:t>
+            </w:r>
+            <w:r>
+              <w:rPr>
+                <w:rFonts w:ascii="Courier New" w:hAnsi="Courier New"/>
+                <w:color w:val="F05922"/>
+                <w:sz w:val="20"/>
+              </w:rPr>
+              <w:t>IsAgentOutdated</w:t>
+            </w:r>
+            <w:r>
+              <w:rPr>
+                <w:sz w:val="20"/>
+              </w:rPr>
+              <w:t xml:space="preserve"> (</w:t>
+            </w:r>
+            <w:r>
+              <w:rPr>
+                <w:rFonts w:ascii="Courier New" w:hAnsi="Courier New"/>
+                <w:color w:val="F05922"/>
+                <w:sz w:val="20"/>
+              </w:rPr>
+              <w:t>RemoteScreenWindow.axaml.cs:163-168</w:t>
+            </w:r>
+            <w:r>
+              <w:rPr>
+                <w:sz w:val="20"/>
+              </w:rPr>
+              <w:t xml:space="preserve">) parse phòng thủ bằng </w:t>
+            </w:r>
+            <w:r>
+              <w:rPr>
+                <w:rFonts w:ascii="Courier New" w:hAnsi="Courier New"/>
+                <w:color w:val="F05922"/>
+                <w:sz w:val="20"/>
+              </w:rPr>
+              <w:t>Version.TryParse</w:t>
+            </w:r>
+            <w:r>
+              <w:rPr>
+                <w:sz w:val="20"/>
+              </w:rPr>
+              <w:t xml:space="preserve">, chuỗi lạ/không đúng định dạng → coi là outdated và CHỈ cảnh báo (1 lần nhờ </w:t>
+            </w:r>
+            <w:r>
+              <w:rPr>
+                <w:rFonts w:ascii="Courier New" w:hAnsi="Courier New"/>
+                <w:color w:val="F05922"/>
+                <w:sz w:val="20"/>
+              </w:rPr>
+              <w:t>_agentVersionWarned</w:t>
+            </w:r>
+            <w:r>
+              <w:rPr>
+                <w:sz w:val="20"/>
+              </w:rPr>
+              <w:t xml:space="preserve">), không crash. Threading đúng: </w:t>
+            </w:r>
+            <w:r>
+              <w:rPr>
+                <w:rFonts w:ascii="Courier New" w:hAnsi="Courier New"/>
+                <w:color w:val="F05922"/>
+                <w:sz w:val="20"/>
+              </w:rPr>
+              <w:t>OnClientStateChanged</w:t>
+            </w:r>
+            <w:r>
+              <w:rPr>
+                <w:sz w:val="20"/>
+              </w:rPr>
+              <w:t xml:space="preserve"> chạy trên connect/receive-thread nhưng dialog qua </w:t>
+            </w:r>
+            <w:r>
+              <w:rPr>
+                <w:rFonts w:ascii="Courier New" w:hAnsi="Courier New"/>
+                <w:color w:val="F05922"/>
+                <w:sz w:val="20"/>
+              </w:rPr>
+              <w:t>Dispatcher.UIThread.Post</w:t>
+            </w:r>
+            <w:r>
+              <w:rPr>
+                <w:sz w:val="20"/>
+              </w:rPr>
+              <w:t xml:space="preserve"> (dòng 153); </w:t>
+            </w:r>
+            <w:r>
+              <w:rPr>
+                <w:rFonts w:ascii="Courier New" w:hAnsi="Courier New"/>
+                <w:color w:val="F05922"/>
+                <w:sz w:val="20"/>
+              </w:rPr>
+              <w:t>OnSysInfoClick</w:t>
+            </w:r>
+            <w:r>
+              <w:rPr>
+                <w:sz w:val="20"/>
+              </w:rPr>
+              <w:t xml:space="preserve"> là async void event handler → continuation sau </w:t>
+            </w:r>
+            <w:r>
+              <w:rPr>
+                <w:rFonts w:ascii="Courier New" w:hAnsi="Courier New"/>
+                <w:color w:val="F05922"/>
+                <w:sz w:val="20"/>
+              </w:rPr>
+              <w:t>Task.Delay</w:t>
+            </w:r>
+            <w:r>
+              <w:rPr>
+                <w:sz w:val="20"/>
+              </w:rPr>
+              <w:t xml:space="preserve"> quay về UI thread (Avalonia sync context) → </w:t>
+            </w:r>
+            <w:r>
+              <w:rPr>
+                <w:rFonts w:ascii="Courier New" w:hAnsi="Courier New"/>
+                <w:color w:val="F05922"/>
+                <w:sz w:val="20"/>
+              </w:rPr>
+              <w:t>ShowInfoDialog</w:t>
+            </w:r>
+            <w:r>
+              <w:rPr>
+                <w:sz w:val="20"/>
+              </w:rPr>
+              <w:t xml:space="preserve"> an toàn; đóng cửa sổ hủy CTS trong </w:t>
+            </w:r>
+            <w:r>
+              <w:rPr>
+                <w:rFonts w:ascii="Courier New" w:hAnsi="Courier New"/>
+                <w:color w:val="F05922"/>
+                <w:sz w:val="20"/>
+              </w:rPr>
+              <w:t>OnClosing</w:t>
+            </w:r>
+            <w:r>
+              <w:rPr>
+                <w:sz w:val="20"/>
+              </w:rPr>
+              <w:t xml:space="preserve"> → không dialog mồ côi. Timeout 10s: chấp nhận được — SysInfoResp là payload nhỏ, và dialog chỉ mang tính hướng dẫn ("thử lại sau"), false-positive trên mạng chậm không gây hại chức năng. </w:t>
+            </w:r>
+            <w:r>
+              <w:rPr>
+                <w:b/>
+                <w:sz w:val="20"/>
+              </w:rPr>
+              <w:t>Nit 1:</w:t>
+            </w:r>
+            <w:r>
+              <w:rPr>
+                <w:sz w:val="20"/>
+              </w:rPr>
+              <w:t xml:space="preserve"> </w:t>
+            </w:r>
+            <w:r>
+              <w:rPr>
+                <w:rFonts w:ascii="Courier New" w:hAnsi="Courier New"/>
+                <w:color w:val="F05922"/>
+                <w:sz w:val="20"/>
+              </w:rPr>
+              <w:t>ServerName</w:t>
+            </w:r>
+            <w:r>
+              <w:rPr>
+                <w:sz w:val="20"/>
+              </w:rPr>
+              <w:t xml:space="preserve"> chưa thêm vào </w:t>
+            </w:r>
+            <w:r>
+              <w:rPr>
+                <w:rFonts w:ascii="Courier New" w:hAnsi="Courier New"/>
+                <w:color w:val="F05922"/>
+                <w:sz w:val="20"/>
+              </w:rPr>
+              <w:t>IRemoteControlClient</w:t>
+            </w:r>
+            <w:r>
+              <w:rPr>
+                <w:sz w:val="20"/>
+              </w:rPr>
+              <w:t xml:space="preserve"> (build pass vì </w:t>
+            </w:r>
+            <w:r>
+              <w:rPr>
+                <w:rFonts w:ascii="Courier New" w:hAnsi="Courier New"/>
+                <w:color w:val="F05922"/>
+                <w:sz w:val="20"/>
+              </w:rPr>
+              <w:t>RemoteScreenViewModel.Client</w:t>
+            </w:r>
+            <w:r>
+              <w:rPr>
+                <w:sz w:val="20"/>
+              </w:rPr>
+              <w:t xml:space="preserve"> expose concrete class — </w:t>
+            </w:r>
+            <w:r>
+              <w:rPr>
+                <w:rFonts w:ascii="Courier New" w:hAnsi="Courier New"/>
+                <w:color w:val="F05922"/>
+                <w:sz w:val="20"/>
+              </w:rPr>
+              <w:t>RemoteScreenViewModel.cs:21</w:t>
+            </w:r>
+            <w:r>
+              <w:rPr>
+                <w:sz w:val="20"/>
+              </w:rPr>
+              <w:t xml:space="preserve">) — thêm vào interface cho nhất quán với </w:t>
+            </w:r>
+            <w:r>
+              <w:rPr>
+                <w:rFonts w:ascii="Courier New" w:hAnsi="Courier New"/>
+                <w:color w:val="F05922"/>
+                <w:sz w:val="20"/>
+              </w:rPr>
+              <w:t>ScreenWidth/Height</w:t>
+            </w:r>
+            <w:r>
+              <w:rPr>
+                <w:sz w:val="20"/>
+              </w:rPr>
+              <w:t xml:space="preserve">. </w:t>
+            </w:r>
+            <w:r>
+              <w:rPr>
+                <w:b/>
+                <w:sz w:val="20"/>
+              </w:rPr>
+              <w:t>Nit 2:</w:t>
+            </w:r>
+            <w:r>
+              <w:rPr>
+                <w:sz w:val="20"/>
+              </w:rPr>
+              <w:t xml:space="preserve"> </w:t>
+            </w:r>
+            <w:r>
+              <w:rPr>
+                <w:rFonts w:ascii="Courier New" w:hAnsi="Courier New"/>
+                <w:color w:val="F05922"/>
+                <w:sz w:val="20"/>
+              </w:rPr>
+              <w:t>CancellationTokenSource</w:t>
+            </w:r>
+            <w:r>
+              <w:rPr>
+                <w:sz w:val="20"/>
+              </w:rPr>
+              <w:t xml:space="preserve"> không được </w:t>
+            </w:r>
+            <w:r>
+              <w:rPr>
+                <w:rFonts w:ascii="Courier New" w:hAnsi="Courier New"/>
+                <w:color w:val="F05922"/>
+                <w:sz w:val="20"/>
+              </w:rPr>
+              <w:t>Dispose</w:t>
+            </w:r>
+            <w:r>
+              <w:rPr>
+                <w:sz w:val="20"/>
+              </w:rPr>
+              <w:t xml:space="preserve"> sau dùng — leak nhỏ, dọn khi tiện. </w:t>
+            </w:r>
+            <w:r>
+              <w:rPr>
+                <w:b/>
+                <w:sz w:val="20"/>
+              </w:rPr>
+              <w:t>FYI:</w:t>
+            </w:r>
+            <w:r>
+              <w:rPr>
+                <w:sz w:val="20"/>
+              </w:rPr>
+              <w:t xml:space="preserve"> SysInfoResp trễ của request TRƯỚC có thể cancel nhầm timer của request SAU — hậu quả chỉ là mất 1 cảnh báo trong khi dữ liệu thật đã về, chấp nhận.</w:t>
+            </w:r>
+          </w:p>
+        </w:tc>
+      </w:tr>
+      <w:tr>
+        <w:tc>
+          <w:tcPr>
+            <w:tcW w:type="dxa" w:w="3230"/>
+            <w:shd w:val="clear" w:color="auto" w:fill="B8B3D6"/>
+            <w:tcBorders>
+              <w:top w:val="single" w:sz="4" w:space="0" w:color="CBCBCB"/>
+              <w:left w:val="single" w:sz="4" w:space="0" w:color="CBCBCB"/>
+              <w:bottom w:val="single" w:sz="4" w:space="0" w:color="CBCBCB"/>
+              <w:right w:val="single" w:sz="4" w:space="0" w:color="CBCBCB"/>
+            </w:tcBorders>
+          </w:tcPr>
+          <w:p>
+            <w:r>
+              <w:rPr>
+                <w:b/>
+                <w:sz w:val="20"/>
+              </w:rPr>
+              <w:t>F03</w:t>
+            </w:r>
+            <w:r>
+              <w:rPr>
+                <w:sz w:val="20"/>
+              </w:rPr>
+              <w:t xml:space="preserve"> — snippet dropdown</w:t>
+            </w:r>
+          </w:p>
+        </w:tc>
+        <w:tc>
+          <w:tcPr>
+            <w:tcW w:type="dxa" w:w="3230"/>
+            <w:shd w:val="clear" w:color="auto" w:fill="B8B3D6"/>
+            <w:tcBorders>
+              <w:top w:val="single" w:sz="4" w:space="0" w:color="CBCBCB"/>
+              <w:left w:val="single" w:sz="4" w:space="0" w:color="CBCBCB"/>
+              <w:bottom w:val="single" w:sz="4" w:space="0" w:color="CBCBCB"/>
+              <w:right w:val="single" w:sz="4" w:space="0" w:color="CBCBCB"/>
+            </w:tcBorders>
+          </w:tcPr>
+          <w:p>
+            <w:r>
+              <w:rPr>
+                <w:b/>
+                <w:sz w:val="20"/>
+              </w:rPr>
+              <w:t>APPROVE</w:t>
+            </w:r>
+          </w:p>
+        </w:tc>
+        <w:tc>
+          <w:tcPr>
+            <w:tcW w:type="dxa" w:w="3230"/>
+            <w:shd w:val="clear" w:color="auto" w:fill="B8B3D6"/>
+            <w:tcBorders>
+              <w:top w:val="single" w:sz="4" w:space="0" w:color="CBCBCB"/>
+              <w:left w:val="single" w:sz="4" w:space="0" w:color="CBCBCB"/>
+              <w:bottom w:val="single" w:sz="4" w:space="0" w:color="CBCBCB"/>
+              <w:right w:val="single" w:sz="4" w:space="0" w:color="CBCBCB"/>
+            </w:tcBorders>
+          </w:tcPr>
+          <w:p>
+            <w:r>
+              <w:rPr>
+                <w:sz w:val="20"/>
+              </w:rPr>
+              <w:t xml:space="preserve">Chẩn đoán đúng quirk </w:t>
+            </w:r>
+            <w:r>
+              <w:rPr>
+                <w:rFonts w:ascii="Courier New" w:hAnsi="Courier New"/>
+                <w:color w:val="F05922"/>
+                <w:sz w:val="20"/>
+              </w:rPr>
+              <w:t>AutoCompleteBox</w:t>
+            </w:r>
+            <w:r>
+              <w:rPr>
+                <w:sz w:val="20"/>
+              </w:rPr>
+              <w:t xml:space="preserve"> (view lọc nội bộ rỗng → popup 0 item vô hình + property kẹt </w:t>
+            </w:r>
+            <w:r>
+              <w:rPr>
+                <w:rFonts w:ascii="Courier New" w:hAnsi="Courier New"/>
+                <w:color w:val="F05922"/>
+                <w:sz w:val="20"/>
+              </w:rPr>
+              <w:t>true</w:t>
+            </w:r>
+            <w:r>
+              <w:rPr>
+                <w:sz w:val="20"/>
+              </w:rPr>
+              <w:t xml:space="preserve">); fix </w:t>
+            </w:r>
+            <w:r>
+              <w:rPr>
+                <w:rFonts w:ascii="Courier New" w:hAnsi="Courier New"/>
+                <w:color w:val="F05922"/>
+                <w:sz w:val="20"/>
+              </w:rPr>
+              <w:t>false → PopulateComplete() → true</w:t>
+            </w:r>
+            <w:r>
+              <w:rPr>
+                <w:sz w:val="20"/>
+              </w:rPr>
+              <w:t xml:space="preserve"> áp dụng nhất quán cả 2 cửa sổ (</w:t>
+            </w:r>
+            <w:r>
+              <w:rPr>
+                <w:rFonts w:ascii="Courier New" w:hAnsi="Courier New"/>
+                <w:color w:val="F05922"/>
+                <w:sz w:val="20"/>
+              </w:rPr>
+              <w:t>RemoteCommandWindow.axaml.cs:239-241</w:t>
+            </w:r>
+            <w:r>
+              <w:rPr>
+                <w:sz w:val="20"/>
+              </w:rPr>
+              <w:t xml:space="preserve">, </w:t>
+            </w:r>
+            <w:r>
+              <w:rPr>
+                <w:rFonts w:ascii="Courier New" w:hAnsi="Courier New"/>
+                <w:color w:val="F05922"/>
+                <w:sz w:val="20"/>
+              </w:rPr>
+              <w:t>BulkActionWindow.axaml.cs:234-236</w:t>
+            </w:r>
+            <w:r>
+              <w:rPr>
+                <w:sz w:val="20"/>
+              </w:rPr>
+              <w:t xml:space="preserve">). Handler </w:t>
+            </w:r>
+            <w:r>
+              <w:rPr>
+                <w:rFonts w:ascii="Courier New" w:hAnsi="Courier New"/>
+                <w:color w:val="F05922"/>
+                <w:sz w:val="20"/>
+              </w:rPr>
+              <w:t>Tapped</w:t>
+            </w:r>
+            <w:r>
+              <w:rPr>
+                <w:sz w:val="20"/>
+              </w:rPr>
+              <w:t xml:space="preserve"> chạy trên UI thread — không vấn đề threading. Đối chứng RemoteAppInstall (prefill Text) củng cố root cause. GOTCHAS G018 (</w:t>
+            </w:r>
+            <w:r>
+              <w:rPr>
+                <w:rFonts w:ascii="Courier New" w:hAnsi="Courier New"/>
+                <w:color w:val="F05922"/>
+                <w:sz w:val="20"/>
+              </w:rPr>
+              <w:t>6e5084d</w:t>
+            </w:r>
+            <w:r>
+              <w:rPr>
+                <w:sz w:val="20"/>
+              </w:rPr>
+              <w:t>) ghi đúng chuẩn, có mục "Không cần làm lại".</w:t>
+            </w:r>
+          </w:p>
+        </w:tc>
+      </w:tr>
+      <w:tr>
+        <w:tc>
+          <w:tcPr>
+            <w:tcW w:type="dxa" w:w="3230"/>
+            <w:tcBorders>
+              <w:top w:val="single" w:sz="4" w:space="0" w:color="CBCBCB"/>
+              <w:left w:val="single" w:sz="4" w:space="0" w:color="CBCBCB"/>
+              <w:bottom w:val="single" w:sz="4" w:space="0" w:color="CBCBCB"/>
+              <w:right w:val="single" w:sz="4" w:space="0" w:color="CBCBCB"/>
+            </w:tcBorders>
+          </w:tcPr>
+          <w:p>
+            <w:r>
+              <w:rPr>
+                <w:b/>
+                <w:sz w:val="20"/>
+              </w:rPr>
+              <w:t>F04</w:t>
+            </w:r>
+            <w:r>
+              <w:rPr>
+                <w:sz w:val="20"/>
+              </w:rPr>
+              <w:t xml:space="preserve"> — reset status cũ</w:t>
+            </w:r>
+          </w:p>
+        </w:tc>
+        <w:tc>
+          <w:tcPr>
+            <w:tcW w:type="dxa" w:w="3230"/>
+            <w:tcBorders>
+              <w:top w:val="single" w:sz="4" w:space="0" w:color="CBCBCB"/>
+              <w:left w:val="single" w:sz="4" w:space="0" w:color="CBCBCB"/>
+              <w:bottom w:val="single" w:sz="4" w:space="0" w:color="CBCBCB"/>
+              <w:right w:val="single" w:sz="4" w:space="0" w:color="CBCBCB"/>
+            </w:tcBorders>
+          </w:tcPr>
+          <w:p>
+            <w:r>
+              <w:rPr>
+                <w:b/>
+                <w:sz w:val="20"/>
+              </w:rPr>
+              <w:t>APPROVE</w:t>
+            </w:r>
+          </w:p>
+        </w:tc>
+        <w:tc>
+          <w:tcPr>
+            <w:tcW w:type="dxa" w:w="3230"/>
+            <w:tcBorders>
+              <w:top w:val="single" w:sz="4" w:space="0" w:color="CBCBCB"/>
+              <w:left w:val="single" w:sz="4" w:space="0" w:color="CBCBCB"/>
+              <w:bottom w:val="single" w:sz="4" w:space="0" w:color="CBCBCB"/>
+              <w:right w:val="single" w:sz="4" w:space="0" w:color="CBCBCB"/>
+            </w:tcBorders>
+          </w:tcPr>
+          <w:p>
+            <w:r>
+              <w:rPr>
+                <w:sz w:val="20"/>
+              </w:rPr>
+              <w:t xml:space="preserve">Wizard reset </w:t>
+            </w:r>
+            <w:r>
+              <w:rPr>
+                <w:rFonts w:ascii="Courier New" w:hAnsi="Courier New"/>
+                <w:color w:val="F05922"/>
+                <w:sz w:val="20"/>
+              </w:rPr>
+              <w:t>PART_StatusMsg</w:t>
+            </w:r>
+            <w:r>
+              <w:rPr>
+                <w:sz w:val="20"/>
+              </w:rPr>
+              <w:t xml:space="preserve"> sau validation cùng chỗ reset log/progress (</w:t>
+            </w:r>
+            <w:r>
+              <w:rPr>
+                <w:rFonts w:ascii="Courier New" w:hAnsi="Courier New"/>
+                <w:color w:val="F05922"/>
+                <w:sz w:val="20"/>
+              </w:rPr>
+              <w:t>ZcuSetupWizardWindow.axaml.cs:91-94</w:t>
+            </w:r>
+            <w:r>
+              <w:rPr>
+                <w:sz w:val="20"/>
+              </w:rPr>
+              <w:t>); RemoteAppInstall xóa status đỏ ngay khi chọn xong file (</w:t>
+            </w:r>
+            <w:r>
+              <w:rPr>
+                <w:rFonts w:ascii="Courier New" w:hAnsi="Courier New"/>
+                <w:color w:val="F05922"/>
+                <w:sz w:val="20"/>
+              </w:rPr>
+              <w:t>RemoteAppInstallWindow.axaml.cs:120-123</w:t>
+            </w:r>
+            <w:r>
+              <w:rPr>
+                <w:sz w:val="20"/>
+              </w:rPr>
+              <w:t>) — đúng cả 2 nhánh mô tả trong finding. Cả 2 đều là UI event handler trên UI thread.</w:t>
+            </w:r>
+          </w:p>
+        </w:tc>
+      </w:tr>
+      <w:tr>
+        <w:tc>
+          <w:tcPr>
+            <w:tcW w:type="dxa" w:w="3230"/>
+            <w:shd w:val="clear" w:color="auto" w:fill="B8B3D6"/>
+            <w:tcBorders>
+              <w:top w:val="single" w:sz="4" w:space="0" w:color="CBCBCB"/>
+              <w:left w:val="single" w:sz="4" w:space="0" w:color="CBCBCB"/>
+              <w:bottom w:val="single" w:sz="4" w:space="0" w:color="CBCBCB"/>
+              <w:right w:val="single" w:sz="4" w:space="0" w:color="CBCBCB"/>
+            </w:tcBorders>
+          </w:tcPr>
+          <w:p>
+            <w:r>
+              <w:rPr>
+                <w:b/>
+                <w:sz w:val="20"/>
+              </w:rPr>
+              <w:t>F05</w:t>
+            </w:r>
+            <w:r>
+              <w:rPr>
+                <w:sz w:val="20"/>
+              </w:rPr>
+              <w:t xml:space="preserve"> — thông báo SSH tiếng Việt</w:t>
+            </w:r>
+          </w:p>
+        </w:tc>
+        <w:tc>
+          <w:tcPr>
+            <w:tcW w:type="dxa" w:w="3230"/>
+            <w:shd w:val="clear" w:color="auto" w:fill="B8B3D6"/>
+            <w:tcBorders>
+              <w:top w:val="single" w:sz="4" w:space="0" w:color="CBCBCB"/>
+              <w:left w:val="single" w:sz="4" w:space="0" w:color="CBCBCB"/>
+              <w:bottom w:val="single" w:sz="4" w:space="0" w:color="CBCBCB"/>
+              <w:right w:val="single" w:sz="4" w:space="0" w:color="CBCBCB"/>
+            </w:tcBorders>
+          </w:tcPr>
+          <w:p>
+            <w:r>
+              <w:rPr>
+                <w:b/>
+                <w:sz w:val="20"/>
+              </w:rPr>
+              <w:t>APPROVE</w:t>
+            </w:r>
+          </w:p>
+        </w:tc>
+        <w:tc>
+          <w:tcPr>
+            <w:tcW w:type="dxa" w:w="3230"/>
+            <w:shd w:val="clear" w:color="auto" w:fill="B8B3D6"/>
+            <w:tcBorders>
+              <w:top w:val="single" w:sz="4" w:space="0" w:color="CBCBCB"/>
+              <w:left w:val="single" w:sz="4" w:space="0" w:color="CBCBCB"/>
+              <w:bottom w:val="single" w:sz="4" w:space="0" w:color="CBCBCB"/>
+              <w:right w:val="single" w:sz="4" w:space="0" w:color="CBCBCB"/>
+            </w:tcBorders>
+          </w:tcPr>
+          <w:p>
+            <w:r>
+              <w:rPr>
+                <w:rFonts w:ascii="Courier New" w:hAnsi="Courier New"/>
+                <w:color w:val="F05922"/>
+                <w:sz w:val="20"/>
+              </w:rPr>
+              <w:t>ValidateSshProfile</w:t>
+            </w:r>
+            <w:r>
+              <w:rPr>
+                <w:sz w:val="20"/>
+              </w:rPr>
+              <w:t xml:space="preserve"> gọi ở đầu CẢ 2 action (chạy lệnh </w:t>
+            </w:r>
+            <w:r>
+              <w:rPr>
+                <w:rFonts w:ascii="Courier New" w:hAnsi="Courier New"/>
+                <w:color w:val="F05922"/>
+                <w:sz w:val="20"/>
+              </w:rPr>
+              <w:t>BulkActionWindow.axaml.cs:261</w:t>
+            </w:r>
+            <w:r>
+              <w:rPr>
+                <w:sz w:val="20"/>
+              </w:rPr>
+              <w:t xml:space="preserve"> + upload </w:t>
+            </w:r>
+            <w:r>
+              <w:rPr>
+                <w:rFonts w:ascii="Courier New" w:hAnsi="Courier New"/>
+                <w:color w:val="F05922"/>
+                <w:sz w:val="20"/>
+              </w:rPr>
+              <w:t>:294</w:t>
+            </w:r>
+            <w:r>
+              <w:rPr>
+                <w:sz w:val="20"/>
+              </w:rPr>
+              <w:t xml:space="preserve">) TRƯỚC khi tạo </w:t>
+            </w:r>
+            <w:r>
+              <w:rPr>
+                <w:rFonts w:ascii="Courier New" w:hAnsi="Courier New"/>
+                <w:color w:val="F05922"/>
+                <w:sz w:val="20"/>
+              </w:rPr>
+              <w:t>SshClient</w:t>
+            </w:r>
+            <w:r>
+              <w:rPr>
+                <w:sz w:val="20"/>
+              </w:rPr>
+              <w:t>/</w:t>
+            </w:r>
+            <w:r>
+              <w:rPr>
+                <w:rFonts w:ascii="Courier New" w:hAnsi="Courier New"/>
+                <w:color w:val="F05922"/>
+                <w:sz w:val="20"/>
+              </w:rPr>
+              <w:t>SftpClient</w:t>
+            </w:r>
+            <w:r>
+              <w:rPr>
+                <w:sz w:val="20"/>
+              </w:rPr>
+              <w:t xml:space="preserve">; message tiếng Việt chỉ rõ cách khắc phục; máy khác trong batch vẫn chạy song song (exception per-task → </w:t>
+            </w:r>
+            <w:r>
+              <w:rPr>
+                <w:rFonts w:ascii="Courier New" w:hAnsi="Courier New"/>
+                <w:color w:val="F05922"/>
+                <w:sz w:val="20"/>
+              </w:rPr>
+              <w:t>SetError</w:t>
+            </w:r>
+            <w:r>
+              <w:rPr>
+                <w:sz w:val="20"/>
+              </w:rPr>
+              <w:t>). Đúng AC.</w:t>
+            </w:r>
+          </w:p>
+        </w:tc>
+      </w:tr>
+      <w:tr>
+        <w:tc>
+          <w:tcPr>
+            <w:tcW w:type="dxa" w:w="3230"/>
+            <w:tcBorders>
+              <w:top w:val="single" w:sz="4" w:space="0" w:color="CBCBCB"/>
+              <w:left w:val="single" w:sz="4" w:space="0" w:color="CBCBCB"/>
+              <w:bottom w:val="single" w:sz="4" w:space="0" w:color="CBCBCB"/>
+              <w:right w:val="single" w:sz="4" w:space="0" w:color="CBCBCB"/>
+            </w:tcBorders>
+          </w:tcPr>
+          <w:p>
+            <w:r>
+              <w:rPr>
+                <w:b/>
+                <w:sz w:val="20"/>
+              </w:rPr>
+              <w:t>F06</w:t>
+            </w:r>
+            <w:r>
+              <w:rPr>
+                <w:sz w:val="20"/>
+              </w:rPr>
+              <w:t xml:space="preserve"> (phần agent)</w:t>
+            </w:r>
+          </w:p>
+        </w:tc>
+        <w:tc>
+          <w:tcPr>
+            <w:tcW w:type="dxa" w:w="3230"/>
+            <w:tcBorders>
+              <w:top w:val="single" w:sz="4" w:space="0" w:color="CBCBCB"/>
+              <w:left w:val="single" w:sz="4" w:space="0" w:color="CBCBCB"/>
+              <w:bottom w:val="single" w:sz="4" w:space="0" w:color="CBCBCB"/>
+              <w:right w:val="single" w:sz="4" w:space="0" w:color="CBCBCB"/>
+            </w:tcBorders>
+          </w:tcPr>
+          <w:p>
+            <w:r>
+              <w:rPr>
+                <w:b/>
+                <w:sz w:val="20"/>
+              </w:rPr>
+              <w:t>APPROVE-WITH-COMMENT</w:t>
+            </w:r>
+          </w:p>
+        </w:tc>
+        <w:tc>
+          <w:tcPr>
+            <w:tcW w:type="dxa" w:w="3230"/>
+            <w:tcBorders>
+              <w:top w:val="single" w:sz="4" w:space="0" w:color="CBCBCB"/>
+              <w:left w:val="single" w:sz="4" w:space="0" w:color="CBCBCB"/>
+              <w:bottom w:val="single" w:sz="4" w:space="0" w:color="CBCBCB"/>
+              <w:right w:val="single" w:sz="4" w:space="0" w:color="CBCBCB"/>
+            </w:tcBorders>
+          </w:tcPr>
+          <w:p>
+            <w:r>
+              <w:rPr>
+                <w:b/>
+                <w:sz w:val="20"/>
+              </w:rPr>
+              <w:t>Parse nhiều CIDR đúng:</w:t>
+            </w:r>
+            <w:r>
+              <w:rPr>
+                <w:sz w:val="20"/>
+              </w:rPr>
+              <w:t xml:space="preserve"> đã đối chiếu </w:t>
+            </w:r>
+            <w:r>
+              <w:rPr>
+                <w:rFonts w:ascii="Courier New" w:hAnsi="Courier New"/>
+                <w:color w:val="F05922"/>
+                <w:sz w:val="20"/>
+              </w:rPr>
+              <w:t>AuthManager.IsInRange</w:t>
+            </w:r>
+            <w:r>
+              <w:rPr>
+                <w:sz w:val="20"/>
+              </w:rPr>
+              <w:t xml:space="preserve"> (</w:t>
+            </w:r>
+            <w:r>
+              <w:rPr>
+                <w:rFonts w:ascii="Courier New" w:hAnsi="Courier New"/>
+                <w:color w:val="F05922"/>
+                <w:sz w:val="20"/>
+              </w:rPr>
+              <w:t>AuthManager.cs:144-182</w:t>
+            </w:r>
+            <w:r>
+              <w:rPr>
+                <w:sz w:val="20"/>
+              </w:rPr>
+              <w:t xml:space="preserve">) — parse TỪNG entry (IP đơn lẻ hoặc CIDR), 1 entry gộp chứa dấu phẩy sẽ deny-all → việc installer C# split </w:t>
+            </w:r>
+            <w:r>
+              <w:rPr>
+                <w:rFonts w:ascii="Courier New" w:hAnsi="Courier New"/>
+                <w:color w:val="F05922"/>
+                <w:sz w:val="20"/>
+              </w:rPr>
+              <w:t>,</w:t>
+            </w:r>
+            <w:r>
+              <w:rPr>
+                <w:sz w:val="20"/>
+              </w:rPr>
+              <w:t>/</w:t>
+            </w:r>
+            <w:r>
+              <w:rPr>
+                <w:rFonts w:ascii="Courier New" w:hAnsi="Courier New"/>
+                <w:color w:val="F05922"/>
+                <w:sz w:val="20"/>
+              </w:rPr>
+              <w:t>;</w:t>
+            </w:r>
+            <w:r>
+              <w:rPr>
+                <w:sz w:val="20"/>
+              </w:rPr>
+              <w:t xml:space="preserve"> (</w:t>
+            </w:r>
+            <w:r>
+              <w:rPr>
+                <w:rFonts w:ascii="Courier New" w:hAnsi="Courier New"/>
+                <w:color w:val="F05922"/>
+                <w:sz w:val="20"/>
+              </w:rPr>
+              <w:t>ZcuRemoteInstallerService.cs:142-145</w:t>
+            </w:r>
+            <w:r>
+              <w:rPr>
+                <w:sz w:val="20"/>
+              </w:rPr>
+              <w:t>) và script bash tách mảng JSON (</w:t>
+            </w:r>
+            <w:r>
+              <w:rPr>
+                <w:rFonts w:ascii="Courier New" w:hAnsi="Courier New"/>
+                <w:color w:val="F05922"/>
+                <w:sz w:val="20"/>
+              </w:rPr>
+              <w:t>setup-zcu-agent.sh:72-80</w:t>
+            </w:r>
+            <w:r>
+              <w:rPr>
+                <w:sz w:val="20"/>
+              </w:rPr>
+              <w:t xml:space="preserve">) là BẮT BUỘC và đã làm đúng (kèm trim, bỏ entry rỗng). </w:t>
+            </w:r>
+            <w:r>
+              <w:rPr>
+                <w:b/>
+                <w:sz w:val="20"/>
+              </w:rPr>
+              <w:t>Backward compat OK:</w:t>
+            </w:r>
+            <w:r>
+              <w:rPr>
+                <w:sz w:val="20"/>
+              </w:rPr>
+              <w:t xml:space="preserve"> máy đã cài giữ config </w:t>
+            </w:r>
+            <w:r>
+              <w:rPr>
+                <w:rFonts w:ascii="Courier New" w:hAnsi="Courier New"/>
+                <w:color w:val="F05922"/>
+                <w:sz w:val="20"/>
+              </w:rPr>
+              <w:t>["0.0.0.0/0"]</w:t>
+            </w:r>
+            <w:r>
+              <w:rPr>
+                <w:sz w:val="20"/>
+              </w:rPr>
+              <w:t xml:space="preserve"> — vẫn là mảng 1 entry hợp lệ, agent mới đọc bình thường + warning catch-all có sẵn (</w:t>
+            </w:r>
+            <w:r>
+              <w:rPr>
+                <w:rFonts w:ascii="Courier New" w:hAnsi="Courier New"/>
+                <w:color w:val="F05922"/>
+                <w:sz w:val="20"/>
+              </w:rPr>
+              <w:t>RemoteControlHostedService.cs:120-127</w:t>
+            </w:r>
+            <w:r>
+              <w:rPr>
+                <w:sz w:val="20"/>
+              </w:rPr>
+              <w:t xml:space="preserve">); nâng cấp agent KHÔNG chết cấu hình cũ. Không đụng </w:t>
+            </w:r>
+            <w:r>
+              <w:rPr>
+                <w:rFonts w:ascii="Courier New" w:hAnsi="Courier New"/>
+                <w:color w:val="F05922"/>
+                <w:sz w:val="20"/>
+              </w:rPr>
+              <w:t>LicenseManagerService.cs</w:t>
+            </w:r>
+            <w:r>
+              <w:rPr>
+                <w:sz w:val="20"/>
+              </w:rPr>
+              <w:t xml:space="preserve"> — đúng quyết định user. </w:t>
+            </w:r>
+            <w:r>
+              <w:rPr>
+                <w:b/>
+                <w:sz w:val="20"/>
+              </w:rPr>
+              <w:t>Quan điểm về mức độ siết:</w:t>
+            </w:r>
+            <w:r>
+              <w:rPr>
+                <w:sz w:val="20"/>
+              </w:rPr>
+              <w:t xml:space="preserve"> cảnh báo (không fail-fast) token &lt; 16 ký tự là lựa chọn đúng cho bản vá — chặn cứng sẽ phá deployment hiện có; wizard/script luôn sinh token 32 hex nên cài mới không bị ảnh hưởng. Đề xuất backlog: fail-fast token yếu cho </w:t>
+            </w:r>
+            <w:r>
+              <w:rPr>
+                <w:b/>
+                <w:sz w:val="20"/>
+              </w:rPr>
+              <w:t>cài đặt MỚI</w:t>
+            </w:r>
+            <w:r>
+              <w:rPr>
+                <w:sz w:val="20"/>
+              </w:rPr>
+              <w:t xml:space="preserve"> ở bản major kế tiếp. </w:t>
+            </w:r>
+            <w:r>
+              <w:rPr>
+                <w:b/>
+                <w:sz w:val="20"/>
+              </w:rPr>
+              <w:t>Required (docs, đã tự sửa trong review này — xem ghi chú dưới bảng):</w:t>
+            </w:r>
+            <w:r>
+              <w:rPr>
+                <w:sz w:val="20"/>
+              </w:rPr>
+              <w:t xml:space="preserve"> CCU kết nối qua VPN/CGNAT ngoài RFC 1918 (VD Tailscale </w:t>
+            </w:r>
+            <w:r>
+              <w:rPr>
+                <w:rFonts w:ascii="Courier New" w:hAnsi="Courier New"/>
+                <w:color w:val="F05922"/>
+                <w:sz w:val="20"/>
+              </w:rPr>
+              <w:t>100.64.0.0/10</w:t>
+            </w:r>
+            <w:r>
+              <w:rPr>
+                <w:sz w:val="20"/>
+              </w:rPr>
+              <w:t xml:space="preserve">, ZeroTier) sẽ bị chặn bởi default mới — MANUAL mới nói chung chung "IP ngoài LAN bị chặn", cần nêu rõ trường hợp VPN để tránh ticket "sau nâng cấp không kết nối được". </w:t>
+            </w:r>
+            <w:r>
+              <w:rPr>
+                <w:b/>
+                <w:sz w:val="20"/>
+              </w:rPr>
+              <w:t>Nit:</w:t>
+            </w:r>
+            <w:r>
+              <w:rPr>
+                <w:sz w:val="20"/>
+              </w:rPr>
+              <w:t xml:space="preserve"> script bash chỉ tách </w:t>
+            </w:r>
+            <w:r>
+              <w:rPr>
+                <w:rFonts w:ascii="Courier New" w:hAnsi="Courier New"/>
+                <w:color w:val="F05922"/>
+                <w:sz w:val="20"/>
+              </w:rPr>
+              <w:t>,</w:t>
+            </w:r>
+            <w:r>
+              <w:rPr>
+                <w:sz w:val="20"/>
+              </w:rPr>
+              <w:t xml:space="preserve"> trong khi C# tách cả </w:t>
+            </w:r>
+            <w:r>
+              <w:rPr>
+                <w:rFonts w:ascii="Courier New" w:hAnsi="Courier New"/>
+                <w:color w:val="F05922"/>
+                <w:sz w:val="20"/>
+              </w:rPr>
+              <w:t>,</w:t>
+            </w:r>
+            <w:r>
+              <w:rPr>
+                <w:sz w:val="20"/>
+              </w:rPr>
+              <w:t xml:space="preserve"> và </w:t>
+            </w:r>
+            <w:r>
+              <w:rPr>
+                <w:rFonts w:ascii="Courier New" w:hAnsi="Courier New"/>
+                <w:color w:val="F05922"/>
+                <w:sz w:val="20"/>
+              </w:rPr>
+              <w:t>;</w:t>
+            </w:r>
+            <w:r>
+              <w:rPr>
+                <w:sz w:val="20"/>
+              </w:rPr>
+              <w:t xml:space="preserve"> — nên nhất quán (thêm </w:t>
+            </w:r>
+            <w:r>
+              <w:rPr>
+                <w:rFonts w:ascii="Courier New" w:hAnsi="Courier New"/>
+                <w:color w:val="F05922"/>
+                <w:sz w:val="20"/>
+              </w:rPr>
+              <w:t>;</w:t>
+            </w:r>
+            <w:r>
+              <w:rPr>
+                <w:sz w:val="20"/>
+              </w:rPr>
+              <w:t xml:space="preserve"> vào IFS hoặc bỏ </w:t>
+            </w:r>
+            <w:r>
+              <w:rPr>
+                <w:rFonts w:ascii="Courier New" w:hAnsi="Courier New"/>
+                <w:color w:val="F05922"/>
+                <w:sz w:val="20"/>
+              </w:rPr>
+              <w:t>;</w:t>
+            </w:r>
+            <w:r>
+              <w:rPr>
+                <w:sz w:val="20"/>
+              </w:rPr>
+              <w:t xml:space="preserve"> phía C#); không chặn merge vì MANUAL/watermark chỉ hướng dẫn dấu phẩy.</w:t>
+            </w:r>
+          </w:p>
+        </w:tc>
+      </w:tr>
+      <w:tr>
+        <w:tc>
+          <w:tcPr>
+            <w:tcW w:type="dxa" w:w="3230"/>
+            <w:shd w:val="clear" w:color="auto" w:fill="B8B3D6"/>
+            <w:tcBorders>
+              <w:top w:val="single" w:sz="4" w:space="0" w:color="CBCBCB"/>
+              <w:left w:val="single" w:sz="4" w:space="0" w:color="CBCBCB"/>
+              <w:bottom w:val="single" w:sz="4" w:space="0" w:color="CBCBCB"/>
+              <w:right w:val="single" w:sz="4" w:space="0" w:color="CBCBCB"/>
+            </w:tcBorders>
+          </w:tcPr>
+          <w:p>
+            <w:r>
+              <w:rPr>
+                <w:b/>
+                <w:sz w:val="20"/>
+              </w:rPr>
+              <w:t>Docs sync</w:t>
+            </w:r>
+            <w:r>
+              <w:rPr>
+                <w:sz w:val="20"/>
+              </w:rPr>
+              <w:t xml:space="preserve"> (§15, §17)</w:t>
+            </w:r>
+          </w:p>
+        </w:tc>
+        <w:tc>
+          <w:tcPr>
+            <w:tcW w:type="dxa" w:w="3230"/>
+            <w:shd w:val="clear" w:color="auto" w:fill="B8B3D6"/>
+            <w:tcBorders>
+              <w:top w:val="single" w:sz="4" w:space="0" w:color="CBCBCB"/>
+              <w:left w:val="single" w:sz="4" w:space="0" w:color="CBCBCB"/>
+              <w:bottom w:val="single" w:sz="4" w:space="0" w:color="CBCBCB"/>
+              <w:right w:val="single" w:sz="4" w:space="0" w:color="CBCBCB"/>
+            </w:tcBorders>
+          </w:tcPr>
+          <w:p>
+            <w:r>
+              <w:rPr>
+                <w:b/>
+                <w:sz w:val="20"/>
+              </w:rPr>
+              <w:t>APPROVE</w:t>
+            </w:r>
+          </w:p>
+        </w:tc>
+        <w:tc>
+          <w:tcPr>
+            <w:tcW w:type="dxa" w:w="3230"/>
+            <w:shd w:val="clear" w:color="auto" w:fill="B8B3D6"/>
+            <w:tcBorders>
+              <w:top w:val="single" w:sz="4" w:space="0" w:color="CBCBCB"/>
+              <w:left w:val="single" w:sz="4" w:space="0" w:color="CBCBCB"/>
+              <w:bottom w:val="single" w:sz="4" w:space="0" w:color="CBCBCB"/>
+              <w:right w:val="single" w:sz="4" w:space="0" w:color="CBCBCB"/>
+            </w:tcBorders>
+          </w:tcPr>
+          <w:p>
+            <w:r>
+              <w:rPr>
+                <w:sz w:val="20"/>
+              </w:rPr>
+              <w:t>MANUAL chương 9.1 (bảng tham số + cảnh báo Hình 53) và chương 12 (bảng ALLOWED_IPS) khớp default mới; CODE-GRAPH cập nhật đủ 3 API (</w:t>
+            </w:r>
+            <w:r>
+              <w:rPr>
+                <w:rFonts w:ascii="Courier New" w:hAnsi="Courier New"/>
+                <w:color w:val="F05922"/>
+                <w:sz w:val="20"/>
+              </w:rPr>
+              <w:t>ScreenWidth/Height</w:t>
+            </w:r>
+            <w:r>
+              <w:rPr>
+                <w:sz w:val="20"/>
+              </w:rPr>
+              <w:t xml:space="preserve"> đổi ngữ nghĩa, </w:t>
+            </w:r>
+            <w:r>
+              <w:rPr>
+                <w:rFonts w:ascii="Courier New" w:hAnsi="Courier New"/>
+                <w:color w:val="F05922"/>
+                <w:sz w:val="20"/>
+              </w:rPr>
+              <w:t>ServerName</w:t>
+            </w:r>
+            <w:r>
+              <w:rPr>
+                <w:sz w:val="20"/>
+              </w:rPr>
+              <w:t xml:space="preserve">, </w:t>
+            </w:r>
+            <w:r>
+              <w:rPr>
+                <w:rFonts w:ascii="Courier New" w:hAnsi="Courier New"/>
+                <w:color w:val="F05922"/>
+                <w:sz w:val="20"/>
+              </w:rPr>
+              <w:t>DefaultLanAllowedClientIPs</w:t>
+            </w:r>
+            <w:r>
+              <w:rPr>
+                <w:sz w:val="20"/>
+              </w:rPr>
+              <w:t>) + dòng lịch sử + DOCX/PDF xuất lại. BUG report có Nguyên nhân gốc/Cách sửa/bảng trạng thái từng finding.</w:t>
+            </w:r>
+          </w:p>
+        </w:tc>
+      </w:tr>
+    </w:tbl>
+    <w:p/>
+    <w:p>
+      <w:pPr>
+        <w:spacing w:after="80"/>
+      </w:pPr>
+      <w:r>
+        <w:rPr>
+          <w:b/>
+          <w:sz w:val="21"/>
+        </w:rPr>
+        <w:t>Ghi chú Required F06-docs:</w:t>
+      </w:r>
+      <w:r>
+        <w:rPr>
+          <w:sz w:val="21"/>
+        </w:rPr>
+        <w:t xml:space="preserve"> một dòng lưu ý VPN đã được Tech Lead bổ sung trực tiếp vào MANUAL chương 9.1 trong commit review này (thay đổi 1 dòng hiển nhiên, ghi rõ theo quy tắc review); các Nit còn lại (interface </w:t>
+      </w:r>
+      <w:r>
+        <w:rPr>
+          <w:rFonts w:ascii="Courier New" w:hAnsi="Courier New"/>
+          <w:color w:val="F05922"/>
+          <w:sz w:val="18"/>
+        </w:rPr>
+        <w:t>IRemoteControlClient.ServerName</w:t>
+      </w:r>
+      <w:r>
+        <w:rPr>
+          <w:sz w:val="21"/>
+        </w:rPr>
+        <w:t xml:space="preserve">, CTS dispose, IFS </w:t>
+      </w:r>
+      <w:r>
+        <w:rPr>
+          <w:rFonts w:ascii="Courier New" w:hAnsi="Courier New"/>
+          <w:color w:val="F05922"/>
+          <w:sz w:val="18"/>
+        </w:rPr>
+        <w:t>;</w:t>
+      </w:r>
+      <w:r>
+        <w:rPr>
+          <w:sz w:val="21"/>
+        </w:rPr>
+        <w:t xml:space="preserve"> trong script) giao Senior Developer xử lý ở vòng sau hoặc gộp vào PR kế — KHÔNG chặn QA.</w:t>
+      </w:r>
+    </w:p>
+    <w:p>
+      <w:pPr>
+        <w:pStyle w:val="Heading3"/>
+        <w:spacing w:before="160" w:after="60"/>
+      </w:pPr>
+      <w:r>
+        <w:rPr>
+          <w:color w:val="4A3F8C"/>
+          <w:sz w:val="24"/>
+        </w:rPr>
+        <w:t>Kết luận</w:t>
+      </w:r>
+    </w:p>
+    <w:p>
+      <w:pPr>
+        <w:spacing w:after="80"/>
+      </w:pPr>
+      <w:r>
+        <w:rPr>
+          <w:b/>
+          <w:sz w:val="21"/>
+        </w:rPr>
+        <w:t>APPROVE-WITH-COMMENT — CHO PHÉP chuyển sang QA verify (Bước 4 WF-BUGFIX).</w:t>
+      </w:r>
+      <w:r>
+        <w:rPr>
+          <w:sz w:val="21"/>
+        </w:rPr>
+        <w:t xml:space="preserve"> Không phát hiện lỗi chặn merge: root cause cả 6 finding được xử lý đúng (không vá triệu chứng), backward compat protocol 2 chiều và config </w:t>
+      </w:r>
+      <w:r>
+        <w:rPr>
+          <w:rFonts w:ascii="Courier New" w:hAnsi="Courier New"/>
+          <w:color w:val="F05922"/>
+          <w:sz w:val="18"/>
+        </w:rPr>
+        <w:t>AllowedClientIPs</w:t>
+      </w:r>
+      <w:r>
+        <w:rPr>
+          <w:sz w:val="21"/>
+        </w:rPr>
+        <w:t xml:space="preserve"> cũ đều an toàn, threading UI đúng chuẩn Dispatcher/async-context, build 2 project sạch (tự kiểm chứng). QA lưu ý test thêm: (1) record → đổi resolution ZCU giữa lúc ghi (guard dừng ghi phải kích hoạt đúng, KHÔNG kích hoạt lúc mới bấm Record); (2) kết nối agent cũ 1.0 nếu còn máy chưa nâng cấp (dialog cảnh báo hiện đúng 1 lần); (3) cài mới qua wizard rồi xác nhận </w:t>
+      </w:r>
+      <w:r>
+        <w:rPr>
+          <w:rFonts w:ascii="Courier New" w:hAnsi="Courier New"/>
+          <w:color w:val="F05922"/>
+          <w:sz w:val="18"/>
+        </w:rPr>
+        <w:t>appsettings.json</w:t>
+      </w:r>
+      <w:r>
+        <w:rPr>
+          <w:sz w:val="21"/>
+        </w:rPr>
+        <w:t xml:space="preserve"> trên ZCU có mảng 3 entry CIDR riêng biệt và CCU trong LAN vẫn kết nối được.</w:t>
+      </w:r>
+    </w:p>
+    <w:p>
+      <w:pPr>
+        <w:spacing w:after="80"/>
+      </w:pPr>
+      <w:r>
+        <w:rPr>
+          <w:sz w:val="21"/>
+        </w:rPr>
+        <w:t>— Tech Lead, 2026-07-26 22:17</w:t>
+      </w:r>
+    </w:p>
     <w:sectPr>
       <w:headerReference w:type="default" r:id="rId9"/>
       <w:footerReference w:type="default" r:id="rId10"/>

</xml_diff>

<commit_message>
[bugfix-ccu-findings] QA verify fix F01-F06 trên ZCU thật
- Kết quả tổng: 7 PASS / 0 FAIL / 0 SKIP (V1-V7), regression luồng chính OK
- V1 Record file .avi 37.6MB hợp lệ + guard đổi resolution đúng; V2 dialog agent cũ 1 lần; V3 SysInfo timeout/mở đúng; V4 snippet dropdown+lọc; V5 reset status; V6 SSH message tiếng Việt; V7 AllowedClientIPs LAN CIDR + cảnh báo token yếu
- Dựng agent CŨ thật (b7bbfef) để verify V2/V3; deploy agent MỚI 1.1 qua wizard
- Chụp lại 2 ảnh tài liệu đổi giao diện: zcu-setup-wizard-default.png, zcu-terminal-appsettings.png (token đã che)
- Đủ điều kiện sign-off, bàn giao QA Lead

Refs: docs/bugs/BUG-ccu-ui-findings-2026-07-26.md
Co-Authored-By: Claude Opus 5 (1M context) <noreply@anthropic.com>
</commit_message>
<xml_diff>
--- a/docs/bugs/BUG-ccu-ui-findings-2026-07-26.docx
+++ b/docs/bugs/BUG-ccu-ui-findings-2026-07-26.docx
@@ -7588,6 +7588,1904 @@
           <w:sz w:val="21"/>
         </w:rPr>
         <w:t>— Tech Lead, 2026-07-26 22:17</w:t>
+      </w:r>
+    </w:p>
+    <w:p>
+      <w:pPr>
+        <w:pBdr>
+          <w:bottom w:val="single" w:sz="6" w:space="1" w:color="F05922"/>
+        </w:pBdr>
+        <w:spacing w:after="120"/>
+      </w:pPr>
+    </w:p>
+    <w:p>
+      <w:pPr>
+        <w:pStyle w:val="Heading2"/>
+        <w:spacing w:before="200" w:after="80"/>
+      </w:pPr>
+      <w:r>
+        <w:rPr>
+          <w:color w:val="F05922"/>
+          <w:sz w:val="28"/>
+        </w:rPr>
+        <w:t>Kết quả QA verify — 2026-07-26 23:05</w:t>
+      </w:r>
+    </w:p>
+    <w:p>
+      <w:pPr>
+        <w:spacing w:after="80"/>
+      </w:pPr>
+      <w:r>
+        <w:rPr>
+          <w:b/>
+          <w:sz w:val="21"/>
+        </w:rPr>
+        <w:t>Người thực hiện:</w:t>
+      </w:r>
+      <w:r>
+        <w:rPr>
+          <w:sz w:val="21"/>
+        </w:rPr>
+        <w:t xml:space="preserve"> QA Engineer (WF-BUGFIX Bước 4)</w:t>
+      </w:r>
+    </w:p>
+    <w:p>
+      <w:pPr>
+        <w:spacing w:after="80"/>
+      </w:pPr>
+      <w:r>
+        <w:rPr>
+          <w:b/>
+          <w:sz w:val="21"/>
+        </w:rPr>
+        <w:t>Môi trường:</w:t>
+      </w:r>
+      <w:r>
+        <w:rPr>
+          <w:sz w:val="21"/>
+        </w:rPr>
+        <w:t xml:space="preserve"> CcuUI Release build có fix (commit </w:t>
+      </w:r>
+      <w:r>
+        <w:rPr>
+          <w:rFonts w:ascii="Courier New" w:hAnsi="Courier New"/>
+          <w:color w:val="F05922"/>
+          <w:sz w:val="18"/>
+        </w:rPr>
+        <w:t>9caed3d</w:t>
+      </w:r>
+      <w:r>
+        <w:rPr>
+          <w:sz w:val="21"/>
+        </w:rPr>
+        <w:t xml:space="preserve">, CCU </w:t>
+      </w:r>
+      <w:r>
+        <w:rPr>
+          <w:rFonts w:ascii="Courier New" w:hAnsi="Courier New"/>
+          <w:color w:val="F05922"/>
+          <w:sz w:val="18"/>
+        </w:rPr>
+        <w:t>192.168.0.100</w:t>
+      </w:r>
+      <w:r>
+        <w:rPr>
+          <w:sz w:val="21"/>
+        </w:rPr>
+        <w:t xml:space="preserve">) + ZCU thật </w:t>
+      </w:r>
+      <w:r>
+        <w:rPr>
+          <w:rFonts w:ascii="Courier New" w:hAnsi="Courier New"/>
+          <w:color w:val="F05922"/>
+          <w:sz w:val="18"/>
+        </w:rPr>
+        <w:t>192.168.0.101</w:t>
+      </w:r>
+      <w:r>
+        <w:rPr>
+          <w:sz w:val="21"/>
+        </w:rPr>
+        <w:t xml:space="preserve"> (Ubuntu 22, kztek). Agent bản mới </w:t>
+      </w:r>
+      <w:r>
+        <w:rPr>
+          <w:b/>
+          <w:sz w:val="21"/>
+        </w:rPr>
+        <w:t>ZcuAgent/1.1</w:t>
+      </w:r>
+      <w:r>
+        <w:rPr>
+          <w:sz w:val="21"/>
+        </w:rPr>
+        <w:t xml:space="preserve"> deploy qua ZcuSetupWizard (build </w:t>
+      </w:r>
+      <w:r>
+        <w:rPr>
+          <w:rFonts w:ascii="Courier New" w:hAnsi="Courier New"/>
+          <w:color w:val="F05922"/>
+          <w:sz w:val="18"/>
+        </w:rPr>
+        <w:t>dotnet publish linux-x64</w:t>
+      </w:r>
+      <w:r>
+        <w:rPr>
+          <w:sz w:val="21"/>
+        </w:rPr>
+        <w:t xml:space="preserve"> từ HEAD). Build CcuUI Release: </w:t>
+      </w:r>
+      <w:r>
+        <w:rPr>
+          <w:b/>
+          <w:sz w:val="21"/>
+        </w:rPr>
+        <w:t>0 Error / 19 warning</w:t>
+      </w:r>
+      <w:r>
+        <w:rPr>
+          <w:sz w:val="21"/>
+        </w:rPr>
+        <w:t xml:space="preserve">; ZcuAgent Release: </w:t>
+      </w:r>
+      <w:r>
+        <w:rPr>
+          <w:b/>
+          <w:sz w:val="21"/>
+        </w:rPr>
+        <w:t>0 Error</w:t>
+      </w:r>
+      <w:r>
+        <w:rPr>
+          <w:sz w:val="21"/>
+        </w:rPr>
+        <w:t>.</w:t>
+      </w:r>
+    </w:p>
+    <w:p>
+      <w:pPr>
+        <w:spacing w:after="80"/>
+      </w:pPr>
+      <w:r>
+        <w:rPr>
+          <w:b/>
+          <w:sz w:val="21"/>
+        </w:rPr>
+        <w:t>Cách test:</w:t>
+      </w:r>
+      <w:r>
+        <w:rPr>
+          <w:sz w:val="21"/>
+        </w:rPr>
+        <w:t xml:space="preserve"> thao tác UI thật qua UIA + chuột/bàn phím thật (bộ script </w:t>
+      </w:r>
+      <w:r>
+        <w:rPr>
+          <w:rFonts w:ascii="Courier New" w:hAnsi="Courier New"/>
+          <w:color w:val="F05922"/>
+          <w:sz w:val="18"/>
+        </w:rPr>
+        <w:t>temp/user-manual-ccu-zcu/</w:t>
+      </w:r>
+      <w:r>
+        <w:rPr>
+          <w:sz w:val="21"/>
+        </w:rPr>
+        <w:t>), đối chiếu file/log thật trên ZCU qua SSH.</w:t>
+      </w:r>
+    </w:p>
+    <w:p>
+      <w:pPr>
+        <w:pStyle w:val="Heading3"/>
+        <w:spacing w:before="160" w:after="60"/>
+      </w:pPr>
+      <w:r>
+        <w:rPr>
+          <w:color w:val="4A3F8C"/>
+          <w:sz w:val="24"/>
+        </w:rPr>
+        <w:t>Bảng kết quả V1–V7</w:t>
+      </w:r>
+    </w:p>
+    <w:tbl>
+      <w:tblPr>
+        <w:tblStyle w:val="TableGrid"/>
+        <w:tblW w:type="auto" w:w="0"/>
+        <w:tblLook w:firstColumn="1" w:firstRow="1" w:lastColumn="0" w:lastRow="0" w:noHBand="0" w:noVBand="1" w:val="04A0"/>
+      </w:tblPr>
+      <w:tblGrid>
+        <w:gridCol w:w="2422"/>
+        <w:gridCol w:w="2422"/>
+        <w:gridCol w:w="2422"/>
+        <w:gridCol w:w="2422"/>
+      </w:tblGrid>
+      <w:tr>
+        <w:tc>
+          <w:tcPr>
+            <w:tcW w:type="dxa" w:w="2422"/>
+            <w:shd w:val="clear" w:color="auto" w:fill="251C53"/>
+            <w:tcBorders>
+              <w:top w:val="single" w:sz="4" w:space="0" w:color="251C53"/>
+              <w:left w:val="single" w:sz="4" w:space="0" w:color="251C53"/>
+              <w:bottom w:val="single" w:sz="4" w:space="0" w:color="251C53"/>
+              <w:right w:val="single" w:sz="4" w:space="0" w:color="251C53"/>
+            </w:tcBorders>
+          </w:tcPr>
+          <w:p>
+            <w:r>
+              <w:rPr>
+                <w:b/>
+                <w:color w:val="FFFFFF"/>
+                <w:sz w:val="20"/>
+              </w:rPr>
+              <w:t>Case</w:t>
+            </w:r>
+          </w:p>
+        </w:tc>
+        <w:tc>
+          <w:tcPr>
+            <w:tcW w:type="dxa" w:w="2422"/>
+            <w:shd w:val="clear" w:color="auto" w:fill="251C53"/>
+            <w:tcBorders>
+              <w:top w:val="single" w:sz="4" w:space="0" w:color="251C53"/>
+              <w:left w:val="single" w:sz="4" w:space="0" w:color="251C53"/>
+              <w:bottom w:val="single" w:sz="4" w:space="0" w:color="251C53"/>
+              <w:right w:val="single" w:sz="4" w:space="0" w:color="251C53"/>
+            </w:tcBorders>
+          </w:tcPr>
+          <w:p>
+            <w:r>
+              <w:rPr>
+                <w:b/>
+                <w:color w:val="FFFFFF"/>
+                <w:sz w:val="20"/>
+              </w:rPr>
+              <w:t>Finding</w:t>
+            </w:r>
+          </w:p>
+        </w:tc>
+        <w:tc>
+          <w:tcPr>
+            <w:tcW w:type="dxa" w:w="2422"/>
+            <w:shd w:val="clear" w:color="auto" w:fill="251C53"/>
+            <w:tcBorders>
+              <w:top w:val="single" w:sz="4" w:space="0" w:color="251C53"/>
+              <w:left w:val="single" w:sz="4" w:space="0" w:color="251C53"/>
+              <w:bottom w:val="single" w:sz="4" w:space="0" w:color="251C53"/>
+              <w:right w:val="single" w:sz="4" w:space="0" w:color="251C53"/>
+            </w:tcBorders>
+          </w:tcPr>
+          <w:p>
+            <w:r>
+              <w:rPr>
+                <w:b/>
+                <w:color w:val="FFFFFF"/>
+                <w:sz w:val="20"/>
+              </w:rPr>
+              <w:t>Kết quả</w:t>
+            </w:r>
+          </w:p>
+        </w:tc>
+        <w:tc>
+          <w:tcPr>
+            <w:tcW w:type="dxa" w:w="2422"/>
+            <w:shd w:val="clear" w:color="auto" w:fill="251C53"/>
+            <w:tcBorders>
+              <w:top w:val="single" w:sz="4" w:space="0" w:color="251C53"/>
+              <w:left w:val="single" w:sz="4" w:space="0" w:color="251C53"/>
+              <w:bottom w:val="single" w:sz="4" w:space="0" w:color="251C53"/>
+              <w:right w:val="single" w:sz="4" w:space="0" w:color="251C53"/>
+            </w:tcBorders>
+          </w:tcPr>
+          <w:p>
+            <w:r>
+              <w:rPr>
+                <w:b/>
+                <w:color w:val="FFFFFF"/>
+                <w:sz w:val="20"/>
+              </w:rPr>
+              <w:t>Bằng chứng</w:t>
+            </w:r>
+          </w:p>
+        </w:tc>
+      </w:tr>
+      <w:tr>
+        <w:tc>
+          <w:tcPr>
+            <w:tcW w:type="dxa" w:w="2422"/>
+            <w:tcBorders>
+              <w:top w:val="single" w:sz="4" w:space="0" w:color="CBCBCB"/>
+              <w:left w:val="single" w:sz="4" w:space="0" w:color="CBCBCB"/>
+              <w:bottom w:val="single" w:sz="4" w:space="0" w:color="CBCBCB"/>
+              <w:right w:val="single" w:sz="4" w:space="0" w:color="CBCBCB"/>
+            </w:tcBorders>
+          </w:tcPr>
+          <w:p>
+            <w:r>
+              <w:rPr>
+                <w:sz w:val="20"/>
+              </w:rPr>
+              <w:t>---</w:t>
+            </w:r>
+          </w:p>
+        </w:tc>
+        <w:tc>
+          <w:tcPr>
+            <w:tcW w:type="dxa" w:w="2422"/>
+            <w:tcBorders>
+              <w:top w:val="single" w:sz="4" w:space="0" w:color="CBCBCB"/>
+              <w:left w:val="single" w:sz="4" w:space="0" w:color="CBCBCB"/>
+              <w:bottom w:val="single" w:sz="4" w:space="0" w:color="CBCBCB"/>
+              <w:right w:val="single" w:sz="4" w:space="0" w:color="CBCBCB"/>
+            </w:tcBorders>
+          </w:tcPr>
+          <w:p>
+            <w:r>
+              <w:rPr>
+                <w:sz w:val="20"/>
+              </w:rPr>
+              <w:t>---</w:t>
+            </w:r>
+          </w:p>
+        </w:tc>
+        <w:tc>
+          <w:tcPr>
+            <w:tcW w:type="dxa" w:w="2422"/>
+            <w:tcBorders>
+              <w:top w:val="single" w:sz="4" w:space="0" w:color="CBCBCB"/>
+              <w:left w:val="single" w:sz="4" w:space="0" w:color="CBCBCB"/>
+              <w:bottom w:val="single" w:sz="4" w:space="0" w:color="CBCBCB"/>
+              <w:right w:val="single" w:sz="4" w:space="0" w:color="CBCBCB"/>
+            </w:tcBorders>
+          </w:tcPr>
+          <w:p>
+            <w:r>
+              <w:rPr>
+                <w:sz w:val="20"/>
+              </w:rPr>
+              <w:t>---</w:t>
+            </w:r>
+          </w:p>
+        </w:tc>
+        <w:tc>
+          <w:tcPr>
+            <w:tcW w:type="dxa" w:w="2422"/>
+            <w:tcBorders>
+              <w:top w:val="single" w:sz="4" w:space="0" w:color="CBCBCB"/>
+              <w:left w:val="single" w:sz="4" w:space="0" w:color="CBCBCB"/>
+              <w:bottom w:val="single" w:sz="4" w:space="0" w:color="CBCBCB"/>
+              <w:right w:val="single" w:sz="4" w:space="0" w:color="CBCBCB"/>
+            </w:tcBorders>
+          </w:tcPr>
+          <w:p>
+            <w:r>
+              <w:rPr>
+                <w:sz w:val="20"/>
+              </w:rPr>
+              <w:t>---</w:t>
+            </w:r>
+          </w:p>
+        </w:tc>
+      </w:tr>
+      <w:tr>
+        <w:tc>
+          <w:tcPr>
+            <w:tcW w:type="dxa" w:w="2422"/>
+            <w:shd w:val="clear" w:color="auto" w:fill="B8B3D6"/>
+            <w:tcBorders>
+              <w:top w:val="single" w:sz="4" w:space="0" w:color="CBCBCB"/>
+              <w:left w:val="single" w:sz="4" w:space="0" w:color="CBCBCB"/>
+              <w:bottom w:val="single" w:sz="4" w:space="0" w:color="CBCBCB"/>
+              <w:right w:val="single" w:sz="4" w:space="0" w:color="CBCBCB"/>
+            </w:tcBorders>
+          </w:tcPr>
+          <w:p>
+            <w:r>
+              <w:rPr>
+                <w:b/>
+                <w:sz w:val="20"/>
+              </w:rPr>
+              <w:t>V1</w:t>
+            </w:r>
+          </w:p>
+        </w:tc>
+        <w:tc>
+          <w:tcPr>
+            <w:tcW w:type="dxa" w:w="2422"/>
+            <w:shd w:val="clear" w:color="auto" w:fill="B8B3D6"/>
+            <w:tcBorders>
+              <w:top w:val="single" w:sz="4" w:space="0" w:color="CBCBCB"/>
+              <w:left w:val="single" w:sz="4" w:space="0" w:color="CBCBCB"/>
+              <w:bottom w:val="single" w:sz="4" w:space="0" w:color="CBCBCB"/>
+              <w:right w:val="single" w:sz="4" w:space="0" w:color="CBCBCB"/>
+            </w:tcBorders>
+          </w:tcPr>
+          <w:p>
+            <w:r>
+              <w:rPr>
+                <w:sz w:val="20"/>
+              </w:rPr>
+              <w:t>F01 Record</w:t>
+            </w:r>
+          </w:p>
+        </w:tc>
+        <w:tc>
+          <w:tcPr>
+            <w:tcW w:type="dxa" w:w="2422"/>
+            <w:shd w:val="clear" w:color="auto" w:fill="B8B3D6"/>
+            <w:tcBorders>
+              <w:top w:val="single" w:sz="4" w:space="0" w:color="CBCBCB"/>
+              <w:left w:val="single" w:sz="4" w:space="0" w:color="CBCBCB"/>
+              <w:bottom w:val="single" w:sz="4" w:space="0" w:color="CBCBCB"/>
+              <w:right w:val="single" w:sz="4" w:space="0" w:color="CBCBCB"/>
+            </w:tcBorders>
+          </w:tcPr>
+          <w:p>
+            <w:r>
+              <w:rPr>
+                <w:sz w:val="20"/>
+              </w:rPr>
+              <w:t xml:space="preserve">✅ </w:t>
+            </w:r>
+            <w:r>
+              <w:rPr>
+                <w:b/>
+                <w:sz w:val="20"/>
+              </w:rPr>
+              <w:t>PASS</w:t>
+            </w:r>
+          </w:p>
+        </w:tc>
+        <w:tc>
+          <w:tcPr>
+            <w:tcW w:type="dxa" w:w="2422"/>
+            <w:shd w:val="clear" w:color="auto" w:fill="B8B3D6"/>
+            <w:tcBorders>
+              <w:top w:val="single" w:sz="4" w:space="0" w:color="CBCBCB"/>
+              <w:left w:val="single" w:sz="4" w:space="0" w:color="CBCBCB"/>
+              <w:bottom w:val="single" w:sz="4" w:space="0" w:color="CBCBCB"/>
+              <w:right w:val="single" w:sz="4" w:space="0" w:color="CBCBCB"/>
+            </w:tcBorders>
+          </w:tcPr>
+          <w:p>
+            <w:r>
+              <w:rPr>
+                <w:sz w:val="20"/>
+              </w:rPr>
+              <w:t xml:space="preserve">Sau khi stream ~15s rồi Record ~20s → file </w:t>
+            </w:r>
+            <w:r>
+              <w:rPr>
+                <w:rFonts w:ascii="Courier New" w:hAnsi="Courier New"/>
+                <w:color w:val="F05922"/>
+                <w:sz w:val="20"/>
+              </w:rPr>
+              <w:t>RemoteSession_20260726_223656.avi</w:t>
+            </w:r>
+            <w:r>
+              <w:rPr>
+                <w:sz w:val="20"/>
+              </w:rPr>
+              <w:t xml:space="preserve"> </w:t>
+            </w:r>
+            <w:r>
+              <w:rPr>
+                <w:b/>
+                <w:sz w:val="20"/>
+              </w:rPr>
+              <w:t>37.6 MB</w:t>
+            </w:r>
+            <w:r>
+              <w:rPr>
+                <w:sz w:val="20"/>
+              </w:rPr>
+              <w:t>, header AVI hợp lệ (</w:t>
+            </w:r>
+            <w:r>
+              <w:rPr>
+                <w:rFonts w:ascii="Courier New" w:hAnsi="Courier New"/>
+                <w:color w:val="F05922"/>
+                <w:sz w:val="20"/>
+              </w:rPr>
+              <w:t xml:space="preserve">RIFF/AVI </w:t>
+            </w:r>
+            <w:r>
+              <w:rPr>
+                <w:sz w:val="20"/>
+              </w:rPr>
+              <w:t xml:space="preserve">, MJPG, 15fps, 586 frames, 1279×799), frame đầu decode được đúng độ phân giải đang stream (không phải 232 bytes). Đổi độ phân giải ZCU </w:t>
+            </w:r>
+            <w:r>
+              <w:rPr>
+                <w:b/>
+                <w:sz w:val="20"/>
+              </w:rPr>
+              <w:t>giữa lúc ghi</w:t>
+            </w:r>
+            <w:r>
+              <w:rPr>
+                <w:sz w:val="20"/>
+              </w:rPr>
+              <w:t xml:space="preserve"> (</w:t>
+            </w:r>
+            <w:r>
+              <w:rPr>
+                <w:rFonts w:ascii="Courier New" w:hAnsi="Courier New"/>
+                <w:color w:val="F05922"/>
+                <w:sz w:val="20"/>
+              </w:rPr>
+              <w:t>xrandr</w:t>
+            </w:r>
+            <w:r>
+              <w:rPr>
+                <w:sz w:val="20"/>
+              </w:rPr>
+              <w:t xml:space="preserve"> 1279→3020/4096) → guard dừng ghi đúng, file partial 278 frames vẫn hợp lệ, tiêu đề "⏹ Đã dừng ghi hình: độ phân giải ZCU thay đổi". </w:t>
+            </w:r>
+            <w:r>
+              <w:rPr>
+                <w:rFonts w:ascii="Courier New" w:hAnsi="Courier New"/>
+                <w:color w:val="F05922"/>
+                <w:sz w:val="20"/>
+              </w:rPr>
+              <w:t>verify-v1-record-frame1.png</w:t>
+            </w:r>
+            <w:r>
+              <w:rPr>
+                <w:sz w:val="20"/>
+              </w:rPr>
+              <w:t xml:space="preserve">, </w:t>
+            </w:r>
+            <w:r>
+              <w:rPr>
+                <w:rFonts w:ascii="Courier New" w:hAnsi="Courier New"/>
+                <w:color w:val="F05922"/>
+                <w:sz w:val="20"/>
+              </w:rPr>
+              <w:t>verify-v1-record-resolution-guard.png</w:t>
+            </w:r>
+          </w:p>
+        </w:tc>
+      </w:tr>
+      <w:tr>
+        <w:tc>
+          <w:tcPr>
+            <w:tcW w:type="dxa" w:w="2422"/>
+            <w:tcBorders>
+              <w:top w:val="single" w:sz="4" w:space="0" w:color="CBCBCB"/>
+              <w:left w:val="single" w:sz="4" w:space="0" w:color="CBCBCB"/>
+              <w:bottom w:val="single" w:sz="4" w:space="0" w:color="CBCBCB"/>
+              <w:right w:val="single" w:sz="4" w:space="0" w:color="CBCBCB"/>
+            </w:tcBorders>
+          </w:tcPr>
+          <w:p>
+            <w:r>
+              <w:rPr>
+                <w:b/>
+                <w:sz w:val="20"/>
+              </w:rPr>
+              <w:t>V2</w:t>
+            </w:r>
+          </w:p>
+        </w:tc>
+        <w:tc>
+          <w:tcPr>
+            <w:tcW w:type="dxa" w:w="2422"/>
+            <w:tcBorders>
+              <w:top w:val="single" w:sz="4" w:space="0" w:color="CBCBCB"/>
+              <w:left w:val="single" w:sz="4" w:space="0" w:color="CBCBCB"/>
+              <w:bottom w:val="single" w:sz="4" w:space="0" w:color="CBCBCB"/>
+              <w:right w:val="single" w:sz="4" w:space="0" w:color="CBCBCB"/>
+            </w:tcBorders>
+          </w:tcPr>
+          <w:p>
+            <w:r>
+              <w:rPr>
+                <w:sz w:val="20"/>
+              </w:rPr>
+              <w:t>F02-a agent cũ</w:t>
+            </w:r>
+          </w:p>
+        </w:tc>
+        <w:tc>
+          <w:tcPr>
+            <w:tcW w:type="dxa" w:w="2422"/>
+            <w:tcBorders>
+              <w:top w:val="single" w:sz="4" w:space="0" w:color="CBCBCB"/>
+              <w:left w:val="single" w:sz="4" w:space="0" w:color="CBCBCB"/>
+              <w:bottom w:val="single" w:sz="4" w:space="0" w:color="CBCBCB"/>
+              <w:right w:val="single" w:sz="4" w:space="0" w:color="CBCBCB"/>
+            </w:tcBorders>
+          </w:tcPr>
+          <w:p>
+            <w:r>
+              <w:rPr>
+                <w:sz w:val="20"/>
+              </w:rPr>
+              <w:t xml:space="preserve">✅ </w:t>
+            </w:r>
+            <w:r>
+              <w:rPr>
+                <w:b/>
+                <w:sz w:val="20"/>
+              </w:rPr>
+              <w:t>PASS</w:t>
+            </w:r>
+          </w:p>
+        </w:tc>
+        <w:tc>
+          <w:tcPr>
+            <w:tcW w:type="dxa" w:w="2422"/>
+            <w:tcBorders>
+              <w:top w:val="single" w:sz="4" w:space="0" w:color="CBCBCB"/>
+              <w:left w:val="single" w:sz="4" w:space="0" w:color="CBCBCB"/>
+              <w:bottom w:val="single" w:sz="4" w:space="0" w:color="CBCBCB"/>
+              <w:right w:val="single" w:sz="4" w:space="0" w:color="CBCBCB"/>
+            </w:tcBorders>
+          </w:tcPr>
+          <w:p>
+            <w:r>
+              <w:rPr>
+                <w:sz w:val="20"/>
+              </w:rPr>
+              <w:t xml:space="preserve">Dựng agent </w:t>
+            </w:r>
+            <w:r>
+              <w:rPr>
+                <w:b/>
+                <w:sz w:val="20"/>
+              </w:rPr>
+              <w:t>thật</w:t>
+            </w:r>
+            <w:r>
+              <w:rPr>
+                <w:sz w:val="20"/>
+              </w:rPr>
+              <w:t xml:space="preserve"> bản pre-Enterprise (commit </w:t>
+            </w:r>
+            <w:r>
+              <w:rPr>
+                <w:rFonts w:ascii="Courier New" w:hAnsi="Courier New"/>
+                <w:color w:val="F05922"/>
+                <w:sz w:val="20"/>
+              </w:rPr>
+              <w:t>b7bbfef</w:t>
+            </w:r>
+            <w:r>
+              <w:rPr>
+                <w:sz w:val="20"/>
+              </w:rPr>
+              <w:t xml:space="preserve">, publish linux-x64) deploy lên ZCU → kết nối: dialog "Agent phiên bản cũ" (báo </w:t>
+            </w:r>
+            <w:r>
+              <w:rPr>
+                <w:rFonts w:ascii="Courier New" w:hAnsi="Courier New"/>
+                <w:color w:val="F05922"/>
+                <w:sz w:val="20"/>
+              </w:rPr>
+              <w:t>ZcuAgent/1.0</w:t>
+            </w:r>
+            <w:r>
+              <w:rPr>
+                <w:sz w:val="20"/>
+              </w:rPr>
+              <w:t xml:space="preserve"> &lt; 1.1) hiện đúng </w:t>
+            </w:r>
+            <w:r>
+              <w:rPr>
+                <w:b/>
+                <w:sz w:val="20"/>
+              </w:rPr>
+              <w:t>1 lần</w:t>
+            </w:r>
+            <w:r>
+              <w:rPr>
+                <w:sz w:val="20"/>
+              </w:rPr>
+              <w:t xml:space="preserve">; bấm "Đã hiểu" xong không hiện lại; reconnect (cửa sổ mới) hiện lại 1 lần — đúng "1 lần/cửa sổ". </w:t>
+            </w:r>
+            <w:r>
+              <w:rPr>
+                <w:rFonts w:ascii="Courier New" w:hAnsi="Courier New"/>
+                <w:color w:val="F05922"/>
+                <w:sz w:val="20"/>
+              </w:rPr>
+              <w:t>verify-v2-agent-old-dialog.png</w:t>
+            </w:r>
+          </w:p>
+        </w:tc>
+      </w:tr>
+      <w:tr>
+        <w:tc>
+          <w:tcPr>
+            <w:tcW w:type="dxa" w:w="2422"/>
+            <w:shd w:val="clear" w:color="auto" w:fill="B8B3D6"/>
+            <w:tcBorders>
+              <w:top w:val="single" w:sz="4" w:space="0" w:color="CBCBCB"/>
+              <w:left w:val="single" w:sz="4" w:space="0" w:color="CBCBCB"/>
+              <w:bottom w:val="single" w:sz="4" w:space="0" w:color="CBCBCB"/>
+              <w:right w:val="single" w:sz="4" w:space="0" w:color="CBCBCB"/>
+            </w:tcBorders>
+          </w:tcPr>
+          <w:p>
+            <w:r>
+              <w:rPr>
+                <w:b/>
+                <w:sz w:val="20"/>
+              </w:rPr>
+              <w:t>V3</w:t>
+            </w:r>
+          </w:p>
+        </w:tc>
+        <w:tc>
+          <w:tcPr>
+            <w:tcW w:type="dxa" w:w="2422"/>
+            <w:shd w:val="clear" w:color="auto" w:fill="B8B3D6"/>
+            <w:tcBorders>
+              <w:top w:val="single" w:sz="4" w:space="0" w:color="CBCBCB"/>
+              <w:left w:val="single" w:sz="4" w:space="0" w:color="CBCBCB"/>
+              <w:bottom w:val="single" w:sz="4" w:space="0" w:color="CBCBCB"/>
+              <w:right w:val="single" w:sz="4" w:space="0" w:color="CBCBCB"/>
+            </w:tcBorders>
+          </w:tcPr>
+          <w:p>
+            <w:r>
+              <w:rPr>
+                <w:sz w:val="20"/>
+              </w:rPr>
+              <w:t>F02-b SysInfo</w:t>
+            </w:r>
+          </w:p>
+        </w:tc>
+        <w:tc>
+          <w:tcPr>
+            <w:tcW w:type="dxa" w:w="2422"/>
+            <w:shd w:val="clear" w:color="auto" w:fill="B8B3D6"/>
+            <w:tcBorders>
+              <w:top w:val="single" w:sz="4" w:space="0" w:color="CBCBCB"/>
+              <w:left w:val="single" w:sz="4" w:space="0" w:color="CBCBCB"/>
+              <w:bottom w:val="single" w:sz="4" w:space="0" w:color="CBCBCB"/>
+              <w:right w:val="single" w:sz="4" w:space="0" w:color="CBCBCB"/>
+            </w:tcBorders>
+          </w:tcPr>
+          <w:p>
+            <w:r>
+              <w:rPr>
+                <w:sz w:val="20"/>
+              </w:rPr>
+              <w:t xml:space="preserve">✅ </w:t>
+            </w:r>
+            <w:r>
+              <w:rPr>
+                <w:b/>
+                <w:sz w:val="20"/>
+              </w:rPr>
+              <w:t>PASS</w:t>
+            </w:r>
+          </w:p>
+        </w:tc>
+        <w:tc>
+          <w:tcPr>
+            <w:tcW w:type="dxa" w:w="2422"/>
+            <w:shd w:val="clear" w:color="auto" w:fill="B8B3D6"/>
+            <w:tcBorders>
+              <w:top w:val="single" w:sz="4" w:space="0" w:color="CBCBCB"/>
+              <w:left w:val="single" w:sz="4" w:space="0" w:color="CBCBCB"/>
+              <w:bottom w:val="single" w:sz="4" w:space="0" w:color="CBCBCB"/>
+              <w:right w:val="single" w:sz="4" w:space="0" w:color="CBCBCB"/>
+            </w:tcBorders>
+          </w:tcPr>
+          <w:p>
+            <w:r>
+              <w:rPr>
+                <w:sz w:val="20"/>
+              </w:rPr>
+              <w:t xml:space="preserve">Agent CŨ: bấm SysInfo → sau ~10s hiện dialog "Không nhận được phản hồi SysInfo" nêu nguyên nhân + cách xử lý (không fail âm thầm). Agent MỚI 1.1: </w:t>
+            </w:r>
+            <w:r>
+              <w:rPr>
+                <w:rFonts w:ascii="Courier New" w:hAnsi="Courier New"/>
+                <w:color w:val="F05922"/>
+                <w:sz w:val="20"/>
+              </w:rPr>
+              <w:t>SystemInventoryWindow</w:t>
+            </w:r>
+            <w:r>
+              <w:rPr>
+                <w:sz w:val="20"/>
+              </w:rPr>
+              <w:t xml:space="preserve"> mở ngay với dữ liệu thật (CPU i7-12700H, RAM 5.74 GB, Unix 6.8.0-134, X64), </w:t>
+            </w:r>
+            <w:r>
+              <w:rPr>
+                <w:b/>
+                <w:sz w:val="20"/>
+              </w:rPr>
+              <w:t>KHÔNG</w:t>
+            </w:r>
+            <w:r>
+              <w:rPr>
+                <w:sz w:val="20"/>
+              </w:rPr>
+              <w:t xml:space="preserve"> có dialog cảnh báo. </w:t>
+            </w:r>
+            <w:r>
+              <w:rPr>
+                <w:rFonts w:ascii="Courier New" w:hAnsi="Courier New"/>
+                <w:color w:val="F05922"/>
+                <w:sz w:val="20"/>
+              </w:rPr>
+              <w:t>verify-v3-sysinfo-timeout.png</w:t>
+            </w:r>
+            <w:r>
+              <w:rPr>
+                <w:sz w:val="20"/>
+              </w:rPr>
+              <w:t xml:space="preserve">, </w:t>
+            </w:r>
+            <w:r>
+              <w:rPr>
+                <w:rFonts w:ascii="Courier New" w:hAnsi="Courier New"/>
+                <w:color w:val="F05922"/>
+                <w:sz w:val="20"/>
+              </w:rPr>
+              <w:t>verify-v3-sysinfo-new-agent.png</w:t>
+            </w:r>
+          </w:p>
+        </w:tc>
+      </w:tr>
+      <w:tr>
+        <w:tc>
+          <w:tcPr>
+            <w:tcW w:type="dxa" w:w="2422"/>
+            <w:tcBorders>
+              <w:top w:val="single" w:sz="4" w:space="0" w:color="CBCBCB"/>
+              <w:left w:val="single" w:sz="4" w:space="0" w:color="CBCBCB"/>
+              <w:bottom w:val="single" w:sz="4" w:space="0" w:color="CBCBCB"/>
+              <w:right w:val="single" w:sz="4" w:space="0" w:color="CBCBCB"/>
+            </w:tcBorders>
+          </w:tcPr>
+          <w:p>
+            <w:r>
+              <w:rPr>
+                <w:b/>
+                <w:sz w:val="20"/>
+              </w:rPr>
+              <w:t>V4</w:t>
+            </w:r>
+          </w:p>
+        </w:tc>
+        <w:tc>
+          <w:tcPr>
+            <w:tcW w:type="dxa" w:w="2422"/>
+            <w:tcBorders>
+              <w:top w:val="single" w:sz="4" w:space="0" w:color="CBCBCB"/>
+              <w:left w:val="single" w:sz="4" w:space="0" w:color="CBCBCB"/>
+              <w:bottom w:val="single" w:sz="4" w:space="0" w:color="CBCBCB"/>
+              <w:right w:val="single" w:sz="4" w:space="0" w:color="CBCBCB"/>
+            </w:tcBorders>
+          </w:tcPr>
+          <w:p>
+            <w:r>
+              <w:rPr>
+                <w:sz w:val="20"/>
+              </w:rPr>
+              <w:t>F03 snippet</w:t>
+            </w:r>
+          </w:p>
+        </w:tc>
+        <w:tc>
+          <w:tcPr>
+            <w:tcW w:type="dxa" w:w="2422"/>
+            <w:tcBorders>
+              <w:top w:val="single" w:sz="4" w:space="0" w:color="CBCBCB"/>
+              <w:left w:val="single" w:sz="4" w:space="0" w:color="CBCBCB"/>
+              <w:bottom w:val="single" w:sz="4" w:space="0" w:color="CBCBCB"/>
+              <w:right w:val="single" w:sz="4" w:space="0" w:color="CBCBCB"/>
+            </w:tcBorders>
+          </w:tcPr>
+          <w:p>
+            <w:r>
+              <w:rPr>
+                <w:sz w:val="20"/>
+              </w:rPr>
+              <w:t xml:space="preserve">✅ </w:t>
+            </w:r>
+            <w:r>
+              <w:rPr>
+                <w:b/>
+                <w:sz w:val="20"/>
+              </w:rPr>
+              <w:t>PASS</w:t>
+            </w:r>
+          </w:p>
+        </w:tc>
+        <w:tc>
+          <w:tcPr>
+            <w:tcW w:type="dxa" w:w="2422"/>
+            <w:tcBorders>
+              <w:top w:val="single" w:sz="4" w:space="0" w:color="CBCBCB"/>
+              <w:left w:val="single" w:sz="4" w:space="0" w:color="CBCBCB"/>
+              <w:bottom w:val="single" w:sz="4" w:space="0" w:color="CBCBCB"/>
+              <w:right w:val="single" w:sz="4" w:space="0" w:color="CBCBCB"/>
+            </w:tcBorders>
+          </w:tcPr>
+          <w:p>
+            <w:r>
+              <w:rPr>
+                <w:sz w:val="20"/>
+              </w:rPr>
+              <w:t xml:space="preserve">CMD Shell (Console): click ô snippet → dropdown 12 lệnh mẫu mở (Reboot, Kiểm tra RAM &amp; Ổ cứng, apt update…); set "RAM" qua UIA + click → lọc đúng còn "Kiểm tra RAM &amp; Ổ cứng". BulkAction: tương tự, dropdown mở + lọc "RAM" đúng. </w:t>
+            </w:r>
+            <w:r>
+              <w:rPr>
+                <w:rFonts w:ascii="Courier New" w:hAnsi="Courier New"/>
+                <w:color w:val="F05922"/>
+                <w:sz w:val="20"/>
+              </w:rPr>
+              <w:t>verify-v4-snippet-dropdown-cmd.png</w:t>
+            </w:r>
+            <w:r>
+              <w:rPr>
+                <w:sz w:val="20"/>
+              </w:rPr>
+              <w:t xml:space="preserve">, </w:t>
+            </w:r>
+            <w:r>
+              <w:rPr>
+                <w:rFonts w:ascii="Courier New" w:hAnsi="Courier New"/>
+                <w:color w:val="F05922"/>
+                <w:sz w:val="20"/>
+              </w:rPr>
+              <w:t>verify-v4-snippet-filter-ram.png</w:t>
+            </w:r>
+            <w:r>
+              <w:rPr>
+                <w:sz w:val="20"/>
+              </w:rPr>
+              <w:t xml:space="preserve">, </w:t>
+            </w:r>
+            <w:r>
+              <w:rPr>
+                <w:rFonts w:ascii="Courier New" w:hAnsi="Courier New"/>
+                <w:color w:val="F05922"/>
+                <w:sz w:val="20"/>
+              </w:rPr>
+              <w:t>verify-v4-snippet-bulk-ram.png</w:t>
+            </w:r>
+          </w:p>
+        </w:tc>
+      </w:tr>
+      <w:tr>
+        <w:tc>
+          <w:tcPr>
+            <w:tcW w:type="dxa" w:w="2422"/>
+            <w:shd w:val="clear" w:color="auto" w:fill="B8B3D6"/>
+            <w:tcBorders>
+              <w:top w:val="single" w:sz="4" w:space="0" w:color="CBCBCB"/>
+              <w:left w:val="single" w:sz="4" w:space="0" w:color="CBCBCB"/>
+              <w:bottom w:val="single" w:sz="4" w:space="0" w:color="CBCBCB"/>
+              <w:right w:val="single" w:sz="4" w:space="0" w:color="CBCBCB"/>
+            </w:tcBorders>
+          </w:tcPr>
+          <w:p>
+            <w:r>
+              <w:rPr>
+                <w:b/>
+                <w:sz w:val="20"/>
+              </w:rPr>
+              <w:t>V5</w:t>
+            </w:r>
+          </w:p>
+        </w:tc>
+        <w:tc>
+          <w:tcPr>
+            <w:tcW w:type="dxa" w:w="2422"/>
+            <w:shd w:val="clear" w:color="auto" w:fill="B8B3D6"/>
+            <w:tcBorders>
+              <w:top w:val="single" w:sz="4" w:space="0" w:color="CBCBCB"/>
+              <w:left w:val="single" w:sz="4" w:space="0" w:color="CBCBCB"/>
+              <w:bottom w:val="single" w:sz="4" w:space="0" w:color="CBCBCB"/>
+              <w:right w:val="single" w:sz="4" w:space="0" w:color="CBCBCB"/>
+            </w:tcBorders>
+          </w:tcPr>
+          <w:p>
+            <w:r>
+              <w:rPr>
+                <w:sz w:val="20"/>
+              </w:rPr>
+              <w:t>F04 reset status</w:t>
+            </w:r>
+          </w:p>
+        </w:tc>
+        <w:tc>
+          <w:tcPr>
+            <w:tcW w:type="dxa" w:w="2422"/>
+            <w:shd w:val="clear" w:color="auto" w:fill="B8B3D6"/>
+            <w:tcBorders>
+              <w:top w:val="single" w:sz="4" w:space="0" w:color="CBCBCB"/>
+              <w:left w:val="single" w:sz="4" w:space="0" w:color="CBCBCB"/>
+              <w:bottom w:val="single" w:sz="4" w:space="0" w:color="CBCBCB"/>
+              <w:right w:val="single" w:sz="4" w:space="0" w:color="CBCBCB"/>
+            </w:tcBorders>
+          </w:tcPr>
+          <w:p>
+            <w:r>
+              <w:rPr>
+                <w:sz w:val="20"/>
+              </w:rPr>
+              <w:t xml:space="preserve">✅ </w:t>
+            </w:r>
+            <w:r>
+              <w:rPr>
+                <w:b/>
+                <w:sz w:val="20"/>
+              </w:rPr>
+              <w:t>PASS</w:t>
+            </w:r>
+          </w:p>
+        </w:tc>
+        <w:tc>
+          <w:tcPr>
+            <w:tcW w:type="dxa" w:w="2422"/>
+            <w:shd w:val="clear" w:color="auto" w:fill="B8B3D6"/>
+            <w:tcBorders>
+              <w:top w:val="single" w:sz="4" w:space="0" w:color="CBCBCB"/>
+              <w:left w:val="single" w:sz="4" w:space="0" w:color="CBCBCB"/>
+              <w:bottom w:val="single" w:sz="4" w:space="0" w:color="CBCBCB"/>
+              <w:right w:val="single" w:sz="4" w:space="0" w:color="CBCBCB"/>
+            </w:tcBorders>
+          </w:tcPr>
+          <w:p>
+            <w:r>
+              <w:rPr>
+                <w:sz w:val="20"/>
+              </w:rPr>
+              <w:t xml:space="preserve">Wizard: xóa Token → Bắt đầu → status đỏ "Thiếu IP/SSH user… hoặc Token Agent."; nhập lại Token + Bắt đầu → status đổi ngay thành "Đang cài đặt ZcuAgent..." (xám), lỗi đỏ cũ biến mất tức thì (log/progress chạy song song không còn lỗi treo). RemoteAppInstall: chọn xong file → status đỏ validation biến mất. </w:t>
+            </w:r>
+            <w:r>
+              <w:rPr>
+                <w:rFonts w:ascii="Courier New" w:hAnsi="Courier New"/>
+                <w:color w:val="F05922"/>
+                <w:sz w:val="20"/>
+              </w:rPr>
+              <w:t>verify-v5-wizard-error.png</w:t>
+            </w:r>
+            <w:r>
+              <w:rPr>
+                <w:sz w:val="20"/>
+              </w:rPr>
+              <w:t xml:space="preserve">, </w:t>
+            </w:r>
+            <w:r>
+              <w:rPr>
+                <w:rFonts w:ascii="Courier New" w:hAnsi="Courier New"/>
+                <w:color w:val="F05922"/>
+                <w:sz w:val="20"/>
+              </w:rPr>
+              <w:t>verify-v5-wizard-status-reset.png</w:t>
+            </w:r>
+          </w:p>
+        </w:tc>
+      </w:tr>
+      <w:tr>
+        <w:tc>
+          <w:tcPr>
+            <w:tcW w:type="dxa" w:w="2422"/>
+            <w:tcBorders>
+              <w:top w:val="single" w:sz="4" w:space="0" w:color="CBCBCB"/>
+              <w:left w:val="single" w:sz="4" w:space="0" w:color="CBCBCB"/>
+              <w:bottom w:val="single" w:sz="4" w:space="0" w:color="CBCBCB"/>
+              <w:right w:val="single" w:sz="4" w:space="0" w:color="CBCBCB"/>
+            </w:tcBorders>
+          </w:tcPr>
+          <w:p>
+            <w:r>
+              <w:rPr>
+                <w:b/>
+                <w:sz w:val="20"/>
+              </w:rPr>
+              <w:t>V6</w:t>
+            </w:r>
+          </w:p>
+        </w:tc>
+        <w:tc>
+          <w:tcPr>
+            <w:tcW w:type="dxa" w:w="2422"/>
+            <w:tcBorders>
+              <w:top w:val="single" w:sz="4" w:space="0" w:color="CBCBCB"/>
+              <w:left w:val="single" w:sz="4" w:space="0" w:color="CBCBCB"/>
+              <w:bottom w:val="single" w:sz="4" w:space="0" w:color="CBCBCB"/>
+              <w:right w:val="single" w:sz="4" w:space="0" w:color="CBCBCB"/>
+            </w:tcBorders>
+          </w:tcPr>
+          <w:p>
+            <w:r>
+              <w:rPr>
+                <w:sz w:val="20"/>
+              </w:rPr>
+              <w:t>F05 SSH message</w:t>
+            </w:r>
+          </w:p>
+        </w:tc>
+        <w:tc>
+          <w:tcPr>
+            <w:tcW w:type="dxa" w:w="2422"/>
+            <w:tcBorders>
+              <w:top w:val="single" w:sz="4" w:space="0" w:color="CBCBCB"/>
+              <w:left w:val="single" w:sz="4" w:space="0" w:color="CBCBCB"/>
+              <w:bottom w:val="single" w:sz="4" w:space="0" w:color="CBCBCB"/>
+              <w:right w:val="single" w:sz="4" w:space="0" w:color="CBCBCB"/>
+            </w:tcBorders>
+          </w:tcPr>
+          <w:p>
+            <w:r>
+              <w:rPr>
+                <w:sz w:val="20"/>
+              </w:rPr>
+              <w:t xml:space="preserve">✅ </w:t>
+            </w:r>
+            <w:r>
+              <w:rPr>
+                <w:b/>
+                <w:sz w:val="20"/>
+              </w:rPr>
+              <w:t>PASS</w:t>
+            </w:r>
+          </w:p>
+        </w:tc>
+        <w:tc>
+          <w:tcPr>
+            <w:tcW w:type="dxa" w:w="2422"/>
+            <w:tcBorders>
+              <w:top w:val="single" w:sz="4" w:space="0" w:color="CBCBCB"/>
+              <w:left w:val="single" w:sz="4" w:space="0" w:color="CBCBCB"/>
+              <w:bottom w:val="single" w:sz="4" w:space="0" w:color="CBCBCB"/>
+              <w:right w:val="single" w:sz="4" w:space="0" w:color="CBCBCB"/>
+            </w:tcBorders>
+          </w:tcPr>
+          <w:p>
+            <w:r>
+              <w:rPr>
+                <w:sz w:val="20"/>
+              </w:rPr>
+              <w:t xml:space="preserve">BulkAction chạy </w:t>
+            </w:r>
+            <w:r>
+              <w:rPr>
+                <w:rFonts w:ascii="Courier New" w:hAnsi="Courier New"/>
+                <w:color w:val="F05922"/>
+                <w:sz w:val="20"/>
+              </w:rPr>
+              <w:t>uname -a</w:t>
+            </w:r>
+            <w:r>
+              <w:rPr>
+                <w:sz w:val="20"/>
+              </w:rPr>
+              <w:t xml:space="preserve"> trên VietAnh (đủ SSH) + Kien (thiếu SSH user): VietAnh "Thành công"; Kien "Lỗi" với thông báo tiếng Việt thân thiện "Máy chưa cấu hình SSH user — bấm '✏️ Sửa' máy tính này để bổ sung SSH username/password rồi chạy lại." — KHÔNG còn raw .NET exception. </w:t>
+            </w:r>
+            <w:r>
+              <w:rPr>
+                <w:rFonts w:ascii="Courier New" w:hAnsi="Courier New"/>
+                <w:color w:val="F05922"/>
+                <w:sz w:val="20"/>
+              </w:rPr>
+              <w:t>verify-v6-bulk-ssh-message.png</w:t>
+            </w:r>
+          </w:p>
+        </w:tc>
+      </w:tr>
+      <w:tr>
+        <w:tc>
+          <w:tcPr>
+            <w:tcW w:type="dxa" w:w="2422"/>
+            <w:shd w:val="clear" w:color="auto" w:fill="B8B3D6"/>
+            <w:tcBorders>
+              <w:top w:val="single" w:sz="4" w:space="0" w:color="CBCBCB"/>
+              <w:left w:val="single" w:sz="4" w:space="0" w:color="CBCBCB"/>
+              <w:bottom w:val="single" w:sz="4" w:space="0" w:color="CBCBCB"/>
+              <w:right w:val="single" w:sz="4" w:space="0" w:color="CBCBCB"/>
+            </w:tcBorders>
+          </w:tcPr>
+          <w:p>
+            <w:r>
+              <w:rPr>
+                <w:b/>
+                <w:sz w:val="20"/>
+              </w:rPr>
+              <w:t>V7</w:t>
+            </w:r>
+          </w:p>
+        </w:tc>
+        <w:tc>
+          <w:tcPr>
+            <w:tcW w:type="dxa" w:w="2422"/>
+            <w:shd w:val="clear" w:color="auto" w:fill="B8B3D6"/>
+            <w:tcBorders>
+              <w:top w:val="single" w:sz="4" w:space="0" w:color="CBCBCB"/>
+              <w:left w:val="single" w:sz="4" w:space="0" w:color="CBCBCB"/>
+              <w:bottom w:val="single" w:sz="4" w:space="0" w:color="CBCBCB"/>
+              <w:right w:val="single" w:sz="4" w:space="0" w:color="CBCBCB"/>
+            </w:tcBorders>
+          </w:tcPr>
+          <w:p>
+            <w:r>
+              <w:rPr>
+                <w:sz w:val="20"/>
+              </w:rPr>
+              <w:t>F06 agent security</w:t>
+            </w:r>
+          </w:p>
+        </w:tc>
+        <w:tc>
+          <w:tcPr>
+            <w:tcW w:type="dxa" w:w="2422"/>
+            <w:shd w:val="clear" w:color="auto" w:fill="B8B3D6"/>
+            <w:tcBorders>
+              <w:top w:val="single" w:sz="4" w:space="0" w:color="CBCBCB"/>
+              <w:left w:val="single" w:sz="4" w:space="0" w:color="CBCBCB"/>
+              <w:bottom w:val="single" w:sz="4" w:space="0" w:color="CBCBCB"/>
+              <w:right w:val="single" w:sz="4" w:space="0" w:color="CBCBCB"/>
+            </w:tcBorders>
+          </w:tcPr>
+          <w:p>
+            <w:r>
+              <w:rPr>
+                <w:sz w:val="20"/>
+              </w:rPr>
+              <w:t xml:space="preserve">✅ </w:t>
+            </w:r>
+            <w:r>
+              <w:rPr>
+                <w:b/>
+                <w:sz w:val="20"/>
+              </w:rPr>
+              <w:t>PASS</w:t>
+            </w:r>
+          </w:p>
+        </w:tc>
+        <w:tc>
+          <w:tcPr>
+            <w:tcW w:type="dxa" w:w="2422"/>
+            <w:shd w:val="clear" w:color="auto" w:fill="B8B3D6"/>
+            <w:tcBorders>
+              <w:top w:val="single" w:sz="4" w:space="0" w:color="CBCBCB"/>
+              <w:left w:val="single" w:sz="4" w:space="0" w:color="CBCBCB"/>
+              <w:bottom w:val="single" w:sz="4" w:space="0" w:color="CBCBCB"/>
+              <w:right w:val="single" w:sz="4" w:space="0" w:color="CBCBCB"/>
+            </w:tcBorders>
+          </w:tcPr>
+          <w:p>
+            <w:r>
+              <w:rPr>
+                <w:sz w:val="20"/>
+              </w:rPr>
+              <w:t xml:space="preserve">Wizard default </w:t>
+            </w:r>
+            <w:r>
+              <w:rPr>
+                <w:rFonts w:ascii="Courier New" w:hAnsi="Courier New"/>
+                <w:color w:val="F05922"/>
+                <w:sz w:val="20"/>
+              </w:rPr>
+              <w:t>AllowedClientIPs</w:t>
+            </w:r>
+            <w:r>
+              <w:rPr>
+                <w:sz w:val="20"/>
+              </w:rPr>
+              <w:t xml:space="preserve"> = </w:t>
+            </w:r>
+            <w:r>
+              <w:rPr>
+                <w:rFonts w:ascii="Courier New" w:hAnsi="Courier New"/>
+                <w:color w:val="F05922"/>
+                <w:sz w:val="20"/>
+              </w:rPr>
+              <w:t>192.168.0.0/16,10.0.0.0/8,172.16.0.0/12</w:t>
+            </w:r>
+            <w:r>
+              <w:rPr>
+                <w:sz w:val="20"/>
+              </w:rPr>
+              <w:t xml:space="preserve"> (không còn </w:t>
+            </w:r>
+            <w:r>
+              <w:rPr>
+                <w:rFonts w:ascii="Courier New" w:hAnsi="Courier New"/>
+                <w:color w:val="F05922"/>
+                <w:sz w:val="20"/>
+              </w:rPr>
+              <w:t>0.0.0.0/0</w:t>
+            </w:r>
+            <w:r>
+              <w:rPr>
+                <w:sz w:val="20"/>
+              </w:rPr>
+              <w:t xml:space="preserve">). Cài mới qua wizard → </w:t>
+            </w:r>
+            <w:r>
+              <w:rPr>
+                <w:rFonts w:ascii="Courier New" w:hAnsi="Courier New"/>
+                <w:color w:val="F05922"/>
+                <w:sz w:val="20"/>
+              </w:rPr>
+              <w:t>appsettings.json</w:t>
+            </w:r>
+            <w:r>
+              <w:rPr>
+                <w:sz w:val="20"/>
+              </w:rPr>
+              <w:t xml:space="preserve"> trên ZCU ghi </w:t>
+            </w:r>
+            <w:r>
+              <w:rPr>
+                <w:b/>
+                <w:sz w:val="20"/>
+              </w:rPr>
+              <w:t>mảng 3 CIDR riêng biệt</w:t>
+            </w:r>
+            <w:r>
+              <w:rPr>
+                <w:sz w:val="20"/>
+              </w:rPr>
+              <w:t xml:space="preserve"> đúng dạng; CCU </w:t>
+            </w:r>
+            <w:r>
+              <w:rPr>
+                <w:rFonts w:ascii="Courier New" w:hAnsi="Courier New"/>
+                <w:color w:val="F05922"/>
+                <w:sz w:val="20"/>
+              </w:rPr>
+              <w:t>192.168.0.100</w:t>
+            </w:r>
+            <w:r>
+              <w:rPr>
+                <w:sz w:val="20"/>
+              </w:rPr>
+              <w:t xml:space="preserve"> (thuộc </w:t>
+            </w:r>
+            <w:r>
+              <w:rPr>
+                <w:rFonts w:ascii="Courier New" w:hAnsi="Courier New"/>
+                <w:color w:val="F05922"/>
+                <w:sz w:val="20"/>
+              </w:rPr>
+              <w:t>192.168.0.0/16</w:t>
+            </w:r>
+            <w:r>
+              <w:rPr>
+                <w:sz w:val="20"/>
+              </w:rPr>
+              <w:t>) kết nối + stream ZCU bình thường (agent log "accepted connection from 192.168.0.100"). Nhập token ngắn (</w:t>
+            </w:r>
+            <w:r>
+              <w:rPr>
+                <w:rFonts w:ascii="Courier New" w:hAnsi="Courier New"/>
+                <w:color w:val="F05922"/>
+                <w:sz w:val="20"/>
+              </w:rPr>
+              <w:t>short123</w:t>
+            </w:r>
+            <w:r>
+              <w:rPr>
+                <w:sz w:val="20"/>
+              </w:rPr>
+              <w:t xml:space="preserve"> &lt; 16) + </w:t>
+            </w:r>
+            <w:r>
+              <w:rPr>
+                <w:rFonts w:ascii="Courier New" w:hAnsi="Courier New"/>
+                <w:color w:val="F05922"/>
+                <w:sz w:val="20"/>
+              </w:rPr>
+              <w:t>0.0.0.0/0</w:t>
+            </w:r>
+            <w:r>
+              <w:rPr>
+                <w:sz w:val="20"/>
+              </w:rPr>
+              <w:t xml:space="preserve"> → wizard ghi </w:t>
+            </w:r>
+            <w:r>
+              <w:rPr>
+                <w:b/>
+                <w:sz w:val="20"/>
+              </w:rPr>
+              <w:t>2 dòng CẢNH BÁO BẢO MẬT</w:t>
+            </w:r>
+            <w:r>
+              <w:rPr>
+                <w:sz w:val="20"/>
+              </w:rPr>
+              <w:t xml:space="preserve"> vào Nhật ký Cài đặt; agent ZCU cũng log </w:t>
+            </w:r>
+            <w:r>
+              <w:rPr>
+                <w:rFonts w:ascii="Courier New" w:hAnsi="Courier New"/>
+                <w:color w:val="F05922"/>
+                <w:sz w:val="20"/>
+              </w:rPr>
+              <w:t>SECURITY: Token is only … chars</w:t>
+            </w:r>
+            <w:r>
+              <w:rPr>
+                <w:sz w:val="20"/>
+              </w:rPr>
+              <w:t xml:space="preserve">. </w:t>
+            </w:r>
+            <w:r>
+              <w:rPr>
+                <w:rFonts w:ascii="Courier New" w:hAnsi="Courier New"/>
+                <w:color w:val="F05922"/>
+                <w:sz w:val="20"/>
+              </w:rPr>
+              <w:t>verify-v7-connect-lan-cidr.png</w:t>
+            </w:r>
+            <w:r>
+              <w:rPr>
+                <w:sz w:val="20"/>
+              </w:rPr>
+              <w:t xml:space="preserve">, </w:t>
+            </w:r>
+            <w:r>
+              <w:rPr>
+                <w:rFonts w:ascii="Courier New" w:hAnsi="Courier New"/>
+                <w:color w:val="F05922"/>
+                <w:sz w:val="20"/>
+              </w:rPr>
+              <w:t>verify-v7-wizard-security-warning.png</w:t>
+            </w:r>
+            <w:r>
+              <w:rPr>
+                <w:sz w:val="20"/>
+              </w:rPr>
+              <w:t xml:space="preserve"> (bằng chứng text log trong mục dưới)</w:t>
+            </w:r>
+          </w:p>
+        </w:tc>
+      </w:tr>
+    </w:tbl>
+    <w:p/>
+    <w:p>
+      <w:pPr>
+        <w:spacing w:after="80"/>
+      </w:pPr>
+      <w:r>
+        <w:rPr>
+          <w:b/>
+          <w:sz w:val="21"/>
+        </w:rPr>
+        <w:t>Tổng: 7 PASS / 0 FAIL / 0 SKIP.</w:t>
+      </w:r>
+    </w:p>
+    <w:p>
+      <w:pPr>
+        <w:pStyle w:val="Heading3"/>
+        <w:spacing w:before="160" w:after="60"/>
+      </w:pPr>
+      <w:r>
+        <w:rPr>
+          <w:color w:val="4A3F8C"/>
+          <w:sz w:val="24"/>
+        </w:rPr>
+        <w:t>Regression test nhanh (luồng chính) — tất cả OK</w:t>
+      </w:r>
+    </w:p>
+    <w:p>
+      <w:pPr>
+        <w:pStyle w:val="ListBullet"/>
+        <w:spacing w:after="20"/>
+        <w:ind w:left="283"/>
+      </w:pPr>
+      <w:r>
+        <w:rPr>
+          <w:b/>
+          <w:sz w:val="21"/>
+        </w:rPr>
+        <w:t>Kết nối + xem màn hình:</w:t>
+      </w:r>
+      <w:r>
+        <w:rPr>
+          <w:sz w:val="21"/>
+        </w:rPr>
+        <w:t xml:space="preserve"> connect VietAnh (agent 1.1) → stream ZCU realtime OK, không dialog cảnh báo.</w:t>
+      </w:r>
+    </w:p>
+    <w:p>
+      <w:pPr>
+        <w:pStyle w:val="ListBullet"/>
+        <w:spacing w:after="20"/>
+        <w:ind w:left="283"/>
+      </w:pPr>
+      <w:r>
+        <w:rPr>
+          <w:b/>
+          <w:sz w:val="21"/>
+        </w:rPr>
+        <w:t>CMD Shell chạy lệnh:</w:t>
+      </w:r>
+      <w:r>
+        <w:rPr>
+          <w:sz w:val="21"/>
+        </w:rPr>
+        <w:t xml:space="preserve"> </w:t>
+      </w:r>
+      <w:r>
+        <w:rPr>
+          <w:rFonts w:ascii="Courier New" w:hAnsi="Courier New"/>
+          <w:color w:val="F05922"/>
+          <w:sz w:val="21"/>
+        </w:rPr>
+        <w:t>uname -a &amp;&amp; df -h /</w:t>
+      </w:r>
+      <w:r>
+        <w:rPr>
+          <w:sz w:val="21"/>
+        </w:rPr>
+        <w:t xml:space="preserve"> trả kết quả đúng (Linux ubuntu-22 … / 67G 38%).</w:t>
+      </w:r>
+    </w:p>
+    <w:p>
+      <w:pPr>
+        <w:pStyle w:val="ListBullet"/>
+        <w:spacing w:after="20"/>
+        <w:ind w:left="283"/>
+      </w:pPr>
+      <w:r>
+        <w:rPr>
+          <w:b/>
+          <w:sz w:val="21"/>
+        </w:rPr>
+        <w:t>FileManager (SFTP) duyệt:</w:t>
+      </w:r>
+      <w:r>
+        <w:rPr>
+          <w:sz w:val="21"/>
+        </w:rPr>
+        <w:t xml:space="preserve"> browse </w:t>
+      </w:r>
+      <w:r>
+        <w:rPr>
+          <w:rFonts w:ascii="Courier New" w:hAnsi="Courier New"/>
+          <w:color w:val="F05922"/>
+          <w:sz w:val="21"/>
+        </w:rPr>
+        <w:t>/home/kztek/ipgs/remote-agent</w:t>
+      </w:r>
+      <w:r>
+        <w:rPr>
+          <w:sz w:val="21"/>
+        </w:rPr>
+        <w:t xml:space="preserve"> → tải đúng 36 mục, hiển thị danh sách file/kích thước/thời gian (appsettings.json, ZcuAgent.dll…). </w:t>
+      </w:r>
+      <w:r>
+        <w:rPr>
+          <w:rFonts w:ascii="Courier New" w:hAnsi="Courier New"/>
+          <w:color w:val="F05922"/>
+          <w:sz w:val="21"/>
+        </w:rPr>
+        <w:t>verify-regression-filemanager.png</w:t>
+      </w:r>
+    </w:p>
+    <w:p>
+      <w:pPr>
+        <w:pStyle w:val="ListBullet"/>
+        <w:spacing w:after="20"/>
+        <w:ind w:left="283"/>
+      </w:pPr>
+      <w:r>
+        <w:rPr>
+          <w:b/>
+          <w:sz w:val="21"/>
+        </w:rPr>
+        <w:t>BulkAction song song:</w:t>
+      </w:r>
+      <w:r>
+        <w:rPr>
+          <w:sz w:val="21"/>
+        </w:rPr>
+        <w:t xml:space="preserve"> 2 máy chạy đồng thời, máy lỗi không chặn máy thành công.</w:t>
+      </w:r>
+    </w:p>
+    <w:p>
+      <w:pPr>
+        <w:pStyle w:val="ListBullet"/>
+        <w:spacing w:after="20"/>
+        <w:ind w:left="283"/>
+      </w:pPr>
+      <w:r>
+        <w:rPr>
+          <w:b/>
+          <w:sz w:val="21"/>
+        </w:rPr>
+        <w:t>Wizard 7/7 bước:</w:t>
+      </w:r>
+      <w:r>
+        <w:rPr>
+          <w:sz w:val="21"/>
+        </w:rPr>
+        <w:t xml:space="preserve"> cài đặt hoàn tất ~15s, agent tự restart về </w:t>
+      </w:r>
+      <w:r>
+        <w:rPr>
+          <w:rFonts w:ascii="Courier New" w:hAnsi="Courier New"/>
+          <w:color w:val="F05922"/>
+          <w:sz w:val="21"/>
+        </w:rPr>
+        <w:t>active</w:t>
+      </w:r>
+      <w:r>
+        <w:rPr>
+          <w:sz w:val="21"/>
+        </w:rPr>
+        <w:t>.</w:t>
+      </w:r>
+    </w:p>
+    <w:p>
+      <w:pPr>
+        <w:pStyle w:val="Heading3"/>
+        <w:spacing w:before="160" w:after="60"/>
+      </w:pPr>
+      <w:r>
+        <w:rPr>
+          <w:color w:val="4A3F8C"/>
+          <w:sz w:val="24"/>
+        </w:rPr>
+        <w:t>Bằng chứng text — cảnh báo bảo mật wizard (V7, token yếu + 0.0.0.0/0)</w:t>
+      </w:r>
+    </w:p>
+    <w:p>
+      <w:pPr>
+        <w:spacing w:before="80" w:after="80"/>
+        <w:ind w:left="283"/>
+        <w:shd w:val="clear" w:color="auto" w:fill="F4F4F8"/>
+      </w:pPr>
+      <w:r>
+        <w:rPr>
+          <w:rFonts w:ascii="Courier New" w:hAnsi="Courier New"/>
+          <w:color w:val="251C53"/>
+          <w:sz w:val="18"/>
+        </w:rPr>
+        <w:t>[23:01:23] ⚠ CẢNH BÁO BẢO MẬT: Token ngắn hơn 16 ký tự - dễ bị đoán. Dùng nút 🎲 Sinh Token để tạo token ngẫu nhiên mạnh.</w:t>
+        <w:br/>
+        <w:t>[23:01:23] ⚠ CẢNH BÁO BẢO MẬT: AllowedClientIPs đang mở cho MỌI IP (0.0.0.0/0) - nên giới hạn về dải LAN quản trị (VD 192.168.0.0/16).</w:t>
+      </w:r>
+    </w:p>
+    <w:p>
+      <w:pPr>
+        <w:spacing w:after="80"/>
+      </w:pPr>
+      <w:r>
+        <w:rPr>
+          <w:sz w:val="21"/>
+        </w:rPr>
+        <w:t>Agent ZCU (journalctl) khi Token = 5 ký tự:</w:t>
+      </w:r>
+    </w:p>
+    <w:p>
+      <w:pPr>
+        <w:spacing w:before="80" w:after="80"/>
+        <w:ind w:left="283"/>
+        <w:shd w:val="clear" w:color="auto" w:fill="F4F4F8"/>
+      </w:pPr>
+      <w:r>
+        <w:rPr>
+          <w:rFonts w:ascii="Courier New" w:hAnsi="Courier New"/>
+          <w:color w:val="251C53"/>
+          <w:sz w:val="18"/>
+        </w:rPr>
+        <w:t>warn: SECURITY: RemoteControl:Token is only 5 chars — short tokens are guessable. Generate a strong random token (&gt;= 32 chars) via the CCU Setup Wizard.</w:t>
+      </w:r>
+    </w:p>
+    <w:p>
+      <w:pPr>
+        <w:pStyle w:val="Heading3"/>
+        <w:spacing w:before="160" w:after="60"/>
+      </w:pPr>
+      <w:r>
+        <w:rPr>
+          <w:color w:val="4A3F8C"/>
+          <w:sz w:val="24"/>
+        </w:rPr>
+        <w:t>Ảnh tài liệu chụp lại (do fix đổi giao diện)</w:t>
+      </w:r>
+    </w:p>
+    <w:p>
+      <w:pPr>
+        <w:pStyle w:val="ListBullet"/>
+        <w:spacing w:after="20"/>
+        <w:ind w:left="283"/>
+      </w:pPr>
+      <w:r>
+        <w:rPr>
+          <w:rFonts w:ascii="Courier New" w:hAnsi="Courier New"/>
+          <w:color w:val="F05922"/>
+          <w:sz w:val="21"/>
+        </w:rPr>
+        <w:t>docs/user-manuals/screenshots/zcu-setup-wizard-default.png</w:t>
+      </w:r>
+      <w:r>
+        <w:rPr>
+          <w:sz w:val="21"/>
+        </w:rPr>
+        <w:t xml:space="preserve"> — ô AllowedClientIPs nay hiển thị 3 dải LAN riêng (token đã che). Khớp caption Hình 53 (đã đúng sẵn — không cần sửa MANUAL).</w:t>
+      </w:r>
+    </w:p>
+    <w:p>
+      <w:pPr>
+        <w:pStyle w:val="ListBullet"/>
+        <w:spacing w:after="20"/>
+        <w:ind w:left="283"/>
+      </w:pPr>
+      <w:r>
+        <w:rPr>
+          <w:rFonts w:ascii="Courier New" w:hAnsi="Courier New"/>
+          <w:color w:val="F05922"/>
+          <w:sz w:val="21"/>
+        </w:rPr>
+        <w:t>docs/user-manuals/screenshots/zcu-terminal-appsettings.png</w:t>
+      </w:r>
+      <w:r>
+        <w:rPr>
+          <w:sz w:val="21"/>
+        </w:rPr>
+        <w:t xml:space="preserve"> — </w:t>
+      </w:r>
+      <w:r>
+        <w:rPr>
+          <w:rFonts w:ascii="Courier New" w:hAnsi="Courier New"/>
+          <w:color w:val="F05922"/>
+          <w:sz w:val="21"/>
+        </w:rPr>
+        <w:t>appsettings.json</w:t>
+      </w:r>
+      <w:r>
+        <w:rPr>
+          <w:sz w:val="21"/>
+        </w:rPr>
+        <w:t xml:space="preserve"> nay có mảng 3 CIDR thay </w:t>
+      </w:r>
+      <w:r>
+        <w:rPr>
+          <w:rFonts w:ascii="Courier New" w:hAnsi="Courier New"/>
+          <w:color w:val="F05922"/>
+          <w:sz w:val="21"/>
+        </w:rPr>
+        <w:t>0.0.0.0/0</w:t>
+      </w:r>
+      <w:r>
+        <w:rPr>
+          <w:sz w:val="21"/>
+        </w:rPr>
+        <w:t xml:space="preserve"> (token đã che). Khớp caption Hình 70.</w:t>
+      </w:r>
+    </w:p>
+    <w:p>
+      <w:pPr>
+        <w:pStyle w:val="ListBullet"/>
+        <w:spacing w:after="20"/>
+        <w:ind w:left="283"/>
+      </w:pPr>
+      <w:r>
+        <w:rPr>
+          <w:sz w:val="21"/>
+        </w:rPr>
+        <w:t xml:space="preserve">MANUAL text đã khớp default mới (Tech Lead cập nhật ở commit review) → không sửa </w:t>
+      </w:r>
+      <w:r>
+        <w:rPr>
+          <w:rFonts w:ascii="Courier New" w:hAnsi="Courier New"/>
+          <w:color w:val="F05922"/>
+          <w:sz w:val="21"/>
+        </w:rPr>
+        <w:t>.md</w:t>
+      </w:r>
+      <w:r>
+        <w:rPr>
+          <w:sz w:val="21"/>
+        </w:rPr>
+        <w:t>, không cần chạy lại md_to_docx.</w:t>
+      </w:r>
+    </w:p>
+    <w:p>
+      <w:pPr>
+        <w:pStyle w:val="Heading3"/>
+        <w:spacing w:before="160" w:after="60"/>
+      </w:pPr>
+      <w:r>
+        <w:rPr>
+          <w:color w:val="4A3F8C"/>
+          <w:sz w:val="24"/>
+        </w:rPr>
+        <w:t>Lỗi mới phát hiện</w:t>
+      </w:r>
+    </w:p>
+    <w:p>
+      <w:pPr>
+        <w:spacing w:after="80"/>
+      </w:pPr>
+      <w:r>
+        <w:rPr>
+          <w:sz w:val="21"/>
+        </w:rPr>
+        <w:t>Không phát hiện lỗi mới trong phạm vi verify (không append F07). Ghi chú không chặn: cửa sổ ZcuSetupWizard tự đóng ~1.5s sau khi cài xong nên khó chụp trạng thái "hoàn tất" — không phải lỗi, chỉ là điểm bất tiện cho việc chụp tài liệu.</w:t>
+      </w:r>
+    </w:p>
+    <w:p>
+      <w:pPr>
+        <w:pStyle w:val="Heading3"/>
+        <w:spacing w:before="160" w:after="60"/>
+      </w:pPr>
+      <w:r>
+        <w:rPr>
+          <w:color w:val="4A3F8C"/>
+          <w:sz w:val="24"/>
+        </w:rPr>
+        <w:t>Kết luận</w:t>
+      </w:r>
+    </w:p>
+    <w:p>
+      <w:pPr>
+        <w:spacing w:after="80"/>
+      </w:pPr>
+      <w:r>
+        <w:rPr>
+          <w:sz w:val="21"/>
+        </w:rPr>
+        <w:t xml:space="preserve">✅ </w:t>
+      </w:r>
+      <w:r>
+        <w:rPr>
+          <w:b/>
+          <w:sz w:val="21"/>
+        </w:rPr>
+        <w:t>Đủ điều kiện SIGN-OFF</w:t>
+      </w:r>
+      <w:r>
+        <w:rPr>
+          <w:sz w:val="21"/>
+        </w:rPr>
+        <w:t xml:space="preserve"> — cả 6 finding F01–F06 (F06 phần agent) đã verify PASS trên app + ZCU thật với agent 1.1; regression luồng chính không bị phá. </w:t>
+      </w:r>
+      <w:r>
+        <w:rPr>
+          <w:b/>
+          <w:sz w:val="21"/>
+        </w:rPr>
+        <w:t>Bàn giao QA Lead sign-off (Bước 5 WF-BUGFIX).</w:t>
+      </w:r>
+      <w:r>
+        <w:rPr>
+          <w:sz w:val="21"/>
+        </w:rPr>
+        <w:t xml:space="preserve"> F06(a) backdoor license </w:t>
+      </w:r>
+      <w:r>
+        <w:rPr>
+          <w:rFonts w:ascii="Courier New" w:hAnsi="Courier New"/>
+          <w:color w:val="F05922"/>
+          <w:sz w:val="18"/>
+        </w:rPr>
+        <w:t>ANHNV</w:t>
+      </w:r>
+      <w:r>
+        <w:rPr>
+          <w:sz w:val="21"/>
+        </w:rPr>
+        <w:t xml:space="preserve"> vẫn ⏭️ giữ nguyên theo quyết định user (ngoài scope vòng fix này).</w:t>
+      </w:r>
+    </w:p>
+    <w:p>
+      <w:pPr>
+        <w:spacing w:after="80"/>
+      </w:pPr>
+      <w:r>
+        <w:rPr>
+          <w:sz w:val="21"/>
+        </w:rPr>
+        <w:t>— QA Engineer, 2026-07-26 23:05</w:t>
       </w:r>
     </w:p>
     <w:sectPr>

</xml_diff>

<commit_message>
[bugfix-ccu-findings] Tech Lead review fix F07, F08
- APPROVE ca 2 commit (fc7fd09 F07, 2727b87 F08) — khong co REQUEST-CHANGES,
  cho phep chuyen QA verify (Buoc 4 WF-BUGFIX)
- F07: regex vi-tri-lenh khong false-positive (echo/cat/grep reboot), dieu kien
  kep khong nuot loi that; comment Optional ve nhanh "timed out" gop mat mang that
- F08: root cause "GDM race" chua chung minh truc tiep (bang chung loai tru) nhung
  fix TimedLogin 5s + verify + exit-code khong phu thuoc chan doan; TimedLogin
  khong ha bao mat tren kiosk da autologin — chap nhan mac dinh; throwOnError
  opt-in dung, cac call site khac khong doi hanh vi
- Bo sung 3 case QA cho F08 (sudo sai, deploy 2 lan idempotent, tat autologin)

Refs: docs/bugs/BUG-ccu-ui-findings-2026-07-26.md
Co-Authored-By: Claude Opus 5 (1M context) <noreply@anthropic.com>
</commit_message>
<xml_diff>
--- a/docs/bugs/BUG-ccu-ui-findings-2026-07-26.docx
+++ b/docs/bugs/BUG-ccu-ui-findings-2026-07-26.docx
@@ -12727,6 +12727,2215 @@
       </w:tr>
     </w:tbl>
     <w:p/>
+    <w:p>
+      <w:pPr>
+        <w:pBdr>
+          <w:bottom w:val="single" w:sz="6" w:space="1" w:color="F05922"/>
+        </w:pBdr>
+        <w:spacing w:after="120"/>
+      </w:pPr>
+    </w:p>
+    <w:p>
+      <w:pPr>
+        <w:pStyle w:val="Heading2"/>
+        <w:spacing w:before="200" w:after="80"/>
+      </w:pPr>
+      <w:r>
+        <w:rPr>
+          <w:color w:val="F05922"/>
+          <w:sz w:val="28"/>
+        </w:rPr>
+        <w:t>Review của Tech Lead — F07, F08 — 2026-07-26 23:38</w:t>
+      </w:r>
+    </w:p>
+    <w:p>
+      <w:pPr>
+        <w:spacing w:after="80"/>
+      </w:pPr>
+      <w:r>
+        <w:rPr>
+          <w:sz w:val="21"/>
+        </w:rPr>
+        <w:t xml:space="preserve">Phạm vi: commit </w:t>
+      </w:r>
+      <w:r>
+        <w:rPr>
+          <w:rFonts w:ascii="Courier New" w:hAnsi="Courier New"/>
+          <w:color w:val="F05922"/>
+          <w:sz w:val="18"/>
+        </w:rPr>
+        <w:t>fc7fd09</w:t>
+      </w:r>
+      <w:r>
+        <w:rPr>
+          <w:sz w:val="21"/>
+        </w:rPr>
+        <w:t xml:space="preserve"> (F07) + </w:t>
+      </w:r>
+      <w:r>
+        <w:rPr>
+          <w:rFonts w:ascii="Courier New" w:hAnsi="Courier New"/>
+          <w:color w:val="F05922"/>
+          <w:sz w:val="18"/>
+        </w:rPr>
+        <w:t>2727b87</w:t>
+      </w:r>
+      <w:r>
+        <w:rPr>
+          <w:sz w:val="21"/>
+        </w:rPr>
+        <w:t xml:space="preserve"> (F08). Đã đọc toàn bộ diff, đối chiếu code hiện hành (</w:t>
+      </w:r>
+      <w:r>
+        <w:rPr>
+          <w:rFonts w:ascii="Courier New" w:hAnsi="Courier New"/>
+          <w:color w:val="F05922"/>
+          <w:sz w:val="18"/>
+        </w:rPr>
+        <w:t>KioskDeployService.cs</w:t>
+      </w:r>
+      <w:r>
+        <w:rPr>
+          <w:sz w:val="21"/>
+        </w:rPr>
+        <w:t xml:space="preserve">, </w:t>
+      </w:r>
+      <w:r>
+        <w:rPr>
+          <w:rFonts w:ascii="Courier New" w:hAnsi="Courier New"/>
+          <w:color w:val="F05922"/>
+          <w:sz w:val="18"/>
+        </w:rPr>
+        <w:t>KioskDeployWindow.axaml.cs</w:t>
+      </w:r>
+      <w:r>
+        <w:rPr>
+          <w:sz w:val="21"/>
+        </w:rPr>
+        <w:t xml:space="preserve">, grep toàn CcuUI tìm đường </w:t>
+      </w:r>
+      <w:r>
+        <w:rPr>
+          <w:rFonts w:ascii="Courier New" w:hAnsi="Courier New"/>
+          <w:color w:val="F05922"/>
+          <w:sz w:val="18"/>
+        </w:rPr>
+        <w:t>[debug]</w:t>
+      </w:r>
+      <w:r>
+        <w:rPr>
+          <w:sz w:val="21"/>
+        </w:rPr>
+        <w:t xml:space="preserve"> khác), MANUAL 6.2.1/9.3, CODE-GRAPH, GOTCHAS G019.</w:t>
+      </w:r>
+    </w:p>
+    <w:p>
+      <w:pPr>
+        <w:pStyle w:val="Heading3"/>
+        <w:spacing w:before="160" w:after="60"/>
+      </w:pPr>
+      <w:r>
+        <w:rPr>
+          <w:color w:val="4A3F8C"/>
+          <w:sz w:val="24"/>
+        </w:rPr>
+        <w:t>Bảng verdict</w:t>
+      </w:r>
+    </w:p>
+    <w:tbl>
+      <w:tblPr>
+        <w:tblStyle w:val="TableGrid"/>
+        <w:tblW w:type="auto" w:w="0"/>
+        <w:tblLook w:firstColumn="1" w:firstRow="1" w:lastColumn="0" w:lastRow="0" w:noHBand="0" w:noVBand="1" w:val="04A0"/>
+      </w:tblPr>
+      <w:tblGrid>
+        <w:gridCol w:w="1938"/>
+        <w:gridCol w:w="1938"/>
+        <w:gridCol w:w="1938"/>
+        <w:gridCol w:w="1938"/>
+        <w:gridCol w:w="1938"/>
+      </w:tblGrid>
+      <w:tr>
+        <w:tc>
+          <w:tcPr>
+            <w:tcW w:type="dxa" w:w="1938"/>
+            <w:shd w:val="clear" w:color="auto" w:fill="251C53"/>
+            <w:tcBorders>
+              <w:top w:val="single" w:sz="4" w:space="0" w:color="251C53"/>
+              <w:left w:val="single" w:sz="4" w:space="0" w:color="251C53"/>
+              <w:bottom w:val="single" w:sz="4" w:space="0" w:color="251C53"/>
+              <w:right w:val="single" w:sz="4" w:space="0" w:color="251C53"/>
+            </w:tcBorders>
+          </w:tcPr>
+          <w:p>
+            <w:r>
+              <w:rPr>
+                <w:b/>
+                <w:color w:val="FFFFFF"/>
+                <w:sz w:val="20"/>
+              </w:rPr>
+              <w:t>#</w:t>
+            </w:r>
+          </w:p>
+        </w:tc>
+        <w:tc>
+          <w:tcPr>
+            <w:tcW w:type="dxa" w:w="1938"/>
+            <w:shd w:val="clear" w:color="auto" w:fill="251C53"/>
+            <w:tcBorders>
+              <w:top w:val="single" w:sz="4" w:space="0" w:color="251C53"/>
+              <w:left w:val="single" w:sz="4" w:space="0" w:color="251C53"/>
+              <w:bottom w:val="single" w:sz="4" w:space="0" w:color="251C53"/>
+              <w:right w:val="single" w:sz="4" w:space="0" w:color="251C53"/>
+            </w:tcBorders>
+          </w:tcPr>
+          <w:p>
+            <w:r>
+              <w:rPr>
+                <w:b/>
+                <w:color w:val="FFFFFF"/>
+                <w:sz w:val="20"/>
+              </w:rPr>
+              <w:t>Thay đổi</w:t>
+            </w:r>
+          </w:p>
+        </w:tc>
+        <w:tc>
+          <w:tcPr>
+            <w:tcW w:type="dxa" w:w="1938"/>
+            <w:shd w:val="clear" w:color="auto" w:fill="251C53"/>
+            <w:tcBorders>
+              <w:top w:val="single" w:sz="4" w:space="0" w:color="251C53"/>
+              <w:left w:val="single" w:sz="4" w:space="0" w:color="251C53"/>
+              <w:bottom w:val="single" w:sz="4" w:space="0" w:color="251C53"/>
+              <w:right w:val="single" w:sz="4" w:space="0" w:color="251C53"/>
+            </w:tcBorders>
+          </w:tcPr>
+          <w:p>
+            <w:r>
+              <w:rPr>
+                <w:b/>
+                <w:color w:val="FFFFFF"/>
+                <w:sz w:val="20"/>
+              </w:rPr>
+              <w:t>Verdict</w:t>
+            </w:r>
+          </w:p>
+        </w:tc>
+        <w:tc>
+          <w:tcPr>
+            <w:tcW w:type="dxa" w:w="1938"/>
+            <w:shd w:val="clear" w:color="auto" w:fill="251C53"/>
+            <w:tcBorders>
+              <w:top w:val="single" w:sz="4" w:space="0" w:color="251C53"/>
+              <w:left w:val="single" w:sz="4" w:space="0" w:color="251C53"/>
+              <w:bottom w:val="single" w:sz="4" w:space="0" w:color="251C53"/>
+              <w:right w:val="single" w:sz="4" w:space="0" w:color="251C53"/>
+            </w:tcBorders>
+          </w:tcPr>
+          <w:p>
+            <w:r>
+              <w:rPr>
+                <w:b/>
+                <w:color w:val="FFFFFF"/>
+                <w:sz w:val="20"/>
+              </w:rPr>
+              <w:t>Nhận xét (kèm severity)</w:t>
+            </w:r>
+          </w:p>
+        </w:tc>
+        <w:tc>
+          <w:tcPr>
+            <w:tcW w:type="dxa" w:w="1938"/>
+            <w:shd w:val="clear" w:color="auto" w:fill="251C53"/>
+            <w:tcBorders>
+              <w:top w:val="single" w:sz="4" w:space="0" w:color="251C53"/>
+              <w:left w:val="single" w:sz="4" w:space="0" w:color="251C53"/>
+              <w:bottom w:val="single" w:sz="4" w:space="0" w:color="251C53"/>
+              <w:right w:val="single" w:sz="4" w:space="0" w:color="251C53"/>
+            </w:tcBorders>
+          </w:tcPr>
+          <w:p>
+            <w:r>
+              <w:rPr>
+                <w:b/>
+                <w:color w:val="FFFFFF"/>
+                <w:sz w:val="20"/>
+              </w:rPr>
+            </w:r>
+          </w:p>
+        </w:tc>
+      </w:tr>
+      <w:tr>
+        <w:tc>
+          <w:tcPr>
+            <w:tcW w:type="dxa" w:w="1938"/>
+            <w:tcBorders>
+              <w:top w:val="single" w:sz="4" w:space="0" w:color="CBCBCB"/>
+              <w:left w:val="single" w:sz="4" w:space="0" w:color="CBCBCB"/>
+              <w:bottom w:val="single" w:sz="4" w:space="0" w:color="CBCBCB"/>
+              <w:right w:val="single" w:sz="4" w:space="0" w:color="CBCBCB"/>
+            </w:tcBorders>
+          </w:tcPr>
+          <w:p>
+            <w:r>
+              <w:rPr>
+                <w:sz w:val="20"/>
+              </w:rPr>
+              <w:t>---</w:t>
+            </w:r>
+          </w:p>
+        </w:tc>
+        <w:tc>
+          <w:tcPr>
+            <w:tcW w:type="dxa" w:w="1938"/>
+            <w:tcBorders>
+              <w:top w:val="single" w:sz="4" w:space="0" w:color="CBCBCB"/>
+              <w:left w:val="single" w:sz="4" w:space="0" w:color="CBCBCB"/>
+              <w:bottom w:val="single" w:sz="4" w:space="0" w:color="CBCBCB"/>
+              <w:right w:val="single" w:sz="4" w:space="0" w:color="CBCBCB"/>
+            </w:tcBorders>
+          </w:tcPr>
+          <w:p>
+            <w:r>
+              <w:rPr>
+                <w:sz w:val="20"/>
+              </w:rPr>
+              <w:t>---</w:t>
+            </w:r>
+          </w:p>
+        </w:tc>
+        <w:tc>
+          <w:tcPr>
+            <w:tcW w:type="dxa" w:w="1938"/>
+            <w:tcBorders>
+              <w:top w:val="single" w:sz="4" w:space="0" w:color="CBCBCB"/>
+              <w:left w:val="single" w:sz="4" w:space="0" w:color="CBCBCB"/>
+              <w:bottom w:val="single" w:sz="4" w:space="0" w:color="CBCBCB"/>
+              <w:right w:val="single" w:sz="4" w:space="0" w:color="CBCBCB"/>
+            </w:tcBorders>
+          </w:tcPr>
+          <w:p>
+            <w:r>
+              <w:rPr>
+                <w:sz w:val="20"/>
+              </w:rPr>
+              <w:t>---</w:t>
+            </w:r>
+          </w:p>
+        </w:tc>
+        <w:tc>
+          <w:tcPr>
+            <w:tcW w:type="dxa" w:w="1938"/>
+            <w:tcBorders>
+              <w:top w:val="single" w:sz="4" w:space="0" w:color="CBCBCB"/>
+              <w:left w:val="single" w:sz="4" w:space="0" w:color="CBCBCB"/>
+              <w:bottom w:val="single" w:sz="4" w:space="0" w:color="CBCBCB"/>
+              <w:right w:val="single" w:sz="4" w:space="0" w:color="CBCBCB"/>
+            </w:tcBorders>
+          </w:tcPr>
+          <w:p>
+            <w:r>
+              <w:rPr>
+                <w:sz w:val="20"/>
+              </w:rPr>
+              <w:t>---</w:t>
+            </w:r>
+          </w:p>
+        </w:tc>
+        <w:tc>
+          <w:tcPr>
+            <w:tcW w:type="dxa" w:w="1938"/>
+            <w:tcBorders>
+              <w:top w:val="single" w:sz="4" w:space="0" w:color="CBCBCB"/>
+              <w:left w:val="single" w:sz="4" w:space="0" w:color="CBCBCB"/>
+              <w:bottom w:val="single" w:sz="4" w:space="0" w:color="CBCBCB"/>
+              <w:right w:val="single" w:sz="4" w:space="0" w:color="CBCBCB"/>
+            </w:tcBorders>
+          </w:tcPr>
+          <w:p/>
+        </w:tc>
+      </w:tr>
+      <w:tr>
+        <w:tc>
+          <w:tcPr>
+            <w:tcW w:type="dxa" w:w="1938"/>
+            <w:shd w:val="clear" w:color="auto" w:fill="B8B3D6"/>
+            <w:tcBorders>
+              <w:top w:val="single" w:sz="4" w:space="0" w:color="CBCBCB"/>
+              <w:left w:val="single" w:sz="4" w:space="0" w:color="CBCBCB"/>
+              <w:bottom w:val="single" w:sz="4" w:space="0" w:color="CBCBCB"/>
+              <w:right w:val="single" w:sz="4" w:space="0" w:color="CBCBCB"/>
+            </w:tcBorders>
+          </w:tcPr>
+          <w:p>
+            <w:r>
+              <w:rPr>
+                <w:sz w:val="20"/>
+              </w:rPr>
+              <w:t>1</w:t>
+            </w:r>
+          </w:p>
+        </w:tc>
+        <w:tc>
+          <w:tcPr>
+            <w:tcW w:type="dxa" w:w="1938"/>
+            <w:shd w:val="clear" w:color="auto" w:fill="B8B3D6"/>
+            <w:tcBorders>
+              <w:top w:val="single" w:sz="4" w:space="0" w:color="CBCBCB"/>
+              <w:left w:val="single" w:sz="4" w:space="0" w:color="CBCBCB"/>
+              <w:bottom w:val="single" w:sz="4" w:space="0" w:color="CBCBCB"/>
+              <w:right w:val="single" w:sz="4" w:space="0" w:color="CBCBCB"/>
+            </w:tcBorders>
+          </w:tcPr>
+          <w:p>
+            <w:r>
+              <w:rPr>
+                <w:sz w:val="20"/>
+              </w:rPr>
+              <w:t xml:space="preserve">F07 — </w:t>
+            </w:r>
+            <w:r>
+              <w:rPr>
+                <w:rFonts w:ascii="Courier New" w:hAnsi="Courier New"/>
+                <w:color w:val="F05922"/>
+                <w:sz w:val="20"/>
+              </w:rPr>
+              <w:t>SshCommandHints.ShutdownPattern</w:t>
+            </w:r>
+            <w:r>
+              <w:rPr>
+                <w:sz w:val="20"/>
+              </w:rPr>
+              <w:t xml:space="preserve"> (</w:t>
+            </w:r>
+            <w:r>
+              <w:rPr>
+                <w:rFonts w:ascii="Courier New" w:hAnsi="Courier New"/>
+                <w:color w:val="F05922"/>
+                <w:sz w:val="20"/>
+              </w:rPr>
+              <w:t>SshCommandHints.cs:22-24</w:t>
+            </w:r>
+            <w:r>
+              <w:rPr>
+                <w:sz w:val="20"/>
+              </w:rPr>
+              <w:t>)</w:t>
+            </w:r>
+          </w:p>
+        </w:tc>
+        <w:tc>
+          <w:tcPr>
+            <w:tcW w:type="dxa" w:w="1938"/>
+            <w:shd w:val="clear" w:color="auto" w:fill="B8B3D6"/>
+            <w:tcBorders>
+              <w:top w:val="single" w:sz="4" w:space="0" w:color="CBCBCB"/>
+              <w:left w:val="single" w:sz="4" w:space="0" w:color="CBCBCB"/>
+              <w:bottom w:val="single" w:sz="4" w:space="0" w:color="CBCBCB"/>
+              <w:right w:val="single" w:sz="4" w:space="0" w:color="CBCBCB"/>
+            </w:tcBorders>
+          </w:tcPr>
+          <w:p>
+            <w:r>
+              <w:rPr>
+                <w:b/>
+                <w:sz w:val="20"/>
+              </w:rPr>
+              <w:t>APPROVE</w:t>
+            </w:r>
+          </w:p>
+        </w:tc>
+        <w:tc>
+          <w:tcPr>
+            <w:tcW w:type="dxa" w:w="1938"/>
+            <w:shd w:val="clear" w:color="auto" w:fill="B8B3D6"/>
+            <w:tcBorders>
+              <w:top w:val="single" w:sz="4" w:space="0" w:color="CBCBCB"/>
+              <w:left w:val="single" w:sz="4" w:space="0" w:color="CBCBCB"/>
+              <w:bottom w:val="single" w:sz="4" w:space="0" w:color="CBCBCB"/>
+              <w:right w:val="single" w:sz="4" w:space="0" w:color="CBCBCB"/>
+            </w:tcBorders>
+          </w:tcPr>
+          <w:p>
+            <w:r>
+              <w:rPr>
+                <w:sz w:val="20"/>
+              </w:rPr>
+              <w:t xml:space="preserve">Đã kiểm tra false-positive: </w:t>
+            </w:r>
+            <w:r>
+              <w:rPr>
+                <w:rFonts w:ascii="Courier New" w:hAnsi="Courier New"/>
+                <w:color w:val="F05922"/>
+                <w:sz w:val="20"/>
+              </w:rPr>
+              <w:t>echo reboot</w:t>
+            </w:r>
+            <w:r>
+              <w:rPr>
+                <w:sz w:val="20"/>
+              </w:rPr>
+              <w:t xml:space="preserve">, </w:t>
+            </w:r>
+            <w:r>
+              <w:rPr>
+                <w:rFonts w:ascii="Courier New" w:hAnsi="Courier New"/>
+                <w:color w:val="F05922"/>
+                <w:sz w:val="20"/>
+              </w:rPr>
+              <w:t>cat /var/log/reboot.log</w:t>
+            </w:r>
+            <w:r>
+              <w:rPr>
+                <w:sz w:val="20"/>
+              </w:rPr>
+              <w:t xml:space="preserve">, </w:t>
+            </w:r>
+            <w:r>
+              <w:rPr>
+                <w:rFonts w:ascii="Courier New" w:hAnsi="Courier New"/>
+                <w:color w:val="F05922"/>
+                <w:sz w:val="20"/>
+              </w:rPr>
+              <w:t>grep reboot f</w:t>
+            </w:r>
+            <w:r>
+              <w:rPr>
+                <w:sz w:val="20"/>
+              </w:rPr>
+              <w:t xml:space="preserve"> đều KHÔNG match (từ khóa phải ở vị trí lệnh — đầu chuỗi hoặc sau `;&amp;\</w:t>
+            </w:r>
+          </w:p>
+        </w:tc>
+        <w:tc>
+          <w:tcPr>
+            <w:tcW w:type="dxa" w:w="1938"/>
+            <w:shd w:val="clear" w:color="auto" w:fill="B8B3D6"/>
+            <w:tcBorders>
+              <w:top w:val="single" w:sz="4" w:space="0" w:color="CBCBCB"/>
+              <w:left w:val="single" w:sz="4" w:space="0" w:color="CBCBCB"/>
+              <w:bottom w:val="single" w:sz="4" w:space="0" w:color="CBCBCB"/>
+              <w:right w:val="single" w:sz="4" w:space="0" w:color="CBCBCB"/>
+            </w:tcBorders>
+          </w:tcPr>
+          <w:p>
+            <w:r>
+              <w:rPr>
+                <w:sz w:val="20"/>
+              </w:rPr>
+              <w:t>(</w:t>
+            </w:r>
+            <w:r>
+              <w:rPr>
+                <w:rFonts w:ascii="Courier New" w:hAnsi="Courier New"/>
+                <w:color w:val="F05922"/>
+                <w:sz w:val="20"/>
+              </w:rPr>
+              <w:t xml:space="preserve">, chỉ cho tiền tố </w:t>
+            </w:r>
+            <w:r>
+              <w:rPr>
+                <w:sz w:val="20"/>
+              </w:rPr>
+              <w:t>sudo [opts]</w:t>
+            </w:r>
+            <w:r>
+              <w:rPr>
+                <w:rFonts w:ascii="Courier New" w:hAnsi="Courier New"/>
+                <w:color w:val="F05922"/>
+                <w:sz w:val="20"/>
+              </w:rPr>
+              <w:t xml:space="preserve">); </w:t>
+            </w:r>
+            <w:r>
+              <w:rPr>
+                <w:sz w:val="20"/>
+              </w:rPr>
+              <w:t>x &amp;&amp; reboot</w:t>
+            </w:r>
+            <w:r>
+              <w:rPr>
+                <w:rFonts w:ascii="Courier New" w:hAnsi="Courier New"/>
+                <w:color w:val="F05922"/>
+                <w:sz w:val="20"/>
+              </w:rPr>
+              <w:t xml:space="preserve">, </w:t>
+            </w:r>
+            <w:r>
+              <w:rPr>
+                <w:sz w:val="20"/>
+              </w:rPr>
+              <w:t>sudo reboot</w:t>
+            </w:r>
+            <w:r>
+              <w:rPr>
+                <w:rFonts w:ascii="Courier New" w:hAnsi="Courier New"/>
+                <w:color w:val="F05922"/>
+                <w:sz w:val="20"/>
+              </w:rPr>
+              <w:t xml:space="preserve"> match đúng. **FYI:** </w:t>
+            </w:r>
+            <w:r>
+              <w:rPr>
+                <w:sz w:val="20"/>
+              </w:rPr>
+              <w:t>shutdown -c` (hủy hẹn tắt máy) match pattern nhưng vô hại — lệnh này không làm đứt SSH nên điều kiện kép không kích hoạt.</w:t>
+            </w:r>
+          </w:p>
+        </w:tc>
+      </w:tr>
+      <w:tr>
+        <w:tc>
+          <w:tcPr>
+            <w:tcW w:type="dxa" w:w="1938"/>
+            <w:tcBorders>
+              <w:top w:val="single" w:sz="4" w:space="0" w:color="CBCBCB"/>
+              <w:left w:val="single" w:sz="4" w:space="0" w:color="CBCBCB"/>
+              <w:bottom w:val="single" w:sz="4" w:space="0" w:color="CBCBCB"/>
+              <w:right w:val="single" w:sz="4" w:space="0" w:color="CBCBCB"/>
+            </w:tcBorders>
+          </w:tcPr>
+          <w:p>
+            <w:r>
+              <w:rPr>
+                <w:sz w:val="20"/>
+              </w:rPr>
+              <w:t>2</w:t>
+            </w:r>
+          </w:p>
+        </w:tc>
+        <w:tc>
+          <w:tcPr>
+            <w:tcW w:type="dxa" w:w="1938"/>
+            <w:tcBorders>
+              <w:top w:val="single" w:sz="4" w:space="0" w:color="CBCBCB"/>
+              <w:left w:val="single" w:sz="4" w:space="0" w:color="CBCBCB"/>
+              <w:bottom w:val="single" w:sz="4" w:space="0" w:color="CBCBCB"/>
+              <w:right w:val="single" w:sz="4" w:space="0" w:color="CBCBCB"/>
+            </w:tcBorders>
+          </w:tcPr>
+          <w:p>
+            <w:r>
+              <w:rPr>
+                <w:sz w:val="20"/>
+              </w:rPr>
+              <w:t xml:space="preserve">F07 — </w:t>
+            </w:r>
+            <w:r>
+              <w:rPr>
+                <w:rFonts w:ascii="Courier New" w:hAnsi="Courier New"/>
+                <w:color w:val="F05922"/>
+                <w:sz w:val="20"/>
+              </w:rPr>
+              <w:t>IsConnectionDropped</w:t>
+            </w:r>
+            <w:r>
+              <w:rPr>
+                <w:sz w:val="20"/>
+              </w:rPr>
+              <w:t xml:space="preserve"> (</w:t>
+            </w:r>
+            <w:r>
+              <w:rPr>
+                <w:rFonts w:ascii="Courier New" w:hAnsi="Courier New"/>
+                <w:color w:val="F05922"/>
+                <w:sz w:val="20"/>
+              </w:rPr>
+              <w:t>SshCommandHints.cs:47-68</w:t>
+            </w:r>
+            <w:r>
+              <w:rPr>
+                <w:sz w:val="20"/>
+              </w:rPr>
+              <w:t>)</w:t>
+            </w:r>
+          </w:p>
+        </w:tc>
+        <w:tc>
+          <w:tcPr>
+            <w:tcW w:type="dxa" w:w="1938"/>
+            <w:tcBorders>
+              <w:top w:val="single" w:sz="4" w:space="0" w:color="CBCBCB"/>
+              <w:left w:val="single" w:sz="4" w:space="0" w:color="CBCBCB"/>
+              <w:bottom w:val="single" w:sz="4" w:space="0" w:color="CBCBCB"/>
+              <w:right w:val="single" w:sz="4" w:space="0" w:color="CBCBCB"/>
+            </w:tcBorders>
+          </w:tcPr>
+          <w:p>
+            <w:r>
+              <w:rPr>
+                <w:b/>
+                <w:sz w:val="20"/>
+              </w:rPr>
+              <w:t>APPROVE-WITH-COMMENT</w:t>
+            </w:r>
+          </w:p>
+        </w:tc>
+        <w:tc>
+          <w:tcPr>
+            <w:tcW w:type="dxa" w:w="1938"/>
+            <w:tcBorders>
+              <w:top w:val="single" w:sz="4" w:space="0" w:color="CBCBCB"/>
+              <w:left w:val="single" w:sz="4" w:space="0" w:color="CBCBCB"/>
+              <w:bottom w:val="single" w:sz="4" w:space="0" w:color="CBCBCB"/>
+              <w:right w:val="single" w:sz="4" w:space="0" w:color="CBCBCB"/>
+            </w:tcBorders>
+          </w:tcPr>
+          <w:p>
+            <w:r>
+              <w:rPr>
+                <w:b/>
+                <w:sz w:val="20"/>
+              </w:rPr>
+              <w:t>Optional:</w:t>
+            </w:r>
+            <w:r>
+              <w:rPr>
+                <w:sz w:val="20"/>
+              </w:rPr>
+              <w:t xml:space="preserve"> vế </w:t>
+            </w:r>
+            <w:r>
+              <w:rPr>
+                <w:rFonts w:ascii="Courier New" w:hAnsi="Courier New"/>
+                <w:color w:val="F05922"/>
+                <w:sz w:val="20"/>
+              </w:rPr>
+              <w:t>"timed out"</w:t>
+            </w:r>
+            <w:r>
+              <w:rPr>
+                <w:sz w:val="20"/>
+              </w:rPr>
+              <w:t xml:space="preserve"> là rộng nhất — nếu đúng lúc chạy </w:t>
+            </w:r>
+            <w:r>
+              <w:rPr>
+                <w:rFonts w:ascii="Courier New" w:hAnsi="Courier New"/>
+                <w:color w:val="F05922"/>
+                <w:sz w:val="20"/>
+              </w:rPr>
+              <w:t>sudo reboot</w:t>
+            </w:r>
+            <w:r>
+              <w:rPr>
+                <w:sz w:val="20"/>
+              </w:rPr>
+              <w:t xml:space="preserve"> mà mạng chết thật (WiFi rớt/ZCU treo trước khi lệnh tới nơi), app vẫn hiện "ℹ️ Đã gửi lệnh khởi động lại" trong khi lệnh có thể chưa thực thi. Rủi ro CHẤP NHẬN ĐƯỢC cho P3 UX: chỉ xảy ra khi trùng hợp cả 2 điều kiện, thông báo đã dặn "kết nối lại sau ~1 phút" — nếu máy không lên lại, user tự phát hiện. Cân nhắc thêm chữ "nếu sau 2 phút máy không phản hồi, kiểm tra lại kết nối mạng" vào </w:t>
+            </w:r>
+            <w:r>
+              <w:rPr>
+                <w:rFonts w:ascii="Courier New" w:hAnsi="Courier New"/>
+                <w:color w:val="F05922"/>
+                <w:sz w:val="20"/>
+              </w:rPr>
+              <w:t>ShutdownInfoMessage</w:t>
+            </w:r>
+            <w:r>
+              <w:rPr>
+                <w:sz w:val="20"/>
+              </w:rPr>
+              <w:t xml:space="preserve"> ở vòng sau.</w:t>
+            </w:r>
+          </w:p>
+        </w:tc>
+        <w:tc>
+          <w:tcPr>
+            <w:tcW w:type="dxa" w:w="1938"/>
+            <w:tcBorders>
+              <w:top w:val="single" w:sz="4" w:space="0" w:color="CBCBCB"/>
+              <w:left w:val="single" w:sz="4" w:space="0" w:color="CBCBCB"/>
+              <w:bottom w:val="single" w:sz="4" w:space="0" w:color="CBCBCB"/>
+              <w:right w:val="single" w:sz="4" w:space="0" w:color="CBCBCB"/>
+            </w:tcBorders>
+          </w:tcPr>
+          <w:p/>
+        </w:tc>
+      </w:tr>
+      <w:tr>
+        <w:tc>
+          <w:tcPr>
+            <w:tcW w:type="dxa" w:w="1938"/>
+            <w:shd w:val="clear" w:color="auto" w:fill="B8B3D6"/>
+            <w:tcBorders>
+              <w:top w:val="single" w:sz="4" w:space="0" w:color="CBCBCB"/>
+              <w:left w:val="single" w:sz="4" w:space="0" w:color="CBCBCB"/>
+              <w:bottom w:val="single" w:sz="4" w:space="0" w:color="CBCBCB"/>
+              <w:right w:val="single" w:sz="4" w:space="0" w:color="CBCBCB"/>
+            </w:tcBorders>
+          </w:tcPr>
+          <w:p>
+            <w:r>
+              <w:rPr>
+                <w:sz w:val="20"/>
+              </w:rPr>
+              <w:t>3</w:t>
+            </w:r>
+          </w:p>
+        </w:tc>
+        <w:tc>
+          <w:tcPr>
+            <w:tcW w:type="dxa" w:w="1938"/>
+            <w:shd w:val="clear" w:color="auto" w:fill="B8B3D6"/>
+            <w:tcBorders>
+              <w:top w:val="single" w:sz="4" w:space="0" w:color="CBCBCB"/>
+              <w:left w:val="single" w:sz="4" w:space="0" w:color="CBCBCB"/>
+              <w:bottom w:val="single" w:sz="4" w:space="0" w:color="CBCBCB"/>
+              <w:right w:val="single" w:sz="4" w:space="0" w:color="CBCBCB"/>
+            </w:tcBorders>
+          </w:tcPr>
+          <w:p>
+            <w:r>
+              <w:rPr>
+                <w:sz w:val="20"/>
+              </w:rPr>
+              <w:t xml:space="preserve">F07 — catch điều kiện kép </w:t>
+            </w:r>
+            <w:r>
+              <w:rPr>
+                <w:rFonts w:ascii="Courier New" w:hAnsi="Courier New"/>
+                <w:color w:val="F05922"/>
+                <w:sz w:val="20"/>
+              </w:rPr>
+              <w:t>RemoteCommandWindow.axaml.cs:311-329</w:t>
+            </w:r>
+            <w:r>
+              <w:rPr>
+                <w:sz w:val="20"/>
+              </w:rPr>
+              <w:t xml:space="preserve"> + </w:t>
+            </w:r>
+            <w:r>
+              <w:rPr>
+                <w:rFonts w:ascii="Courier New" w:hAnsi="Courier New"/>
+                <w:color w:val="F05922"/>
+                <w:sz w:val="20"/>
+              </w:rPr>
+              <w:t>BulkActionWindow.axaml.cs:268-281</w:t>
+            </w:r>
+          </w:p>
+        </w:tc>
+        <w:tc>
+          <w:tcPr>
+            <w:tcW w:type="dxa" w:w="1938"/>
+            <w:shd w:val="clear" w:color="auto" w:fill="B8B3D6"/>
+            <w:tcBorders>
+              <w:top w:val="single" w:sz="4" w:space="0" w:color="CBCBCB"/>
+              <w:left w:val="single" w:sz="4" w:space="0" w:color="CBCBCB"/>
+              <w:bottom w:val="single" w:sz="4" w:space="0" w:color="CBCBCB"/>
+              <w:right w:val="single" w:sz="4" w:space="0" w:color="CBCBCB"/>
+            </w:tcBorders>
+          </w:tcPr>
+          <w:p>
+            <w:r>
+              <w:rPr>
+                <w:b/>
+                <w:sz w:val="20"/>
+              </w:rPr>
+              <w:t>APPROVE</w:t>
+            </w:r>
+          </w:p>
+        </w:tc>
+        <w:tc>
+          <w:tcPr>
+            <w:tcW w:type="dxa" w:w="1938"/>
+            <w:shd w:val="clear" w:color="auto" w:fill="B8B3D6"/>
+            <w:tcBorders>
+              <w:top w:val="single" w:sz="4" w:space="0" w:color="CBCBCB"/>
+              <w:left w:val="single" w:sz="4" w:space="0" w:color="CBCBCB"/>
+              <w:bottom w:val="single" w:sz="4" w:space="0" w:color="CBCBCB"/>
+              <w:right w:val="single" w:sz="4" w:space="0" w:color="CBCBCB"/>
+            </w:tcBorders>
+          </w:tcPr>
+          <w:p>
+            <w:r>
+              <w:rPr>
+                <w:sz w:val="20"/>
+              </w:rPr>
+              <w:t xml:space="preserve">Không nuốt lỗi thật: sai mật khẩu sudo / command-not-found đi qua stderr (không phải exception) → không rơi vào filter; exception khác shutdown-cmd vẫn báo đỏ như cũ. </w:t>
+            </w:r>
+            <w:r>
+              <w:rPr>
+                <w:rFonts w:ascii="Courier New" w:hAnsi="Courier New"/>
+                <w:color w:val="F05922"/>
+                <w:sz w:val="20"/>
+              </w:rPr>
+              <w:t>catch ... when</w:t>
+            </w:r>
+            <w:r>
+              <w:rPr>
+                <w:sz w:val="20"/>
+              </w:rPr>
+              <w:t xml:space="preserve"> ở BulkAction đúng scope per-máy.</w:t>
+            </w:r>
+          </w:p>
+        </w:tc>
+        <w:tc>
+          <w:tcPr>
+            <w:tcW w:type="dxa" w:w="1938"/>
+            <w:shd w:val="clear" w:color="auto" w:fill="B8B3D6"/>
+            <w:tcBorders>
+              <w:top w:val="single" w:sz="4" w:space="0" w:color="CBCBCB"/>
+              <w:left w:val="single" w:sz="4" w:space="0" w:color="CBCBCB"/>
+              <w:bottom w:val="single" w:sz="4" w:space="0" w:color="CBCBCB"/>
+              <w:right w:val="single" w:sz="4" w:space="0" w:color="CBCBCB"/>
+            </w:tcBorders>
+          </w:tcPr>
+          <w:p/>
+        </w:tc>
+      </w:tr>
+      <w:tr>
+        <w:tc>
+          <w:tcPr>
+            <w:tcW w:type="dxa" w:w="1938"/>
+            <w:tcBorders>
+              <w:top w:val="single" w:sz="4" w:space="0" w:color="CBCBCB"/>
+              <w:left w:val="single" w:sz="4" w:space="0" w:color="CBCBCB"/>
+              <w:bottom w:val="single" w:sz="4" w:space="0" w:color="CBCBCB"/>
+              <w:right w:val="single" w:sz="4" w:space="0" w:color="CBCBCB"/>
+            </w:tcBorders>
+          </w:tcPr>
+          <w:p>
+            <w:r>
+              <w:rPr>
+                <w:sz w:val="20"/>
+              </w:rPr>
+              <w:t>4</w:t>
+            </w:r>
+          </w:p>
+        </w:tc>
+        <w:tc>
+          <w:tcPr>
+            <w:tcW w:type="dxa" w:w="1938"/>
+            <w:tcBorders>
+              <w:top w:val="single" w:sz="4" w:space="0" w:color="CBCBCB"/>
+              <w:left w:val="single" w:sz="4" w:space="0" w:color="CBCBCB"/>
+              <w:bottom w:val="single" w:sz="4" w:space="0" w:color="CBCBCB"/>
+              <w:right w:val="single" w:sz="4" w:space="0" w:color="CBCBCB"/>
+            </w:tcBorders>
+          </w:tcPr>
+          <w:p>
+            <w:r>
+              <w:rPr>
+                <w:sz w:val="20"/>
+              </w:rPr>
+              <w:t xml:space="preserve">F07 — gate </w:t>
+            </w:r>
+            <w:r>
+              <w:rPr>
+                <w:rFonts w:ascii="Courier New" w:hAnsi="Courier New"/>
+                <w:color w:val="F05922"/>
+                <w:sz w:val="20"/>
+              </w:rPr>
+              <w:t>[debug]</w:t>
+            </w:r>
+            <w:r>
+              <w:rPr>
+                <w:sz w:val="20"/>
+              </w:rPr>
+              <w:t xml:space="preserve"> bằng env </w:t>
+            </w:r>
+            <w:r>
+              <w:rPr>
+                <w:rFonts w:ascii="Courier New" w:hAnsi="Courier New"/>
+                <w:color w:val="F05922"/>
+                <w:sz w:val="20"/>
+              </w:rPr>
+              <w:t>IPGS_RC_DEBUG</w:t>
+            </w:r>
+            <w:r>
+              <w:rPr>
+                <w:sz w:val="20"/>
+              </w:rPr>
+              <w:t xml:space="preserve"> (</w:t>
+            </w:r>
+            <w:r>
+              <w:rPr>
+                <w:rFonts w:ascii="Courier New" w:hAnsi="Courier New"/>
+                <w:color w:val="F05922"/>
+                <w:sz w:val="20"/>
+              </w:rPr>
+              <w:t>RemoteCommandWindow.axaml.cs:78-81</w:t>
+            </w:r>
+            <w:r>
+              <w:rPr>
+                <w:sz w:val="20"/>
+              </w:rPr>
+              <w:t>)</w:t>
+            </w:r>
+          </w:p>
+        </w:tc>
+        <w:tc>
+          <w:tcPr>
+            <w:tcW w:type="dxa" w:w="1938"/>
+            <w:tcBorders>
+              <w:top w:val="single" w:sz="4" w:space="0" w:color="CBCBCB"/>
+              <w:left w:val="single" w:sz="4" w:space="0" w:color="CBCBCB"/>
+              <w:bottom w:val="single" w:sz="4" w:space="0" w:color="CBCBCB"/>
+              <w:right w:val="single" w:sz="4" w:space="0" w:color="CBCBCB"/>
+            </w:tcBorders>
+          </w:tcPr>
+          <w:p>
+            <w:r>
+              <w:rPr>
+                <w:b/>
+                <w:sz w:val="20"/>
+              </w:rPr>
+              <w:t>APPROVE</w:t>
+            </w:r>
+          </w:p>
+        </w:tc>
+        <w:tc>
+          <w:tcPr>
+            <w:tcW w:type="dxa" w:w="1938"/>
+            <w:tcBorders>
+              <w:top w:val="single" w:sz="4" w:space="0" w:color="CBCBCB"/>
+              <w:left w:val="single" w:sz="4" w:space="0" w:color="CBCBCB"/>
+              <w:bottom w:val="single" w:sz="4" w:space="0" w:color="CBCBCB"/>
+              <w:right w:val="single" w:sz="4" w:space="0" w:color="CBCBCB"/>
+            </w:tcBorders>
+          </w:tcPr>
+          <w:p>
+            <w:r>
+              <w:rPr>
+                <w:sz w:val="20"/>
+              </w:rPr>
+              <w:t xml:space="preserve">Env var hợp lý hơn </w:t>
+            </w:r>
+            <w:r>
+              <w:rPr>
+                <w:rFonts w:ascii="Courier New" w:hAnsi="Courier New"/>
+                <w:color w:val="F05922"/>
+                <w:sz w:val="20"/>
+              </w:rPr>
+              <w:t>#if DEBUG</w:t>
+            </w:r>
+            <w:r>
+              <w:rPr>
+                <w:sz w:val="20"/>
+              </w:rPr>
+              <w:t xml:space="preserve"> (bật được trên bản Release hiện trường, lý do đã ghi trong code). Grep toàn CcuUI xác nhận chỉ còn 1 điểm gọi </w:t>
+            </w:r>
+            <w:r>
+              <w:rPr>
+                <w:rFonts w:ascii="Courier New" w:hAnsi="Courier New"/>
+                <w:color w:val="F05922"/>
+                <w:sz w:val="20"/>
+              </w:rPr>
+              <w:t>diag?.Invoke</w:t>
+            </w:r>
+            <w:r>
+              <w:rPr>
+                <w:sz w:val="20"/>
+              </w:rPr>
+              <w:t xml:space="preserve"> và </w:t>
+            </w:r>
+            <w:r>
+              <w:rPr>
+                <w:rFonts w:ascii="Courier New" w:hAnsi="Courier New"/>
+                <w:color w:val="F05922"/>
+                <w:sz w:val="20"/>
+              </w:rPr>
+              <w:t>bashCmd</w:t>
+            </w:r>
+            <w:r>
+              <w:rPr>
+                <w:sz w:val="20"/>
+              </w:rPr>
+              <w:t xml:space="preserve"> không chứa mật khẩu (password đi qua stdin — S3). Không còn đường lộ khác.</w:t>
+            </w:r>
+          </w:p>
+        </w:tc>
+        <w:tc>
+          <w:tcPr>
+            <w:tcW w:type="dxa" w:w="1938"/>
+            <w:tcBorders>
+              <w:top w:val="single" w:sz="4" w:space="0" w:color="CBCBCB"/>
+              <w:left w:val="single" w:sz="4" w:space="0" w:color="CBCBCB"/>
+              <w:bottom w:val="single" w:sz="4" w:space="0" w:color="CBCBCB"/>
+              <w:right w:val="single" w:sz="4" w:space="0" w:color="CBCBCB"/>
+            </w:tcBorders>
+          </w:tcPr>
+          <w:p/>
+        </w:tc>
+      </w:tr>
+      <w:tr>
+        <w:tc>
+          <w:tcPr>
+            <w:tcW w:type="dxa" w:w="1938"/>
+            <w:shd w:val="clear" w:color="auto" w:fill="B8B3D6"/>
+            <w:tcBorders>
+              <w:top w:val="single" w:sz="4" w:space="0" w:color="CBCBCB"/>
+              <w:left w:val="single" w:sz="4" w:space="0" w:color="CBCBCB"/>
+              <w:bottom w:val="single" w:sz="4" w:space="0" w:color="CBCBCB"/>
+              <w:right w:val="single" w:sz="4" w:space="0" w:color="CBCBCB"/>
+            </w:tcBorders>
+          </w:tcPr>
+          <w:p>
+            <w:r>
+              <w:rPr>
+                <w:sz w:val="20"/>
+              </w:rPr>
+              <w:t>5</w:t>
+            </w:r>
+          </w:p>
+        </w:tc>
+        <w:tc>
+          <w:tcPr>
+            <w:tcW w:type="dxa" w:w="1938"/>
+            <w:shd w:val="clear" w:color="auto" w:fill="B8B3D6"/>
+            <w:tcBorders>
+              <w:top w:val="single" w:sz="4" w:space="0" w:color="CBCBCB"/>
+              <w:left w:val="single" w:sz="4" w:space="0" w:color="CBCBCB"/>
+              <w:bottom w:val="single" w:sz="4" w:space="0" w:color="CBCBCB"/>
+              <w:right w:val="single" w:sz="4" w:space="0" w:color="CBCBCB"/>
+            </w:tcBorders>
+          </w:tcPr>
+          <w:p>
+            <w:r>
+              <w:rPr>
+                <w:sz w:val="20"/>
+              </w:rPr>
+              <w:t>F08 — kết luận root cause "GDM race hiếm"</w:t>
+            </w:r>
+          </w:p>
+        </w:tc>
+        <w:tc>
+          <w:tcPr>
+            <w:tcW w:type="dxa" w:w="1938"/>
+            <w:shd w:val="clear" w:color="auto" w:fill="B8B3D6"/>
+            <w:tcBorders>
+              <w:top w:val="single" w:sz="4" w:space="0" w:color="CBCBCB"/>
+              <w:left w:val="single" w:sz="4" w:space="0" w:color="CBCBCB"/>
+              <w:bottom w:val="single" w:sz="4" w:space="0" w:color="CBCBCB"/>
+              <w:right w:val="single" w:sz="4" w:space="0" w:color="CBCBCB"/>
+            </w:tcBorders>
+          </w:tcPr>
+          <w:p>
+            <w:r>
+              <w:rPr>
+                <w:b/>
+                <w:sz w:val="20"/>
+              </w:rPr>
+              <w:t>APPROVE-WITH-COMMENT</w:t>
+            </w:r>
+          </w:p>
+        </w:tc>
+        <w:tc>
+          <w:tcPr>
+            <w:tcW w:type="dxa" w:w="1938"/>
+            <w:shd w:val="clear" w:color="auto" w:fill="B8B3D6"/>
+            <w:tcBorders>
+              <w:top w:val="single" w:sz="4" w:space="0" w:color="CBCBCB"/>
+              <w:left w:val="single" w:sz="4" w:space="0" w:color="CBCBCB"/>
+              <w:bottom w:val="single" w:sz="4" w:space="0" w:color="CBCBCB"/>
+              <w:right w:val="single" w:sz="4" w:space="0" w:color="CBCBCB"/>
+            </w:tcBorders>
+          </w:tcPr>
+          <w:p>
+            <w:r>
+              <w:rPr>
+                <w:sz w:val="20"/>
+              </w:rPr>
+              <w:t xml:space="preserve">Nói thẳng: chẩn đoán này </w:t>
+            </w:r>
+            <w:r>
+              <w:rPr>
+                <w:b/>
+                <w:sz w:val="20"/>
+              </w:rPr>
+              <w:t>chưa được chứng minh trực tiếp</w:t>
+            </w:r>
+            <w:r>
+              <w:rPr>
+                <w:sz w:val="20"/>
+              </w:rPr>
+              <w:t xml:space="preserve"> — bằng chứng là loại trừ (config đúng từ 24/07, mọi boot có journal đều </w:t>
+            </w:r>
+            <w:r>
+              <w:rPr>
+                <w:rFonts w:ascii="Courier New" w:hAnsi="Courier New"/>
+                <w:color w:val="F05922"/>
+                <w:sz w:val="20"/>
+              </w:rPr>
+              <w:t>gdm-autologin</w:t>
+            </w:r>
+            <w:r>
+              <w:rPr>
+                <w:sz w:val="20"/>
+              </w:rPr>
+              <w:t xml:space="preserve"> OK, boot lỗi 17:13 KHÔNG có journal nên không thể xác nhận điều gì đã xảy ra). "Không có journal" nghĩa là không loại trừ được nguyên nhân khác (VM crash giữa boot, disk chưa flush). TUY NHIÊN chấp nhận được vì </w:t>
+            </w:r>
+            <w:r>
+              <w:rPr>
+                <w:b/>
+                <w:sz w:val="20"/>
+              </w:rPr>
+              <w:t>cách sửa không phụ thuộc chẩn đoán đúng</w:t>
+            </w:r>
+            <w:r>
+              <w:rPr>
+                <w:sz w:val="20"/>
+              </w:rPr>
+              <w:t>: TimedLogin 5s là defense-in-depth che mọi trường hợp greeter hiện ra bất kể lý do; verify-sau-ghi + exit-code che nhánh "ghi fail". Yêu cầu: nếu lỗi tái diễn sau bản này (greeter đứng &gt; 10s) → mở finding mới, không đóng bằng "race hiếm" lần nữa.</w:t>
+            </w:r>
+          </w:p>
+        </w:tc>
+        <w:tc>
+          <w:tcPr>
+            <w:tcW w:type="dxa" w:w="1938"/>
+            <w:shd w:val="clear" w:color="auto" w:fill="B8B3D6"/>
+            <w:tcBorders>
+              <w:top w:val="single" w:sz="4" w:space="0" w:color="CBCBCB"/>
+              <w:left w:val="single" w:sz="4" w:space="0" w:color="CBCBCB"/>
+              <w:bottom w:val="single" w:sz="4" w:space="0" w:color="CBCBCB"/>
+              <w:right w:val="single" w:sz="4" w:space="0" w:color="CBCBCB"/>
+            </w:tcBorders>
+          </w:tcPr>
+          <w:p/>
+        </w:tc>
+      </w:tr>
+      <w:tr>
+        <w:tc>
+          <w:tcPr>
+            <w:tcW w:type="dxa" w:w="1938"/>
+            <w:tcBorders>
+              <w:top w:val="single" w:sz="4" w:space="0" w:color="CBCBCB"/>
+              <w:left w:val="single" w:sz="4" w:space="0" w:color="CBCBCB"/>
+              <w:bottom w:val="single" w:sz="4" w:space="0" w:color="CBCBCB"/>
+              <w:right w:val="single" w:sz="4" w:space="0" w:color="CBCBCB"/>
+            </w:tcBorders>
+          </w:tcPr>
+          <w:p>
+            <w:r>
+              <w:rPr>
+                <w:sz w:val="20"/>
+              </w:rPr>
+              <w:t>6</w:t>
+            </w:r>
+          </w:p>
+        </w:tc>
+        <w:tc>
+          <w:tcPr>
+            <w:tcW w:type="dxa" w:w="1938"/>
+            <w:tcBorders>
+              <w:top w:val="single" w:sz="4" w:space="0" w:color="CBCBCB"/>
+              <w:left w:val="single" w:sz="4" w:space="0" w:color="CBCBCB"/>
+              <w:bottom w:val="single" w:sz="4" w:space="0" w:color="CBCBCB"/>
+              <w:right w:val="single" w:sz="4" w:space="0" w:color="CBCBCB"/>
+            </w:tcBorders>
+          </w:tcPr>
+          <w:p>
+            <w:r>
+              <w:rPr>
+                <w:sz w:val="20"/>
+              </w:rPr>
+              <w:t xml:space="preserve">F08 — </w:t>
+            </w:r>
+            <w:r>
+              <w:rPr>
+                <w:rFonts w:ascii="Courier New" w:hAnsi="Courier New"/>
+                <w:color w:val="F05922"/>
+                <w:sz w:val="20"/>
+              </w:rPr>
+              <w:t>TimedLogin</w:t>
+            </w:r>
+            <w:r>
+              <w:rPr>
+                <w:sz w:val="20"/>
+              </w:rPr>
+              <w:t xml:space="preserve"> fallback 5s mặc định</w:t>
+            </w:r>
+          </w:p>
+        </w:tc>
+        <w:tc>
+          <w:tcPr>
+            <w:tcW w:type="dxa" w:w="1938"/>
+            <w:tcBorders>
+              <w:top w:val="single" w:sz="4" w:space="0" w:color="CBCBCB"/>
+              <w:left w:val="single" w:sz="4" w:space="0" w:color="CBCBCB"/>
+              <w:bottom w:val="single" w:sz="4" w:space="0" w:color="CBCBCB"/>
+              <w:right w:val="single" w:sz="4" w:space="0" w:color="CBCBCB"/>
+            </w:tcBorders>
+          </w:tcPr>
+          <w:p>
+            <w:r>
+              <w:rPr>
+                <w:b/>
+                <w:sz w:val="20"/>
+              </w:rPr>
+              <w:t>APPROVE-WITH-COMMENT</w:t>
+            </w:r>
+          </w:p>
+        </w:tc>
+        <w:tc>
+          <w:tcPr>
+            <w:tcW w:type="dxa" w:w="1938"/>
+            <w:tcBorders>
+              <w:top w:val="single" w:sz="4" w:space="0" w:color="CBCBCB"/>
+              <w:left w:val="single" w:sz="4" w:space="0" w:color="CBCBCB"/>
+              <w:bottom w:val="single" w:sz="4" w:space="0" w:color="CBCBCB"/>
+              <w:right w:val="single" w:sz="4" w:space="0" w:color="CBCBCB"/>
+            </w:tcBorders>
+          </w:tcPr>
+          <w:p>
+            <w:r>
+              <w:rPr>
+                <w:sz w:val="20"/>
+              </w:rPr>
+              <w:t xml:space="preserve">Tác dụng phụ có thật: TimedLogin áp dụng ở MỌI lần greeter hiện (kể cả sau khi admin chủ động Log Out để đăng nhập tài khoản khác) — có cửa sổ 5s trước khi máy tự vào lại kztek; GDM hủy đếm ngược khi user tương tác greeter nên thực tế vẫn đăng nhập tài khoản khác được. Trên thiết bị kiosk đã bật AutomaticLogin thì TimedLogin </w:t>
+            </w:r>
+            <w:r>
+              <w:rPr>
+                <w:b/>
+                <w:sz w:val="20"/>
+              </w:rPr>
+              <w:t>không hạ thêm mức bảo mật nào</w:t>
+            </w:r>
+            <w:r>
+              <w:rPr>
+                <w:sz w:val="20"/>
+              </w:rPr>
+              <w:t xml:space="preserve"> (ai chạm máy cũng đã vào được desktop). Chấp nhận mặc định, KHÔNG cần tách thành option riêng cho scope kiosk. </w:t>
+            </w:r>
+            <w:r>
+              <w:rPr>
+                <w:b/>
+                <w:sz w:val="20"/>
+              </w:rPr>
+              <w:t>Nit:</w:t>
+            </w:r>
+            <w:r>
+              <w:rPr>
+                <w:sz w:val="20"/>
+              </w:rPr>
+              <w:t xml:space="preserve"> nên ghi 1 câu vào MANUAL 9.3 rằng khi Log Out thủ công máy sẽ tự đăng nhập lại sau 5s nếu không thao tác — tránh kỹ thuật viên bất ngờ.</w:t>
+            </w:r>
+          </w:p>
+        </w:tc>
+        <w:tc>
+          <w:tcPr>
+            <w:tcW w:type="dxa" w:w="1938"/>
+            <w:tcBorders>
+              <w:top w:val="single" w:sz="4" w:space="0" w:color="CBCBCB"/>
+              <w:left w:val="single" w:sz="4" w:space="0" w:color="CBCBCB"/>
+              <w:bottom w:val="single" w:sz="4" w:space="0" w:color="CBCBCB"/>
+              <w:right w:val="single" w:sz="4" w:space="0" w:color="CBCBCB"/>
+            </w:tcBorders>
+          </w:tcPr>
+          <w:p/>
+        </w:tc>
+      </w:tr>
+      <w:tr>
+        <w:tc>
+          <w:tcPr>
+            <w:tcW w:type="dxa" w:w="1938"/>
+            <w:shd w:val="clear" w:color="auto" w:fill="B8B3D6"/>
+            <w:tcBorders>
+              <w:top w:val="single" w:sz="4" w:space="0" w:color="CBCBCB"/>
+              <w:left w:val="single" w:sz="4" w:space="0" w:color="CBCBCB"/>
+              <w:bottom w:val="single" w:sz="4" w:space="0" w:color="CBCBCB"/>
+              <w:right w:val="single" w:sz="4" w:space="0" w:color="CBCBCB"/>
+            </w:tcBorders>
+          </w:tcPr>
+          <w:p>
+            <w:r>
+              <w:rPr>
+                <w:sz w:val="20"/>
+              </w:rPr>
+              <w:t>7</w:t>
+            </w:r>
+          </w:p>
+        </w:tc>
+        <w:tc>
+          <w:tcPr>
+            <w:tcW w:type="dxa" w:w="1938"/>
+            <w:shd w:val="clear" w:color="auto" w:fill="B8B3D6"/>
+            <w:tcBorders>
+              <w:top w:val="single" w:sz="4" w:space="0" w:color="CBCBCB"/>
+              <w:left w:val="single" w:sz="4" w:space="0" w:color="CBCBCB"/>
+              <w:bottom w:val="single" w:sz="4" w:space="0" w:color="CBCBCB"/>
+              <w:right w:val="single" w:sz="4" w:space="0" w:color="CBCBCB"/>
+            </w:tcBorders>
+          </w:tcPr>
+          <w:p>
+            <w:r>
+              <w:rPr>
+                <w:sz w:val="20"/>
+              </w:rPr>
+              <w:t xml:space="preserve">F08 — </w:t>
+            </w:r>
+            <w:r>
+              <w:rPr>
+                <w:rFonts w:ascii="Courier New" w:hAnsi="Courier New"/>
+                <w:color w:val="F05922"/>
+                <w:sz w:val="20"/>
+              </w:rPr>
+              <w:t>RunCommand</w:t>
+            </w:r>
+            <w:r>
+              <w:rPr>
+                <w:sz w:val="20"/>
+              </w:rPr>
+              <w:t xml:space="preserve"> thêm </w:t>
+            </w:r>
+            <w:r>
+              <w:rPr>
+                <w:rFonts w:ascii="Courier New" w:hAnsi="Courier New"/>
+                <w:color w:val="F05922"/>
+                <w:sz w:val="20"/>
+              </w:rPr>
+              <w:t>throwOnError</w:t>
+            </w:r>
+            <w:r>
+              <w:rPr>
+                <w:sz w:val="20"/>
+              </w:rPr>
+              <w:t xml:space="preserve"> (</w:t>
+            </w:r>
+            <w:r>
+              <w:rPr>
+                <w:rFonts w:ascii="Courier New" w:hAnsi="Courier New"/>
+                <w:color w:val="F05922"/>
+                <w:sz w:val="20"/>
+              </w:rPr>
+              <w:t>KioskDeployService.cs:216-247</w:t>
+            </w:r>
+            <w:r>
+              <w:rPr>
+                <w:sz w:val="20"/>
+              </w:rPr>
+              <w:t>)</w:t>
+            </w:r>
+          </w:p>
+        </w:tc>
+        <w:tc>
+          <w:tcPr>
+            <w:tcW w:type="dxa" w:w="1938"/>
+            <w:shd w:val="clear" w:color="auto" w:fill="B8B3D6"/>
+            <w:tcBorders>
+              <w:top w:val="single" w:sz="4" w:space="0" w:color="CBCBCB"/>
+              <w:left w:val="single" w:sz="4" w:space="0" w:color="CBCBCB"/>
+              <w:bottom w:val="single" w:sz="4" w:space="0" w:color="CBCBCB"/>
+              <w:right w:val="single" w:sz="4" w:space="0" w:color="CBCBCB"/>
+            </w:tcBorders>
+          </w:tcPr>
+          <w:p>
+            <w:r>
+              <w:rPr>
+                <w:b/>
+                <w:sz w:val="20"/>
+              </w:rPr>
+              <w:t>APPROVE</w:t>
+            </w:r>
+          </w:p>
+        </w:tc>
+        <w:tc>
+          <w:tcPr>
+            <w:tcW w:type="dxa" w:w="1938"/>
+            <w:shd w:val="clear" w:color="auto" w:fill="B8B3D6"/>
+            <w:tcBorders>
+              <w:top w:val="single" w:sz="4" w:space="0" w:color="CBCBCB"/>
+              <w:left w:val="single" w:sz="4" w:space="0" w:color="CBCBCB"/>
+              <w:bottom w:val="single" w:sz="4" w:space="0" w:color="CBCBCB"/>
+              <w:right w:val="single" w:sz="4" w:space="0" w:color="CBCBCB"/>
+            </w:tcBorders>
+          </w:tcPr>
+          <w:p>
+            <w:r>
+              <w:rPr>
+                <w:sz w:val="20"/>
+              </w:rPr>
+              <w:t xml:space="preserve">Opt-in đúng cách: default </w:t>
+            </w:r>
+            <w:r>
+              <w:rPr>
+                <w:rFonts w:ascii="Courier New" w:hAnsi="Courier New"/>
+                <w:color w:val="F05922"/>
+                <w:sz w:val="20"/>
+              </w:rPr>
+              <w:t>false</w:t>
+            </w:r>
+            <w:r>
+              <w:rPr>
+                <w:sz w:val="20"/>
+              </w:rPr>
+              <w:t>, chỉ 2 call site script bật (dòng 165, 179) — các call site khác (</w:t>
+            </w:r>
+            <w:r>
+              <w:rPr>
+                <w:rFonts w:ascii="Courier New" w:hAnsi="Courier New"/>
+                <w:color w:val="F05922"/>
+                <w:sz w:val="20"/>
+              </w:rPr>
+              <w:t>chmod</w:t>
+            </w:r>
+            <w:r>
+              <w:rPr>
+                <w:sz w:val="20"/>
+              </w:rPr>
+              <w:t xml:space="preserve"> dòng 138, health-check) không đổi hành vi. Exception nổi lên qua </w:t>
+            </w:r>
+            <w:r>
+              <w:rPr>
+                <w:rFonts w:ascii="Courier New" w:hAnsi="Courier New"/>
+                <w:color w:val="F05922"/>
+                <w:sz w:val="20"/>
+              </w:rPr>
+              <w:t>Task.Run</w:t>
+            </w:r>
+            <w:r>
+              <w:rPr>
+                <w:sz w:val="20"/>
+              </w:rPr>
+              <w:t xml:space="preserve"> → </w:t>
+            </w:r>
+            <w:r>
+              <w:rPr>
+                <w:rFonts w:ascii="Courier New" w:hAnsi="Courier New"/>
+                <w:color w:val="F05922"/>
+                <w:sz w:val="20"/>
+              </w:rPr>
+              <w:t>KioskDeployWindow.axaml.cs:113-117</w:t>
+            </w:r>
+            <w:r>
+              <w:rPr>
+                <w:sz w:val="20"/>
+              </w:rPr>
+              <w:t xml:space="preserve"> bắt và hiện "❌ Deploy thất bại" (đã kiểm chứng). </w:t>
+            </w:r>
+            <w:r>
+              <w:rPr>
+                <w:rFonts w:ascii="Courier New" w:hAnsi="Courier New"/>
+                <w:color w:val="F05922"/>
+                <w:sz w:val="20"/>
+              </w:rPr>
+              <w:t>using var ssh</w:t>
+            </w:r>
+            <w:r>
+              <w:rPr>
+                <w:sz w:val="20"/>
+              </w:rPr>
+              <w:t xml:space="preserve"> (dòng 120) đảm bảo dispose khi ném giữa chừng. Fail giữa chừng để máy ở trạng thái cấu hình dở là chấp nhận được: script idempotent, chạy Deploy lại là đủ — tốt hơn hẳn "thành công giả" cũ; không cần rollback tự động. </w:t>
+            </w:r>
+            <w:r>
+              <w:rPr>
+                <w:b/>
+                <w:sz w:val="20"/>
+              </w:rPr>
+              <w:t>FYI:</w:t>
+            </w:r>
+            <w:r>
+              <w:rPr>
+                <w:sz w:val="20"/>
+              </w:rPr>
+              <w:t xml:space="preserve"> </w:t>
+            </w:r>
+            <w:r>
+              <w:rPr>
+                <w:rFonts w:ascii="Courier New" w:hAnsi="Courier New"/>
+                <w:color w:val="F05922"/>
+                <w:sz w:val="20"/>
+              </w:rPr>
+              <w:t>cmd.ExitStatus ?? 0</w:t>
+            </w:r>
+            <w:r>
+              <w:rPr>
+                <w:sz w:val="20"/>
+              </w:rPr>
+              <w:t xml:space="preserve"> coi null (kết nối đứt) là thành công — hiếm, và trường hợp đó thường đã ném exception ở tầng SSH.NET.</w:t>
+            </w:r>
+          </w:p>
+        </w:tc>
+        <w:tc>
+          <w:tcPr>
+            <w:tcW w:type="dxa" w:w="1938"/>
+            <w:shd w:val="clear" w:color="auto" w:fill="B8B3D6"/>
+            <w:tcBorders>
+              <w:top w:val="single" w:sz="4" w:space="0" w:color="CBCBCB"/>
+              <w:left w:val="single" w:sz="4" w:space="0" w:color="CBCBCB"/>
+              <w:bottom w:val="single" w:sz="4" w:space="0" w:color="CBCBCB"/>
+              <w:right w:val="single" w:sz="4" w:space="0" w:color="CBCBCB"/>
+            </w:tcBorders>
+          </w:tcPr>
+          <w:p/>
+        </w:tc>
+      </w:tr>
+      <w:tr>
+        <w:tc>
+          <w:tcPr>
+            <w:tcW w:type="dxa" w:w="1938"/>
+            <w:tcBorders>
+              <w:top w:val="single" w:sz="4" w:space="0" w:color="CBCBCB"/>
+              <w:left w:val="single" w:sz="4" w:space="0" w:color="CBCBCB"/>
+              <w:bottom w:val="single" w:sz="4" w:space="0" w:color="CBCBCB"/>
+              <w:right w:val="single" w:sz="4" w:space="0" w:color="CBCBCB"/>
+            </w:tcBorders>
+          </w:tcPr>
+          <w:p>
+            <w:r>
+              <w:rPr>
+                <w:sz w:val="20"/>
+              </w:rPr>
+              <w:t>8</w:t>
+            </w:r>
+          </w:p>
+        </w:tc>
+        <w:tc>
+          <w:tcPr>
+            <w:tcW w:type="dxa" w:w="1938"/>
+            <w:tcBorders>
+              <w:top w:val="single" w:sz="4" w:space="0" w:color="CBCBCB"/>
+              <w:left w:val="single" w:sz="4" w:space="0" w:color="CBCBCB"/>
+              <w:bottom w:val="single" w:sz="4" w:space="0" w:color="CBCBCB"/>
+              <w:right w:val="single" w:sz="4" w:space="0" w:color="CBCBCB"/>
+            </w:tcBorders>
+          </w:tcPr>
+          <w:p>
+            <w:r>
+              <w:rPr>
+                <w:sz w:val="20"/>
+              </w:rPr>
+              <w:t xml:space="preserve">F08 — </w:t>
+            </w:r>
+            <w:r>
+              <w:rPr>
+                <w:rFonts w:ascii="Courier New" w:hAnsi="Courier New"/>
+                <w:color w:val="F05922"/>
+                <w:sz w:val="20"/>
+              </w:rPr>
+              <w:t>2-configure-system.sh</w:t>
+            </w:r>
+            <w:r>
+              <w:rPr>
+                <w:sz w:val="20"/>
+              </w:rPr>
+              <w:t xml:space="preserve"> [6/8] viết lại</w:t>
+            </w:r>
+          </w:p>
+        </w:tc>
+        <w:tc>
+          <w:tcPr>
+            <w:tcW w:type="dxa" w:w="1938"/>
+            <w:tcBorders>
+              <w:top w:val="single" w:sz="4" w:space="0" w:color="CBCBCB"/>
+              <w:left w:val="single" w:sz="4" w:space="0" w:color="CBCBCB"/>
+              <w:bottom w:val="single" w:sz="4" w:space="0" w:color="CBCBCB"/>
+              <w:right w:val="single" w:sz="4" w:space="0" w:color="CBCBCB"/>
+            </w:tcBorders>
+          </w:tcPr>
+          <w:p>
+            <w:r>
+              <w:rPr>
+                <w:b/>
+                <w:sz w:val="20"/>
+              </w:rPr>
+              <w:t>APPROVE-WITH-COMMENT</w:t>
+            </w:r>
+          </w:p>
+        </w:tc>
+        <w:tc>
+          <w:tcPr>
+            <w:tcW w:type="dxa" w:w="1938"/>
+            <w:tcBorders>
+              <w:top w:val="single" w:sz="4" w:space="0" w:color="CBCBCB"/>
+              <w:left w:val="single" w:sz="4" w:space="0" w:color="CBCBCB"/>
+              <w:bottom w:val="single" w:sz="4" w:space="0" w:color="CBCBCB"/>
+              <w:right w:val="single" w:sz="4" w:space="0" w:color="CBCBCB"/>
+            </w:tcBorders>
+          </w:tcPr>
+          <w:p>
+            <w:r>
+              <w:rPr>
+                <w:sz w:val="20"/>
+              </w:rPr>
+              <w:t>Dò DM động đúng cách (</w:t>
+            </w:r>
+            <w:r>
+              <w:rPr>
+                <w:rFonts w:ascii="Courier New" w:hAnsi="Courier New"/>
+                <w:color w:val="F05922"/>
+                <w:sz w:val="20"/>
+              </w:rPr>
+              <w:t>/etc/X11/default-display-manager</w:t>
+            </w:r>
+            <w:r>
+              <w:rPr>
+                <w:sz w:val="20"/>
+              </w:rPr>
+              <w:t xml:space="preserve"> → </w:t>
+            </w:r>
+            <w:r>
+              <w:rPr>
+                <w:rFonts w:ascii="Courier New" w:hAnsi="Courier New"/>
+                <w:color w:val="F05922"/>
+                <w:sz w:val="20"/>
+              </w:rPr>
+              <w:t>readlink -f display-manager.service</w:t>
+            </w:r>
+            <w:r>
+              <w:rPr>
+                <w:sz w:val="20"/>
+              </w:rPr>
+              <w:t xml:space="preserve">, xử lý symlink chuẩn, không parse </w:t>
+            </w:r>
+            <w:r>
+              <w:rPr>
+                <w:rFonts w:ascii="Courier New" w:hAnsi="Courier New"/>
+                <w:color w:val="F05922"/>
+                <w:sz w:val="20"/>
+              </w:rPr>
+              <w:t>systemctl status</w:t>
+            </w:r>
+            <w:r>
+              <w:rPr>
+                <w:sz w:val="20"/>
+              </w:rPr>
+              <w:t>). Idempotent: xóa hết dòng cũ (</w:t>
+            </w:r>
+            <w:r>
+              <w:rPr>
+                <w:rFonts w:ascii="Courier New" w:hAnsi="Courier New"/>
+                <w:color w:val="F05922"/>
+                <w:sz w:val="20"/>
+              </w:rPr>
+              <w:t>Automatic*</w:t>
+            </w:r>
+            <w:r>
+              <w:rPr>
+                <w:sz w:val="20"/>
+              </w:rPr>
+              <w:t>/</w:t>
+            </w:r>
+            <w:r>
+              <w:rPr>
+                <w:rFonts w:ascii="Courier New" w:hAnsi="Courier New"/>
+                <w:color w:val="F05922"/>
+                <w:sz w:val="20"/>
+              </w:rPr>
+              <w:t>Timed*</w:t>
+            </w:r>
+            <w:r>
+              <w:rPr>
+                <w:sz w:val="20"/>
+              </w:rPr>
+              <w:t xml:space="preserve">) rồi ghi lại 1 block — chạy N lần không nhân bản dòng; thiếu section </w:t>
+            </w:r>
+            <w:r>
+              <w:rPr>
+                <w:rFonts w:ascii="Courier New" w:hAnsi="Courier New"/>
+                <w:color w:val="F05922"/>
+                <w:sz w:val="20"/>
+              </w:rPr>
+              <w:t>[daemon]</w:t>
+            </w:r>
+            <w:r>
+              <w:rPr>
+                <w:sz w:val="20"/>
+              </w:rPr>
+              <w:t xml:space="preserve"> → verify grep fail → </w:t>
+            </w:r>
+            <w:r>
+              <w:rPr>
+                <w:rFonts w:ascii="Courier New" w:hAnsi="Courier New"/>
+                <w:color w:val="F05922"/>
+                <w:sz w:val="20"/>
+              </w:rPr>
+              <w:t>AUTOLOGIN-FAILED</w:t>
+            </w:r>
+            <w:r>
+              <w:rPr>
+                <w:sz w:val="20"/>
+              </w:rPr>
+              <w:t xml:space="preserve"> exit 1 (fail đúng hướng). Gotcha </w:t>
+            </w:r>
+            <w:r>
+              <w:rPr>
+                <w:rFonts w:ascii="Courier New" w:hAnsi="Courier New"/>
+                <w:color w:val="F05922"/>
+                <w:sz w:val="20"/>
+              </w:rPr>
+              <w:t>_sudo tee</w:t>
+            </w:r>
+            <w:r>
+              <w:rPr>
+                <w:sz w:val="20"/>
+              </w:rPr>
+              <w:t xml:space="preserve"> chiếm stdin đã né đúng bằng </w:t>
+            </w:r>
+            <w:r>
+              <w:rPr>
+                <w:rFonts w:ascii="Courier New" w:hAnsi="Courier New"/>
+                <w:color w:val="F05922"/>
+                <w:sz w:val="20"/>
+              </w:rPr>
+              <w:t>_sudo bash -c '... &gt; file'</w:t>
+            </w:r>
+            <w:r>
+              <w:rPr>
+                <w:sz w:val="20"/>
+              </w:rPr>
+              <w:t xml:space="preserve"> và ghi vào G019. </w:t>
+            </w:r>
+            <w:r>
+              <w:rPr>
+                <w:b/>
+                <w:sz w:val="20"/>
+              </w:rPr>
+              <w:t>Nit:</w:t>
+            </w:r>
+            <w:r>
+              <w:rPr>
+                <w:sz w:val="20"/>
+              </w:rPr>
+              <w:t xml:space="preserve"> </w:t>
+            </w:r>
+            <w:r>
+              <w:rPr>
+                <w:rFonts w:ascii="Courier New" w:hAnsi="Courier New"/>
+                <w:color w:val="F05922"/>
+                <w:sz w:val="20"/>
+              </w:rPr>
+              <w:t>$KIOSK_USER</w:t>
+            </w:r>
+            <w:r>
+              <w:rPr>
+                <w:sz w:val="20"/>
+              </w:rPr>
+              <w:t xml:space="preserve"> nội suy thẳng vào sed/printf trong double-quote — username chứa </w:t>
+            </w:r>
+            <w:r>
+              <w:rPr>
+                <w:rFonts w:ascii="Courier New" w:hAnsi="Courier New"/>
+                <w:color w:val="F05922"/>
+                <w:sz w:val="20"/>
+              </w:rPr>
+              <w:t>&amp;</w:t>
+            </w:r>
+            <w:r>
+              <w:rPr>
+                <w:sz w:val="20"/>
+              </w:rPr>
+              <w:t xml:space="preserve">, </w:t>
+            </w:r>
+            <w:r>
+              <w:rPr>
+                <w:rFonts w:ascii="Courier New" w:hAnsi="Courier New"/>
+                <w:color w:val="F05922"/>
+                <w:sz w:val="20"/>
+              </w:rPr>
+              <w:t>/</w:t>
+            </w:r>
+            <w:r>
+              <w:rPr>
+                <w:sz w:val="20"/>
+              </w:rPr>
+              <w:t xml:space="preserve">, </w:t>
+            </w:r>
+            <w:r>
+              <w:rPr>
+                <w:rFonts w:ascii="Courier New" w:hAnsi="Courier New"/>
+                <w:color w:val="F05922"/>
+                <w:sz w:val="20"/>
+              </w:rPr>
+              <w:t>'</w:t>
+            </w:r>
+            <w:r>
+              <w:rPr>
+                <w:sz w:val="20"/>
+              </w:rPr>
+              <w:t xml:space="preserve"> sẽ vỡ; thực tế username kiosk do mình kiểm soát (kztek) + đã ShellQuote phía C#, chấp nhận, không cần sửa vòng này.</w:t>
+            </w:r>
+          </w:p>
+        </w:tc>
+        <w:tc>
+          <w:tcPr>
+            <w:tcW w:type="dxa" w:w="1938"/>
+            <w:tcBorders>
+              <w:top w:val="single" w:sz="4" w:space="0" w:color="CBCBCB"/>
+              <w:left w:val="single" w:sz="4" w:space="0" w:color="CBCBCB"/>
+              <w:bottom w:val="single" w:sz="4" w:space="0" w:color="CBCBCB"/>
+              <w:right w:val="single" w:sz="4" w:space="0" w:color="CBCBCB"/>
+            </w:tcBorders>
+          </w:tcPr>
+          <w:p/>
+        </w:tc>
+      </w:tr>
+      <w:tr>
+        <w:tc>
+          <w:tcPr>
+            <w:tcW w:type="dxa" w:w="1938"/>
+            <w:shd w:val="clear" w:color="auto" w:fill="B8B3D6"/>
+            <w:tcBorders>
+              <w:top w:val="single" w:sz="4" w:space="0" w:color="CBCBCB"/>
+              <w:left w:val="single" w:sz="4" w:space="0" w:color="CBCBCB"/>
+              <w:bottom w:val="single" w:sz="4" w:space="0" w:color="CBCBCB"/>
+              <w:right w:val="single" w:sz="4" w:space="0" w:color="CBCBCB"/>
+            </w:tcBorders>
+          </w:tcPr>
+          <w:p>
+            <w:r>
+              <w:rPr>
+                <w:sz w:val="20"/>
+              </w:rPr>
+              <w:t>9</w:t>
+            </w:r>
+          </w:p>
+        </w:tc>
+        <w:tc>
+          <w:tcPr>
+            <w:tcW w:type="dxa" w:w="1938"/>
+            <w:shd w:val="clear" w:color="auto" w:fill="B8B3D6"/>
+            <w:tcBorders>
+              <w:top w:val="single" w:sz="4" w:space="0" w:color="CBCBCB"/>
+              <w:left w:val="single" w:sz="4" w:space="0" w:color="CBCBCB"/>
+              <w:bottom w:val="single" w:sz="4" w:space="0" w:color="CBCBCB"/>
+              <w:right w:val="single" w:sz="4" w:space="0" w:color="CBCBCB"/>
+            </w:tcBorders>
+          </w:tcPr>
+          <w:p>
+            <w:r>
+              <w:rPr>
+                <w:sz w:val="20"/>
+              </w:rPr>
+              <w:t>F08 — thao tác trên ZCU thật</w:t>
+            </w:r>
+          </w:p>
+        </w:tc>
+        <w:tc>
+          <w:tcPr>
+            <w:tcW w:type="dxa" w:w="1938"/>
+            <w:shd w:val="clear" w:color="auto" w:fill="B8B3D6"/>
+            <w:tcBorders>
+              <w:top w:val="single" w:sz="4" w:space="0" w:color="CBCBCB"/>
+              <w:left w:val="single" w:sz="4" w:space="0" w:color="CBCBCB"/>
+              <w:bottom w:val="single" w:sz="4" w:space="0" w:color="CBCBCB"/>
+              <w:right w:val="single" w:sz="4" w:space="0" w:color="CBCBCB"/>
+            </w:tcBorders>
+          </w:tcPr>
+          <w:p>
+            <w:r>
+              <w:rPr>
+                <w:b/>
+                <w:sz w:val="20"/>
+              </w:rPr>
+              <w:t>APPROVE</w:t>
+            </w:r>
+          </w:p>
+        </w:tc>
+        <w:tc>
+          <w:tcPr>
+            <w:tcW w:type="dxa" w:w="1938"/>
+            <w:shd w:val="clear" w:color="auto" w:fill="B8B3D6"/>
+            <w:tcBorders>
+              <w:top w:val="single" w:sz="4" w:space="0" w:color="CBCBCB"/>
+              <w:left w:val="single" w:sz="4" w:space="0" w:color="CBCBCB"/>
+              <w:bottom w:val="single" w:sz="4" w:space="0" w:color="CBCBCB"/>
+              <w:right w:val="single" w:sz="4" w:space="0" w:color="CBCBCB"/>
+            </w:tcBorders>
+          </w:tcPr>
+          <w:p>
+            <w:r>
+              <w:rPr>
+                <w:sz w:val="20"/>
+              </w:rPr>
+              <w:t xml:space="preserve">Có backup </w:t>
+            </w:r>
+            <w:r>
+              <w:rPr>
+                <w:rFonts w:ascii="Courier New" w:hAnsi="Courier New"/>
+                <w:color w:val="F05922"/>
+                <w:sz w:val="20"/>
+              </w:rPr>
+              <w:t>/etc/gdm3/custom.conf.bak-2026-07-26</w:t>
+            </w:r>
+            <w:r>
+              <w:rPr>
+                <w:sz w:val="20"/>
+              </w:rPr>
+              <w:t xml:space="preserve">, thay đổi chỉ 5 dòng trong </w:t>
+            </w:r>
+            <w:r>
+              <w:rPr>
+                <w:rFonts w:ascii="Courier New" w:hAnsi="Courier New"/>
+                <w:color w:val="F05922"/>
+                <w:sz w:val="20"/>
+              </w:rPr>
+              <w:t>[daemon]</w:t>
+            </w:r>
+            <w:r>
+              <w:rPr>
+                <w:sz w:val="20"/>
+              </w:rPr>
+              <w:t>, hoàn tác được bằng copy ngược backup. Kiểm chứng reboot thật (</w:t>
+            </w:r>
+            <w:r>
+              <w:rPr>
+                <w:rFonts w:ascii="Courier New" w:hAnsi="Courier New"/>
+                <w:color w:val="F05922"/>
+                <w:sz w:val="20"/>
+              </w:rPr>
+              <w:t>Service=gdm-autologin</w:t>
+            </w:r>
+            <w:r>
+              <w:rPr>
+                <w:sz w:val="20"/>
+              </w:rPr>
+              <w:t>) là bằng chứng mạnh cho happy path.</w:t>
+            </w:r>
+          </w:p>
+        </w:tc>
+        <w:tc>
+          <w:tcPr>
+            <w:tcW w:type="dxa" w:w="1938"/>
+            <w:shd w:val="clear" w:color="auto" w:fill="B8B3D6"/>
+            <w:tcBorders>
+              <w:top w:val="single" w:sz="4" w:space="0" w:color="CBCBCB"/>
+              <w:left w:val="single" w:sz="4" w:space="0" w:color="CBCBCB"/>
+              <w:bottom w:val="single" w:sz="4" w:space="0" w:color="CBCBCB"/>
+              <w:right w:val="single" w:sz="4" w:space="0" w:color="CBCBCB"/>
+            </w:tcBorders>
+          </w:tcPr>
+          <w:p/>
+        </w:tc>
+      </w:tr>
+      <w:tr>
+        <w:tc>
+          <w:tcPr>
+            <w:tcW w:type="dxa" w:w="1938"/>
+            <w:tcBorders>
+              <w:top w:val="single" w:sz="4" w:space="0" w:color="CBCBCB"/>
+              <w:left w:val="single" w:sz="4" w:space="0" w:color="CBCBCB"/>
+              <w:bottom w:val="single" w:sz="4" w:space="0" w:color="CBCBCB"/>
+              <w:right w:val="single" w:sz="4" w:space="0" w:color="CBCBCB"/>
+            </w:tcBorders>
+          </w:tcPr>
+          <w:p>
+            <w:r>
+              <w:rPr>
+                <w:sz w:val="20"/>
+              </w:rPr>
+              <w:t>10</w:t>
+            </w:r>
+          </w:p>
+        </w:tc>
+        <w:tc>
+          <w:tcPr>
+            <w:tcW w:type="dxa" w:w="1938"/>
+            <w:tcBorders>
+              <w:top w:val="single" w:sz="4" w:space="0" w:color="CBCBCB"/>
+              <w:left w:val="single" w:sz="4" w:space="0" w:color="CBCBCB"/>
+              <w:bottom w:val="single" w:sz="4" w:space="0" w:color="CBCBCB"/>
+              <w:right w:val="single" w:sz="4" w:space="0" w:color="CBCBCB"/>
+            </w:tcBorders>
+          </w:tcPr>
+          <w:p>
+            <w:r>
+              <w:rPr>
+                <w:sz w:val="20"/>
+              </w:rPr>
+              <w:t>Đồng bộ tài liệu (MANUAL 6.2.1 + 9.3, CODE-GRAPH, GOTCHAS G019, BUG report F07/F08)</w:t>
+            </w:r>
+          </w:p>
+        </w:tc>
+        <w:tc>
+          <w:tcPr>
+            <w:tcW w:type="dxa" w:w="1938"/>
+            <w:tcBorders>
+              <w:top w:val="single" w:sz="4" w:space="0" w:color="CBCBCB"/>
+              <w:left w:val="single" w:sz="4" w:space="0" w:color="CBCBCB"/>
+              <w:bottom w:val="single" w:sz="4" w:space="0" w:color="CBCBCB"/>
+              <w:right w:val="single" w:sz="4" w:space="0" w:color="CBCBCB"/>
+            </w:tcBorders>
+          </w:tcPr>
+          <w:p>
+            <w:r>
+              <w:rPr>
+                <w:b/>
+                <w:sz w:val="20"/>
+              </w:rPr>
+              <w:t>APPROVE</w:t>
+            </w:r>
+          </w:p>
+        </w:tc>
+        <w:tc>
+          <w:tcPr>
+            <w:tcW w:type="dxa" w:w="1938"/>
+            <w:tcBorders>
+              <w:top w:val="single" w:sz="4" w:space="0" w:color="CBCBCB"/>
+              <w:left w:val="single" w:sz="4" w:space="0" w:color="CBCBCB"/>
+              <w:bottom w:val="single" w:sz="4" w:space="0" w:color="CBCBCB"/>
+              <w:right w:val="single" w:sz="4" w:space="0" w:color="CBCBCB"/>
+            </w:tcBorders>
+          </w:tcPr>
+          <w:p>
+            <w:r>
+              <w:rPr>
+                <w:sz w:val="20"/>
+              </w:rPr>
+              <w:t xml:space="preserve">Khớp code: MANUAL 6.2.1 mô tả đúng thông báo ℹ️ mới; 9.3 mô tả đúng AUTOLOGIN-VERIFIED/FAILED + TimedLogin 5s + lệnh grep chẩn đoán; CODE-GRAPH có </w:t>
+            </w:r>
+            <w:r>
+              <w:rPr>
+                <w:rFonts w:ascii="Courier New" w:hAnsi="Courier New"/>
+                <w:color w:val="F05922"/>
+                <w:sz w:val="20"/>
+              </w:rPr>
+              <w:t>SshCommandHints.cs</w:t>
+            </w:r>
+            <w:r>
+              <w:rPr>
+                <w:sz w:val="20"/>
+              </w:rPr>
+              <w:t xml:space="preserve"> + env </w:t>
+            </w:r>
+            <w:r>
+              <w:rPr>
+                <w:rFonts w:ascii="Courier New" w:hAnsi="Courier New"/>
+                <w:color w:val="F05922"/>
+                <w:sz w:val="20"/>
+              </w:rPr>
+              <w:t>IPGS_RC_DEBUG</w:t>
+            </w:r>
+            <w:r>
+              <w:rPr>
+                <w:sz w:val="20"/>
+              </w:rPr>
+              <w:t xml:space="preserve">; G019 chính xác kỹ thuật. </w:t>
+            </w:r>
+            <w:r>
+              <w:rPr>
+                <w:b/>
+                <w:sz w:val="20"/>
+              </w:rPr>
+              <w:t>FYI:</w:t>
+            </w:r>
+            <w:r>
+              <w:rPr>
+                <w:sz w:val="20"/>
+              </w:rPr>
+              <w:t xml:space="preserve"> PDF MANUAL/CODE-GRAPH chưa xuất lại được (Word COM RPC lỗi) — đã ghi chú, cần xuất bù khi Word ổn, không block.</w:t>
+            </w:r>
+          </w:p>
+        </w:tc>
+        <w:tc>
+          <w:tcPr>
+            <w:tcW w:type="dxa" w:w="1938"/>
+            <w:tcBorders>
+              <w:top w:val="single" w:sz="4" w:space="0" w:color="CBCBCB"/>
+              <w:left w:val="single" w:sz="4" w:space="0" w:color="CBCBCB"/>
+              <w:bottom w:val="single" w:sz="4" w:space="0" w:color="CBCBCB"/>
+              <w:right w:val="single" w:sz="4" w:space="0" w:color="CBCBCB"/>
+            </w:tcBorders>
+          </w:tcPr>
+          <w:p/>
+        </w:tc>
+      </w:tr>
+    </w:tbl>
+    <w:p/>
+    <w:p>
+      <w:pPr>
+        <w:pStyle w:val="Heading3"/>
+        <w:spacing w:before="160" w:after="60"/>
+      </w:pPr>
+      <w:r>
+        <w:rPr>
+          <w:color w:val="4A3F8C"/>
+          <w:sz w:val="24"/>
+        </w:rPr>
+        <w:t>Kết luận</w:t>
+      </w:r>
+    </w:p>
+    <w:p>
+      <w:pPr>
+        <w:spacing w:after="80"/>
+      </w:pPr>
+      <w:r>
+        <w:rPr>
+          <w:b/>
+          <w:sz w:val="21"/>
+        </w:rPr>
+        <w:t>✅ APPROVE cả 2 commit — cho phép chuyển QA Engineer verify (Bước 4 WF-BUGFIX).</w:t>
+      </w:r>
+      <w:r>
+        <w:rPr>
+          <w:sz w:val="21"/>
+        </w:rPr>
+        <w:t xml:space="preserve"> Không có REQUEST-CHANGES; các comment ở mục 2, 6, 8 là Optional/Nit — không chặn merge, đưa vào backlog cải tiến vòng sau.</w:t>
+      </w:r>
+    </w:p>
+    <w:p>
+      <w:pPr>
+        <w:spacing w:after="80"/>
+      </w:pPr>
+      <w:r>
+        <w:rPr>
+          <w:b/>
+          <w:sz w:val="21"/>
+        </w:rPr>
+        <w:t>Lưu ý cho QA:</w:t>
+      </w:r>
+      <w:r>
+        <w:rPr>
+          <w:sz w:val="21"/>
+        </w:rPr>
+        <w:t xml:space="preserve"> ngoài 5 case smoke test F07 SD đã liệt kê, bổ sung cho F08: (a) Deploy với sudo password SAI → app phải hiện "❌ Deploy thất bại ... AUTOLOGIN-FAILED", KHÔNG còn "🎉 Deploy hoàn tất"; (b) Deploy autologin 2 lần liên tiếp → </w:t>
+      </w:r>
+      <w:r>
+        <w:rPr>
+          <w:rFonts w:ascii="Courier New" w:hAnsi="Courier New"/>
+          <w:color w:val="F05922"/>
+          <w:sz w:val="18"/>
+        </w:rPr>
+        <w:t>custom.conf</w:t>
+      </w:r>
+      <w:r>
+        <w:rPr>
+          <w:sz w:val="21"/>
+        </w:rPr>
+        <w:t xml:space="preserve"> không bị nhân bản dòng; (c) tắt autologin (bỏ tick) → </w:t>
+      </w:r>
+      <w:r>
+        <w:rPr>
+          <w:rFonts w:ascii="Courier New" w:hAnsi="Courier New"/>
+          <w:color w:val="F05922"/>
+          <w:sz w:val="18"/>
+        </w:rPr>
+        <w:t>AutomaticLoginEnable = false</w:t>
+      </w:r>
+      <w:r>
+        <w:rPr>
+          <w:sz w:val="21"/>
+        </w:rPr>
+        <w:t xml:space="preserve"> + </w:t>
+      </w:r>
+      <w:r>
+        <w:rPr>
+          <w:rFonts w:ascii="Courier New" w:hAnsi="Courier New"/>
+          <w:color w:val="F05922"/>
+          <w:sz w:val="18"/>
+        </w:rPr>
+        <w:t>TimedLoginEnable = false</w:t>
+      </w:r>
+      <w:r>
+        <w:rPr>
+          <w:sz w:val="21"/>
+        </w:rPr>
+        <w:t>.</w:t>
+      </w:r>
+    </w:p>
+    <w:p>
+      <w:pPr>
+        <w:spacing w:after="80"/>
+      </w:pPr>
+      <w:r>
+        <w:rPr>
+          <w:sz w:val="21"/>
+        </w:rPr>
+        <w:t>— Tech Lead, 2026-07-26 23:38</w:t>
+      </w:r>
+    </w:p>
     <w:sectPr>
       <w:headerReference w:type="default" r:id="rId9"/>
       <w:footerReference w:type="default" r:id="rId10"/>

</xml_diff>

<commit_message>
[bugfix-ccu-findings] Tech Lead re-review F10 vòng 2
- APPROVE — cho chuyển QA verify. Kiểm chứng thực chất trên diff 2dbd68c:
  R1 ma trận .desktop đúng cả 4 tổ hợp (AS,WD), không còn trạng thái mồ côi
  (unclutter cũng 2 chiều); R2 StartLimitIntervalSec=0 + RestartSec=10 —
  không còn đường vào failed vĩnh viễn; R3 đúng schema (shell.keybindings vs
  wm.keybindings), 13 key = 13 lock khớp 1-1. MANUAL/BUG/CODE-GRAPH khớp code.
- Kèm 10 case QA (Q1-Q10): Q7 gesture + Q8 chạm 1 ngón BẮT BUỘC thử tay tại
  màn cảm ứng thật; còn lại verify được qua SSH/Remote Desktop.

Refs: docs/bugs/BUG-ccu-ui-findings-2026-07-26.md
Co-Authored-By: Claude Opus 5 (1M context) <noreply@anthropic.com>
</commit_message>
<xml_diff>
--- a/docs/bugs/BUG-ccu-ui-findings-2026-07-26.docx
+++ b/docs/bugs/BUG-ccu-ui-findings-2026-07-26.docx
@@ -21621,6 +21621,1863 @@
           <w:sz w:val="21"/>
         </w:rPr>
         <w:t>— Tech Lead, 2026-07-27 00:49</w:t>
+      </w:r>
+    </w:p>
+    <w:p>
+      <w:pPr>
+        <w:pBdr>
+          <w:bottom w:val="single" w:sz="6" w:space="1" w:color="F05922"/>
+        </w:pBdr>
+        <w:spacing w:after="120"/>
+      </w:pPr>
+    </w:p>
+    <w:p>
+      <w:pPr>
+        <w:pStyle w:val="Heading2"/>
+        <w:spacing w:before="200" w:after="80"/>
+      </w:pPr>
+      <w:r>
+        <w:rPr>
+          <w:color w:val="F05922"/>
+          <w:sz w:val="28"/>
+        </w:rPr>
+        <w:t>Re-review Tech Lead — F10 vòng 2 — 2026-07-27 01:00</w:t>
+      </w:r>
+    </w:p>
+    <w:p>
+      <w:pPr>
+        <w:spacing w:after="80"/>
+      </w:pPr>
+      <w:r>
+        <w:rPr>
+          <w:sz w:val="21"/>
+        </w:rPr>
+        <w:t xml:space="preserve">Phạm vi: commit </w:t>
+      </w:r>
+      <w:r>
+        <w:rPr>
+          <w:rFonts w:ascii="Courier New" w:hAnsi="Courier New"/>
+          <w:color w:val="F05922"/>
+          <w:sz w:val="18"/>
+        </w:rPr>
+        <w:t>2dbd68c</w:t>
+      </w:r>
+      <w:r>
+        <w:rPr>
+          <w:sz w:val="21"/>
+        </w:rPr>
+        <w:t xml:space="preserve"> — đã đọc toàn bộ diff </w:t>
+      </w:r>
+      <w:r>
+        <w:rPr>
+          <w:rFonts w:ascii="Courier New" w:hAnsi="Courier New"/>
+          <w:color w:val="F05922"/>
+          <w:sz w:val="18"/>
+        </w:rPr>
+        <w:t>2-configure-system.sh</w:t>
+      </w:r>
+      <w:r>
+        <w:rPr>
+          <w:sz w:val="21"/>
+        </w:rPr>
+        <w:t xml:space="preserve"> + MANUAL + BUG + CODE-GRAPH, tự đối chiếu logic (không tin báo cáo SD nguyên trạng).</w:t>
+      </w:r>
+    </w:p>
+    <w:p>
+      <w:pPr>
+        <w:pStyle w:val="Heading3"/>
+        <w:spacing w:before="160" w:after="60"/>
+      </w:pPr>
+      <w:r>
+        <w:rPr>
+          <w:color w:val="4A3F8C"/>
+          <w:sz w:val="24"/>
+        </w:rPr>
+        <w:t>Verdict: ✅ APPROVE — cho chuyển QA verify</w:t>
+      </w:r>
+    </w:p>
+    <w:tbl>
+      <w:tblPr>
+        <w:tblStyle w:val="TableGrid"/>
+        <w:tblW w:type="auto" w:w="0"/>
+        <w:tblLook w:firstColumn="1" w:firstRow="1" w:lastColumn="0" w:lastRow="0" w:noHBand="0" w:noVBand="1" w:val="04A0"/>
+      </w:tblPr>
+      <w:tblGrid>
+        <w:gridCol w:w="4844"/>
+        <w:gridCol w:w="4844"/>
+      </w:tblGrid>
+      <w:tr>
+        <w:tc>
+          <w:tcPr>
+            <w:tcW w:type="dxa" w:w="4844"/>
+            <w:shd w:val="clear" w:color="auto" w:fill="251C53"/>
+            <w:tcBorders>
+              <w:top w:val="single" w:sz="4" w:space="0" w:color="251C53"/>
+              <w:left w:val="single" w:sz="4" w:space="0" w:color="251C53"/>
+              <w:bottom w:val="single" w:sz="4" w:space="0" w:color="251C53"/>
+              <w:right w:val="single" w:sz="4" w:space="0" w:color="251C53"/>
+            </w:tcBorders>
+          </w:tcPr>
+          <w:p>
+            <w:r>
+              <w:rPr>
+                <w:b/>
+                <w:color w:val="FFFFFF"/>
+                <w:sz w:val="20"/>
+              </w:rPr>
+              <w:t>Điểm</w:t>
+            </w:r>
+          </w:p>
+        </w:tc>
+        <w:tc>
+          <w:tcPr>
+            <w:tcW w:type="dxa" w:w="4844"/>
+            <w:shd w:val="clear" w:color="auto" w:fill="251C53"/>
+            <w:tcBorders>
+              <w:top w:val="single" w:sz="4" w:space="0" w:color="251C53"/>
+              <w:left w:val="single" w:sz="4" w:space="0" w:color="251C53"/>
+              <w:bottom w:val="single" w:sz="4" w:space="0" w:color="251C53"/>
+              <w:right w:val="single" w:sz="4" w:space="0" w:color="251C53"/>
+            </w:tcBorders>
+          </w:tcPr>
+          <w:p>
+            <w:r>
+              <w:rPr>
+                <w:b/>
+                <w:color w:val="FFFFFF"/>
+                <w:sz w:val="20"/>
+              </w:rPr>
+              <w:t>Kết quả kiểm chứng</w:t>
+            </w:r>
+          </w:p>
+        </w:tc>
+      </w:tr>
+      <w:tr>
+        <w:tc>
+          <w:tcPr>
+            <w:tcW w:type="dxa" w:w="4844"/>
+            <w:tcBorders>
+              <w:top w:val="single" w:sz="4" w:space="0" w:color="CBCBCB"/>
+              <w:left w:val="single" w:sz="4" w:space="0" w:color="CBCBCB"/>
+              <w:bottom w:val="single" w:sz="4" w:space="0" w:color="CBCBCB"/>
+              <w:right w:val="single" w:sz="4" w:space="0" w:color="CBCBCB"/>
+            </w:tcBorders>
+          </w:tcPr>
+          <w:p>
+            <w:r>
+              <w:rPr>
+                <w:sz w:val="20"/>
+              </w:rPr>
+              <w:t>---</w:t>
+            </w:r>
+          </w:p>
+        </w:tc>
+        <w:tc>
+          <w:tcPr>
+            <w:tcW w:type="dxa" w:w="4844"/>
+            <w:tcBorders>
+              <w:top w:val="single" w:sz="4" w:space="0" w:color="CBCBCB"/>
+              <w:left w:val="single" w:sz="4" w:space="0" w:color="CBCBCB"/>
+              <w:bottom w:val="single" w:sz="4" w:space="0" w:color="CBCBCB"/>
+              <w:right w:val="single" w:sz="4" w:space="0" w:color="CBCBCB"/>
+            </w:tcBorders>
+          </w:tcPr>
+          <w:p>
+            <w:r>
+              <w:rPr>
+                <w:sz w:val="20"/>
+              </w:rPr>
+              <w:t>---</w:t>
+            </w:r>
+          </w:p>
+        </w:tc>
+      </w:tr>
+      <w:tr>
+        <w:tc>
+          <w:tcPr>
+            <w:tcW w:type="dxa" w:w="4844"/>
+            <w:shd w:val="clear" w:color="auto" w:fill="B8B3D6"/>
+            <w:tcBorders>
+              <w:top w:val="single" w:sz="4" w:space="0" w:color="CBCBCB"/>
+              <w:left w:val="single" w:sz="4" w:space="0" w:color="CBCBCB"/>
+              <w:bottom w:val="single" w:sz="4" w:space="0" w:color="CBCBCB"/>
+              <w:right w:val="single" w:sz="4" w:space="0" w:color="CBCBCB"/>
+            </w:tcBorders>
+          </w:tcPr>
+          <w:p>
+            <w:r>
+              <w:rPr>
+                <w:b/>
+                <w:sz w:val="20"/>
+              </w:rPr>
+              <w:t>R1 — ma trận `.desktop`</w:t>
+            </w:r>
+          </w:p>
+        </w:tc>
+        <w:tc>
+          <w:tcPr>
+            <w:tcW w:type="dxa" w:w="4844"/>
+            <w:shd w:val="clear" w:color="auto" w:fill="B8B3D6"/>
+            <w:tcBorders>
+              <w:top w:val="single" w:sz="4" w:space="0" w:color="CBCBCB"/>
+              <w:left w:val="single" w:sz="4" w:space="0" w:color="CBCBCB"/>
+              <w:bottom w:val="single" w:sz="4" w:space="0" w:color="CBCBCB"/>
+              <w:right w:val="single" w:sz="4" w:space="0" w:color="CBCBCB"/>
+            </w:tcBorders>
+          </w:tcPr>
+          <w:p>
+            <w:r>
+              <w:rPr>
+                <w:sz w:val="20"/>
+              </w:rPr>
+              <w:t xml:space="preserve">✅ ĐÚNG THỰC CHẤT. Đã tự dò 4 tổ hợp trên code mới mục [8/9]: (WD=1,AS=1) → rm app </w:t>
+            </w:r>
+            <w:r>
+              <w:rPr>
+                <w:rFonts w:ascii="Courier New" w:hAnsi="Courier New"/>
+                <w:color w:val="F05922"/>
+                <w:sz w:val="20"/>
+              </w:rPr>
+              <w:t>.desktop</w:t>
+            </w:r>
+            <w:r>
+              <w:rPr>
+                <w:sz w:val="20"/>
+              </w:rPr>
+              <w:t xml:space="preserve">, tạo unclutter, [10] cài service; (WD=1,AS=0) → rm app </w:t>
+            </w:r>
+            <w:r>
+              <w:rPr>
+                <w:rFonts w:ascii="Courier New" w:hAnsi="Courier New"/>
+                <w:color w:val="F05922"/>
+                <w:sz w:val="20"/>
+              </w:rPr>
+              <w:t>.desktop</w:t>
+            </w:r>
+            <w:r>
+              <w:rPr>
+                <w:sz w:val="20"/>
+              </w:rPr>
+              <w:t xml:space="preserve"> + rm unclutter, cài service; (WD=0,AS=1) → tạo </w:t>
+            </w:r>
+            <w:r>
+              <w:rPr>
+                <w:rFonts w:ascii="Courier New" w:hAnsi="Courier New"/>
+                <w:color w:val="F05922"/>
+                <w:sz w:val="20"/>
+              </w:rPr>
+              <w:t>.desktop</w:t>
+            </w:r>
+            <w:r>
+              <w:rPr>
+                <w:sz w:val="20"/>
+              </w:rPr>
+              <w:t xml:space="preserve"> + unclutter, [10] gỡ service (nhánh else gỡ vô điều kiện nếu file unit tồn tại — đã có sẵn từ vòng 1); (WD=0,AS=0) → rm cả 2 </w:t>
+            </w:r>
+            <w:r>
+              <w:rPr>
+                <w:rFonts w:ascii="Courier New" w:hAnsi="Courier New"/>
+                <w:color w:val="F05922"/>
+                <w:sz w:val="20"/>
+              </w:rPr>
+              <w:t>.desktop</w:t>
+            </w:r>
+            <w:r>
+              <w:rPr>
+                <w:sz w:val="20"/>
+              </w:rPr>
+              <w:t xml:space="preserve">, gỡ service. Không còn tổ hợp nào để lại file/service mồ côi khi deploy đè cấu hình cũ khác — cấu trúc </w:t>
+            </w:r>
+            <w:r>
+              <w:rPr>
+                <w:rFonts w:ascii="Courier New" w:hAnsi="Courier New"/>
+                <w:color w:val="F05922"/>
+                <w:sz w:val="20"/>
+              </w:rPr>
+              <w:t>if WD=1 / elif AS=1 / else rm</w:t>
+            </w:r>
+            <w:r>
+              <w:rPr>
+                <w:sz w:val="20"/>
+              </w:rPr>
+              <w:t xml:space="preserve"> đảm bảo trạng thái cuối chỉ phụ thuộc cấu hình VỪA chọn. Bonus đúng: </w:t>
+            </w:r>
+            <w:r>
+              <w:rPr>
+                <w:rFonts w:ascii="Courier New" w:hAnsi="Courier New"/>
+                <w:color w:val="F05922"/>
+                <w:sz w:val="20"/>
+              </w:rPr>
+              <w:t>unclutter.desktop</w:t>
+            </w:r>
+            <w:r>
+              <w:rPr>
+                <w:sz w:val="20"/>
+              </w:rPr>
+              <w:t xml:space="preserve"> giờ cũng 2 chiều (trước đây bỏ tick Autostart không xoá — mồ côi tiềm ẩn cũ).</w:t>
+            </w:r>
+          </w:p>
+        </w:tc>
+      </w:tr>
+      <w:tr>
+        <w:tc>
+          <w:tcPr>
+            <w:tcW w:type="dxa" w:w="4844"/>
+            <w:tcBorders>
+              <w:top w:val="single" w:sz="4" w:space="0" w:color="CBCBCB"/>
+              <w:left w:val="single" w:sz="4" w:space="0" w:color="CBCBCB"/>
+              <w:bottom w:val="single" w:sz="4" w:space="0" w:color="CBCBCB"/>
+              <w:right w:val="single" w:sz="4" w:space="0" w:color="CBCBCB"/>
+            </w:tcBorders>
+          </w:tcPr>
+          <w:p>
+            <w:r>
+              <w:rPr>
+                <w:b/>
+                <w:sz w:val="20"/>
+              </w:rPr>
+              <w:t>R2 — watchdog không chết vĩnh viễn</w:t>
+            </w:r>
+          </w:p>
+        </w:tc>
+        <w:tc>
+          <w:tcPr>
+            <w:tcW w:type="dxa" w:w="4844"/>
+            <w:tcBorders>
+              <w:top w:val="single" w:sz="4" w:space="0" w:color="CBCBCB"/>
+              <w:left w:val="single" w:sz="4" w:space="0" w:color="CBCBCB"/>
+              <w:bottom w:val="single" w:sz="4" w:space="0" w:color="CBCBCB"/>
+              <w:right w:val="single" w:sz="4" w:space="0" w:color="CBCBCB"/>
+            </w:tcBorders>
+          </w:tcPr>
+          <w:p>
+            <w:r>
+              <w:rPr>
+                <w:sz w:val="20"/>
+              </w:rPr>
+              <w:t xml:space="preserve">✅ ĐÚNG. Unit mới: </w:t>
+            </w:r>
+            <w:r>
+              <w:rPr>
+                <w:rFonts w:ascii="Courier New" w:hAnsi="Courier New"/>
+                <w:color w:val="F05922"/>
+                <w:sz w:val="20"/>
+              </w:rPr>
+              <w:t>StartLimitIntervalSec=0</w:t>
+            </w:r>
+            <w:r>
+              <w:rPr>
+                <w:sz w:val="20"/>
+              </w:rPr>
+              <w:t xml:space="preserve"> (tắt hẳn start rate-limit — theo systemd, interval=0 vô hiệu cơ chế StartLimit) + </w:t>
+            </w:r>
+            <w:r>
+              <w:rPr>
+                <w:rFonts w:ascii="Courier New" w:hAnsi="Courier New"/>
+                <w:color w:val="F05922"/>
+                <w:sz w:val="20"/>
+              </w:rPr>
+              <w:t>Restart=always</w:t>
+            </w:r>
+            <w:r>
+              <w:rPr>
+                <w:sz w:val="20"/>
+              </w:rPr>
+              <w:t xml:space="preserve"> + </w:t>
+            </w:r>
+            <w:r>
+              <w:rPr>
+                <w:rFonts w:ascii="Courier New" w:hAnsi="Courier New"/>
+                <w:color w:val="F05922"/>
+                <w:sz w:val="20"/>
+              </w:rPr>
+              <w:t>RestartSec=10</w:t>
+            </w:r>
+            <w:r>
+              <w:rPr>
+                <w:sz w:val="20"/>
+              </w:rPr>
+              <w:t xml:space="preserve">, không còn </w:t>
+            </w:r>
+            <w:r>
+              <w:rPr>
+                <w:rFonts w:ascii="Courier New" w:hAnsi="Courier New"/>
+                <w:color w:val="F05922"/>
+                <w:sz w:val="20"/>
+              </w:rPr>
+              <w:t>StartLimitBurst</w:t>
+            </w:r>
+            <w:r>
+              <w:rPr>
+                <w:sz w:val="20"/>
+              </w:rPr>
+              <w:t xml:space="preserve">. Không còn đường nào đưa service vào </w:t>
+            </w:r>
+            <w:r>
+              <w:rPr>
+                <w:rFonts w:ascii="Courier New" w:hAnsi="Courier New"/>
+                <w:color w:val="F05922"/>
+                <w:sz w:val="20"/>
+              </w:rPr>
+              <w:t>failed</w:t>
+            </w:r>
+            <w:r>
+              <w:rPr>
+                <w:sz w:val="20"/>
+              </w:rPr>
+              <w:t xml:space="preserve"> vĩnh viễn: crash-loop/binary thiếu → retry vô hạn mỗi 10s. Lập luận log hợp lệ: ~6 chu kỳ/phút « RateLimitBurst mặc định 10000/30s của journald; giữ log chẩn đoán (không null output) — đúng khuyến nghị phương án (a) của review vòng 1.</w:t>
+            </w:r>
+          </w:p>
+        </w:tc>
+      </w:tr>
+      <w:tr>
+        <w:tc>
+          <w:tcPr>
+            <w:tcW w:type="dxa" w:w="4844"/>
+            <w:shd w:val="clear" w:color="auto" w:fill="B8B3D6"/>
+            <w:tcBorders>
+              <w:top w:val="single" w:sz="4" w:space="0" w:color="CBCBCB"/>
+              <w:left w:val="single" w:sz="4" w:space="0" w:color="CBCBCB"/>
+              <w:bottom w:val="single" w:sz="4" w:space="0" w:color="CBCBCB"/>
+              <w:right w:val="single" w:sz="4" w:space="0" w:color="CBCBCB"/>
+            </w:tcBorders>
+          </w:tcPr>
+          <w:p>
+            <w:r>
+              <w:rPr>
+                <w:b/>
+                <w:sz w:val="20"/>
+              </w:rPr>
+              <w:t>R3 — khoá thêm key, đúng schema</w:t>
+            </w:r>
+          </w:p>
+        </w:tc>
+        <w:tc>
+          <w:tcPr>
+            <w:tcW w:type="dxa" w:w="4844"/>
+            <w:shd w:val="clear" w:color="auto" w:fill="B8B3D6"/>
+            <w:tcBorders>
+              <w:top w:val="single" w:sz="4" w:space="0" w:color="CBCBCB"/>
+              <w:left w:val="single" w:sz="4" w:space="0" w:color="CBCBCB"/>
+              <w:bottom w:val="single" w:sz="4" w:space="0" w:color="CBCBCB"/>
+              <w:right w:val="single" w:sz="4" w:space="0" w:color="CBCBCB"/>
+            </w:tcBorders>
+          </w:tcPr>
+          <w:p>
+            <w:r>
+              <w:rPr>
+                <w:sz w:val="20"/>
+              </w:rPr>
+              <w:t xml:space="preserve">✅ ĐÚNG SCHEMA. </w:t>
+            </w:r>
+            <w:r>
+              <w:rPr>
+                <w:rFonts w:ascii="Courier New" w:hAnsi="Courier New"/>
+                <w:color w:val="F05922"/>
+                <w:sz w:val="20"/>
+              </w:rPr>
+              <w:t>switch-to-application-1..9</w:t>
+            </w:r>
+            <w:r>
+              <w:rPr>
+                <w:sz w:val="20"/>
+              </w:rPr>
+              <w:t xml:space="preserve"> đặt trong </w:t>
+            </w:r>
+            <w:r>
+              <w:rPr>
+                <w:rFonts w:ascii="Courier New" w:hAnsi="Courier New"/>
+                <w:color w:val="F05922"/>
+                <w:sz w:val="20"/>
+              </w:rPr>
+              <w:t>[org/gnome/shell/keybindings]</w:t>
+            </w:r>
+            <w:r>
+              <w:rPr>
+                <w:sz w:val="20"/>
+              </w:rPr>
+              <w:t xml:space="preserve"> — đúng (schema </w:t>
+            </w:r>
+            <w:r>
+              <w:rPr>
+                <w:rFonts w:ascii="Courier New" w:hAnsi="Courier New"/>
+                <w:color w:val="F05922"/>
+                <w:sz w:val="20"/>
+              </w:rPr>
+              <w:t>org.gnome.shell.keybindings</w:t>
+            </w:r>
+            <w:r>
+              <w:rPr>
+                <w:sz w:val="20"/>
+              </w:rPr>
+              <w:t xml:space="preserve">, khớp bằng chứng audit </w:t>
+            </w:r>
+            <w:r>
+              <w:rPr>
+                <w:rFonts w:ascii="Courier New" w:hAnsi="Courier New"/>
+                <w:color w:val="F05922"/>
+                <w:sz w:val="20"/>
+              </w:rPr>
+              <w:t>gsettings writable org.gnome.shell.keybindings switch-to-application-4</w:t>
+            </w:r>
+            <w:r>
+              <w:rPr>
+                <w:sz w:val="20"/>
+              </w:rPr>
+              <w:t xml:space="preserve">). </w:t>
+            </w:r>
+            <w:r>
+              <w:rPr>
+                <w:rFonts w:ascii="Courier New" w:hAnsi="Courier New"/>
+                <w:color w:val="F05922"/>
+                <w:sz w:val="20"/>
+              </w:rPr>
+              <w:t>switch-group(-backward)</w:t>
+            </w:r>
+            <w:r>
+              <w:rPr>
+                <w:sz w:val="20"/>
+              </w:rPr>
+              <w:t xml:space="preserve">, </w:t>
+            </w:r>
+            <w:r>
+              <w:rPr>
+                <w:rFonts w:ascii="Courier New" w:hAnsi="Courier New"/>
+                <w:color w:val="F05922"/>
+                <w:sz w:val="20"/>
+              </w:rPr>
+              <w:t>activate-window-menu</w:t>
+            </w:r>
+            <w:r>
+              <w:rPr>
+                <w:sz w:val="20"/>
+              </w:rPr>
+              <w:t xml:space="preserve">, </w:t>
+            </w:r>
+            <w:r>
+              <w:rPr>
+                <w:rFonts w:ascii="Courier New" w:hAnsi="Courier New"/>
+                <w:color w:val="F05922"/>
+                <w:sz w:val="20"/>
+              </w:rPr>
+              <w:t>minimize</w:t>
+            </w:r>
+            <w:r>
+              <w:rPr>
+                <w:sz w:val="20"/>
+              </w:rPr>
+              <w:t xml:space="preserve"> đặt trong </w:t>
+            </w:r>
+            <w:r>
+              <w:rPr>
+                <w:rFonts w:ascii="Courier New" w:hAnsi="Courier New"/>
+                <w:color w:val="F05922"/>
+                <w:sz w:val="20"/>
+              </w:rPr>
+              <w:t>[org/gnome/desktop/wm/keybindings]</w:t>
+            </w:r>
+            <w:r>
+              <w:rPr>
+                <w:sz w:val="20"/>
+              </w:rPr>
+              <w:t xml:space="preserve"> — đúng. Đối chiếu từng key trong </w:t>
+            </w:r>
+            <w:r>
+              <w:rPr>
+                <w:rFonts w:ascii="Courier New" w:hAnsi="Courier New"/>
+                <w:color w:val="F05922"/>
+                <w:sz w:val="20"/>
+              </w:rPr>
+              <w:t>settings</w:t>
+            </w:r>
+            <w:r>
+              <w:rPr>
+                <w:sz w:val="20"/>
+              </w:rPr>
+              <w:t xml:space="preserve"> đều có dòng lock tương ứng trong </w:t>
+            </w:r>
+            <w:r>
+              <w:rPr>
+                <w:rFonts w:ascii="Courier New" w:hAnsi="Courier New"/>
+                <w:color w:val="F05922"/>
+                <w:sz w:val="20"/>
+              </w:rPr>
+              <w:t>locks</w:t>
+            </w:r>
+            <w:r>
+              <w:rPr>
+                <w:sz w:val="20"/>
+              </w:rPr>
+              <w:t xml:space="preserve"> (9 + 4 = 13 key, 13 lock, path khớp 1-1).</w:t>
+            </w:r>
+          </w:p>
+        </w:tc>
+      </w:tr>
+      <w:tr>
+        <w:tc>
+          <w:tcPr>
+            <w:tcW w:type="dxa" w:w="4844"/>
+            <w:tcBorders>
+              <w:top w:val="single" w:sz="4" w:space="0" w:color="CBCBCB"/>
+              <w:left w:val="single" w:sz="4" w:space="0" w:color="CBCBCB"/>
+              <w:bottom w:val="single" w:sz="4" w:space="0" w:color="CBCBCB"/>
+              <w:right w:val="single" w:sz="4" w:space="0" w:color="CBCBCB"/>
+            </w:tcBorders>
+          </w:tcPr>
+          <w:p>
+            <w:r>
+              <w:rPr>
+                <w:b/>
+                <w:sz w:val="20"/>
+              </w:rPr>
+              <w:t>Tài liệu khớp code</w:t>
+            </w:r>
+          </w:p>
+        </w:tc>
+        <w:tc>
+          <w:tcPr>
+            <w:tcW w:type="dxa" w:w="4844"/>
+            <w:tcBorders>
+              <w:top w:val="single" w:sz="4" w:space="0" w:color="CBCBCB"/>
+              <w:left w:val="single" w:sz="4" w:space="0" w:color="CBCBCB"/>
+              <w:bottom w:val="single" w:sz="4" w:space="0" w:color="CBCBCB"/>
+              <w:right w:val="single" w:sz="4" w:space="0" w:color="CBCBCB"/>
+            </w:tcBorders>
+          </w:tcPr>
+          <w:p>
+            <w:r>
+              <w:rPr>
+                <w:sz w:val="20"/>
+              </w:rPr>
+              <w:t>✅ KHỚP. MANUAL 9.3: gesture đổi "đã chặn" → "được cấu hình để chặn + cần nghiệm thu trực tiếp tại máy" (đúng Nit mục #10 vòng 1); watchdog mô tả "thử mãi mỗi 10 giây, không bao giờ tự bỏ cuộc" khớp unit mới; danh sách Super+1..9/Alt+`/Alt+Space/Super+H bổ sung khớp lock list. BUG report có mục Vòng 2 ghi rõ cả lưu ý "kết quả test 'dừng sau 5 lần' vòng 1 là hành vi unit CŨ" — trung thực. CODE-GRAPH cập nhật đúng tham số R1/R2/R3. Không chạm C# → không cần build lại: chấp nhận.</w:t>
+            </w:r>
+          </w:p>
+        </w:tc>
+      </w:tr>
+    </w:tbl>
+    <w:p/>
+    <w:p>
+      <w:pPr>
+        <w:spacing w:after="80"/>
+      </w:pPr>
+      <w:r>
+        <w:rPr>
+          <w:b/>
+          <w:sz w:val="21"/>
+        </w:rPr>
+        <w:t>Ghi chú tồn dư (không block):</w:t>
+      </w:r>
+      <w:r>
+        <w:rPr>
+          <w:sz w:val="21"/>
+        </w:rPr>
+        <w:t xml:space="preserve"> kiểm chứng vòng 2 chỉ bằng </w:t>
+      </w:r>
+      <w:r>
+        <w:rPr>
+          <w:rFonts w:ascii="Courier New" w:hAnsi="Courier New"/>
+          <w:color w:val="F05922"/>
+          <w:sz w:val="18"/>
+        </w:rPr>
+        <w:t>bash -n</w:t>
+      </w:r>
+      <w:r>
+        <w:rPr>
+          <w:sz w:val="21"/>
+        </w:rPr>
+        <w:t xml:space="preserve"> + suy luận logic — hành vi ma trận R1 và retry-vô-hạn R2 trên máy thật giao cho QA verify (danh sách dưới). Các nợ kỹ thuật đã chấp nhận ở review vòng 1 (bàn phím USB, USB automount-open, extension chết âm thầm khi nâng GNOME, user </w:t>
+      </w:r>
+      <w:r>
+        <w:rPr>
+          <w:rFonts w:ascii="Courier New" w:hAnsi="Courier New"/>
+          <w:color w:val="F05922"/>
+          <w:sz w:val="18"/>
+        </w:rPr>
+        <w:t>kztek</w:t>
+      </w:r>
+      <w:r>
+        <w:rPr>
+          <w:sz w:val="21"/>
+        </w:rPr>
+        <w:t xml:space="preserve"> trong sudo) giữ nguyên hiệu lực — không thay đổi.</w:t>
+      </w:r>
+    </w:p>
+    <w:p>
+      <w:pPr>
+        <w:pStyle w:val="Heading3"/>
+        <w:spacing w:before="160" w:after="60"/>
+      </w:pPr>
+      <w:r>
+        <w:rPr>
+          <w:color w:val="4A3F8C"/>
+          <w:sz w:val="24"/>
+        </w:rPr>
+        <w:t>Danh sách case QA cần verify trên ZCU thật</w:t>
+      </w:r>
+    </w:p>
+    <w:tbl>
+      <w:tblPr>
+        <w:tblStyle w:val="TableGrid"/>
+        <w:tblW w:type="auto" w:w="0"/>
+        <w:tblLook w:firstColumn="1" w:firstRow="1" w:lastColumn="0" w:lastRow="0" w:noHBand="0" w:noVBand="1" w:val="04A0"/>
+      </w:tblPr>
+      <w:tblGrid>
+        <w:gridCol w:w="2422"/>
+        <w:gridCol w:w="2422"/>
+        <w:gridCol w:w="2422"/>
+        <w:gridCol w:w="2422"/>
+      </w:tblGrid>
+      <w:tr>
+        <w:tc>
+          <w:tcPr>
+            <w:tcW w:type="dxa" w:w="2422"/>
+            <w:shd w:val="clear" w:color="auto" w:fill="251C53"/>
+            <w:tcBorders>
+              <w:top w:val="single" w:sz="4" w:space="0" w:color="251C53"/>
+              <w:left w:val="single" w:sz="4" w:space="0" w:color="251C53"/>
+              <w:bottom w:val="single" w:sz="4" w:space="0" w:color="251C53"/>
+              <w:right w:val="single" w:sz="4" w:space="0" w:color="251C53"/>
+            </w:tcBorders>
+          </w:tcPr>
+          <w:p>
+            <w:r>
+              <w:rPr>
+                <w:b/>
+                <w:color w:val="FFFFFF"/>
+                <w:sz w:val="20"/>
+              </w:rPr>
+              <w:t>#</w:t>
+            </w:r>
+          </w:p>
+        </w:tc>
+        <w:tc>
+          <w:tcPr>
+            <w:tcW w:type="dxa" w:w="2422"/>
+            <w:shd w:val="clear" w:color="auto" w:fill="251C53"/>
+            <w:tcBorders>
+              <w:top w:val="single" w:sz="4" w:space="0" w:color="251C53"/>
+              <w:left w:val="single" w:sz="4" w:space="0" w:color="251C53"/>
+              <w:bottom w:val="single" w:sz="4" w:space="0" w:color="251C53"/>
+              <w:right w:val="single" w:sz="4" w:space="0" w:color="251C53"/>
+            </w:tcBorders>
+          </w:tcPr>
+          <w:p>
+            <w:r>
+              <w:rPr>
+                <w:b/>
+                <w:color w:val="FFFFFF"/>
+                <w:sz w:val="20"/>
+              </w:rPr>
+              <w:t>Case</w:t>
+            </w:r>
+          </w:p>
+        </w:tc>
+        <w:tc>
+          <w:tcPr>
+            <w:tcW w:type="dxa" w:w="2422"/>
+            <w:shd w:val="clear" w:color="auto" w:fill="251C53"/>
+            <w:tcBorders>
+              <w:top w:val="single" w:sz="4" w:space="0" w:color="251C53"/>
+              <w:left w:val="single" w:sz="4" w:space="0" w:color="251C53"/>
+              <w:bottom w:val="single" w:sz="4" w:space="0" w:color="251C53"/>
+              <w:right w:val="single" w:sz="4" w:space="0" w:color="251C53"/>
+            </w:tcBorders>
+          </w:tcPr>
+          <w:p>
+            <w:r>
+              <w:rPr>
+                <w:b/>
+                <w:color w:val="FFFFFF"/>
+                <w:sz w:val="20"/>
+              </w:rPr>
+              <w:t>Cách verify</w:t>
+            </w:r>
+          </w:p>
+        </w:tc>
+        <w:tc>
+          <w:tcPr>
+            <w:tcW w:type="dxa" w:w="2422"/>
+            <w:shd w:val="clear" w:color="auto" w:fill="251C53"/>
+            <w:tcBorders>
+              <w:top w:val="single" w:sz="4" w:space="0" w:color="251C53"/>
+              <w:left w:val="single" w:sz="4" w:space="0" w:color="251C53"/>
+              <w:bottom w:val="single" w:sz="4" w:space="0" w:color="251C53"/>
+              <w:right w:val="single" w:sz="4" w:space="0" w:color="251C53"/>
+            </w:tcBorders>
+          </w:tcPr>
+          <w:p>
+            <w:r>
+              <w:rPr>
+                <w:b/>
+                <w:color w:val="FFFFFF"/>
+                <w:sz w:val="20"/>
+              </w:rPr>
+              <w:t>Thử tay tại màn cảm ứng?</w:t>
+            </w:r>
+          </w:p>
+        </w:tc>
+      </w:tr>
+      <w:tr>
+        <w:tc>
+          <w:tcPr>
+            <w:tcW w:type="dxa" w:w="2422"/>
+            <w:tcBorders>
+              <w:top w:val="single" w:sz="4" w:space="0" w:color="CBCBCB"/>
+              <w:left w:val="single" w:sz="4" w:space="0" w:color="CBCBCB"/>
+              <w:bottom w:val="single" w:sz="4" w:space="0" w:color="CBCBCB"/>
+              <w:right w:val="single" w:sz="4" w:space="0" w:color="CBCBCB"/>
+            </w:tcBorders>
+          </w:tcPr>
+          <w:p>
+            <w:r>
+              <w:rPr>
+                <w:sz w:val="20"/>
+              </w:rPr>
+              <w:t>---</w:t>
+            </w:r>
+          </w:p>
+        </w:tc>
+        <w:tc>
+          <w:tcPr>
+            <w:tcW w:type="dxa" w:w="2422"/>
+            <w:tcBorders>
+              <w:top w:val="single" w:sz="4" w:space="0" w:color="CBCBCB"/>
+              <w:left w:val="single" w:sz="4" w:space="0" w:color="CBCBCB"/>
+              <w:bottom w:val="single" w:sz="4" w:space="0" w:color="CBCBCB"/>
+              <w:right w:val="single" w:sz="4" w:space="0" w:color="CBCBCB"/>
+            </w:tcBorders>
+          </w:tcPr>
+          <w:p>
+            <w:r>
+              <w:rPr>
+                <w:sz w:val="20"/>
+              </w:rPr>
+              <w:t>---</w:t>
+            </w:r>
+          </w:p>
+        </w:tc>
+        <w:tc>
+          <w:tcPr>
+            <w:tcW w:type="dxa" w:w="2422"/>
+            <w:tcBorders>
+              <w:top w:val="single" w:sz="4" w:space="0" w:color="CBCBCB"/>
+              <w:left w:val="single" w:sz="4" w:space="0" w:color="CBCBCB"/>
+              <w:bottom w:val="single" w:sz="4" w:space="0" w:color="CBCBCB"/>
+              <w:right w:val="single" w:sz="4" w:space="0" w:color="CBCBCB"/>
+            </w:tcBorders>
+          </w:tcPr>
+          <w:p>
+            <w:r>
+              <w:rPr>
+                <w:sz w:val="20"/>
+              </w:rPr>
+              <w:t>---</w:t>
+            </w:r>
+          </w:p>
+        </w:tc>
+        <w:tc>
+          <w:tcPr>
+            <w:tcW w:type="dxa" w:w="2422"/>
+            <w:tcBorders>
+              <w:top w:val="single" w:sz="4" w:space="0" w:color="CBCBCB"/>
+              <w:left w:val="single" w:sz="4" w:space="0" w:color="CBCBCB"/>
+              <w:bottom w:val="single" w:sz="4" w:space="0" w:color="CBCBCB"/>
+              <w:right w:val="single" w:sz="4" w:space="0" w:color="CBCBCB"/>
+            </w:tcBorders>
+          </w:tcPr>
+          <w:p>
+            <w:r>
+              <w:rPr>
+                <w:sz w:val="20"/>
+              </w:rPr>
+              <w:t>---</w:t>
+            </w:r>
+          </w:p>
+        </w:tc>
+      </w:tr>
+      <w:tr>
+        <w:tc>
+          <w:tcPr>
+            <w:tcW w:type="dxa" w:w="2422"/>
+            <w:shd w:val="clear" w:color="auto" w:fill="B8B3D6"/>
+            <w:tcBorders>
+              <w:top w:val="single" w:sz="4" w:space="0" w:color="CBCBCB"/>
+              <w:left w:val="single" w:sz="4" w:space="0" w:color="CBCBCB"/>
+              <w:bottom w:val="single" w:sz="4" w:space="0" w:color="CBCBCB"/>
+              <w:right w:val="single" w:sz="4" w:space="0" w:color="CBCBCB"/>
+            </w:tcBorders>
+          </w:tcPr>
+          <w:p>
+            <w:r>
+              <w:rPr>
+                <w:sz w:val="20"/>
+              </w:rPr>
+              <w:t>Q1</w:t>
+            </w:r>
+          </w:p>
+        </w:tc>
+        <w:tc>
+          <w:tcPr>
+            <w:tcW w:type="dxa" w:w="2422"/>
+            <w:shd w:val="clear" w:color="auto" w:fill="B8B3D6"/>
+            <w:tcBorders>
+              <w:top w:val="single" w:sz="4" w:space="0" w:color="CBCBCB"/>
+              <w:left w:val="single" w:sz="4" w:space="0" w:color="CBCBCB"/>
+              <w:bottom w:val="single" w:sz="4" w:space="0" w:color="CBCBCB"/>
+              <w:right w:val="single" w:sz="4" w:space="0" w:color="CBCBCB"/>
+            </w:tcBorders>
+          </w:tcPr>
+          <w:p>
+            <w:r>
+              <w:rPr>
+                <w:sz w:val="20"/>
+              </w:rPr>
+              <w:t>R1 ma trận: deploy (AS=1,WD=0) → deploy lại (AS=0,WD=1)</w:t>
+            </w:r>
+          </w:p>
+        </w:tc>
+        <w:tc>
+          <w:tcPr>
+            <w:tcW w:type="dxa" w:w="2422"/>
+            <w:shd w:val="clear" w:color="auto" w:fill="B8B3D6"/>
+            <w:tcBorders>
+              <w:top w:val="single" w:sz="4" w:space="0" w:color="CBCBCB"/>
+              <w:left w:val="single" w:sz="4" w:space="0" w:color="CBCBCB"/>
+              <w:bottom w:val="single" w:sz="4" w:space="0" w:color="CBCBCB"/>
+              <w:right w:val="single" w:sz="4" w:space="0" w:color="CBCBCB"/>
+            </w:tcBorders>
+          </w:tcPr>
+          <w:p>
+            <w:r>
+              <w:rPr>
+                <w:sz w:val="20"/>
+              </w:rPr>
+              <w:t xml:space="preserve">Sau lần 2: </w:t>
+            </w:r>
+            <w:r>
+              <w:rPr>
+                <w:rFonts w:ascii="Courier New" w:hAnsi="Courier New"/>
+                <w:color w:val="F05922"/>
+                <w:sz w:val="20"/>
+              </w:rPr>
+              <w:t>ls ~/.config/autostart/</w:t>
+            </w:r>
+            <w:r>
+              <w:rPr>
+                <w:sz w:val="20"/>
+              </w:rPr>
+              <w:t xml:space="preserve"> KHÔNG còn </w:t>
+            </w:r>
+            <w:r>
+              <w:rPr>
+                <w:rFonts w:ascii="Courier New" w:hAnsi="Courier New"/>
+                <w:color w:val="F05922"/>
+                <w:sz w:val="20"/>
+              </w:rPr>
+              <w:t>ipgs-kiosk.desktop</w:t>
+            </w:r>
+            <w:r>
+              <w:rPr>
+                <w:sz w:val="20"/>
+              </w:rPr>
+              <w:t xml:space="preserve">; </w:t>
+            </w:r>
+            <w:r>
+              <w:rPr>
+                <w:rFonts w:ascii="Courier New" w:hAnsi="Courier New"/>
+                <w:color w:val="F05922"/>
+                <w:sz w:val="20"/>
+              </w:rPr>
+              <w:t>systemctl --user is-enabled ipgs-kiosk-app</w:t>
+            </w:r>
+            <w:r>
+              <w:rPr>
+                <w:sz w:val="20"/>
+              </w:rPr>
+              <w:t xml:space="preserve"> = enabled; reboot → chỉ 1 instance app (</w:t>
+            </w:r>
+            <w:r>
+              <w:rPr>
+                <w:rFonts w:ascii="Courier New" w:hAnsi="Courier New"/>
+                <w:color w:val="F05922"/>
+                <w:sz w:val="20"/>
+              </w:rPr>
+              <w:t>pgrep -c</w:t>
+            </w:r>
+            <w:r>
+              <w:rPr>
+                <w:sz w:val="20"/>
+              </w:rPr>
+              <w:t>)</w:t>
+            </w:r>
+          </w:p>
+        </w:tc>
+        <w:tc>
+          <w:tcPr>
+            <w:tcW w:type="dxa" w:w="2422"/>
+            <w:shd w:val="clear" w:color="auto" w:fill="B8B3D6"/>
+            <w:tcBorders>
+              <w:top w:val="single" w:sz="4" w:space="0" w:color="CBCBCB"/>
+              <w:left w:val="single" w:sz="4" w:space="0" w:color="CBCBCB"/>
+              <w:bottom w:val="single" w:sz="4" w:space="0" w:color="CBCBCB"/>
+              <w:right w:val="single" w:sz="4" w:space="0" w:color="CBCBCB"/>
+            </w:tcBorders>
+          </w:tcPr>
+          <w:p>
+            <w:r>
+              <w:rPr>
+                <w:sz w:val="20"/>
+              </w:rPr>
+              <w:t>Không (SSH đủ)</w:t>
+            </w:r>
+          </w:p>
+        </w:tc>
+      </w:tr>
+      <w:tr>
+        <w:tc>
+          <w:tcPr>
+            <w:tcW w:type="dxa" w:w="2422"/>
+            <w:tcBorders>
+              <w:top w:val="single" w:sz="4" w:space="0" w:color="CBCBCB"/>
+              <w:left w:val="single" w:sz="4" w:space="0" w:color="CBCBCB"/>
+              <w:bottom w:val="single" w:sz="4" w:space="0" w:color="CBCBCB"/>
+              <w:right w:val="single" w:sz="4" w:space="0" w:color="CBCBCB"/>
+            </w:tcBorders>
+          </w:tcPr>
+          <w:p>
+            <w:r>
+              <w:rPr>
+                <w:sz w:val="20"/>
+              </w:rPr>
+              <w:t>Q2</w:t>
+            </w:r>
+          </w:p>
+        </w:tc>
+        <w:tc>
+          <w:tcPr>
+            <w:tcW w:type="dxa" w:w="2422"/>
+            <w:tcBorders>
+              <w:top w:val="single" w:sz="4" w:space="0" w:color="CBCBCB"/>
+              <w:left w:val="single" w:sz="4" w:space="0" w:color="CBCBCB"/>
+              <w:bottom w:val="single" w:sz="4" w:space="0" w:color="CBCBCB"/>
+              <w:right w:val="single" w:sz="4" w:space="0" w:color="CBCBCB"/>
+            </w:tcBorders>
+          </w:tcPr>
+          <w:p>
+            <w:r>
+              <w:rPr>
+                <w:sz w:val="20"/>
+              </w:rPr>
+              <w:t>R1 chiều ngược: deploy (WD=1) → deploy lại (WD=0,AS=1)</w:t>
+            </w:r>
+          </w:p>
+        </w:tc>
+        <w:tc>
+          <w:tcPr>
+            <w:tcW w:type="dxa" w:w="2422"/>
+            <w:tcBorders>
+              <w:top w:val="single" w:sz="4" w:space="0" w:color="CBCBCB"/>
+              <w:left w:val="single" w:sz="4" w:space="0" w:color="CBCBCB"/>
+              <w:bottom w:val="single" w:sz="4" w:space="0" w:color="CBCBCB"/>
+              <w:right w:val="single" w:sz="4" w:space="0" w:color="CBCBCB"/>
+            </w:tcBorders>
+          </w:tcPr>
+          <w:p>
+            <w:r>
+              <w:rPr>
+                <w:sz w:val="20"/>
+              </w:rPr>
+              <w:t>Service bị gỡ (</w:t>
+            </w:r>
+            <w:r>
+              <w:rPr>
+                <w:rFonts w:ascii="Courier New" w:hAnsi="Courier New"/>
+                <w:color w:val="F05922"/>
+                <w:sz w:val="20"/>
+              </w:rPr>
+              <w:t>systemctl --user cat ipgs-kiosk-app</w:t>
+            </w:r>
+            <w:r>
+              <w:rPr>
+                <w:sz w:val="20"/>
+              </w:rPr>
+              <w:t xml:space="preserve"> → lỗi), </w:t>
+            </w:r>
+            <w:r>
+              <w:rPr>
+                <w:rFonts w:ascii="Courier New" w:hAnsi="Courier New"/>
+                <w:color w:val="F05922"/>
+                <w:sz w:val="20"/>
+              </w:rPr>
+              <w:t>.desktop</w:t>
+            </w:r>
+            <w:r>
+              <w:rPr>
+                <w:sz w:val="20"/>
+              </w:rPr>
+              <w:t xml:space="preserve"> được tạo lại, unclutter còn</w:t>
+            </w:r>
+          </w:p>
+        </w:tc>
+        <w:tc>
+          <w:tcPr>
+            <w:tcW w:type="dxa" w:w="2422"/>
+            <w:tcBorders>
+              <w:top w:val="single" w:sz="4" w:space="0" w:color="CBCBCB"/>
+              <w:left w:val="single" w:sz="4" w:space="0" w:color="CBCBCB"/>
+              <w:bottom w:val="single" w:sz="4" w:space="0" w:color="CBCBCB"/>
+              <w:right w:val="single" w:sz="4" w:space="0" w:color="CBCBCB"/>
+            </w:tcBorders>
+          </w:tcPr>
+          <w:p>
+            <w:r>
+              <w:rPr>
+                <w:sz w:val="20"/>
+              </w:rPr>
+              <w:t>Không (SSH đủ)</w:t>
+            </w:r>
+          </w:p>
+        </w:tc>
+      </w:tr>
+      <w:tr>
+        <w:tc>
+          <w:tcPr>
+            <w:tcW w:type="dxa" w:w="2422"/>
+            <w:shd w:val="clear" w:color="auto" w:fill="B8B3D6"/>
+            <w:tcBorders>
+              <w:top w:val="single" w:sz="4" w:space="0" w:color="CBCBCB"/>
+              <w:left w:val="single" w:sz="4" w:space="0" w:color="CBCBCB"/>
+              <w:bottom w:val="single" w:sz="4" w:space="0" w:color="CBCBCB"/>
+              <w:right w:val="single" w:sz="4" w:space="0" w:color="CBCBCB"/>
+            </w:tcBorders>
+          </w:tcPr>
+          <w:p>
+            <w:r>
+              <w:rPr>
+                <w:sz w:val="20"/>
+              </w:rPr>
+              <w:t>Q3</w:t>
+            </w:r>
+          </w:p>
+        </w:tc>
+        <w:tc>
+          <w:tcPr>
+            <w:tcW w:type="dxa" w:w="2422"/>
+            <w:shd w:val="clear" w:color="auto" w:fill="B8B3D6"/>
+            <w:tcBorders>
+              <w:top w:val="single" w:sz="4" w:space="0" w:color="CBCBCB"/>
+              <w:left w:val="single" w:sz="4" w:space="0" w:color="CBCBCB"/>
+              <w:bottom w:val="single" w:sz="4" w:space="0" w:color="CBCBCB"/>
+              <w:right w:val="single" w:sz="4" w:space="0" w:color="CBCBCB"/>
+            </w:tcBorders>
+          </w:tcPr>
+          <w:p>
+            <w:r>
+              <w:rPr>
+                <w:sz w:val="20"/>
+              </w:rPr>
+              <w:t>R2 retry vô hạn: đặt binary giả crash ngay (exit 1)</w:t>
+            </w:r>
+          </w:p>
+        </w:tc>
+        <w:tc>
+          <w:tcPr>
+            <w:tcW w:type="dxa" w:w="2422"/>
+            <w:shd w:val="clear" w:color="auto" w:fill="B8B3D6"/>
+            <w:tcBorders>
+              <w:top w:val="single" w:sz="4" w:space="0" w:color="CBCBCB"/>
+              <w:left w:val="single" w:sz="4" w:space="0" w:color="CBCBCB"/>
+              <w:bottom w:val="single" w:sz="4" w:space="0" w:color="CBCBCB"/>
+              <w:right w:val="single" w:sz="4" w:space="0" w:color="CBCBCB"/>
+            </w:tcBorders>
+          </w:tcPr>
+          <w:p>
+            <w:r>
+              <w:rPr>
+                <w:rFonts w:ascii="Courier New" w:hAnsi="Courier New"/>
+                <w:color w:val="F05922"/>
+                <w:sz w:val="20"/>
+              </w:rPr>
+              <w:t>systemctl --user status</w:t>
+            </w:r>
+            <w:r>
+              <w:rPr>
+                <w:sz w:val="20"/>
+              </w:rPr>
+              <w:t xml:space="preserve"> KHÔNG bao giờ vào </w:t>
+            </w:r>
+            <w:r>
+              <w:rPr>
+                <w:rFonts w:ascii="Courier New" w:hAnsi="Courier New"/>
+                <w:color w:val="F05922"/>
+                <w:sz w:val="20"/>
+              </w:rPr>
+              <w:t>failed</w:t>
+            </w:r>
+            <w:r>
+              <w:rPr>
+                <w:sz w:val="20"/>
+              </w:rPr>
+              <w:t xml:space="preserve">; </w:t>
+            </w:r>
+            <w:r>
+              <w:rPr>
+                <w:rFonts w:ascii="Courier New" w:hAnsi="Courier New"/>
+                <w:color w:val="F05922"/>
+                <w:sz w:val="20"/>
+              </w:rPr>
+              <w:t>NRestarts</w:t>
+            </w:r>
+            <w:r>
+              <w:rPr>
+                <w:sz w:val="20"/>
+              </w:rPr>
+              <w:t xml:space="preserve"> tăng đều nhịp ~10s; theo dõi ≥ 3 phút</w:t>
+            </w:r>
+          </w:p>
+        </w:tc>
+        <w:tc>
+          <w:tcPr>
+            <w:tcW w:type="dxa" w:w="2422"/>
+            <w:shd w:val="clear" w:color="auto" w:fill="B8B3D6"/>
+            <w:tcBorders>
+              <w:top w:val="single" w:sz="4" w:space="0" w:color="CBCBCB"/>
+              <w:left w:val="single" w:sz="4" w:space="0" w:color="CBCBCB"/>
+              <w:bottom w:val="single" w:sz="4" w:space="0" w:color="CBCBCB"/>
+              <w:right w:val="single" w:sz="4" w:space="0" w:color="CBCBCB"/>
+            </w:tcBorders>
+          </w:tcPr>
+          <w:p>
+            <w:r>
+              <w:rPr>
+                <w:sz w:val="20"/>
+              </w:rPr>
+              <w:t>Không (SSH đủ)</w:t>
+            </w:r>
+          </w:p>
+        </w:tc>
+      </w:tr>
+      <w:tr>
+        <w:tc>
+          <w:tcPr>
+            <w:tcW w:type="dxa" w:w="2422"/>
+            <w:tcBorders>
+              <w:top w:val="single" w:sz="4" w:space="0" w:color="CBCBCB"/>
+              <w:left w:val="single" w:sz="4" w:space="0" w:color="CBCBCB"/>
+              <w:bottom w:val="single" w:sz="4" w:space="0" w:color="CBCBCB"/>
+              <w:right w:val="single" w:sz="4" w:space="0" w:color="CBCBCB"/>
+            </w:tcBorders>
+          </w:tcPr>
+          <w:p>
+            <w:r>
+              <w:rPr>
+                <w:sz w:val="20"/>
+              </w:rPr>
+              <w:t>Q4</w:t>
+            </w:r>
+          </w:p>
+        </w:tc>
+        <w:tc>
+          <w:tcPr>
+            <w:tcW w:type="dxa" w:w="2422"/>
+            <w:tcBorders>
+              <w:top w:val="single" w:sz="4" w:space="0" w:color="CBCBCB"/>
+              <w:left w:val="single" w:sz="4" w:space="0" w:color="CBCBCB"/>
+              <w:bottom w:val="single" w:sz="4" w:space="0" w:color="CBCBCB"/>
+              <w:right w:val="single" w:sz="4" w:space="0" w:color="CBCBCB"/>
+            </w:tcBorders>
+          </w:tcPr>
+          <w:p>
+            <w:r>
+              <w:rPr>
+                <w:sz w:val="20"/>
+              </w:rPr>
+              <w:t>R2 hồi phục: giữa lúc retry, cài binary đúng</w:t>
+            </w:r>
+          </w:p>
+        </w:tc>
+        <w:tc>
+          <w:tcPr>
+            <w:tcW w:type="dxa" w:w="2422"/>
+            <w:tcBorders>
+              <w:top w:val="single" w:sz="4" w:space="0" w:color="CBCBCB"/>
+              <w:left w:val="single" w:sz="4" w:space="0" w:color="CBCBCB"/>
+              <w:bottom w:val="single" w:sz="4" w:space="0" w:color="CBCBCB"/>
+              <w:right w:val="single" w:sz="4" w:space="0" w:color="CBCBCB"/>
+            </w:tcBorders>
+          </w:tcPr>
+          <w:p>
+            <w:r>
+              <w:rPr>
+                <w:sz w:val="20"/>
+              </w:rPr>
+              <w:t>Lần retry kế tiếp app chạy, không cần thao tác gì</w:t>
+            </w:r>
+          </w:p>
+        </w:tc>
+        <w:tc>
+          <w:tcPr>
+            <w:tcW w:type="dxa" w:w="2422"/>
+            <w:tcBorders>
+              <w:top w:val="single" w:sz="4" w:space="0" w:color="CBCBCB"/>
+              <w:left w:val="single" w:sz="4" w:space="0" w:color="CBCBCB"/>
+              <w:bottom w:val="single" w:sz="4" w:space="0" w:color="CBCBCB"/>
+              <w:right w:val="single" w:sz="4" w:space="0" w:color="CBCBCB"/>
+            </w:tcBorders>
+          </w:tcPr>
+          <w:p>
+            <w:r>
+              <w:rPr>
+                <w:sz w:val="20"/>
+              </w:rPr>
+              <w:t>Không (SSH đủ)</w:t>
+            </w:r>
+          </w:p>
+        </w:tc>
+      </w:tr>
+      <w:tr>
+        <w:tc>
+          <w:tcPr>
+            <w:tcW w:type="dxa" w:w="2422"/>
+            <w:shd w:val="clear" w:color="auto" w:fill="B8B3D6"/>
+            <w:tcBorders>
+              <w:top w:val="single" w:sz="4" w:space="0" w:color="CBCBCB"/>
+              <w:left w:val="single" w:sz="4" w:space="0" w:color="CBCBCB"/>
+              <w:bottom w:val="single" w:sz="4" w:space="0" w:color="CBCBCB"/>
+              <w:right w:val="single" w:sz="4" w:space="0" w:color="CBCBCB"/>
+            </w:tcBorders>
+          </w:tcPr>
+          <w:p>
+            <w:r>
+              <w:rPr>
+                <w:sz w:val="20"/>
+              </w:rPr>
+              <w:t>Q5</w:t>
+            </w:r>
+          </w:p>
+        </w:tc>
+        <w:tc>
+          <w:tcPr>
+            <w:tcW w:type="dxa" w:w="2422"/>
+            <w:shd w:val="clear" w:color="auto" w:fill="B8B3D6"/>
+            <w:tcBorders>
+              <w:top w:val="single" w:sz="4" w:space="0" w:color="CBCBCB"/>
+              <w:left w:val="single" w:sz="4" w:space="0" w:color="CBCBCB"/>
+              <w:bottom w:val="single" w:sz="4" w:space="0" w:color="CBCBCB"/>
+              <w:right w:val="single" w:sz="4" w:space="0" w:color="CBCBCB"/>
+            </w:tcBorders>
+          </w:tcPr>
+          <w:p>
+            <w:r>
+              <w:rPr>
+                <w:sz w:val="20"/>
+              </w:rPr>
+              <w:t>App GUI THẬT chạy từ service (DISPLAY/XAUTHORITY)</w:t>
+            </w:r>
+          </w:p>
+        </w:tc>
+        <w:tc>
+          <w:tcPr>
+            <w:tcW w:type="dxa" w:w="2422"/>
+            <w:shd w:val="clear" w:color="auto" w:fill="B8B3D6"/>
+            <w:tcBorders>
+              <w:top w:val="single" w:sz="4" w:space="0" w:color="CBCBCB"/>
+              <w:left w:val="single" w:sz="4" w:space="0" w:color="CBCBCB"/>
+              <w:bottom w:val="single" w:sz="4" w:space="0" w:color="CBCBCB"/>
+              <w:right w:val="single" w:sz="4" w:space="0" w:color="CBCBCB"/>
+            </w:tcBorders>
+          </w:tcPr>
+          <w:p>
+            <w:r>
+              <w:rPr>
+                <w:sz w:val="20"/>
+              </w:rPr>
+              <w:t>Deploy app thật + reboot → cửa sổ app hiện trên màn hình (vòng 1 chỉ test binary giả không cần DISPLAY)</w:t>
+            </w:r>
+          </w:p>
+        </w:tc>
+        <w:tc>
+          <w:tcPr>
+            <w:tcW w:type="dxa" w:w="2422"/>
+            <w:shd w:val="clear" w:color="auto" w:fill="B8B3D6"/>
+            <w:tcBorders>
+              <w:top w:val="single" w:sz="4" w:space="0" w:color="CBCBCB"/>
+              <w:left w:val="single" w:sz="4" w:space="0" w:color="CBCBCB"/>
+              <w:bottom w:val="single" w:sz="4" w:space="0" w:color="CBCBCB"/>
+              <w:right w:val="single" w:sz="4" w:space="0" w:color="CBCBCB"/>
+            </w:tcBorders>
+          </w:tcPr>
+          <w:p>
+            <w:r>
+              <w:rPr>
+                <w:sz w:val="20"/>
+              </w:rPr>
+              <w:t>Không bắt buộc (nhìn qua Remote Desktop được)</w:t>
+            </w:r>
+          </w:p>
+        </w:tc>
+      </w:tr>
+      <w:tr>
+        <w:tc>
+          <w:tcPr>
+            <w:tcW w:type="dxa" w:w="2422"/>
+            <w:tcBorders>
+              <w:top w:val="single" w:sz="4" w:space="0" w:color="CBCBCB"/>
+              <w:left w:val="single" w:sz="4" w:space="0" w:color="CBCBCB"/>
+              <w:bottom w:val="single" w:sz="4" w:space="0" w:color="CBCBCB"/>
+              <w:right w:val="single" w:sz="4" w:space="0" w:color="CBCBCB"/>
+            </w:tcBorders>
+          </w:tcPr>
+          <w:p>
+            <w:r>
+              <w:rPr>
+                <w:sz w:val="20"/>
+              </w:rPr>
+              <w:t>Q6</w:t>
+            </w:r>
+          </w:p>
+        </w:tc>
+        <w:tc>
+          <w:tcPr>
+            <w:tcW w:type="dxa" w:w="2422"/>
+            <w:tcBorders>
+              <w:top w:val="single" w:sz="4" w:space="0" w:color="CBCBCB"/>
+              <w:left w:val="single" w:sz="4" w:space="0" w:color="CBCBCB"/>
+              <w:bottom w:val="single" w:sz="4" w:space="0" w:color="CBCBCB"/>
+              <w:right w:val="single" w:sz="4" w:space="0" w:color="CBCBCB"/>
+            </w:tcBorders>
+          </w:tcPr>
+          <w:p>
+            <w:r>
+              <w:rPr>
+                <w:sz w:val="20"/>
+              </w:rPr>
+              <w:t>Extension ACTIVE sau reboot</w:t>
+            </w:r>
+          </w:p>
+        </w:tc>
+        <w:tc>
+          <w:tcPr>
+            <w:tcW w:type="dxa" w:w="2422"/>
+            <w:tcBorders>
+              <w:top w:val="single" w:sz="4" w:space="0" w:color="CBCBCB"/>
+              <w:left w:val="single" w:sz="4" w:space="0" w:color="CBCBCB"/>
+              <w:bottom w:val="single" w:sz="4" w:space="0" w:color="CBCBCB"/>
+              <w:right w:val="single" w:sz="4" w:space="0" w:color="CBCBCB"/>
+            </w:tcBorders>
+          </w:tcPr>
+          <w:p>
+            <w:r>
+              <w:rPr>
+                <w:rFonts w:ascii="Courier New" w:hAnsi="Courier New"/>
+                <w:color w:val="F05922"/>
+                <w:sz w:val="20"/>
+              </w:rPr>
+              <w:t>gnome-extensions info disable-overview-gestures@kztek</w:t>
+            </w:r>
+            <w:r>
+              <w:rPr>
+                <w:sz w:val="20"/>
+              </w:rPr>
+              <w:t xml:space="preserve"> → </w:t>
+            </w:r>
+            <w:r>
+              <w:rPr>
+                <w:rFonts w:ascii="Courier New" w:hAnsi="Courier New"/>
+                <w:color w:val="F05922"/>
+                <w:sz w:val="20"/>
+              </w:rPr>
+              <w:t>State: ACTIVE</w:t>
+            </w:r>
+          </w:p>
+        </w:tc>
+        <w:tc>
+          <w:tcPr>
+            <w:tcW w:type="dxa" w:w="2422"/>
+            <w:tcBorders>
+              <w:top w:val="single" w:sz="4" w:space="0" w:color="CBCBCB"/>
+              <w:left w:val="single" w:sz="4" w:space="0" w:color="CBCBCB"/>
+              <w:bottom w:val="single" w:sz="4" w:space="0" w:color="CBCBCB"/>
+              <w:right w:val="single" w:sz="4" w:space="0" w:color="CBCBCB"/>
+            </w:tcBorders>
+          </w:tcPr>
+          <w:p>
+            <w:r>
+              <w:rPr>
+                <w:sz w:val="20"/>
+              </w:rPr>
+              <w:t>Không (SSH đủ)</w:t>
+            </w:r>
+          </w:p>
+        </w:tc>
+      </w:tr>
+      <w:tr>
+        <w:tc>
+          <w:tcPr>
+            <w:tcW w:type="dxa" w:w="2422"/>
+            <w:shd w:val="clear" w:color="auto" w:fill="B8B3D6"/>
+            <w:tcBorders>
+              <w:top w:val="single" w:sz="4" w:space="0" w:color="CBCBCB"/>
+              <w:left w:val="single" w:sz="4" w:space="0" w:color="CBCBCB"/>
+              <w:bottom w:val="single" w:sz="4" w:space="0" w:color="CBCBCB"/>
+              <w:right w:val="single" w:sz="4" w:space="0" w:color="CBCBCB"/>
+            </w:tcBorders>
+          </w:tcPr>
+          <w:p>
+            <w:r>
+              <w:rPr>
+                <w:sz w:val="20"/>
+              </w:rPr>
+              <w:t>Q7</w:t>
+            </w:r>
+          </w:p>
+        </w:tc>
+        <w:tc>
+          <w:tcPr>
+            <w:tcW w:type="dxa" w:w="2422"/>
+            <w:shd w:val="clear" w:color="auto" w:fill="B8B3D6"/>
+            <w:tcBorders>
+              <w:top w:val="single" w:sz="4" w:space="0" w:color="CBCBCB"/>
+              <w:left w:val="single" w:sz="4" w:space="0" w:color="CBCBCB"/>
+              <w:bottom w:val="single" w:sz="4" w:space="0" w:color="CBCBCB"/>
+              <w:right w:val="single" w:sz="4" w:space="0" w:color="CBCBCB"/>
+            </w:tcBorders>
+          </w:tcPr>
+          <w:p>
+            <w:r>
+              <w:rPr>
+                <w:b/>
+                <w:sz w:val="20"/>
+              </w:rPr>
+              <w:t>Gesture cảm ứng: vuốt 3/4 ngón lên, vuốt từ mép, chạm-giữ (long-press)</w:t>
+            </w:r>
+            <w:r>
+              <w:rPr>
+                <w:sz w:val="20"/>
+              </w:rPr>
+              <w:t xml:space="preserve"> — overview KHÔNG mở</w:t>
+            </w:r>
+          </w:p>
+        </w:tc>
+        <w:tc>
+          <w:tcPr>
+            <w:tcW w:type="dxa" w:w="2422"/>
+            <w:shd w:val="clear" w:color="auto" w:fill="B8B3D6"/>
+            <w:tcBorders>
+              <w:top w:val="single" w:sz="4" w:space="0" w:color="CBCBCB"/>
+              <w:left w:val="single" w:sz="4" w:space="0" w:color="CBCBCB"/>
+              <w:bottom w:val="single" w:sz="4" w:space="0" w:color="CBCBCB"/>
+              <w:right w:val="single" w:sz="4" w:space="0" w:color="CBCBCB"/>
+            </w:tcBorders>
+          </w:tcPr>
+          <w:p>
+            <w:r>
+              <w:rPr>
+                <w:sz w:val="20"/>
+              </w:rPr>
+              <w:t>Thao tác ngón tay trực tiếp trên màn cảm ứng, sau reboot</w:t>
+            </w:r>
+          </w:p>
+        </w:tc>
+        <w:tc>
+          <w:tcPr>
+            <w:tcW w:type="dxa" w:w="2422"/>
+            <w:shd w:val="clear" w:color="auto" w:fill="B8B3D6"/>
+            <w:tcBorders>
+              <w:top w:val="single" w:sz="4" w:space="0" w:color="CBCBCB"/>
+              <w:left w:val="single" w:sz="4" w:space="0" w:color="CBCBCB"/>
+              <w:bottom w:val="single" w:sz="4" w:space="0" w:color="CBCBCB"/>
+              <w:right w:val="single" w:sz="4" w:space="0" w:color="CBCBCB"/>
+            </w:tcBorders>
+          </w:tcPr>
+          <w:p>
+            <w:r>
+              <w:rPr>
+                <w:b/>
+                <w:sz w:val="20"/>
+              </w:rPr>
+              <w:t>✋ BẮT BUỘC thử tay</w:t>
+            </w:r>
+            <w:r>
+              <w:rPr>
+                <w:sz w:val="20"/>
+              </w:rPr>
+              <w:t xml:space="preserve"> — không giả lập được qua SSH/VM</w:t>
+            </w:r>
+          </w:p>
+        </w:tc>
+      </w:tr>
+      <w:tr>
+        <w:tc>
+          <w:tcPr>
+            <w:tcW w:type="dxa" w:w="2422"/>
+            <w:tcBorders>
+              <w:top w:val="single" w:sz="4" w:space="0" w:color="CBCBCB"/>
+              <w:left w:val="single" w:sz="4" w:space="0" w:color="CBCBCB"/>
+              <w:bottom w:val="single" w:sz="4" w:space="0" w:color="CBCBCB"/>
+              <w:right w:val="single" w:sz="4" w:space="0" w:color="CBCBCB"/>
+            </w:tcBorders>
+          </w:tcPr>
+          <w:p>
+            <w:r>
+              <w:rPr>
+                <w:sz w:val="20"/>
+              </w:rPr>
+              <w:t>Q8</w:t>
+            </w:r>
+          </w:p>
+        </w:tc>
+        <w:tc>
+          <w:tcPr>
+            <w:tcW w:type="dxa" w:w="2422"/>
+            <w:tcBorders>
+              <w:top w:val="single" w:sz="4" w:space="0" w:color="CBCBCB"/>
+              <w:left w:val="single" w:sz="4" w:space="0" w:color="CBCBCB"/>
+              <w:bottom w:val="single" w:sz="4" w:space="0" w:color="CBCBCB"/>
+              <w:right w:val="single" w:sz="4" w:space="0" w:color="CBCBCB"/>
+            </w:tcBorders>
+          </w:tcPr>
+          <w:p>
+            <w:r>
+              <w:rPr>
+                <w:b/>
+                <w:sz w:val="20"/>
+              </w:rPr>
+              <w:t>Chạm 1 ngón dùng app bình thường</w:t>
+            </w:r>
+            <w:r>
+              <w:rPr>
+                <w:sz w:val="20"/>
+              </w:rPr>
+              <w:t xml:space="preserve"> (extension không phá touch input của app)</w:t>
+            </w:r>
+          </w:p>
+        </w:tc>
+        <w:tc>
+          <w:tcPr>
+            <w:tcW w:type="dxa" w:w="2422"/>
+            <w:tcBorders>
+              <w:top w:val="single" w:sz="4" w:space="0" w:color="CBCBCB"/>
+              <w:left w:val="single" w:sz="4" w:space="0" w:color="CBCBCB"/>
+              <w:bottom w:val="single" w:sz="4" w:space="0" w:color="CBCBCB"/>
+              <w:right w:val="single" w:sz="4" w:space="0" w:color="CBCBCB"/>
+            </w:tcBorders>
+          </w:tcPr>
+          <w:p>
+            <w:r>
+              <w:rPr>
+                <w:sz w:val="20"/>
+              </w:rPr>
+              <w:t>Thao tác trực tiếp trên app kiosk thật</w:t>
+            </w:r>
+          </w:p>
+        </w:tc>
+        <w:tc>
+          <w:tcPr>
+            <w:tcW w:type="dxa" w:w="2422"/>
+            <w:tcBorders>
+              <w:top w:val="single" w:sz="4" w:space="0" w:color="CBCBCB"/>
+              <w:left w:val="single" w:sz="4" w:space="0" w:color="CBCBCB"/>
+              <w:bottom w:val="single" w:sz="4" w:space="0" w:color="CBCBCB"/>
+              <w:right w:val="single" w:sz="4" w:space="0" w:color="CBCBCB"/>
+            </w:tcBorders>
+          </w:tcPr>
+          <w:p>
+            <w:r>
+              <w:rPr>
+                <w:b/>
+                <w:sz w:val="20"/>
+              </w:rPr>
+              <w:t>✋ BẮT BUỘC thử tay</w:t>
+            </w:r>
+          </w:p>
+        </w:tc>
+      </w:tr>
+      <w:tr>
+        <w:tc>
+          <w:tcPr>
+            <w:tcW w:type="dxa" w:w="2422"/>
+            <w:shd w:val="clear" w:color="auto" w:fill="B8B3D6"/>
+            <w:tcBorders>
+              <w:top w:val="single" w:sz="4" w:space="0" w:color="CBCBCB"/>
+              <w:left w:val="single" w:sz="4" w:space="0" w:color="CBCBCB"/>
+              <w:bottom w:val="single" w:sz="4" w:space="0" w:color="CBCBCB"/>
+              <w:right w:val="single" w:sz="4" w:space="0" w:color="CBCBCB"/>
+            </w:tcBorders>
+          </w:tcPr>
+          <w:p>
+            <w:r>
+              <w:rPr>
+                <w:sz w:val="20"/>
+              </w:rPr>
+              <w:t>Q9</w:t>
+            </w:r>
+          </w:p>
+        </w:tc>
+        <w:tc>
+          <w:tcPr>
+            <w:tcW w:type="dxa" w:w="2422"/>
+            <w:shd w:val="clear" w:color="auto" w:fill="B8B3D6"/>
+            <w:tcBorders>
+              <w:top w:val="single" w:sz="4" w:space="0" w:color="CBCBCB"/>
+              <w:left w:val="single" w:sz="4" w:space="0" w:color="CBCBCB"/>
+              <w:bottom w:val="single" w:sz="4" w:space="0" w:color="CBCBCB"/>
+              <w:right w:val="single" w:sz="4" w:space="0" w:color="CBCBCB"/>
+            </w:tcBorders>
+          </w:tcPr>
+          <w:p>
+            <w:r>
+              <w:rPr>
+                <w:sz w:val="20"/>
+              </w:rPr>
+              <w:t>R3 (nếu có bàn phím cắm thử): Super+1..9, Alt+`, Alt+Space, Super+H đều câm</w:t>
+            </w:r>
+          </w:p>
+        </w:tc>
+        <w:tc>
+          <w:tcPr>
+            <w:tcW w:type="dxa" w:w="2422"/>
+            <w:shd w:val="clear" w:color="auto" w:fill="B8B3D6"/>
+            <w:tcBorders>
+              <w:top w:val="single" w:sz="4" w:space="0" w:color="CBCBCB"/>
+              <w:left w:val="single" w:sz="4" w:space="0" w:color="CBCBCB"/>
+              <w:bottom w:val="single" w:sz="4" w:space="0" w:color="CBCBCB"/>
+              <w:right w:val="single" w:sz="4" w:space="0" w:color="CBCBCB"/>
+            </w:tcBorders>
+          </w:tcPr>
+          <w:p>
+            <w:r>
+              <w:rPr>
+                <w:sz w:val="20"/>
+              </w:rPr>
+              <w:t xml:space="preserve">Cắm bàn phím USB tạm, bấm thử sau reboot; hoặc </w:t>
+            </w:r>
+            <w:r>
+              <w:rPr>
+                <w:rFonts w:ascii="Courier New" w:hAnsi="Courier New"/>
+                <w:color w:val="F05922"/>
+                <w:sz w:val="20"/>
+              </w:rPr>
+              <w:t>gsettings writable org.gnome.shell.keybindings switch-to-application-4</w:t>
+            </w:r>
+            <w:r>
+              <w:rPr>
+                <w:sz w:val="20"/>
+              </w:rPr>
+              <w:t xml:space="preserve"> = false qua SSH</w:t>
+            </w:r>
+          </w:p>
+        </w:tc>
+        <w:tc>
+          <w:tcPr>
+            <w:tcW w:type="dxa" w:w="2422"/>
+            <w:shd w:val="clear" w:color="auto" w:fill="B8B3D6"/>
+            <w:tcBorders>
+              <w:top w:val="single" w:sz="4" w:space="0" w:color="CBCBCB"/>
+              <w:left w:val="single" w:sz="4" w:space="0" w:color="CBCBCB"/>
+              <w:bottom w:val="single" w:sz="4" w:space="0" w:color="CBCBCB"/>
+              <w:right w:val="single" w:sz="4" w:space="0" w:color="CBCBCB"/>
+            </w:tcBorders>
+          </w:tcPr>
+          <w:p>
+            <w:r>
+              <w:rPr>
+                <w:sz w:val="20"/>
+              </w:rPr>
+              <w:t>Không bắt buộc (SSH check writable đủ mức tối thiểu)</w:t>
+            </w:r>
+          </w:p>
+        </w:tc>
+      </w:tr>
+      <w:tr>
+        <w:tc>
+          <w:tcPr>
+            <w:tcW w:type="dxa" w:w="2422"/>
+            <w:tcBorders>
+              <w:top w:val="single" w:sz="4" w:space="0" w:color="CBCBCB"/>
+              <w:left w:val="single" w:sz="4" w:space="0" w:color="CBCBCB"/>
+              <w:bottom w:val="single" w:sz="4" w:space="0" w:color="CBCBCB"/>
+              <w:right w:val="single" w:sz="4" w:space="0" w:color="CBCBCB"/>
+            </w:tcBorders>
+          </w:tcPr>
+          <w:p>
+            <w:r>
+              <w:rPr>
+                <w:sz w:val="20"/>
+              </w:rPr>
+              <w:t>Q10</w:t>
+            </w:r>
+          </w:p>
+        </w:tc>
+        <w:tc>
+          <w:tcPr>
+            <w:tcW w:type="dxa" w:w="2422"/>
+            <w:tcBorders>
+              <w:top w:val="single" w:sz="4" w:space="0" w:color="CBCBCB"/>
+              <w:left w:val="single" w:sz="4" w:space="0" w:color="CBCBCB"/>
+              <w:bottom w:val="single" w:sz="4" w:space="0" w:color="CBCBCB"/>
+              <w:right w:val="single" w:sz="4" w:space="0" w:color="CBCBCB"/>
+            </w:tcBorders>
+          </w:tcPr>
+          <w:p>
+            <w:r>
+              <w:rPr>
+                <w:sz w:val="20"/>
+              </w:rPr>
+              <w:t>Regression F09: SSH + ZcuAgent + Remote Desktop vẫn hoạt động sau deploy đầy đủ</w:t>
+            </w:r>
+          </w:p>
+        </w:tc>
+        <w:tc>
+          <w:tcPr>
+            <w:tcW w:type="dxa" w:w="2422"/>
+            <w:tcBorders>
+              <w:top w:val="single" w:sz="4" w:space="0" w:color="CBCBCB"/>
+              <w:left w:val="single" w:sz="4" w:space="0" w:color="CBCBCB"/>
+              <w:bottom w:val="single" w:sz="4" w:space="0" w:color="CBCBCB"/>
+              <w:right w:val="single" w:sz="4" w:space="0" w:color="CBCBCB"/>
+            </w:tcBorders>
+          </w:tcPr>
+          <w:p>
+            <w:r>
+              <w:rPr>
+                <w:sz w:val="20"/>
+              </w:rPr>
+              <w:t>Kết nối từ CCU như thường lệ</w:t>
+            </w:r>
+          </w:p>
+        </w:tc>
+        <w:tc>
+          <w:tcPr>
+            <w:tcW w:type="dxa" w:w="2422"/>
+            <w:tcBorders>
+              <w:top w:val="single" w:sz="4" w:space="0" w:color="CBCBCB"/>
+              <w:left w:val="single" w:sz="4" w:space="0" w:color="CBCBCB"/>
+              <w:bottom w:val="single" w:sz="4" w:space="0" w:color="CBCBCB"/>
+              <w:right w:val="single" w:sz="4" w:space="0" w:color="CBCBCB"/>
+            </w:tcBorders>
+          </w:tcPr>
+          <w:p>
+            <w:r>
+              <w:rPr>
+                <w:sz w:val="20"/>
+              </w:rPr>
+              <w:t>Không</w:t>
+            </w:r>
+          </w:p>
+        </w:tc>
+      </w:tr>
+    </w:tbl>
+    <w:p/>
+    <w:p>
+      <w:pPr>
+        <w:spacing w:after="80"/>
+      </w:pPr>
+      <w:r>
+        <w:rPr>
+          <w:sz w:val="21"/>
+        </w:rPr>
+        <w:t>— Tech Lead, 2026-07-27 01:00</w:t>
       </w:r>
     </w:p>
     <w:sectPr>

</xml_diff>

<commit_message>
[bugfix-ccu-findings] QA verify F09/F10 vòng 2 trên ZCU thật
- 8 PASS / 0 FAIL / 2 cần thử tay (Q7,Q8 cử chỉ/chạm cảm ứng — VM không có touchscreen)
- Q1-Q6,Q9,Q10 PASS; phát hiện F11 (P2): backup dconf trong thư mục db làm hỏng lệnh gỡ khoá bảo trì
- Đã dọn sạch binary/service test; kiosk lockdown F09/F10 + agent + autologin giữ nguyên

Refs: docs/bugs/BUG-ccu-ui-findings-2026-07-26.md
Co-Authored-By: Claude Opus 5 (1M context) <noreply@anthropic.com>
</commit_message>
<xml_diff>
--- a/docs/bugs/BUG-ccu-ui-findings-2026-07-26.docx
+++ b/docs/bugs/BUG-ccu-ui-findings-2026-07-26.docx
@@ -23479,6 +23479,4561 @@
         </w:rPr>
         <w:t>— Tech Lead, 2026-07-27 01:00</w:t>
       </w:r>
+    </w:p>
+    <w:p>
+      <w:pPr>
+        <w:pBdr>
+          <w:bottom w:val="single" w:sz="6" w:space="1" w:color="F05922"/>
+        </w:pBdr>
+        <w:spacing w:after="120"/>
+      </w:pPr>
+    </w:p>
+    <w:p>
+      <w:pPr>
+        <w:pStyle w:val="Heading2"/>
+        <w:spacing w:before="200" w:after="80"/>
+      </w:pPr>
+      <w:r>
+        <w:rPr>
+          <w:color w:val="F05922"/>
+          <w:sz w:val="28"/>
+        </w:rPr>
+        <w:t>Kết quả QA verify F09/F10 — 2026-07-27 01:22</w:t>
+      </w:r>
+    </w:p>
+    <w:p>
+      <w:pPr>
+        <w:spacing w:after="80"/>
+      </w:pPr>
+      <w:r>
+        <w:rPr>
+          <w:b/>
+          <w:sz w:val="21"/>
+        </w:rPr>
+        <w:t>Người thực hiện:</w:t>
+      </w:r>
+      <w:r>
+        <w:rPr>
+          <w:sz w:val="21"/>
+        </w:rPr>
+        <w:t xml:space="preserve"> QA Engineer (WF-BUGFIX Bước 4 — verify vòng 2 sau APPROVE của Tech Lead </w:t>
+      </w:r>
+      <w:r>
+        <w:rPr>
+          <w:rFonts w:ascii="Courier New" w:hAnsi="Courier New"/>
+          <w:color w:val="F05922"/>
+          <w:sz w:val="18"/>
+        </w:rPr>
+        <w:t>89bf834</w:t>
+      </w:r>
+      <w:r>
+        <w:rPr>
+          <w:sz w:val="21"/>
+        </w:rPr>
+        <w:t>)</w:t>
+      </w:r>
+    </w:p>
+    <w:p>
+      <w:pPr>
+        <w:spacing w:after="80"/>
+      </w:pPr>
+      <w:r>
+        <w:rPr>
+          <w:b/>
+          <w:sz w:val="21"/>
+        </w:rPr>
+        <w:t>Môi trường:</w:t>
+      </w:r>
+      <w:r>
+        <w:rPr>
+          <w:sz w:val="21"/>
+        </w:rPr>
+        <w:t xml:space="preserve"> ZCU thật </w:t>
+      </w:r>
+      <w:r>
+        <w:rPr>
+          <w:rFonts w:ascii="Courier New" w:hAnsi="Courier New"/>
+          <w:color w:val="F05922"/>
+          <w:sz w:val="18"/>
+        </w:rPr>
+        <w:t>192.168.0.101</w:t>
+      </w:r>
+      <w:r>
+        <w:rPr>
+          <w:sz w:val="21"/>
+        </w:rPr>
+        <w:t xml:space="preserve"> (Ubuntu 22.04, GNOME Shell 42.9, X11, GDM3, user </w:t>
+      </w:r>
+      <w:r>
+        <w:rPr>
+          <w:rFonts w:ascii="Courier New" w:hAnsi="Courier New"/>
+          <w:color w:val="F05922"/>
+          <w:sz w:val="18"/>
+        </w:rPr>
+        <w:t>kztek</w:t>
+      </w:r>
+      <w:r>
+        <w:rPr>
+          <w:sz w:val="21"/>
+        </w:rPr>
+        <w:t xml:space="preserve">). Máy là </w:t>
+      </w:r>
+      <w:r>
+        <w:rPr>
+          <w:b/>
+          <w:sz w:val="21"/>
+        </w:rPr>
+        <w:t>VM VirtualBox không có touchscreen vật lý</w:t>
+      </w:r>
+      <w:r>
+        <w:rPr>
+          <w:sz w:val="21"/>
+        </w:rPr>
+        <w:t xml:space="preserve"> → Q7/Q8 (cử chỉ cảm ứng) KHÔNG giả lập được, chuyển user thử tay. Script test upload vào </w:t>
+      </w:r>
+      <w:r>
+        <w:rPr>
+          <w:rFonts w:ascii="Courier New" w:hAnsi="Courier New"/>
+          <w:color w:val="F05922"/>
+          <w:sz w:val="18"/>
+        </w:rPr>
+        <w:t>/tmp/qa-kiosk/</w:t>
+      </w:r>
+      <w:r>
+        <w:rPr>
+          <w:sz w:val="21"/>
+        </w:rPr>
+        <w:t xml:space="preserve"> (bản HEAD </w:t>
+      </w:r>
+      <w:r>
+        <w:rPr>
+          <w:rFonts w:ascii="Courier New" w:hAnsi="Courier New"/>
+          <w:color w:val="F05922"/>
+          <w:sz w:val="18"/>
+        </w:rPr>
+        <w:t>2-configure-system.sh</w:t>
+      </w:r>
+      <w:r>
+        <w:rPr>
+          <w:sz w:val="21"/>
+        </w:rPr>
+        <w:t xml:space="preserve"> + </w:t>
+      </w:r>
+      <w:r>
+        <w:rPr>
+          <w:rFonts w:ascii="Courier New" w:hAnsi="Courier New"/>
+          <w:color w:val="F05922"/>
+          <w:sz w:val="18"/>
+        </w:rPr>
+        <w:t>1-install-software.sh</w:t>
+      </w:r>
+      <w:r>
+        <w:rPr>
+          <w:sz w:val="21"/>
+        </w:rPr>
+        <w:t>).</w:t>
+      </w:r>
+    </w:p>
+    <w:p>
+      <w:pPr>
+        <w:spacing w:after="80"/>
+      </w:pPr>
+      <w:r>
+        <w:rPr>
+          <w:b/>
+          <w:sz w:val="21"/>
+        </w:rPr>
+        <w:t>Backup trước khi test:</w:t>
+      </w:r>
+      <w:r>
+        <w:rPr>
+          <w:sz w:val="21"/>
+        </w:rPr>
+        <w:t xml:space="preserve"> </w:t>
+      </w:r>
+      <w:r>
+        <w:rPr>
+          <w:rFonts w:ascii="Courier New" w:hAnsi="Courier New"/>
+          <w:color w:val="F05922"/>
+          <w:sz w:val="18"/>
+        </w:rPr>
+        <w:t>~/kiosk-qa-backup-2026-07-27/</w:t>
+      </w:r>
+      <w:r>
+        <w:rPr>
+          <w:sz w:val="21"/>
+        </w:rPr>
+        <w:t xml:space="preserve"> chứa </w:t>
+      </w:r>
+      <w:r>
+        <w:rPr>
+          <w:rFonts w:ascii="Courier New" w:hAnsi="Courier New"/>
+          <w:color w:val="F05922"/>
+          <w:sz w:val="18"/>
+        </w:rPr>
+        <w:t>.bak-2026-07-27-qa</w:t>
+      </w:r>
+      <w:r>
+        <w:rPr>
+          <w:sz w:val="21"/>
+        </w:rPr>
+        <w:t xml:space="preserve"> của </w:t>
+      </w:r>
+      <w:r>
+        <w:rPr>
+          <w:rFonts w:ascii="Courier New" w:hAnsi="Courier New"/>
+          <w:color w:val="F05922"/>
+          <w:sz w:val="18"/>
+        </w:rPr>
+        <w:t>ipgs-kiosk.desktop</w:t>
+      </w:r>
+      <w:r>
+        <w:rPr>
+          <w:sz w:val="21"/>
+        </w:rPr>
+        <w:t xml:space="preserve">, </w:t>
+      </w:r>
+      <w:r>
+        <w:rPr>
+          <w:rFonts w:ascii="Courier New" w:hAnsi="Courier New"/>
+          <w:color w:val="F05922"/>
+          <w:sz w:val="18"/>
+        </w:rPr>
+        <w:t>unclutter.desktop</w:t>
+      </w:r>
+      <w:r>
+        <w:rPr>
+          <w:sz w:val="21"/>
+        </w:rPr>
+        <w:t xml:space="preserve">, dconf lockdown + locks. Autologin/gdm có backup </w:t>
+      </w:r>
+      <w:r>
+        <w:rPr>
+          <w:rFonts w:ascii="Courier New" w:hAnsi="Courier New"/>
+          <w:color w:val="F05922"/>
+          <w:sz w:val="18"/>
+        </w:rPr>
+        <w:t>.bak-*</w:t>
+      </w:r>
+      <w:r>
+        <w:rPr>
+          <w:sz w:val="21"/>
+        </w:rPr>
+        <w:t xml:space="preserve"> sẵn của script.</w:t>
+      </w:r>
+    </w:p>
+    <w:p>
+      <w:pPr>
+        <w:spacing w:after="80"/>
+      </w:pPr>
+      <w:r>
+        <w:rPr>
+          <w:b/>
+          <w:sz w:val="21"/>
+        </w:rPr>
+        <w:t>Cách test:</w:t>
+      </w:r>
+      <w:r>
+        <w:rPr>
+          <w:sz w:val="21"/>
+        </w:rPr>
+        <w:t xml:space="preserve"> chạy script với đủ 4 tổ hợp (Autostart, Watchdog), deploy đè lên nhau; watchdog test bằng binary giả an toàn (</w:t>
+      </w:r>
+      <w:r>
+        <w:rPr>
+          <w:rFonts w:ascii="Courier New" w:hAnsi="Courier New"/>
+          <w:color w:val="F05922"/>
+          <w:sz w:val="18"/>
+        </w:rPr>
+        <w:t>exit 1</w:t>
+      </w:r>
+      <w:r>
+        <w:rPr>
+          <w:sz w:val="21"/>
+        </w:rPr>
+        <w:t xml:space="preserve"> để crash-loop, </w:t>
+      </w:r>
+      <w:r>
+        <w:rPr>
+          <w:rFonts w:ascii="Courier New" w:hAnsi="Courier New"/>
+          <w:color w:val="F05922"/>
+          <w:sz w:val="18"/>
+        </w:rPr>
+        <w:t>sleep infinity</w:t>
+      </w:r>
+      <w:r>
+        <w:rPr>
+          <w:sz w:val="21"/>
+        </w:rPr>
+        <w:t xml:space="preserve"> + </w:t>
+      </w:r>
+      <w:r>
+        <w:rPr>
+          <w:rFonts w:ascii="Courier New" w:hAnsi="Courier New"/>
+          <w:color w:val="F05922"/>
+          <w:sz w:val="18"/>
+        </w:rPr>
+        <w:t>gnome-calculator</w:t>
+      </w:r>
+      <w:r>
+        <w:rPr>
+          <w:sz w:val="21"/>
+        </w:rPr>
+        <w:t xml:space="preserve"> cho app sống/GUI); reboot thật cho Q6/Q10; kiểm bằng </w:t>
+      </w:r>
+      <w:r>
+        <w:rPr>
+          <w:rFonts w:ascii="Courier New" w:hAnsi="Courier New"/>
+          <w:color w:val="F05922"/>
+          <w:sz w:val="18"/>
+        </w:rPr>
+        <w:t>systemctl --user</w:t>
+      </w:r>
+      <w:r>
+        <w:rPr>
+          <w:sz w:val="21"/>
+        </w:rPr>
+        <w:t xml:space="preserve">, </w:t>
+      </w:r>
+      <w:r>
+        <w:rPr>
+          <w:rFonts w:ascii="Courier New" w:hAnsi="Courier New"/>
+          <w:color w:val="F05922"/>
+          <w:sz w:val="18"/>
+        </w:rPr>
+        <w:t>ls</w:t>
+      </w:r>
+      <w:r>
+        <w:rPr>
+          <w:sz w:val="21"/>
+        </w:rPr>
+        <w:t xml:space="preserve">, </w:t>
+      </w:r>
+      <w:r>
+        <w:rPr>
+          <w:rFonts w:ascii="Courier New" w:hAnsi="Courier New"/>
+          <w:color w:val="F05922"/>
+          <w:sz w:val="18"/>
+        </w:rPr>
+        <w:t>gsettings writable</w:t>
+      </w:r>
+      <w:r>
+        <w:rPr>
+          <w:sz w:val="21"/>
+        </w:rPr>
+        <w:t xml:space="preserve">, </w:t>
+      </w:r>
+      <w:r>
+        <w:rPr>
+          <w:rFonts w:ascii="Courier New" w:hAnsi="Courier New"/>
+          <w:color w:val="F05922"/>
+          <w:sz w:val="18"/>
+        </w:rPr>
+        <w:t>gnome-extensions info</w:t>
+      </w:r>
+      <w:r>
+        <w:rPr>
+          <w:sz w:val="21"/>
+        </w:rPr>
+        <w:t xml:space="preserve">, </w:t>
+      </w:r>
+      <w:r>
+        <w:rPr>
+          <w:rFonts w:ascii="Courier New" w:hAnsi="Courier New"/>
+          <w:color w:val="F05922"/>
+          <w:sz w:val="18"/>
+        </w:rPr>
+        <w:t>gnome-screenshot</w:t>
+      </w:r>
+      <w:r>
+        <w:rPr>
+          <w:sz w:val="21"/>
+        </w:rPr>
+        <w:t xml:space="preserve">, </w:t>
+      </w:r>
+      <w:r>
+        <w:rPr>
+          <w:rFonts w:ascii="Courier New" w:hAnsi="Courier New"/>
+          <w:color w:val="F05922"/>
+          <w:sz w:val="18"/>
+        </w:rPr>
+        <w:t>xdotool</w:t>
+      </w:r>
+      <w:r>
+        <w:rPr>
+          <w:sz w:val="21"/>
+        </w:rPr>
+        <w:t>.</w:t>
+      </w:r>
+    </w:p>
+    <w:p>
+      <w:pPr>
+        <w:pStyle w:val="Heading3"/>
+        <w:spacing w:before="160" w:after="60"/>
+      </w:pPr>
+      <w:r>
+        <w:rPr>
+          <w:color w:val="4A3F8C"/>
+          <w:sz w:val="24"/>
+        </w:rPr>
+        <w:t>Bảng kết quả Q1–Q10</w:t>
+      </w:r>
+    </w:p>
+    <w:tbl>
+      <w:tblPr>
+        <w:tblStyle w:val="TableGrid"/>
+        <w:tblW w:type="auto" w:w="0"/>
+        <w:tblLook w:firstColumn="1" w:firstRow="1" w:lastColumn="0" w:lastRow="0" w:noHBand="0" w:noVBand="1" w:val="04A0"/>
+      </w:tblPr>
+      <w:tblGrid>
+        <w:gridCol w:w="1938"/>
+        <w:gridCol w:w="1938"/>
+        <w:gridCol w:w="1938"/>
+        <w:gridCol w:w="1938"/>
+        <w:gridCol w:w="1938"/>
+      </w:tblGrid>
+      <w:tr>
+        <w:tc>
+          <w:tcPr>
+            <w:tcW w:type="dxa" w:w="1938"/>
+            <w:shd w:val="clear" w:color="auto" w:fill="251C53"/>
+            <w:tcBorders>
+              <w:top w:val="single" w:sz="4" w:space="0" w:color="251C53"/>
+              <w:left w:val="single" w:sz="4" w:space="0" w:color="251C53"/>
+              <w:bottom w:val="single" w:sz="4" w:space="0" w:color="251C53"/>
+              <w:right w:val="single" w:sz="4" w:space="0" w:color="251C53"/>
+            </w:tcBorders>
+          </w:tcPr>
+          <w:p>
+            <w:r>
+              <w:rPr>
+                <w:b/>
+                <w:color w:val="FFFFFF"/>
+                <w:sz w:val="20"/>
+              </w:rPr>
+              <w:t>Case</w:t>
+            </w:r>
+          </w:p>
+        </w:tc>
+        <w:tc>
+          <w:tcPr>
+            <w:tcW w:type="dxa" w:w="1938"/>
+            <w:shd w:val="clear" w:color="auto" w:fill="251C53"/>
+            <w:tcBorders>
+              <w:top w:val="single" w:sz="4" w:space="0" w:color="251C53"/>
+              <w:left w:val="single" w:sz="4" w:space="0" w:color="251C53"/>
+              <w:bottom w:val="single" w:sz="4" w:space="0" w:color="251C53"/>
+              <w:right w:val="single" w:sz="4" w:space="0" w:color="251C53"/>
+            </w:tcBorders>
+          </w:tcPr>
+          <w:p>
+            <w:r>
+              <w:rPr>
+                <w:b/>
+                <w:color w:val="FFFFFF"/>
+                <w:sz w:val="20"/>
+              </w:rPr>
+              <w:t>Nội dung</w:t>
+            </w:r>
+          </w:p>
+        </w:tc>
+        <w:tc>
+          <w:tcPr>
+            <w:tcW w:type="dxa" w:w="1938"/>
+            <w:shd w:val="clear" w:color="auto" w:fill="251C53"/>
+            <w:tcBorders>
+              <w:top w:val="single" w:sz="4" w:space="0" w:color="251C53"/>
+              <w:left w:val="single" w:sz="4" w:space="0" w:color="251C53"/>
+              <w:bottom w:val="single" w:sz="4" w:space="0" w:color="251C53"/>
+              <w:right w:val="single" w:sz="4" w:space="0" w:color="251C53"/>
+            </w:tcBorders>
+          </w:tcPr>
+          <w:p>
+            <w:r>
+              <w:rPr>
+                <w:b/>
+                <w:color w:val="FFFFFF"/>
+                <w:sz w:val="20"/>
+              </w:rPr>
+              <w:t>Kết quả</w:t>
+            </w:r>
+          </w:p>
+        </w:tc>
+        <w:tc>
+          <w:tcPr>
+            <w:tcW w:type="dxa" w:w="1938"/>
+            <w:shd w:val="clear" w:color="auto" w:fill="251C53"/>
+            <w:tcBorders>
+              <w:top w:val="single" w:sz="4" w:space="0" w:color="251C53"/>
+              <w:left w:val="single" w:sz="4" w:space="0" w:color="251C53"/>
+              <w:bottom w:val="single" w:sz="4" w:space="0" w:color="251C53"/>
+              <w:right w:val="single" w:sz="4" w:space="0" w:color="251C53"/>
+            </w:tcBorders>
+          </w:tcPr>
+          <w:p>
+            <w:r>
+              <w:rPr>
+                <w:b/>
+                <w:color w:val="FFFFFF"/>
+                <w:sz w:val="20"/>
+              </w:rPr>
+              <w:t>Bằng chứng (lệnh + output rút gọn)</w:t>
+            </w:r>
+          </w:p>
+        </w:tc>
+        <w:tc>
+          <w:tcPr>
+            <w:tcW w:type="dxa" w:w="1938"/>
+            <w:shd w:val="clear" w:color="auto" w:fill="251C53"/>
+            <w:tcBorders>
+              <w:top w:val="single" w:sz="4" w:space="0" w:color="251C53"/>
+              <w:left w:val="single" w:sz="4" w:space="0" w:color="251C53"/>
+              <w:bottom w:val="single" w:sz="4" w:space="0" w:color="251C53"/>
+              <w:right w:val="single" w:sz="4" w:space="0" w:color="251C53"/>
+            </w:tcBorders>
+          </w:tcPr>
+          <w:p>
+            <w:r>
+              <w:rPr>
+                <w:b/>
+                <w:color w:val="FFFFFF"/>
+                <w:sz w:val="20"/>
+              </w:rPr>
+            </w:r>
+          </w:p>
+        </w:tc>
+      </w:tr>
+      <w:tr>
+        <w:tc>
+          <w:tcPr>
+            <w:tcW w:type="dxa" w:w="1938"/>
+            <w:tcBorders>
+              <w:top w:val="single" w:sz="4" w:space="0" w:color="CBCBCB"/>
+              <w:left w:val="single" w:sz="4" w:space="0" w:color="CBCBCB"/>
+              <w:bottom w:val="single" w:sz="4" w:space="0" w:color="CBCBCB"/>
+              <w:right w:val="single" w:sz="4" w:space="0" w:color="CBCBCB"/>
+            </w:tcBorders>
+          </w:tcPr>
+          <w:p>
+            <w:r>
+              <w:rPr>
+                <w:sz w:val="20"/>
+              </w:rPr>
+              <w:t>---</w:t>
+            </w:r>
+          </w:p>
+        </w:tc>
+        <w:tc>
+          <w:tcPr>
+            <w:tcW w:type="dxa" w:w="1938"/>
+            <w:tcBorders>
+              <w:top w:val="single" w:sz="4" w:space="0" w:color="CBCBCB"/>
+              <w:left w:val="single" w:sz="4" w:space="0" w:color="CBCBCB"/>
+              <w:bottom w:val="single" w:sz="4" w:space="0" w:color="CBCBCB"/>
+              <w:right w:val="single" w:sz="4" w:space="0" w:color="CBCBCB"/>
+            </w:tcBorders>
+          </w:tcPr>
+          <w:p>
+            <w:r>
+              <w:rPr>
+                <w:sz w:val="20"/>
+              </w:rPr>
+              <w:t>---</w:t>
+            </w:r>
+          </w:p>
+        </w:tc>
+        <w:tc>
+          <w:tcPr>
+            <w:tcW w:type="dxa" w:w="1938"/>
+            <w:tcBorders>
+              <w:top w:val="single" w:sz="4" w:space="0" w:color="CBCBCB"/>
+              <w:left w:val="single" w:sz="4" w:space="0" w:color="CBCBCB"/>
+              <w:bottom w:val="single" w:sz="4" w:space="0" w:color="CBCBCB"/>
+              <w:right w:val="single" w:sz="4" w:space="0" w:color="CBCBCB"/>
+            </w:tcBorders>
+          </w:tcPr>
+          <w:p>
+            <w:r>
+              <w:rPr>
+                <w:sz w:val="20"/>
+              </w:rPr>
+              <w:t>---</w:t>
+            </w:r>
+          </w:p>
+        </w:tc>
+        <w:tc>
+          <w:tcPr>
+            <w:tcW w:type="dxa" w:w="1938"/>
+            <w:tcBorders>
+              <w:top w:val="single" w:sz="4" w:space="0" w:color="CBCBCB"/>
+              <w:left w:val="single" w:sz="4" w:space="0" w:color="CBCBCB"/>
+              <w:bottom w:val="single" w:sz="4" w:space="0" w:color="CBCBCB"/>
+              <w:right w:val="single" w:sz="4" w:space="0" w:color="CBCBCB"/>
+            </w:tcBorders>
+          </w:tcPr>
+          <w:p>
+            <w:r>
+              <w:rPr>
+                <w:sz w:val="20"/>
+              </w:rPr>
+              <w:t>---</w:t>
+            </w:r>
+          </w:p>
+        </w:tc>
+        <w:tc>
+          <w:tcPr>
+            <w:tcW w:type="dxa" w:w="1938"/>
+            <w:tcBorders>
+              <w:top w:val="single" w:sz="4" w:space="0" w:color="CBCBCB"/>
+              <w:left w:val="single" w:sz="4" w:space="0" w:color="CBCBCB"/>
+              <w:bottom w:val="single" w:sz="4" w:space="0" w:color="CBCBCB"/>
+              <w:right w:val="single" w:sz="4" w:space="0" w:color="CBCBCB"/>
+            </w:tcBorders>
+          </w:tcPr>
+          <w:p/>
+        </w:tc>
+      </w:tr>
+      <w:tr>
+        <w:tc>
+          <w:tcPr>
+            <w:tcW w:type="dxa" w:w="1938"/>
+            <w:shd w:val="clear" w:color="auto" w:fill="B8B3D6"/>
+            <w:tcBorders>
+              <w:top w:val="single" w:sz="4" w:space="0" w:color="CBCBCB"/>
+              <w:left w:val="single" w:sz="4" w:space="0" w:color="CBCBCB"/>
+              <w:bottom w:val="single" w:sz="4" w:space="0" w:color="CBCBCB"/>
+              <w:right w:val="single" w:sz="4" w:space="0" w:color="CBCBCB"/>
+            </w:tcBorders>
+          </w:tcPr>
+          <w:p>
+            <w:r>
+              <w:rPr>
+                <w:b/>
+                <w:sz w:val="20"/>
+              </w:rPr>
+              <w:t>Q1</w:t>
+            </w:r>
+          </w:p>
+        </w:tc>
+        <w:tc>
+          <w:tcPr>
+            <w:tcW w:type="dxa" w:w="1938"/>
+            <w:shd w:val="clear" w:color="auto" w:fill="B8B3D6"/>
+            <w:tcBorders>
+              <w:top w:val="single" w:sz="4" w:space="0" w:color="CBCBCB"/>
+              <w:left w:val="single" w:sz="4" w:space="0" w:color="CBCBCB"/>
+              <w:bottom w:val="single" w:sz="4" w:space="0" w:color="CBCBCB"/>
+              <w:right w:val="single" w:sz="4" w:space="0" w:color="CBCBCB"/>
+            </w:tcBorders>
+          </w:tcPr>
+          <w:p>
+            <w:r>
+              <w:rPr>
+                <w:sz w:val="20"/>
+              </w:rPr>
+              <w:t>R1 ma trận: deploy (AS=1,WD=0) → deploy lại (AS=0,WD=1)</w:t>
+            </w:r>
+          </w:p>
+        </w:tc>
+        <w:tc>
+          <w:tcPr>
+            <w:tcW w:type="dxa" w:w="1938"/>
+            <w:shd w:val="clear" w:color="auto" w:fill="B8B3D6"/>
+            <w:tcBorders>
+              <w:top w:val="single" w:sz="4" w:space="0" w:color="CBCBCB"/>
+              <w:left w:val="single" w:sz="4" w:space="0" w:color="CBCBCB"/>
+              <w:bottom w:val="single" w:sz="4" w:space="0" w:color="CBCBCB"/>
+              <w:right w:val="single" w:sz="4" w:space="0" w:color="CBCBCB"/>
+            </w:tcBorders>
+          </w:tcPr>
+          <w:p>
+            <w:r>
+              <w:rPr>
+                <w:sz w:val="20"/>
+              </w:rPr>
+              <w:t xml:space="preserve">✅ </w:t>
+            </w:r>
+            <w:r>
+              <w:rPr>
+                <w:b/>
+                <w:sz w:val="20"/>
+              </w:rPr>
+              <w:t>PASS</w:t>
+            </w:r>
+          </w:p>
+        </w:tc>
+        <w:tc>
+          <w:tcPr>
+            <w:tcW w:type="dxa" w:w="1938"/>
+            <w:shd w:val="clear" w:color="auto" w:fill="B8B3D6"/>
+            <w:tcBorders>
+              <w:top w:val="single" w:sz="4" w:space="0" w:color="CBCBCB"/>
+              <w:left w:val="single" w:sz="4" w:space="0" w:color="CBCBCB"/>
+              <w:bottom w:val="single" w:sz="4" w:space="0" w:color="CBCBCB"/>
+              <w:right w:val="single" w:sz="4" w:space="0" w:color="CBCBCB"/>
+            </w:tcBorders>
+          </w:tcPr>
+          <w:p>
+            <w:r>
+              <w:rPr>
+                <w:sz w:val="20"/>
+              </w:rPr>
+              <w:t xml:space="preserve">Sau deploy #2 (AS=0,WD=1): mục [8/9] log "Watchdog BẬT: đã xóa autostart .desktop của app"; </w:t>
+            </w:r>
+            <w:r>
+              <w:rPr>
+                <w:rFonts w:ascii="Courier New" w:hAnsi="Courier New"/>
+                <w:color w:val="F05922"/>
+                <w:sz w:val="20"/>
+              </w:rPr>
+              <w:t>ls ~/.config/autostart/</w:t>
+            </w:r>
+            <w:r>
+              <w:rPr>
+                <w:sz w:val="20"/>
+              </w:rPr>
+              <w:t xml:space="preserve"> → </w:t>
+            </w:r>
+            <w:r>
+              <w:rPr>
+                <w:b/>
+                <w:sz w:val="20"/>
+              </w:rPr>
+              <w:t>KHÔNG còn `ipgs-kiosk.desktop`</w:t>
+            </w:r>
+            <w:r>
+              <w:rPr>
+                <w:sz w:val="20"/>
+              </w:rPr>
+              <w:t xml:space="preserve"> (chỉ </w:t>
+            </w:r>
+            <w:r>
+              <w:rPr>
+                <w:rFonts w:ascii="Courier New" w:hAnsi="Courier New"/>
+                <w:color w:val="F05922"/>
+                <w:sz w:val="20"/>
+              </w:rPr>
+              <w:t>update-notifier.desktop</w:t>
+            </w:r>
+            <w:r>
+              <w:rPr>
+                <w:sz w:val="20"/>
+              </w:rPr>
+              <w:t xml:space="preserve">); </w:t>
+            </w:r>
+            <w:r>
+              <w:rPr>
+                <w:rFonts w:ascii="Courier New" w:hAnsi="Courier New"/>
+                <w:color w:val="F05922"/>
+                <w:sz w:val="20"/>
+              </w:rPr>
+              <w:t>systemctl --user is-enabled ipgs-kiosk-app</w:t>
+            </w:r>
+            <w:r>
+              <w:rPr>
+                <w:sz w:val="20"/>
+              </w:rPr>
+              <w:t xml:space="preserve"> = </w:t>
+            </w:r>
+            <w:r>
+              <w:rPr>
+                <w:b/>
+                <w:sz w:val="20"/>
+              </w:rPr>
+              <w:t>enabled</w:t>
+            </w:r>
+            <w:r>
+              <w:rPr>
+                <w:sz w:val="20"/>
+              </w:rPr>
+              <w:t xml:space="preserve">. Không còn </w:t>
+            </w:r>
+            <w:r>
+              <w:rPr>
+                <w:rFonts w:ascii="Courier New" w:hAnsi="Courier New"/>
+                <w:color w:val="F05922"/>
+                <w:sz w:val="20"/>
+              </w:rPr>
+              <w:t>.desktop</w:t>
+            </w:r>
+            <w:r>
+              <w:rPr>
+                <w:sz w:val="20"/>
+              </w:rPr>
+              <w:t xml:space="preserve"> mồ côi.</w:t>
+            </w:r>
+          </w:p>
+        </w:tc>
+        <w:tc>
+          <w:tcPr>
+            <w:tcW w:type="dxa" w:w="1938"/>
+            <w:shd w:val="clear" w:color="auto" w:fill="B8B3D6"/>
+            <w:tcBorders>
+              <w:top w:val="single" w:sz="4" w:space="0" w:color="CBCBCB"/>
+              <w:left w:val="single" w:sz="4" w:space="0" w:color="CBCBCB"/>
+              <w:bottom w:val="single" w:sz="4" w:space="0" w:color="CBCBCB"/>
+              <w:right w:val="single" w:sz="4" w:space="0" w:color="CBCBCB"/>
+            </w:tcBorders>
+          </w:tcPr>
+          <w:p/>
+        </w:tc>
+      </w:tr>
+      <w:tr>
+        <w:tc>
+          <w:tcPr>
+            <w:tcW w:type="dxa" w:w="1938"/>
+            <w:tcBorders>
+              <w:top w:val="single" w:sz="4" w:space="0" w:color="CBCBCB"/>
+              <w:left w:val="single" w:sz="4" w:space="0" w:color="CBCBCB"/>
+              <w:bottom w:val="single" w:sz="4" w:space="0" w:color="CBCBCB"/>
+              <w:right w:val="single" w:sz="4" w:space="0" w:color="CBCBCB"/>
+            </w:tcBorders>
+          </w:tcPr>
+          <w:p>
+            <w:r>
+              <w:rPr>
+                <w:b/>
+                <w:sz w:val="20"/>
+              </w:rPr>
+              <w:t>Q2</w:t>
+            </w:r>
+          </w:p>
+        </w:tc>
+        <w:tc>
+          <w:tcPr>
+            <w:tcW w:type="dxa" w:w="1938"/>
+            <w:tcBorders>
+              <w:top w:val="single" w:sz="4" w:space="0" w:color="CBCBCB"/>
+              <w:left w:val="single" w:sz="4" w:space="0" w:color="CBCBCB"/>
+              <w:bottom w:val="single" w:sz="4" w:space="0" w:color="CBCBCB"/>
+              <w:right w:val="single" w:sz="4" w:space="0" w:color="CBCBCB"/>
+            </w:tcBorders>
+          </w:tcPr>
+          <w:p>
+            <w:r>
+              <w:rPr>
+                <w:sz w:val="20"/>
+              </w:rPr>
+              <w:t>R1 chiều ngược: deploy (WD=1) → deploy lại (WD=0,AS=1)</w:t>
+            </w:r>
+          </w:p>
+        </w:tc>
+        <w:tc>
+          <w:tcPr>
+            <w:tcW w:type="dxa" w:w="1938"/>
+            <w:tcBorders>
+              <w:top w:val="single" w:sz="4" w:space="0" w:color="CBCBCB"/>
+              <w:left w:val="single" w:sz="4" w:space="0" w:color="CBCBCB"/>
+              <w:bottom w:val="single" w:sz="4" w:space="0" w:color="CBCBCB"/>
+              <w:right w:val="single" w:sz="4" w:space="0" w:color="CBCBCB"/>
+            </w:tcBorders>
+          </w:tcPr>
+          <w:p>
+            <w:r>
+              <w:rPr>
+                <w:sz w:val="20"/>
+              </w:rPr>
+              <w:t xml:space="preserve">✅ </w:t>
+            </w:r>
+            <w:r>
+              <w:rPr>
+                <w:b/>
+                <w:sz w:val="20"/>
+              </w:rPr>
+              <w:t>PASS</w:t>
+            </w:r>
+          </w:p>
+        </w:tc>
+        <w:tc>
+          <w:tcPr>
+            <w:tcW w:type="dxa" w:w="1938"/>
+            <w:tcBorders>
+              <w:top w:val="single" w:sz="4" w:space="0" w:color="CBCBCB"/>
+              <w:left w:val="single" w:sz="4" w:space="0" w:color="CBCBCB"/>
+              <w:bottom w:val="single" w:sz="4" w:space="0" w:color="CBCBCB"/>
+              <w:right w:val="single" w:sz="4" w:space="0" w:color="CBCBCB"/>
+            </w:tcBorders>
+          </w:tcPr>
+          <w:p>
+            <w:r>
+              <w:rPr>
+                <w:sz w:val="20"/>
+              </w:rPr>
+              <w:t>Sau deploy (WD=0,AS=1): mục [10] "Đã gỡ watchdog service"; `systemctl --user list-unit-files \</w:t>
+            </w:r>
+          </w:p>
+        </w:tc>
+        <w:tc>
+          <w:tcPr>
+            <w:tcW w:type="dxa" w:w="1938"/>
+            <w:tcBorders>
+              <w:top w:val="single" w:sz="4" w:space="0" w:color="CBCBCB"/>
+              <w:left w:val="single" w:sz="4" w:space="0" w:color="CBCBCB"/>
+              <w:bottom w:val="single" w:sz="4" w:space="0" w:color="CBCBCB"/>
+              <w:right w:val="single" w:sz="4" w:space="0" w:color="CBCBCB"/>
+            </w:tcBorders>
+          </w:tcPr>
+          <w:p>
+            <w:r>
+              <w:rPr>
+                <w:sz w:val="20"/>
+              </w:rPr>
+              <w:t>grep kiosk</w:t>
+            </w:r>
+            <w:r>
+              <w:rPr>
+                <w:rFonts w:ascii="Courier New" w:hAnsi="Courier New"/>
+                <w:color w:val="F05922"/>
+                <w:sz w:val="20"/>
+              </w:rPr>
+              <w:t xml:space="preserve"> → **NO-KIOSK-UNIT** (</w:t>
+            </w:r>
+            <w:r>
+              <w:rPr>
+                <w:sz w:val="20"/>
+              </w:rPr>
+              <w:t>systemctl --user cat ipgs-kiosk-app</w:t>
+            </w:r>
+            <w:r>
+              <w:rPr>
+                <w:rFonts w:ascii="Courier New" w:hAnsi="Courier New"/>
+                <w:color w:val="F05922"/>
+                <w:sz w:val="20"/>
+              </w:rPr>
+              <w:t xml:space="preserve"> → "No files found"); </w:t>
+            </w:r>
+            <w:r>
+              <w:rPr>
+                <w:sz w:val="20"/>
+              </w:rPr>
+              <w:t>.desktop` app + unclutter được tạo lại. Không còn service mồ côi. Đã kiểm cả 2 tổ hợp còn lại (AS=1/WD=1 → chỉ unclutter.desktop + unit enabled; AS=0/WD=0 → không .desktop app, không unit) — trạng thái cuối luôn khớp cấu hình vừa chọn.</w:t>
+            </w:r>
+          </w:p>
+        </w:tc>
+      </w:tr>
+      <w:tr>
+        <w:tc>
+          <w:tcPr>
+            <w:tcW w:type="dxa" w:w="1938"/>
+            <w:shd w:val="clear" w:color="auto" w:fill="B8B3D6"/>
+            <w:tcBorders>
+              <w:top w:val="single" w:sz="4" w:space="0" w:color="CBCBCB"/>
+              <w:left w:val="single" w:sz="4" w:space="0" w:color="CBCBCB"/>
+              <w:bottom w:val="single" w:sz="4" w:space="0" w:color="CBCBCB"/>
+              <w:right w:val="single" w:sz="4" w:space="0" w:color="CBCBCB"/>
+            </w:tcBorders>
+          </w:tcPr>
+          <w:p>
+            <w:r>
+              <w:rPr>
+                <w:b/>
+                <w:sz w:val="20"/>
+              </w:rPr>
+              <w:t>Q3</w:t>
+            </w:r>
+          </w:p>
+        </w:tc>
+        <w:tc>
+          <w:tcPr>
+            <w:tcW w:type="dxa" w:w="1938"/>
+            <w:shd w:val="clear" w:color="auto" w:fill="B8B3D6"/>
+            <w:tcBorders>
+              <w:top w:val="single" w:sz="4" w:space="0" w:color="CBCBCB"/>
+              <w:left w:val="single" w:sz="4" w:space="0" w:color="CBCBCB"/>
+              <w:bottom w:val="single" w:sz="4" w:space="0" w:color="CBCBCB"/>
+              <w:right w:val="single" w:sz="4" w:space="0" w:color="CBCBCB"/>
+            </w:tcBorders>
+          </w:tcPr>
+          <w:p>
+            <w:r>
+              <w:rPr>
+                <w:sz w:val="20"/>
+              </w:rPr>
+              <w:t>R2 retry vô hạn: binary giả crash ngay (exit 1)</w:t>
+            </w:r>
+          </w:p>
+        </w:tc>
+        <w:tc>
+          <w:tcPr>
+            <w:tcW w:type="dxa" w:w="1938"/>
+            <w:shd w:val="clear" w:color="auto" w:fill="B8B3D6"/>
+            <w:tcBorders>
+              <w:top w:val="single" w:sz="4" w:space="0" w:color="CBCBCB"/>
+              <w:left w:val="single" w:sz="4" w:space="0" w:color="CBCBCB"/>
+              <w:bottom w:val="single" w:sz="4" w:space="0" w:color="CBCBCB"/>
+              <w:right w:val="single" w:sz="4" w:space="0" w:color="CBCBCB"/>
+            </w:tcBorders>
+          </w:tcPr>
+          <w:p>
+            <w:r>
+              <w:rPr>
+                <w:sz w:val="20"/>
+              </w:rPr>
+              <w:t xml:space="preserve">✅ </w:t>
+            </w:r>
+            <w:r>
+              <w:rPr>
+                <w:b/>
+                <w:sz w:val="20"/>
+              </w:rPr>
+              <w:t>PASS</w:t>
+            </w:r>
+          </w:p>
+        </w:tc>
+        <w:tc>
+          <w:tcPr>
+            <w:tcW w:type="dxa" w:w="1938"/>
+            <w:shd w:val="clear" w:color="auto" w:fill="B8B3D6"/>
+            <w:tcBorders>
+              <w:top w:val="single" w:sz="4" w:space="0" w:color="CBCBCB"/>
+              <w:left w:val="single" w:sz="4" w:space="0" w:color="CBCBCB"/>
+              <w:bottom w:val="single" w:sz="4" w:space="0" w:color="CBCBCB"/>
+              <w:right w:val="single" w:sz="4" w:space="0" w:color="CBCBCB"/>
+            </w:tcBorders>
+          </w:tcPr>
+          <w:p>
+            <w:r>
+              <w:rPr>
+                <w:sz w:val="20"/>
+              </w:rPr>
+              <w:t xml:space="preserve">Deploy WD=1 trỏ </w:t>
+            </w:r>
+            <w:r>
+              <w:rPr>
+                <w:rFonts w:ascii="Courier New" w:hAnsi="Courier New"/>
+                <w:color w:val="F05922"/>
+                <w:sz w:val="20"/>
+              </w:rPr>
+              <w:t>fakeapp</w:t>
+            </w:r>
+            <w:r>
+              <w:rPr>
+                <w:sz w:val="20"/>
+              </w:rPr>
+              <w:t xml:space="preserve"> (exit 1), </w:t>
+            </w:r>
+            <w:r>
+              <w:rPr>
+                <w:rFonts w:ascii="Courier New" w:hAnsi="Courier New"/>
+                <w:color w:val="F05922"/>
+                <w:sz w:val="20"/>
+              </w:rPr>
+              <w:t>systemctl --user start</w:t>
+            </w:r>
+            <w:r>
+              <w:rPr>
+                <w:sz w:val="20"/>
+              </w:rPr>
+              <w:t xml:space="preserve">. Theo dõi &gt;4 phút (mẫu @01:08→01:12): </w:t>
+            </w:r>
+            <w:r>
+              <w:rPr>
+                <w:rFonts w:ascii="Courier New" w:hAnsi="Courier New"/>
+                <w:color w:val="F05922"/>
+                <w:sz w:val="20"/>
+              </w:rPr>
+              <w:t>ActiveState=activating</w:t>
+            </w:r>
+            <w:r>
+              <w:rPr>
+                <w:sz w:val="20"/>
+              </w:rPr>
+              <w:t xml:space="preserve">, </w:t>
+            </w:r>
+            <w:r>
+              <w:rPr>
+                <w:rFonts w:ascii="Courier New" w:hAnsi="Courier New"/>
+                <w:color w:val="F05922"/>
+                <w:sz w:val="20"/>
+              </w:rPr>
+              <w:t>SubState=auto-restart</w:t>
+            </w:r>
+            <w:r>
+              <w:rPr>
+                <w:sz w:val="20"/>
+              </w:rPr>
+              <w:t xml:space="preserve">, </w:t>
+            </w:r>
+            <w:r>
+              <w:rPr>
+                <w:rFonts w:ascii="Courier New" w:hAnsi="Courier New"/>
+                <w:color w:val="F05922"/>
+                <w:sz w:val="20"/>
+              </w:rPr>
+              <w:t>NRestarts</w:t>
+            </w:r>
+            <w:r>
+              <w:rPr>
+                <w:sz w:val="20"/>
+              </w:rPr>
+              <w:t xml:space="preserve"> tăng đều </w:t>
+            </w:r>
+            <w:r>
+              <w:rPr>
+                <w:b/>
+                <w:sz w:val="20"/>
+              </w:rPr>
+              <w:t>1→7→12→18→27</w:t>
+            </w:r>
+            <w:r>
+              <w:rPr>
+                <w:sz w:val="20"/>
+              </w:rPr>
+              <w:t xml:space="preserve"> (~6 lần/phút, nhịp ~10s), </w:t>
+            </w:r>
+            <w:r>
+              <w:rPr>
+                <w:b/>
+                <w:sz w:val="20"/>
+              </w:rPr>
+              <w:t>KHÔNG bao giờ vào `failed`</w:t>
+            </w:r>
+            <w:r>
+              <w:rPr>
+                <w:sz w:val="20"/>
+              </w:rPr>
+              <w:t xml:space="preserve">. Unit </w:t>
+            </w:r>
+            <w:r>
+              <w:rPr>
+                <w:rFonts w:ascii="Courier New" w:hAnsi="Courier New"/>
+                <w:color w:val="F05922"/>
+                <w:sz w:val="20"/>
+              </w:rPr>
+              <w:t>StartLimitIntervalSec=0</w:t>
+            </w:r>
+            <w:r>
+              <w:rPr>
+                <w:sz w:val="20"/>
+              </w:rPr>
+              <w:t xml:space="preserve"> + </w:t>
+            </w:r>
+            <w:r>
+              <w:rPr>
+                <w:rFonts w:ascii="Courier New" w:hAnsi="Courier New"/>
+                <w:color w:val="F05922"/>
+                <w:sz w:val="20"/>
+              </w:rPr>
+              <w:t>Restart=always RestartSec=10</w:t>
+            </w:r>
+            <w:r>
+              <w:rPr>
+                <w:sz w:val="20"/>
+              </w:rPr>
+              <w:t xml:space="preserve"> xác nhận qua </w:t>
+            </w:r>
+            <w:r>
+              <w:rPr>
+                <w:rFonts w:ascii="Courier New" w:hAnsi="Courier New"/>
+                <w:color w:val="F05922"/>
+                <w:sz w:val="20"/>
+              </w:rPr>
+              <w:t>systemctl --user cat</w:t>
+            </w:r>
+            <w:r>
+              <w:rPr>
+                <w:sz w:val="20"/>
+              </w:rPr>
+              <w:t>.</w:t>
+            </w:r>
+          </w:p>
+        </w:tc>
+        <w:tc>
+          <w:tcPr>
+            <w:tcW w:type="dxa" w:w="1938"/>
+            <w:shd w:val="clear" w:color="auto" w:fill="B8B3D6"/>
+            <w:tcBorders>
+              <w:top w:val="single" w:sz="4" w:space="0" w:color="CBCBCB"/>
+              <w:left w:val="single" w:sz="4" w:space="0" w:color="CBCBCB"/>
+              <w:bottom w:val="single" w:sz="4" w:space="0" w:color="CBCBCB"/>
+              <w:right w:val="single" w:sz="4" w:space="0" w:color="CBCBCB"/>
+            </w:tcBorders>
+          </w:tcPr>
+          <w:p/>
+        </w:tc>
+      </w:tr>
+      <w:tr>
+        <w:tc>
+          <w:tcPr>
+            <w:tcW w:type="dxa" w:w="1938"/>
+            <w:tcBorders>
+              <w:top w:val="single" w:sz="4" w:space="0" w:color="CBCBCB"/>
+              <w:left w:val="single" w:sz="4" w:space="0" w:color="CBCBCB"/>
+              <w:bottom w:val="single" w:sz="4" w:space="0" w:color="CBCBCB"/>
+              <w:right w:val="single" w:sz="4" w:space="0" w:color="CBCBCB"/>
+            </w:tcBorders>
+          </w:tcPr>
+          <w:p>
+            <w:r>
+              <w:rPr>
+                <w:b/>
+                <w:sz w:val="20"/>
+              </w:rPr>
+              <w:t>Q4</w:t>
+            </w:r>
+          </w:p>
+        </w:tc>
+        <w:tc>
+          <w:tcPr>
+            <w:tcW w:type="dxa" w:w="1938"/>
+            <w:tcBorders>
+              <w:top w:val="single" w:sz="4" w:space="0" w:color="CBCBCB"/>
+              <w:left w:val="single" w:sz="4" w:space="0" w:color="CBCBCB"/>
+              <w:bottom w:val="single" w:sz="4" w:space="0" w:color="CBCBCB"/>
+              <w:right w:val="single" w:sz="4" w:space="0" w:color="CBCBCB"/>
+            </w:tcBorders>
+          </w:tcPr>
+          <w:p>
+            <w:r>
+              <w:rPr>
+                <w:sz w:val="20"/>
+              </w:rPr>
+              <w:t>R2 hồi phục: giữa lúc retry, đổi binary thành app sống</w:t>
+            </w:r>
+          </w:p>
+        </w:tc>
+        <w:tc>
+          <w:tcPr>
+            <w:tcW w:type="dxa" w:w="1938"/>
+            <w:tcBorders>
+              <w:top w:val="single" w:sz="4" w:space="0" w:color="CBCBCB"/>
+              <w:left w:val="single" w:sz="4" w:space="0" w:color="CBCBCB"/>
+              <w:bottom w:val="single" w:sz="4" w:space="0" w:color="CBCBCB"/>
+              <w:right w:val="single" w:sz="4" w:space="0" w:color="CBCBCB"/>
+            </w:tcBorders>
+          </w:tcPr>
+          <w:p>
+            <w:r>
+              <w:rPr>
+                <w:sz w:val="20"/>
+              </w:rPr>
+              <w:t xml:space="preserve">✅ </w:t>
+            </w:r>
+            <w:r>
+              <w:rPr>
+                <w:b/>
+                <w:sz w:val="20"/>
+              </w:rPr>
+              <w:t>PASS</w:t>
+            </w:r>
+          </w:p>
+        </w:tc>
+        <w:tc>
+          <w:tcPr>
+            <w:tcW w:type="dxa" w:w="1938"/>
+            <w:tcBorders>
+              <w:top w:val="single" w:sz="4" w:space="0" w:color="CBCBCB"/>
+              <w:left w:val="single" w:sz="4" w:space="0" w:color="CBCBCB"/>
+              <w:bottom w:val="single" w:sz="4" w:space="0" w:color="CBCBCB"/>
+              <w:right w:val="single" w:sz="4" w:space="0" w:color="CBCBCB"/>
+            </w:tcBorders>
+          </w:tcPr>
+          <w:p>
+            <w:r>
+              <w:rPr>
+                <w:sz w:val="20"/>
+              </w:rPr>
+              <w:t xml:space="preserve">Ghi đè </w:t>
+            </w:r>
+            <w:r>
+              <w:rPr>
+                <w:rFonts w:ascii="Courier New" w:hAnsi="Courier New"/>
+                <w:color w:val="F05922"/>
+                <w:sz w:val="20"/>
+              </w:rPr>
+              <w:t>fakeapp</w:t>
+            </w:r>
+            <w:r>
+              <w:rPr>
+                <w:sz w:val="20"/>
+              </w:rPr>
+              <w:t xml:space="preserve"> = </w:t>
+            </w:r>
+            <w:r>
+              <w:rPr>
+                <w:rFonts w:ascii="Courier New" w:hAnsi="Courier New"/>
+                <w:color w:val="F05922"/>
+                <w:sz w:val="20"/>
+              </w:rPr>
+              <w:t>exec sleep infinity</w:t>
+            </w:r>
+            <w:r>
+              <w:rPr>
+                <w:sz w:val="20"/>
+              </w:rPr>
+              <w:t xml:space="preserve"> (KHÔNG chạy lệnh systemctl nào) → lần retry kế tiếp tự chạy: </w:t>
+            </w:r>
+            <w:r>
+              <w:rPr>
+                <w:rFonts w:ascii="Courier New" w:hAnsi="Courier New"/>
+                <w:color w:val="F05922"/>
+                <w:sz w:val="20"/>
+              </w:rPr>
+              <w:t>ActiveState=active SubState=running MainPID=8061</w:t>
+            </w:r>
+            <w:r>
+              <w:rPr>
+                <w:sz w:val="20"/>
+              </w:rPr>
+              <w:t xml:space="preserve">, </w:t>
+            </w:r>
+            <w:r>
+              <w:rPr>
+                <w:rFonts w:ascii="Courier New" w:hAnsi="Courier New"/>
+                <w:color w:val="F05922"/>
+                <w:sz w:val="20"/>
+              </w:rPr>
+              <w:t>NRestarts=27</w:t>
+            </w:r>
+            <w:r>
+              <w:rPr>
+                <w:sz w:val="20"/>
+              </w:rPr>
+              <w:t xml:space="preserve"> (không tăng thêm). Watchdog tự hồi phục không cần thao tác.</w:t>
+            </w:r>
+          </w:p>
+        </w:tc>
+        <w:tc>
+          <w:tcPr>
+            <w:tcW w:type="dxa" w:w="1938"/>
+            <w:tcBorders>
+              <w:top w:val="single" w:sz="4" w:space="0" w:color="CBCBCB"/>
+              <w:left w:val="single" w:sz="4" w:space="0" w:color="CBCBCB"/>
+              <w:bottom w:val="single" w:sz="4" w:space="0" w:color="CBCBCB"/>
+              <w:right w:val="single" w:sz="4" w:space="0" w:color="CBCBCB"/>
+            </w:tcBorders>
+          </w:tcPr>
+          <w:p/>
+        </w:tc>
+      </w:tr>
+      <w:tr>
+        <w:tc>
+          <w:tcPr>
+            <w:tcW w:type="dxa" w:w="1938"/>
+            <w:shd w:val="clear" w:color="auto" w:fill="B8B3D6"/>
+            <w:tcBorders>
+              <w:top w:val="single" w:sz="4" w:space="0" w:color="CBCBCB"/>
+              <w:left w:val="single" w:sz="4" w:space="0" w:color="CBCBCB"/>
+              <w:bottom w:val="single" w:sz="4" w:space="0" w:color="CBCBCB"/>
+              <w:right w:val="single" w:sz="4" w:space="0" w:color="CBCBCB"/>
+            </w:tcBorders>
+          </w:tcPr>
+          <w:p>
+            <w:r>
+              <w:rPr>
+                <w:b/>
+                <w:sz w:val="20"/>
+              </w:rPr>
+              <w:t>Q5</w:t>
+            </w:r>
+          </w:p>
+        </w:tc>
+        <w:tc>
+          <w:tcPr>
+            <w:tcW w:type="dxa" w:w="1938"/>
+            <w:shd w:val="clear" w:color="auto" w:fill="B8B3D6"/>
+            <w:tcBorders>
+              <w:top w:val="single" w:sz="4" w:space="0" w:color="CBCBCB"/>
+              <w:left w:val="single" w:sz="4" w:space="0" w:color="CBCBCB"/>
+              <w:bottom w:val="single" w:sz="4" w:space="0" w:color="CBCBCB"/>
+              <w:right w:val="single" w:sz="4" w:space="0" w:color="CBCBCB"/>
+            </w:tcBorders>
+          </w:tcPr>
+          <w:p>
+            <w:r>
+              <w:rPr>
+                <w:sz w:val="20"/>
+              </w:rPr>
+              <w:t>App GUI THẬT chạy từ service (truyền DISPLAY/XAUTHORITY)</w:t>
+            </w:r>
+          </w:p>
+        </w:tc>
+        <w:tc>
+          <w:tcPr>
+            <w:tcW w:type="dxa" w:w="1938"/>
+            <w:shd w:val="clear" w:color="auto" w:fill="B8B3D6"/>
+            <w:tcBorders>
+              <w:top w:val="single" w:sz="4" w:space="0" w:color="CBCBCB"/>
+              <w:left w:val="single" w:sz="4" w:space="0" w:color="CBCBCB"/>
+              <w:bottom w:val="single" w:sz="4" w:space="0" w:color="CBCBCB"/>
+              <w:right w:val="single" w:sz="4" w:space="0" w:color="CBCBCB"/>
+            </w:tcBorders>
+          </w:tcPr>
+          <w:p>
+            <w:r>
+              <w:rPr>
+                <w:sz w:val="20"/>
+              </w:rPr>
+              <w:t xml:space="preserve">✅ </w:t>
+            </w:r>
+            <w:r>
+              <w:rPr>
+                <w:b/>
+                <w:sz w:val="20"/>
+              </w:rPr>
+              <w:t>PASS</w:t>
+            </w:r>
+          </w:p>
+        </w:tc>
+        <w:tc>
+          <w:tcPr>
+            <w:tcW w:type="dxa" w:w="1938"/>
+            <w:shd w:val="clear" w:color="auto" w:fill="B8B3D6"/>
+            <w:tcBorders>
+              <w:top w:val="single" w:sz="4" w:space="0" w:color="CBCBCB"/>
+              <w:left w:val="single" w:sz="4" w:space="0" w:color="CBCBCB"/>
+              <w:bottom w:val="single" w:sz="4" w:space="0" w:color="CBCBCB"/>
+              <w:right w:val="single" w:sz="4" w:space="0" w:color="CBCBCB"/>
+            </w:tcBorders>
+          </w:tcPr>
+          <w:p>
+            <w:r>
+              <w:rPr>
+                <w:rFonts w:ascii="Courier New" w:hAnsi="Courier New"/>
+                <w:color w:val="F05922"/>
+                <w:sz w:val="20"/>
+              </w:rPr>
+              <w:t>systemctl --user show-environment</w:t>
+            </w:r>
+            <w:r>
+              <w:rPr>
+                <w:sz w:val="20"/>
+              </w:rPr>
+              <w:t xml:space="preserve"> có </w:t>
+            </w:r>
+            <w:r>
+              <w:rPr>
+                <w:rFonts w:ascii="Courier New" w:hAnsi="Courier New"/>
+                <w:color w:val="F05922"/>
+                <w:sz w:val="20"/>
+              </w:rPr>
+              <w:t>DISPLAY=:0</w:t>
+            </w:r>
+            <w:r>
+              <w:rPr>
+                <w:sz w:val="20"/>
+              </w:rPr>
+              <w:t xml:space="preserve"> + </w:t>
+            </w:r>
+            <w:r>
+              <w:rPr>
+                <w:rFonts w:ascii="Courier New" w:hAnsi="Courier New"/>
+                <w:color w:val="F05922"/>
+                <w:sz w:val="20"/>
+              </w:rPr>
+              <w:t>XAUTHORITY=/run/user/1000/gdm/Xauthority</w:t>
+            </w:r>
+            <w:r>
+              <w:rPr>
+                <w:sz w:val="20"/>
+              </w:rPr>
+              <w:t xml:space="preserve">. Đổi </w:t>
+            </w:r>
+            <w:r>
+              <w:rPr>
+                <w:rFonts w:ascii="Courier New" w:hAnsi="Courier New"/>
+                <w:color w:val="F05922"/>
+                <w:sz w:val="20"/>
+              </w:rPr>
+              <w:t>fakeapp</w:t>
+            </w:r>
+            <w:r>
+              <w:rPr>
+                <w:sz w:val="20"/>
+              </w:rPr>
+              <w:t xml:space="preserve"> = </w:t>
+            </w:r>
+            <w:r>
+              <w:rPr>
+                <w:rFonts w:ascii="Courier New" w:hAnsi="Courier New"/>
+                <w:color w:val="F05922"/>
+                <w:sz w:val="20"/>
+              </w:rPr>
+              <w:t>exec gnome-calculator</w:t>
+            </w:r>
+            <w:r>
+              <w:rPr>
+                <w:sz w:val="20"/>
+              </w:rPr>
+              <w:t xml:space="preserve">, restart service → </w:t>
+            </w:r>
+            <w:r>
+              <w:rPr>
+                <w:rFonts w:ascii="Courier New" w:hAnsi="Courier New"/>
+                <w:color w:val="F05922"/>
+                <w:sz w:val="20"/>
+              </w:rPr>
+              <w:t>MainPID=8123</w:t>
+            </w:r>
+            <w:r>
+              <w:rPr>
+                <w:sz w:val="20"/>
+              </w:rPr>
+              <w:t xml:space="preserve">, </w:t>
+            </w:r>
+            <w:r>
+              <w:rPr>
+                <w:rFonts w:ascii="Courier New" w:hAnsi="Courier New"/>
+                <w:color w:val="F05922"/>
+                <w:sz w:val="20"/>
+              </w:rPr>
+              <w:t>pgrep gnome-calculator</w:t>
+            </w:r>
+            <w:r>
+              <w:rPr>
+                <w:sz w:val="20"/>
+              </w:rPr>
+              <w:t xml:space="preserve"> = 8123, cửa sổ X thật </w:t>
+            </w:r>
+            <w:r>
+              <w:rPr>
+                <w:rFonts w:ascii="Courier New" w:hAnsi="Courier New"/>
+                <w:color w:val="F05922"/>
+                <w:sz w:val="20"/>
+              </w:rPr>
+              <w:t>0x3200008 "Calculator" 412x541+31+154</w:t>
+            </w:r>
+            <w:r>
+              <w:rPr>
+                <w:sz w:val="20"/>
+              </w:rPr>
+              <w:t xml:space="preserve">. Screenshot </w:t>
+            </w:r>
+            <w:r>
+              <w:rPr>
+                <w:rFonts w:ascii="Courier New" w:hAnsi="Courier New"/>
+                <w:color w:val="F05922"/>
+                <w:sz w:val="20"/>
+              </w:rPr>
+              <w:t>verify-q5-gui-from-service.png</w:t>
+            </w:r>
+            <w:r>
+              <w:rPr>
+                <w:sz w:val="20"/>
+              </w:rPr>
+              <w:t xml:space="preserve">: </w:t>
+            </w:r>
+            <w:r>
+              <w:rPr>
+                <w:b/>
+                <w:sz w:val="20"/>
+              </w:rPr>
+              <w:t>cửa sổ Calculator hiện trên desktop</w:t>
+            </w:r>
+            <w:r>
+              <w:rPr>
+                <w:sz w:val="20"/>
+              </w:rPr>
+              <w:t xml:space="preserve"> (ban đầu ảnh đen do DPMS ngủ — sau </w:t>
+            </w:r>
+            <w:r>
+              <w:rPr>
+                <w:rFonts w:ascii="Courier New" w:hAnsi="Courier New"/>
+                <w:color w:val="F05922"/>
+                <w:sz w:val="20"/>
+              </w:rPr>
+              <w:t>xset dpms force on</w:t>
+            </w:r>
+            <w:r>
+              <w:rPr>
+                <w:sz w:val="20"/>
+              </w:rPr>
+              <w:t xml:space="preserve"> chụp lại thấy rõ). Kill MainPID → watchdog restart, cửa sổ Calculator hiện lại (MainPID mới 8545).</w:t>
+            </w:r>
+          </w:p>
+        </w:tc>
+        <w:tc>
+          <w:tcPr>
+            <w:tcW w:type="dxa" w:w="1938"/>
+            <w:shd w:val="clear" w:color="auto" w:fill="B8B3D6"/>
+            <w:tcBorders>
+              <w:top w:val="single" w:sz="4" w:space="0" w:color="CBCBCB"/>
+              <w:left w:val="single" w:sz="4" w:space="0" w:color="CBCBCB"/>
+              <w:bottom w:val="single" w:sz="4" w:space="0" w:color="CBCBCB"/>
+              <w:right w:val="single" w:sz="4" w:space="0" w:color="CBCBCB"/>
+            </w:tcBorders>
+          </w:tcPr>
+          <w:p/>
+        </w:tc>
+      </w:tr>
+      <w:tr>
+        <w:tc>
+          <w:tcPr>
+            <w:tcW w:type="dxa" w:w="1938"/>
+            <w:tcBorders>
+              <w:top w:val="single" w:sz="4" w:space="0" w:color="CBCBCB"/>
+              <w:left w:val="single" w:sz="4" w:space="0" w:color="CBCBCB"/>
+              <w:bottom w:val="single" w:sz="4" w:space="0" w:color="CBCBCB"/>
+              <w:right w:val="single" w:sz="4" w:space="0" w:color="CBCBCB"/>
+            </w:tcBorders>
+          </w:tcPr>
+          <w:p>
+            <w:r>
+              <w:rPr>
+                <w:b/>
+                <w:sz w:val="20"/>
+              </w:rPr>
+              <w:t>Q6</w:t>
+            </w:r>
+          </w:p>
+        </w:tc>
+        <w:tc>
+          <w:tcPr>
+            <w:tcW w:type="dxa" w:w="1938"/>
+            <w:tcBorders>
+              <w:top w:val="single" w:sz="4" w:space="0" w:color="CBCBCB"/>
+              <w:left w:val="single" w:sz="4" w:space="0" w:color="CBCBCB"/>
+              <w:bottom w:val="single" w:sz="4" w:space="0" w:color="CBCBCB"/>
+              <w:right w:val="single" w:sz="4" w:space="0" w:color="CBCBCB"/>
+            </w:tcBorders>
+          </w:tcPr>
+          <w:p>
+            <w:r>
+              <w:rPr>
+                <w:sz w:val="20"/>
+              </w:rPr>
+              <w:t>Extension ACTIVE sau reboot</w:t>
+            </w:r>
+          </w:p>
+        </w:tc>
+        <w:tc>
+          <w:tcPr>
+            <w:tcW w:type="dxa" w:w="1938"/>
+            <w:tcBorders>
+              <w:top w:val="single" w:sz="4" w:space="0" w:color="CBCBCB"/>
+              <w:left w:val="single" w:sz="4" w:space="0" w:color="CBCBCB"/>
+              <w:bottom w:val="single" w:sz="4" w:space="0" w:color="CBCBCB"/>
+              <w:right w:val="single" w:sz="4" w:space="0" w:color="CBCBCB"/>
+            </w:tcBorders>
+          </w:tcPr>
+          <w:p>
+            <w:r>
+              <w:rPr>
+                <w:sz w:val="20"/>
+              </w:rPr>
+              <w:t xml:space="preserve">✅ </w:t>
+            </w:r>
+            <w:r>
+              <w:rPr>
+                <w:b/>
+                <w:sz w:val="20"/>
+              </w:rPr>
+              <w:t>PASS</w:t>
+            </w:r>
+          </w:p>
+        </w:tc>
+        <w:tc>
+          <w:tcPr>
+            <w:tcW w:type="dxa" w:w="1938"/>
+            <w:tcBorders>
+              <w:top w:val="single" w:sz="4" w:space="0" w:color="CBCBCB"/>
+              <w:left w:val="single" w:sz="4" w:space="0" w:color="CBCBCB"/>
+              <w:bottom w:val="single" w:sz="4" w:space="0" w:color="CBCBCB"/>
+              <w:right w:val="single" w:sz="4" w:space="0" w:color="CBCBCB"/>
+            </w:tcBorders>
+          </w:tcPr>
+          <w:p>
+            <w:r>
+              <w:rPr>
+                <w:sz w:val="20"/>
+              </w:rPr>
+              <w:t xml:space="preserve">Cài extension qua đúng đoạn </w:t>
+            </w:r>
+            <w:r>
+              <w:rPr>
+                <w:rFonts w:ascii="Courier New" w:hAnsi="Courier New"/>
+                <w:color w:val="F05922"/>
+                <w:sz w:val="20"/>
+              </w:rPr>
+              <w:t>1-install-software.sh</w:t>
+            </w:r>
+            <w:r>
+              <w:rPr>
+                <w:sz w:val="20"/>
+              </w:rPr>
+              <w:t xml:space="preserve"> (HIDE_ACTIVITIES=1). Sau </w:t>
+            </w:r>
+            <w:r>
+              <w:rPr>
+                <w:b/>
+                <w:sz w:val="20"/>
+              </w:rPr>
+              <w:t>reboot thật</w:t>
+            </w:r>
+            <w:r>
+              <w:rPr>
+                <w:sz w:val="20"/>
+              </w:rPr>
+              <w:t xml:space="preserve"> (01:17): </w:t>
+            </w:r>
+            <w:r>
+              <w:rPr>
+                <w:rFonts w:ascii="Courier New" w:hAnsi="Courier New"/>
+                <w:color w:val="F05922"/>
+                <w:sz w:val="20"/>
+              </w:rPr>
+              <w:t>gnome-extensions info disable-overview-gestures@kztek</w:t>
+            </w:r>
+            <w:r>
+              <w:rPr>
+                <w:sz w:val="20"/>
+              </w:rPr>
+              <w:t xml:space="preserve"> → </w:t>
+            </w:r>
+            <w:r>
+              <w:rPr>
+                <w:b/>
+                <w:sz w:val="20"/>
+              </w:rPr>
+              <w:t>`State: ENABLED`</w:t>
+            </w:r>
+            <w:r>
+              <w:rPr>
+                <w:sz w:val="20"/>
+              </w:rPr>
+              <w:t xml:space="preserve"> (ACTIVE). Just Perfection cũng ENABLED. (Có 1 dòng log "Error while downloading update ... Not Found" — vô hại: shell thử tra store cho extension cục bộ, không ảnh hưởng enable.)</w:t>
+            </w:r>
+          </w:p>
+        </w:tc>
+        <w:tc>
+          <w:tcPr>
+            <w:tcW w:type="dxa" w:w="1938"/>
+            <w:tcBorders>
+              <w:top w:val="single" w:sz="4" w:space="0" w:color="CBCBCB"/>
+              <w:left w:val="single" w:sz="4" w:space="0" w:color="CBCBCB"/>
+              <w:bottom w:val="single" w:sz="4" w:space="0" w:color="CBCBCB"/>
+              <w:right w:val="single" w:sz="4" w:space="0" w:color="CBCBCB"/>
+            </w:tcBorders>
+          </w:tcPr>
+          <w:p/>
+        </w:tc>
+      </w:tr>
+      <w:tr>
+        <w:tc>
+          <w:tcPr>
+            <w:tcW w:type="dxa" w:w="1938"/>
+            <w:shd w:val="clear" w:color="auto" w:fill="B8B3D6"/>
+            <w:tcBorders>
+              <w:top w:val="single" w:sz="4" w:space="0" w:color="CBCBCB"/>
+              <w:left w:val="single" w:sz="4" w:space="0" w:color="CBCBCB"/>
+              <w:bottom w:val="single" w:sz="4" w:space="0" w:color="CBCBCB"/>
+              <w:right w:val="single" w:sz="4" w:space="0" w:color="CBCBCB"/>
+            </w:tcBorders>
+          </w:tcPr>
+          <w:p>
+            <w:r>
+              <w:rPr>
+                <w:b/>
+                <w:sz w:val="20"/>
+              </w:rPr>
+              <w:t>Q7</w:t>
+            </w:r>
+          </w:p>
+        </w:tc>
+        <w:tc>
+          <w:tcPr>
+            <w:tcW w:type="dxa" w:w="1938"/>
+            <w:shd w:val="clear" w:color="auto" w:fill="B8B3D6"/>
+            <w:tcBorders>
+              <w:top w:val="single" w:sz="4" w:space="0" w:color="CBCBCB"/>
+              <w:left w:val="single" w:sz="4" w:space="0" w:color="CBCBCB"/>
+              <w:bottom w:val="single" w:sz="4" w:space="0" w:color="CBCBCB"/>
+              <w:right w:val="single" w:sz="4" w:space="0" w:color="CBCBCB"/>
+            </w:tcBorders>
+          </w:tcPr>
+          <w:p>
+            <w:r>
+              <w:rPr>
+                <w:sz w:val="20"/>
+              </w:rPr>
+              <w:t>Cử chỉ cảm ứng (vuốt 3/4 ngón, edge-swipe, long-press) KHÔNG mở overview</w:t>
+            </w:r>
+          </w:p>
+        </w:tc>
+        <w:tc>
+          <w:tcPr>
+            <w:tcW w:type="dxa" w:w="1938"/>
+            <w:shd w:val="clear" w:color="auto" w:fill="B8B3D6"/>
+            <w:tcBorders>
+              <w:top w:val="single" w:sz="4" w:space="0" w:color="CBCBCB"/>
+              <w:left w:val="single" w:sz="4" w:space="0" w:color="CBCBCB"/>
+              <w:bottom w:val="single" w:sz="4" w:space="0" w:color="CBCBCB"/>
+              <w:right w:val="single" w:sz="4" w:space="0" w:color="CBCBCB"/>
+            </w:tcBorders>
+          </w:tcPr>
+          <w:p>
+            <w:r>
+              <w:rPr>
+                <w:sz w:val="20"/>
+              </w:rPr>
+              <w:t xml:space="preserve">⚠️ </w:t>
+            </w:r>
+            <w:r>
+              <w:rPr>
+                <w:b/>
+                <w:sz w:val="20"/>
+              </w:rPr>
+              <w:t>CẦN THỬ TAY</w:t>
+            </w:r>
+          </w:p>
+        </w:tc>
+        <w:tc>
+          <w:tcPr>
+            <w:tcW w:type="dxa" w:w="1938"/>
+            <w:shd w:val="clear" w:color="auto" w:fill="B8B3D6"/>
+            <w:tcBorders>
+              <w:top w:val="single" w:sz="4" w:space="0" w:color="CBCBCB"/>
+              <w:left w:val="single" w:sz="4" w:space="0" w:color="CBCBCB"/>
+              <w:bottom w:val="single" w:sz="4" w:space="0" w:color="CBCBCB"/>
+              <w:right w:val="single" w:sz="4" w:space="0" w:color="CBCBCB"/>
+            </w:tcBorders>
+          </w:tcPr>
+          <w:p>
+            <w:r>
+              <w:rPr>
+                <w:sz w:val="20"/>
+              </w:rPr>
+              <w:t xml:space="preserve">VM không có touchscreen vật lý → không giả lập gesture đa chạm qua SSH. Bằng chứng gián tiếp: extension ENABLED sau reboot (Q6) + override </w:t>
+            </w:r>
+            <w:r>
+              <w:rPr>
+                <w:rFonts w:ascii="Courier New" w:hAnsi="Courier New"/>
+                <w:color w:val="F05922"/>
+                <w:sz w:val="20"/>
+              </w:rPr>
+              <w:t>Main.overview.show/showApps</w:t>
+            </w:r>
+            <w:r>
+              <w:rPr>
+                <w:sz w:val="20"/>
+              </w:rPr>
+              <w:t xml:space="preserve"> + tắt SwipeTracker. </w:t>
+            </w:r>
+            <w:r>
+              <w:rPr>
+                <w:b/>
+                <w:sz w:val="20"/>
+              </w:rPr>
+              <w:t>Hướng dẫn nghiệm thu thủ công cho user ở mục dưới.</w:t>
+            </w:r>
+          </w:p>
+        </w:tc>
+        <w:tc>
+          <w:tcPr>
+            <w:tcW w:type="dxa" w:w="1938"/>
+            <w:shd w:val="clear" w:color="auto" w:fill="B8B3D6"/>
+            <w:tcBorders>
+              <w:top w:val="single" w:sz="4" w:space="0" w:color="CBCBCB"/>
+              <w:left w:val="single" w:sz="4" w:space="0" w:color="CBCBCB"/>
+              <w:bottom w:val="single" w:sz="4" w:space="0" w:color="CBCBCB"/>
+              <w:right w:val="single" w:sz="4" w:space="0" w:color="CBCBCB"/>
+            </w:tcBorders>
+          </w:tcPr>
+          <w:p/>
+        </w:tc>
+      </w:tr>
+      <w:tr>
+        <w:tc>
+          <w:tcPr>
+            <w:tcW w:type="dxa" w:w="1938"/>
+            <w:tcBorders>
+              <w:top w:val="single" w:sz="4" w:space="0" w:color="CBCBCB"/>
+              <w:left w:val="single" w:sz="4" w:space="0" w:color="CBCBCB"/>
+              <w:bottom w:val="single" w:sz="4" w:space="0" w:color="CBCBCB"/>
+              <w:right w:val="single" w:sz="4" w:space="0" w:color="CBCBCB"/>
+            </w:tcBorders>
+          </w:tcPr>
+          <w:p>
+            <w:r>
+              <w:rPr>
+                <w:b/>
+                <w:sz w:val="20"/>
+              </w:rPr>
+              <w:t>Q8</w:t>
+            </w:r>
+          </w:p>
+        </w:tc>
+        <w:tc>
+          <w:tcPr>
+            <w:tcW w:type="dxa" w:w="1938"/>
+            <w:tcBorders>
+              <w:top w:val="single" w:sz="4" w:space="0" w:color="CBCBCB"/>
+              <w:left w:val="single" w:sz="4" w:space="0" w:color="CBCBCB"/>
+              <w:bottom w:val="single" w:sz="4" w:space="0" w:color="CBCBCB"/>
+              <w:right w:val="single" w:sz="4" w:space="0" w:color="CBCBCB"/>
+            </w:tcBorders>
+          </w:tcPr>
+          <w:p>
+            <w:r>
+              <w:rPr>
+                <w:sz w:val="20"/>
+              </w:rPr>
+              <w:t>Chạm 1 ngón dùng app vẫn bình thường</w:t>
+            </w:r>
+          </w:p>
+        </w:tc>
+        <w:tc>
+          <w:tcPr>
+            <w:tcW w:type="dxa" w:w="1938"/>
+            <w:tcBorders>
+              <w:top w:val="single" w:sz="4" w:space="0" w:color="CBCBCB"/>
+              <w:left w:val="single" w:sz="4" w:space="0" w:color="CBCBCB"/>
+              <w:bottom w:val="single" w:sz="4" w:space="0" w:color="CBCBCB"/>
+              <w:right w:val="single" w:sz="4" w:space="0" w:color="CBCBCB"/>
+            </w:tcBorders>
+          </w:tcPr>
+          <w:p>
+            <w:r>
+              <w:rPr>
+                <w:sz w:val="20"/>
+              </w:rPr>
+              <w:t xml:space="preserve">⚠️ </w:t>
+            </w:r>
+            <w:r>
+              <w:rPr>
+                <w:b/>
+                <w:sz w:val="20"/>
+              </w:rPr>
+              <w:t>CẦN THỬ TAY</w:t>
+            </w:r>
+          </w:p>
+        </w:tc>
+        <w:tc>
+          <w:tcPr>
+            <w:tcW w:type="dxa" w:w="1938"/>
+            <w:tcBorders>
+              <w:top w:val="single" w:sz="4" w:space="0" w:color="CBCBCB"/>
+              <w:left w:val="single" w:sz="4" w:space="0" w:color="CBCBCB"/>
+              <w:bottom w:val="single" w:sz="4" w:space="0" w:color="CBCBCB"/>
+              <w:right w:val="single" w:sz="4" w:space="0" w:color="CBCBCB"/>
+            </w:tcBorders>
+          </w:tcPr>
+          <w:p>
+            <w:r>
+              <w:rPr>
+                <w:sz w:val="20"/>
+              </w:rPr>
+              <w:t xml:space="preserve">Extension chỉ chặn overview, không hook sự kiện chạm của app — nhưng phải xác nhận trên phần cứng cảm ứng thật. </w:t>
+            </w:r>
+            <w:r>
+              <w:rPr>
+                <w:b/>
+                <w:sz w:val="20"/>
+              </w:rPr>
+              <w:t>Hướng dẫn nghiệm thu thủ công ở mục dưới.</w:t>
+            </w:r>
+          </w:p>
+        </w:tc>
+        <w:tc>
+          <w:tcPr>
+            <w:tcW w:type="dxa" w:w="1938"/>
+            <w:tcBorders>
+              <w:top w:val="single" w:sz="4" w:space="0" w:color="CBCBCB"/>
+              <w:left w:val="single" w:sz="4" w:space="0" w:color="CBCBCB"/>
+              <w:bottom w:val="single" w:sz="4" w:space="0" w:color="CBCBCB"/>
+              <w:right w:val="single" w:sz="4" w:space="0" w:color="CBCBCB"/>
+            </w:tcBorders>
+          </w:tcPr>
+          <w:p/>
+        </w:tc>
+      </w:tr>
+      <w:tr>
+        <w:tc>
+          <w:tcPr>
+            <w:tcW w:type="dxa" w:w="1938"/>
+            <w:shd w:val="clear" w:color="auto" w:fill="B8B3D6"/>
+            <w:tcBorders>
+              <w:top w:val="single" w:sz="4" w:space="0" w:color="CBCBCB"/>
+              <w:left w:val="single" w:sz="4" w:space="0" w:color="CBCBCB"/>
+              <w:bottom w:val="single" w:sz="4" w:space="0" w:color="CBCBCB"/>
+              <w:right w:val="single" w:sz="4" w:space="0" w:color="CBCBCB"/>
+            </w:tcBorders>
+          </w:tcPr>
+          <w:p>
+            <w:r>
+              <w:rPr>
+                <w:b/>
+                <w:sz w:val="20"/>
+              </w:rPr>
+              <w:t>Q9</w:t>
+            </w:r>
+          </w:p>
+        </w:tc>
+        <w:tc>
+          <w:tcPr>
+            <w:tcW w:type="dxa" w:w="1938"/>
+            <w:shd w:val="clear" w:color="auto" w:fill="B8B3D6"/>
+            <w:tcBorders>
+              <w:top w:val="single" w:sz="4" w:space="0" w:color="CBCBCB"/>
+              <w:left w:val="single" w:sz="4" w:space="0" w:color="CBCBCB"/>
+              <w:bottom w:val="single" w:sz="4" w:space="0" w:color="CBCBCB"/>
+              <w:right w:val="single" w:sz="4" w:space="0" w:color="CBCBCB"/>
+            </w:tcBorders>
+          </w:tcPr>
+          <w:p>
+            <w:r>
+              <w:rPr>
+                <w:sz w:val="20"/>
+              </w:rPr>
+              <w:t>dconf lock ≥6 key + Super+1..9 (R3) không mở Terminal</w:t>
+            </w:r>
+          </w:p>
+        </w:tc>
+        <w:tc>
+          <w:tcPr>
+            <w:tcW w:type="dxa" w:w="1938"/>
+            <w:shd w:val="clear" w:color="auto" w:fill="B8B3D6"/>
+            <w:tcBorders>
+              <w:top w:val="single" w:sz="4" w:space="0" w:color="CBCBCB"/>
+              <w:left w:val="single" w:sz="4" w:space="0" w:color="CBCBCB"/>
+              <w:bottom w:val="single" w:sz="4" w:space="0" w:color="CBCBCB"/>
+              <w:right w:val="single" w:sz="4" w:space="0" w:color="CBCBCB"/>
+            </w:tcBorders>
+          </w:tcPr>
+          <w:p>
+            <w:r>
+              <w:rPr>
+                <w:sz w:val="20"/>
+              </w:rPr>
+              <w:t xml:space="preserve">✅ </w:t>
+            </w:r>
+            <w:r>
+              <w:rPr>
+                <w:b/>
+                <w:sz w:val="20"/>
+              </w:rPr>
+              <w:t>PASS</w:t>
+            </w:r>
+          </w:p>
+        </w:tc>
+        <w:tc>
+          <w:tcPr>
+            <w:tcW w:type="dxa" w:w="1938"/>
+            <w:shd w:val="clear" w:color="auto" w:fill="B8B3D6"/>
+            <w:tcBorders>
+              <w:top w:val="single" w:sz="4" w:space="0" w:color="CBCBCB"/>
+              <w:left w:val="single" w:sz="4" w:space="0" w:color="CBCBCB"/>
+              <w:bottom w:val="single" w:sz="4" w:space="0" w:color="CBCBCB"/>
+              <w:right w:val="single" w:sz="4" w:space="0" w:color="CBCBCB"/>
+            </w:tcBorders>
+          </w:tcPr>
+          <w:p>
+            <w:r>
+              <w:rPr>
+                <w:rFonts w:ascii="Courier New" w:hAnsi="Courier New"/>
+                <w:color w:val="F05922"/>
+                <w:sz w:val="20"/>
+              </w:rPr>
+              <w:t>gsettings set</w:t>
+            </w:r>
+            <w:r>
+              <w:rPr>
+                <w:sz w:val="20"/>
+              </w:rPr>
+              <w:t xml:space="preserve"> báo </w:t>
+            </w:r>
+            <w:r>
+              <w:rPr>
+                <w:b/>
+                <w:sz w:val="20"/>
+              </w:rPr>
+              <w:t>"The key is not writable"</w:t>
+            </w:r>
+            <w:r>
+              <w:rPr>
+                <w:sz w:val="20"/>
+              </w:rPr>
+              <w:t xml:space="preserve"> cho </w:t>
+            </w:r>
+            <w:r>
+              <w:rPr>
+                <w:b/>
+                <w:sz w:val="20"/>
+              </w:rPr>
+              <w:t>8 key</w:t>
+            </w:r>
+            <w:r>
+              <w:rPr>
+                <w:sz w:val="20"/>
+              </w:rPr>
+              <w:t xml:space="preserve"> (writable=false): </w:t>
+            </w:r>
+            <w:r>
+              <w:rPr>
+                <w:rFonts w:ascii="Courier New" w:hAnsi="Courier New"/>
+                <w:color w:val="F05922"/>
+                <w:sz w:val="20"/>
+              </w:rPr>
+              <w:t>switch-to-application-4</w:t>
+            </w:r>
+            <w:r>
+              <w:rPr>
+                <w:sz w:val="20"/>
+              </w:rPr>
+              <w:t xml:space="preserve">, </w:t>
+            </w:r>
+            <w:r>
+              <w:rPr>
+                <w:rFonts w:ascii="Courier New" w:hAnsi="Courier New"/>
+                <w:color w:val="F05922"/>
+                <w:sz w:val="20"/>
+              </w:rPr>
+              <w:t>switch-to-application-1</w:t>
+            </w:r>
+            <w:r>
+              <w:rPr>
+                <w:sz w:val="20"/>
+              </w:rPr>
+              <w:t xml:space="preserve">, </w:t>
+            </w:r>
+            <w:r>
+              <w:rPr>
+                <w:rFonts w:ascii="Courier New" w:hAnsi="Courier New"/>
+                <w:color w:val="F05922"/>
+                <w:sz w:val="20"/>
+              </w:rPr>
+              <w:t>overlay-key</w:t>
+            </w:r>
+            <w:r>
+              <w:rPr>
+                <w:sz w:val="20"/>
+              </w:rPr>
+              <w:t xml:space="preserve">, </w:t>
+            </w:r>
+            <w:r>
+              <w:rPr>
+                <w:rFonts w:ascii="Courier New" w:hAnsi="Courier New"/>
+                <w:color w:val="F05922"/>
+                <w:sz w:val="20"/>
+              </w:rPr>
+              <w:t>switch-applications</w:t>
+            </w:r>
+            <w:r>
+              <w:rPr>
+                <w:sz w:val="20"/>
+              </w:rPr>
+              <w:t xml:space="preserve"> (Alt+Tab), </w:t>
+            </w:r>
+            <w:r>
+              <w:rPr>
+                <w:rFonts w:ascii="Courier New" w:hAnsi="Courier New"/>
+                <w:color w:val="F05922"/>
+                <w:sz w:val="20"/>
+              </w:rPr>
+              <w:t>close</w:t>
+            </w:r>
+            <w:r>
+              <w:rPr>
+                <w:sz w:val="20"/>
+              </w:rPr>
+              <w:t xml:space="preserve"> (Alt+F4), </w:t>
+            </w:r>
+            <w:r>
+              <w:rPr>
+                <w:rFonts w:ascii="Courier New" w:hAnsi="Courier New"/>
+                <w:color w:val="F05922"/>
+                <w:sz w:val="20"/>
+              </w:rPr>
+              <w:t>activate-window-menu</w:t>
+            </w:r>
+            <w:r>
+              <w:rPr>
+                <w:sz w:val="20"/>
+              </w:rPr>
+              <w:t xml:space="preserve"> (Alt+Space), </w:t>
+            </w:r>
+            <w:r>
+              <w:rPr>
+                <w:rFonts w:ascii="Courier New" w:hAnsi="Courier New"/>
+                <w:color w:val="F05922"/>
+                <w:sz w:val="20"/>
+              </w:rPr>
+              <w:t>minimize</w:t>
+            </w:r>
+            <w:r>
+              <w:rPr>
+                <w:sz w:val="20"/>
+              </w:rPr>
+              <w:t xml:space="preserve"> (Super+H), </w:t>
+            </w:r>
+            <w:r>
+              <w:rPr>
+                <w:rFonts w:ascii="Courier New" w:hAnsi="Courier New"/>
+                <w:color w:val="F05922"/>
+                <w:sz w:val="20"/>
+              </w:rPr>
+              <w:t>media-keys/terminal</w:t>
+            </w:r>
+            <w:r>
+              <w:rPr>
+                <w:sz w:val="20"/>
+              </w:rPr>
+              <w:t xml:space="preserve"> (Ctrl+Alt+T). Sau reboot, </w:t>
+            </w:r>
+            <w:r>
+              <w:rPr>
+                <w:rFonts w:ascii="Courier New" w:hAnsi="Courier New"/>
+                <w:color w:val="F05922"/>
+                <w:sz w:val="20"/>
+              </w:rPr>
+              <w:t>xdotool key super+4</w:t>
+            </w:r>
+            <w:r>
+              <w:rPr>
+                <w:sz w:val="20"/>
+              </w:rPr>
+              <w:t xml:space="preserve"> rồi </w:t>
+            </w:r>
+            <w:r>
+              <w:rPr>
+                <w:rFonts w:ascii="Courier New" w:hAnsi="Courier New"/>
+                <w:color w:val="F05922"/>
+                <w:sz w:val="20"/>
+              </w:rPr>
+              <w:t>super+1</w:t>
+            </w:r>
+            <w:r>
+              <w:rPr>
+                <w:sz w:val="20"/>
+              </w:rPr>
+              <w:t xml:space="preserve"> + </w:t>
+            </w:r>
+            <w:r>
+              <w:rPr>
+                <w:rFonts w:ascii="Courier New" w:hAnsi="Courier New"/>
+                <w:color w:val="F05922"/>
+                <w:sz w:val="20"/>
+              </w:rPr>
+              <w:t>gnome-screenshot</w:t>
+            </w:r>
+            <w:r>
+              <w:rPr>
+                <w:sz w:val="20"/>
+              </w:rPr>
+              <w:t xml:space="preserve"> trước/sau → </w:t>
+            </w:r>
+            <w:r>
+              <w:rPr>
+                <w:b/>
+                <w:sz w:val="20"/>
+              </w:rPr>
+              <w:t>3 ảnh md5 GIỐNG HỆT</w:t>
+            </w:r>
+            <w:r>
+              <w:rPr>
+                <w:sz w:val="20"/>
+              </w:rPr>
+              <w:t xml:space="preserve"> (</w:t>
+            </w:r>
+            <w:r>
+              <w:rPr>
+                <w:rFonts w:ascii="Courier New" w:hAnsi="Courier New"/>
+                <w:color w:val="F05922"/>
+                <w:sz w:val="20"/>
+              </w:rPr>
+              <w:t>654f178…</w:t>
+            </w:r>
+            <w:r>
+              <w:rPr>
+                <w:sz w:val="20"/>
+              </w:rPr>
+              <w:t xml:space="preserve">), </w:t>
+            </w:r>
+            <w:r>
+              <w:rPr>
+                <w:rFonts w:ascii="Courier New" w:hAnsi="Courier New"/>
+                <w:color w:val="F05922"/>
+                <w:sz w:val="20"/>
+              </w:rPr>
+              <w:t>xwininfo</w:t>
+            </w:r>
+            <w:r>
+              <w:rPr>
+                <w:sz w:val="20"/>
+              </w:rPr>
+              <w:t xml:space="preserve"> → </w:t>
+            </w:r>
+            <w:r>
+              <w:rPr>
+                <w:b/>
+                <w:sz w:val="20"/>
+              </w:rPr>
+              <w:t>NO-TERMINAL-NO-NAUTILUS-WINDOW</w:t>
+            </w:r>
+            <w:r>
+              <w:rPr>
+                <w:sz w:val="20"/>
+              </w:rPr>
+              <w:t xml:space="preserve">. Lỗ P1 của audit (Super+4→Terminal) đã bịt. </w:t>
+            </w:r>
+            <w:r>
+              <w:rPr>
+                <w:rFonts w:ascii="Courier New" w:hAnsi="Courier New"/>
+                <w:color w:val="F05922"/>
+                <w:sz w:val="20"/>
+              </w:rPr>
+              <w:t>verify-q9-super4-before.png</w:t>
+            </w:r>
+            <w:r>
+              <w:rPr>
+                <w:sz w:val="20"/>
+              </w:rPr>
+              <w:t xml:space="preserve"> / </w:t>
+            </w:r>
+            <w:r>
+              <w:rPr>
+                <w:rFonts w:ascii="Courier New" w:hAnsi="Courier New"/>
+                <w:color w:val="F05922"/>
+                <w:sz w:val="20"/>
+              </w:rPr>
+              <w:t>verify-q9-super4-after.png</w:t>
+            </w:r>
+            <w:r>
+              <w:rPr>
+                <w:sz w:val="20"/>
+              </w:rPr>
+              <w:t xml:space="preserve"> (giống hệt).</w:t>
+            </w:r>
+          </w:p>
+        </w:tc>
+        <w:tc>
+          <w:tcPr>
+            <w:tcW w:type="dxa" w:w="1938"/>
+            <w:shd w:val="clear" w:color="auto" w:fill="B8B3D6"/>
+            <w:tcBorders>
+              <w:top w:val="single" w:sz="4" w:space="0" w:color="CBCBCB"/>
+              <w:left w:val="single" w:sz="4" w:space="0" w:color="CBCBCB"/>
+              <w:bottom w:val="single" w:sz="4" w:space="0" w:color="CBCBCB"/>
+              <w:right w:val="single" w:sz="4" w:space="0" w:color="CBCBCB"/>
+            </w:tcBorders>
+          </w:tcPr>
+          <w:p/>
+        </w:tc>
+      </w:tr>
+      <w:tr>
+        <w:tc>
+          <w:tcPr>
+            <w:tcW w:type="dxa" w:w="1938"/>
+            <w:tcBorders>
+              <w:top w:val="single" w:sz="4" w:space="0" w:color="CBCBCB"/>
+              <w:left w:val="single" w:sz="4" w:space="0" w:color="CBCBCB"/>
+              <w:bottom w:val="single" w:sz="4" w:space="0" w:color="CBCBCB"/>
+              <w:right w:val="single" w:sz="4" w:space="0" w:color="CBCBCB"/>
+            </w:tcBorders>
+          </w:tcPr>
+          <w:p>
+            <w:r>
+              <w:rPr>
+                <w:b/>
+                <w:sz w:val="20"/>
+              </w:rPr>
+              <w:t>Q10</w:t>
+            </w:r>
+          </w:p>
+        </w:tc>
+        <w:tc>
+          <w:tcPr>
+            <w:tcW w:type="dxa" w:w="1938"/>
+            <w:tcBorders>
+              <w:top w:val="single" w:sz="4" w:space="0" w:color="CBCBCB"/>
+              <w:left w:val="single" w:sz="4" w:space="0" w:color="CBCBCB"/>
+              <w:bottom w:val="single" w:sz="4" w:space="0" w:color="CBCBCB"/>
+              <w:right w:val="single" w:sz="4" w:space="0" w:color="CBCBCB"/>
+            </w:tcBorders>
+          </w:tcPr>
+          <w:p>
+            <w:r>
+              <w:rPr>
+                <w:sz w:val="20"/>
+              </w:rPr>
+              <w:t>Regression F09/F08: SSH + agent + autologin sau reboot</w:t>
+            </w:r>
+          </w:p>
+        </w:tc>
+        <w:tc>
+          <w:tcPr>
+            <w:tcW w:type="dxa" w:w="1938"/>
+            <w:tcBorders>
+              <w:top w:val="single" w:sz="4" w:space="0" w:color="CBCBCB"/>
+              <w:left w:val="single" w:sz="4" w:space="0" w:color="CBCBCB"/>
+              <w:bottom w:val="single" w:sz="4" w:space="0" w:color="CBCBCB"/>
+              <w:right w:val="single" w:sz="4" w:space="0" w:color="CBCBCB"/>
+            </w:tcBorders>
+          </w:tcPr>
+          <w:p>
+            <w:r>
+              <w:rPr>
+                <w:sz w:val="20"/>
+              </w:rPr>
+              <w:t xml:space="preserve">✅ </w:t>
+            </w:r>
+            <w:r>
+              <w:rPr>
+                <w:b/>
+                <w:sz w:val="20"/>
+              </w:rPr>
+              <w:t>PASS</w:t>
+            </w:r>
+          </w:p>
+        </w:tc>
+        <w:tc>
+          <w:tcPr>
+            <w:tcW w:type="dxa" w:w="1938"/>
+            <w:tcBorders>
+              <w:top w:val="single" w:sz="4" w:space="0" w:color="CBCBCB"/>
+              <w:left w:val="single" w:sz="4" w:space="0" w:color="CBCBCB"/>
+              <w:bottom w:val="single" w:sz="4" w:space="0" w:color="CBCBCB"/>
+              <w:right w:val="single" w:sz="4" w:space="0" w:color="CBCBCB"/>
+            </w:tcBorders>
+          </w:tcPr>
+          <w:p>
+            <w:r>
+              <w:rPr>
+                <w:sz w:val="20"/>
+              </w:rPr>
+              <w:t xml:space="preserve">Sau reboot: </w:t>
+            </w:r>
+            <w:r>
+              <w:rPr>
+                <w:rFonts w:ascii="Courier New" w:hAnsi="Courier New"/>
+                <w:color w:val="F05922"/>
+                <w:sz w:val="20"/>
+              </w:rPr>
+              <w:t>who</w:t>
+            </w:r>
+            <w:r>
+              <w:rPr>
+                <w:sz w:val="20"/>
+              </w:rPr>
+              <w:t xml:space="preserve"> → </w:t>
+            </w:r>
+            <w:r>
+              <w:rPr>
+                <w:rFonts w:ascii="Courier New" w:hAnsi="Courier New"/>
+                <w:color w:val="F05922"/>
+                <w:sz w:val="20"/>
+              </w:rPr>
+              <w:t>kztek :0 01:17</w:t>
+            </w:r>
+            <w:r>
+              <w:rPr>
+                <w:sz w:val="20"/>
+              </w:rPr>
+              <w:t xml:space="preserve"> (tự vào desktop, không nhập mật khẩu); </w:t>
+            </w:r>
+            <w:r>
+              <w:rPr>
+                <w:rFonts w:ascii="Courier New" w:hAnsi="Courier New"/>
+                <w:color w:val="F05922"/>
+                <w:sz w:val="20"/>
+              </w:rPr>
+              <w:t>systemctl --user is-active ipgs-remote-agent</w:t>
+            </w:r>
+            <w:r>
+              <w:rPr>
+                <w:sz w:val="20"/>
+              </w:rPr>
+              <w:t xml:space="preserve"> = </w:t>
+            </w:r>
+            <w:r>
+              <w:rPr>
+                <w:b/>
+                <w:sz w:val="20"/>
+              </w:rPr>
+              <w:t>active</w:t>
+            </w:r>
+            <w:r>
+              <w:rPr>
+                <w:sz w:val="20"/>
+              </w:rPr>
+              <w:t xml:space="preserve"> (PID 1576); SSH vào bình thường suốt phiên; </w:t>
+            </w:r>
+            <w:r>
+              <w:rPr>
+                <w:rFonts w:ascii="Courier New" w:hAnsi="Courier New"/>
+                <w:color w:val="F05922"/>
+                <w:sz w:val="20"/>
+              </w:rPr>
+              <w:t>/etc/gdm3/custom.conf</w:t>
+            </w:r>
+            <w:r>
+              <w:rPr>
+                <w:sz w:val="20"/>
+              </w:rPr>
+              <w:t xml:space="preserve"> giữ </w:t>
+            </w:r>
+            <w:r>
+              <w:rPr>
+                <w:rFonts w:ascii="Courier New" w:hAnsi="Courier New"/>
+                <w:color w:val="F05922"/>
+                <w:sz w:val="20"/>
+              </w:rPr>
+              <w:t>AutomaticLogin=kztek</w:t>
+            </w:r>
+            <w:r>
+              <w:rPr>
+                <w:sz w:val="20"/>
+              </w:rPr>
+              <w:t xml:space="preserve"> + </w:t>
+            </w:r>
+            <w:r>
+              <w:rPr>
+                <w:rFonts w:ascii="Courier New" w:hAnsi="Courier New"/>
+                <w:color w:val="F05922"/>
+                <w:sz w:val="20"/>
+              </w:rPr>
+              <w:t>TimedLogin</w:t>
+            </w:r>
+            <w:r>
+              <w:rPr>
+                <w:sz w:val="20"/>
+              </w:rPr>
+              <w:t xml:space="preserve"> fallback 5s.</w:t>
+            </w:r>
+          </w:p>
+        </w:tc>
+        <w:tc>
+          <w:tcPr>
+            <w:tcW w:type="dxa" w:w="1938"/>
+            <w:tcBorders>
+              <w:top w:val="single" w:sz="4" w:space="0" w:color="CBCBCB"/>
+              <w:left w:val="single" w:sz="4" w:space="0" w:color="CBCBCB"/>
+              <w:bottom w:val="single" w:sz="4" w:space="0" w:color="CBCBCB"/>
+              <w:right w:val="single" w:sz="4" w:space="0" w:color="CBCBCB"/>
+            </w:tcBorders>
+          </w:tcPr>
+          <w:p/>
+        </w:tc>
+      </w:tr>
+    </w:tbl>
+    <w:p/>
+    <w:p>
+      <w:pPr>
+        <w:spacing w:after="80"/>
+      </w:pPr>
+      <w:r>
+        <w:rPr>
+          <w:b/>
+          <w:sz w:val="21"/>
+        </w:rPr>
+        <w:t>Tổng: 8 PASS / 0 FAIL / 2 CẦN THỬ TAY (Q7, Q8 — bắt buộc trên màn cảm ứng thật).</w:t>
+      </w:r>
+    </w:p>
+    <w:p>
+      <w:pPr>
+        <w:pStyle w:val="Heading3"/>
+        <w:spacing w:before="160" w:after="60"/>
+      </w:pPr>
+      <w:r>
+        <w:rPr>
+          <w:color w:val="4A3F8C"/>
+          <w:sz w:val="24"/>
+        </w:rPr>
+        <w:t>Lỗi mới phát hiện — F11 (xem mục F11 bên dưới)</w:t>
+      </w:r>
+    </w:p>
+    <w:p>
+      <w:pPr>
+        <w:spacing w:after="80"/>
+      </w:pPr>
+      <w:r>
+        <w:rPr>
+          <w:sz w:val="21"/>
+        </w:rPr>
+        <w:t xml:space="preserve">Trong lúc verify Q1/Q9 phát hiện </w:t>
+      </w:r>
+      <w:r>
+        <w:rPr>
+          <w:b/>
+          <w:sz w:val="21"/>
+        </w:rPr>
+        <w:t>F11 (P2)</w:t>
+      </w:r>
+      <w:r>
+        <w:rPr>
+          <w:sz w:val="21"/>
+        </w:rPr>
+        <w:t xml:space="preserve">: script ghi file </w:t>
+      </w:r>
+      <w:r>
+        <w:rPr>
+          <w:rFonts w:ascii="Courier New" w:hAnsi="Courier New"/>
+          <w:color w:val="F05922"/>
+          <w:sz w:val="18"/>
+        </w:rPr>
+        <w:t>.bak-*</w:t>
+      </w:r>
+      <w:r>
+        <w:rPr>
+          <w:sz w:val="21"/>
+        </w:rPr>
+        <w:t xml:space="preserve"> của dconf lockdown </w:t>
+      </w:r>
+      <w:r>
+        <w:rPr>
+          <w:b/>
+          <w:sz w:val="21"/>
+        </w:rPr>
+        <w:t>vào chính thư mục `/etc/dconf/db/local.d/` + `locks/`</w:t>
+      </w:r>
+      <w:r>
+        <w:rPr>
+          <w:sz w:val="21"/>
+        </w:rPr>
+        <w:t xml:space="preserve"> — </w:t>
+      </w:r>
+      <w:r>
+        <w:rPr>
+          <w:rFonts w:ascii="Courier New" w:hAnsi="Courier New"/>
+          <w:color w:val="F05922"/>
+          <w:sz w:val="18"/>
+        </w:rPr>
+        <w:t>dconf update</w:t>
+      </w:r>
+      <w:r>
+        <w:rPr>
+          <w:sz w:val="21"/>
+        </w:rPr>
+        <w:t xml:space="preserve"> biên dịch MỌI file trong thư mục này bất kể đuôi, nên lệnh gỡ khoá bảo trì mà script tự in ra (</w:t>
+      </w:r>
+      <w:r>
+        <w:rPr>
+          <w:rFonts w:ascii="Courier New" w:hAnsi="Courier New"/>
+          <w:color w:val="F05922"/>
+          <w:sz w:val="18"/>
+        </w:rPr>
+        <w:t>sudo rm &lt;2 file active&gt; &amp;&amp; sudo dconf update</w:t>
+      </w:r>
+      <w:r>
+        <w:rPr>
+          <w:sz w:val="21"/>
+        </w:rPr>
+        <w:t xml:space="preserve">) </w:t>
+      </w:r>
+      <w:r>
+        <w:rPr>
+          <w:b/>
+          <w:sz w:val="21"/>
+        </w:rPr>
+        <w:t>KHÔNG thực sự gỡ được khoá</w:t>
+      </w:r>
+      <w:r>
+        <w:rPr>
+          <w:sz w:val="21"/>
+        </w:rPr>
+        <w:t xml:space="preserve"> khi đã có </w:t>
+      </w:r>
+      <w:r>
+        <w:rPr>
+          <w:rFonts w:ascii="Courier New" w:hAnsi="Courier New"/>
+          <w:color w:val="F05922"/>
+          <w:sz w:val="18"/>
+        </w:rPr>
+        <w:t>.bak</w:t>
+      </w:r>
+      <w:r>
+        <w:rPr>
+          <w:sz w:val="21"/>
+        </w:rPr>
+        <w:t xml:space="preserve"> (từ deploy lần 2 trở đi) — các </w:t>
+      </w:r>
+      <w:r>
+        <w:rPr>
+          <w:rFonts w:ascii="Courier New" w:hAnsi="Courier New"/>
+          <w:color w:val="F05922"/>
+          <w:sz w:val="18"/>
+        </w:rPr>
+        <w:t>.bak</w:t>
+      </w:r>
+      <w:r>
+        <w:rPr>
+          <w:sz w:val="21"/>
+        </w:rPr>
+        <w:t xml:space="preserve"> vẫn được nạp và tái áp lock. Không đe doạ bảo mật (fail an toàn về phía "vẫn khoá") nhưng làm </w:t>
+      </w:r>
+      <w:r>
+        <w:rPr>
+          <w:b/>
+          <w:sz w:val="21"/>
+        </w:rPr>
+        <w:t>hỏng đường bảo trì</w:t>
+      </w:r>
+      <w:r>
+        <w:rPr>
+          <w:sz w:val="21"/>
+        </w:rPr>
+        <w:t>. KHÔNG chặn mục tiêu F09/F10.</w:t>
+      </w:r>
+    </w:p>
+    <w:p>
+      <w:pPr>
+        <w:pStyle w:val="Heading3"/>
+        <w:spacing w:before="160" w:after="60"/>
+      </w:pPr>
+      <w:r>
+        <w:rPr>
+          <w:color w:val="4A3F8C"/>
+          <w:sz w:val="24"/>
+        </w:rPr>
+        <w:t>Hướng dẫn nghiệm thu thủ công cho user — Q7 &amp; Q8 (BẮT BUỘC làm tại màn hình cảm ứng thật)</w:t>
+      </w:r>
+    </w:p>
+    <w:p>
+      <w:pPr>
+        <w:spacing w:before="40" w:after="40"/>
+        <w:ind w:left="567"/>
+        <w:pBdr>
+          <w:left w:val="single" w:sz="12" w:space="10" w:color="F05922"/>
+        </w:pBdr>
+      </w:pPr>
+      <w:r>
+        <w:rPr>
+          <w:color w:val="4A3F8C"/>
+        </w:rPr>
+        <w:t xml:space="preserve">Làm sau khi đã Deploy Kiosk (tick "Ẩn nút Activities" + "Watchdog") lên máy cảm ứng thật và </w:t>
+      </w:r>
+      <w:r>
+        <w:rPr>
+          <w:b/>
+          <w:color w:val="4A3F8C"/>
+        </w:rPr>
+        <w:t>khởi động lại máy</w:t>
+      </w:r>
+      <w:r>
+        <w:rPr>
+          <w:color w:val="4A3F8C"/>
+        </w:rPr>
+        <w:t>. Máy phải đang chạy app kiosk fullscreen.</w:t>
+      </w:r>
+    </w:p>
+    <w:p>
+      <w:pPr>
+        <w:spacing w:after="80"/>
+      </w:pPr>
+      <w:r>
+        <w:rPr>
+          <w:b/>
+          <w:sz w:val="21"/>
+        </w:rPr>
+        <w:t>Q7 — Cử chỉ cảm ứng KHÔNG được mở Activities overview:</w:t>
+      </w:r>
+    </w:p>
+    <w:p>
+      <w:pPr>
+        <w:spacing w:after="20"/>
+        <w:ind w:left="567" w:hanging="283"/>
+      </w:pPr>
+      <w:r>
+        <w:rPr>
+          <w:sz w:val="21"/>
+        </w:rPr>
+        <w:t>1.</w:t>
+        <w:tab/>
+      </w:r>
+      <w:r>
+        <w:rPr>
+          <w:sz w:val="21"/>
+        </w:rPr>
+        <w:t xml:space="preserve">Đặt app kiosk đang hiển thị fullscreen. Dùng </w:t>
+      </w:r>
+      <w:r>
+        <w:rPr>
+          <w:b/>
+          <w:sz w:val="21"/>
+        </w:rPr>
+        <w:t>3 ngón tay</w:t>
+      </w:r>
+      <w:r>
+        <w:rPr>
+          <w:sz w:val="21"/>
+        </w:rPr>
+        <w:t xml:space="preserve"> vuốt từ giữa màn hình </w:t>
+      </w:r>
+      <w:r>
+        <w:rPr>
+          <w:b/>
+          <w:sz w:val="21"/>
+        </w:rPr>
+        <w:t>lên trên</w:t>
+      </w:r>
+      <w:r>
+        <w:rPr>
+          <w:sz w:val="21"/>
+        </w:rPr>
+        <w:t xml:space="preserve"> (cử chỉ mở overview mặc định của GNOME). → </w:t>
+      </w:r>
+      <w:r>
+        <w:rPr>
+          <w:b/>
+          <w:sz w:val="21"/>
+        </w:rPr>
+        <w:t>Kỳ vọng:</w:t>
+      </w:r>
+      <w:r>
+        <w:rPr>
+          <w:sz w:val="21"/>
+        </w:rPr>
+        <w:t xml:space="preserve"> màn hình KHÔNG đổi, app vẫn fullscreen, KHÔNG xuất hiện lưới cửa sổ/ô "Type to search". (Trước khi vá: overview bung ra + có ô tìm kiếm.)</w:t>
+      </w:r>
+    </w:p>
+    <w:p>
+      <w:pPr>
+        <w:spacing w:after="20"/>
+        <w:ind w:left="567" w:hanging="283"/>
+      </w:pPr>
+      <w:r>
+        <w:rPr>
+          <w:sz w:val="21"/>
+        </w:rPr>
+        <w:t>2.</w:t>
+        <w:tab/>
+      </w:r>
+      <w:r>
+        <w:rPr>
+          <w:sz w:val="21"/>
+        </w:rPr>
+        <w:t xml:space="preserve">Lặp lại với </w:t>
+      </w:r>
+      <w:r>
+        <w:rPr>
+          <w:b/>
+          <w:sz w:val="21"/>
+        </w:rPr>
+        <w:t>4 ngón</w:t>
+      </w:r>
+      <w:r>
+        <w:rPr>
+          <w:sz w:val="21"/>
+        </w:rPr>
+        <w:t xml:space="preserve"> vuốt lên; rồi </w:t>
+      </w:r>
+      <w:r>
+        <w:rPr>
+          <w:b/>
+          <w:sz w:val="21"/>
+        </w:rPr>
+        <w:t>vuốt từ mép trái/phải/trên vào giữa</w:t>
+      </w:r>
+      <w:r>
+        <w:rPr>
+          <w:sz w:val="21"/>
+        </w:rPr>
+        <w:t xml:space="preserve"> (edge-swipe). → </w:t>
+      </w:r>
+      <w:r>
+        <w:rPr>
+          <w:b/>
+          <w:sz w:val="21"/>
+        </w:rPr>
+        <w:t>Kỳ vọng:</w:t>
+      </w:r>
+      <w:r>
+        <w:rPr>
+          <w:sz w:val="21"/>
+        </w:rPr>
+        <w:t xml:space="preserve"> không có gì mở ra.</w:t>
+      </w:r>
+    </w:p>
+    <w:p>
+      <w:pPr>
+        <w:spacing w:after="20"/>
+        <w:ind w:left="567" w:hanging="283"/>
+      </w:pPr>
+      <w:r>
+        <w:rPr>
+          <w:sz w:val="21"/>
+        </w:rPr>
+        <w:t>3.</w:t>
+        <w:tab/>
+      </w:r>
+      <w:r>
+        <w:rPr>
+          <w:b/>
+          <w:sz w:val="21"/>
+        </w:rPr>
+        <w:t>Chạm-giữ ~1 giây</w:t>
+      </w:r>
+      <w:r>
+        <w:rPr>
+          <w:sz w:val="21"/>
+        </w:rPr>
+        <w:t xml:space="preserve"> (long-press = chuột phải) lên vùng trống của màn hình và lên 1 nút trong app. → </w:t>
+      </w:r>
+      <w:r>
+        <w:rPr>
+          <w:b/>
+          <w:sz w:val="21"/>
+        </w:rPr>
+        <w:t>Kỳ vọng:</w:t>
+      </w:r>
+      <w:r>
+        <w:rPr>
+          <w:sz w:val="21"/>
+        </w:rPr>
+        <w:t xml:space="preserve"> không bung overview, không ra menu ngữ cảnh hệ thống nguy hiểm.</w:t>
+      </w:r>
+    </w:p>
+    <w:p>
+      <w:pPr>
+        <w:spacing w:after="20"/>
+        <w:ind w:left="567" w:hanging="283"/>
+      </w:pPr>
+      <w:r>
+        <w:rPr>
+          <w:sz w:val="21"/>
+        </w:rPr>
+        <w:t>4.</w:t>
+        <w:tab/>
+      </w:r>
+      <w:r>
+        <w:rPr>
+          <w:sz w:val="21"/>
+        </w:rPr>
+        <w:t xml:space="preserve">Chạm nhanh vào </w:t>
+      </w:r>
+      <w:r>
+        <w:rPr>
+          <w:b/>
+          <w:sz w:val="21"/>
+        </w:rPr>
+        <w:t>góc trên-trái</w:t>
+      </w:r>
+      <w:r>
+        <w:rPr>
+          <w:sz w:val="21"/>
+        </w:rPr>
+        <w:t xml:space="preserve"> màn hình (hot corner). → </w:t>
+      </w:r>
+      <w:r>
+        <w:rPr>
+          <w:b/>
+          <w:sz w:val="21"/>
+        </w:rPr>
+        <w:t>Kỳ vọng:</w:t>
+      </w:r>
+      <w:r>
+        <w:rPr>
+          <w:sz w:val="21"/>
+        </w:rPr>
+        <w:t xml:space="preserve"> không mở overview.</w:t>
+      </w:r>
+    </w:p>
+    <w:p>
+      <w:pPr>
+        <w:pStyle w:val="ListBullet"/>
+        <w:spacing w:after="20"/>
+        <w:ind w:left="567"/>
+      </w:pPr>
+      <w:r>
+        <w:rPr>
+          <w:b/>
+          <w:sz w:val="21"/>
+        </w:rPr>
+        <w:t>Nếu overview vẫn bung ra ở bất kỳ bước nào:</w:t>
+      </w:r>
+      <w:r>
+        <w:rPr>
+          <w:sz w:val="21"/>
+        </w:rPr>
+        <w:t xml:space="preserve"> chụp ảnh màn hình đó, và qua SSH gửi lại output của: </w:t>
+      </w:r>
+      <w:r>
+        <w:rPr>
+          <w:rFonts w:ascii="Courier New" w:hAnsi="Courier New"/>
+          <w:color w:val="F05922"/>
+          <w:sz w:val="21"/>
+        </w:rPr>
+        <w:t>gnome-extensions info disable-overview-gestures@kztek</w:t>
+      </w:r>
+      <w:r>
+        <w:rPr>
+          <w:sz w:val="21"/>
+        </w:rPr>
+        <w:t xml:space="preserve"> (phải là </w:t>
+      </w:r>
+      <w:r>
+        <w:rPr>
+          <w:rFonts w:ascii="Courier New" w:hAnsi="Courier New"/>
+          <w:color w:val="F05922"/>
+          <w:sz w:val="21"/>
+        </w:rPr>
+        <w:t>State: ACTIVE</w:t>
+      </w:r>
+      <w:r>
+        <w:rPr>
+          <w:sz w:val="21"/>
+        </w:rPr>
+        <w:t xml:space="preserve">) + </w:t>
+      </w:r>
+      <w:r>
+        <w:rPr>
+          <w:rFonts w:ascii="Courier New" w:hAnsi="Courier New"/>
+          <w:color w:val="F05922"/>
+          <w:sz w:val="21"/>
+        </w:rPr>
+        <w:t>gnome-shell --version</w:t>
+      </w:r>
+      <w:r>
+        <w:rPr>
+          <w:sz w:val="21"/>
+        </w:rPr>
+        <w:t>. Báo lại: cử chỉ nào (mấy ngón / hướng nào) làm bung, overview có ô search không.</w:t>
+      </w:r>
+    </w:p>
+    <w:p>
+      <w:pPr>
+        <w:spacing w:after="80"/>
+      </w:pPr>
+      <w:r>
+        <w:rPr>
+          <w:b/>
+          <w:sz w:val="21"/>
+        </w:rPr>
+        <w:t>Q8 — Chạm 1 ngón dùng app vẫn bình thường:</w:t>
+      </w:r>
+    </w:p>
+    <w:p>
+      <w:pPr>
+        <w:spacing w:after="20"/>
+        <w:ind w:left="567" w:hanging="283"/>
+      </w:pPr>
+      <w:r>
+        <w:rPr>
+          <w:sz w:val="21"/>
+        </w:rPr>
+        <w:t>1.</w:t>
+        <w:tab/>
+      </w:r>
+      <w:r>
+        <w:rPr>
+          <w:sz w:val="21"/>
+        </w:rPr>
+        <w:t xml:space="preserve">Dùng </w:t>
+      </w:r>
+      <w:r>
+        <w:rPr>
+          <w:b/>
+          <w:sz w:val="21"/>
+        </w:rPr>
+        <w:t>1 ngón</w:t>
+      </w:r>
+      <w:r>
+        <w:rPr>
+          <w:sz w:val="21"/>
+        </w:rPr>
+        <w:t xml:space="preserve"> chạm lần lượt các nút / ô nhập / danh sách trong app kiosk. → </w:t>
+      </w:r>
+      <w:r>
+        <w:rPr>
+          <w:b/>
+          <w:sz w:val="21"/>
+        </w:rPr>
+        <w:t>Kỳ vọng:</w:t>
+      </w:r>
+      <w:r>
+        <w:rPr>
+          <w:sz w:val="21"/>
+        </w:rPr>
+        <w:t xml:space="preserve"> app phản hồi đúng từng chạm (bấm nút, cuộn, nhập liệu) y như trước khi vá — extension chỉ chặn overview, KHÔNG được nuốt sự kiện chạm của app.</w:t>
+      </w:r>
+    </w:p>
+    <w:p>
+      <w:pPr>
+        <w:spacing w:after="20"/>
+        <w:ind w:left="567" w:hanging="283"/>
+      </w:pPr>
+      <w:r>
+        <w:rPr>
+          <w:sz w:val="21"/>
+        </w:rPr>
+        <w:t>2.</w:t>
+        <w:tab/>
+      </w:r>
+      <w:r>
+        <w:rPr>
+          <w:sz w:val="21"/>
+        </w:rPr>
+        <w:t xml:space="preserve">Cuộn danh sách bằng 1 ngón, kéo-thả trong app (nếu app có). → </w:t>
+      </w:r>
+      <w:r>
+        <w:rPr>
+          <w:b/>
+          <w:sz w:val="21"/>
+        </w:rPr>
+        <w:t>Kỳ vọng:</w:t>
+      </w:r>
+      <w:r>
+        <w:rPr>
+          <w:sz w:val="21"/>
+        </w:rPr>
+        <w:t xml:space="preserve"> mượt, không mất thao tác.</w:t>
+      </w:r>
+    </w:p>
+    <w:p>
+      <w:pPr>
+        <w:pStyle w:val="ListBullet"/>
+        <w:spacing w:after="20"/>
+        <w:ind w:left="567"/>
+      </w:pPr>
+      <w:r>
+        <w:rPr>
+          <w:b/>
+          <w:sz w:val="21"/>
+        </w:rPr>
+        <w:t>Nếu app không nhận chạm / chạm bị "kẹt" / phải chạm 2 lần:</w:t>
+      </w:r>
+      <w:r>
+        <w:rPr>
+          <w:sz w:val="21"/>
+        </w:rPr>
+        <w:t xml:space="preserve"> báo lại thao tác nào lỗi + chụp màn hình; đây sẽ là lỗi mới cần Senior Developer xem lại extension.</w:t>
+      </w:r>
+    </w:p>
+    <w:p>
+      <w:pPr>
+        <w:pStyle w:val="Heading3"/>
+        <w:spacing w:before="160" w:after="60"/>
+      </w:pPr>
+      <w:r>
+        <w:rPr>
+          <w:color w:val="4A3F8C"/>
+          <w:sz w:val="24"/>
+        </w:rPr>
+        <w:t>Trạng thái máy sau khi dọn dẹp</w:t>
+      </w:r>
+    </w:p>
+    <w:p>
+      <w:pPr>
+        <w:pStyle w:val="ListBullet"/>
+        <w:spacing w:after="20"/>
+        <w:ind w:left="283"/>
+      </w:pPr>
+      <w:r>
+        <w:rPr>
+          <w:b/>
+          <w:sz w:val="21"/>
+        </w:rPr>
+        <w:t>Đã gỡ sạch:</w:t>
+      </w:r>
+      <w:r>
+        <w:rPr>
+          <w:sz w:val="21"/>
+        </w:rPr>
+        <w:t xml:space="preserve"> binary giả (</w:t>
+      </w:r>
+      <w:r>
+        <w:rPr>
+          <w:rFonts w:ascii="Courier New" w:hAnsi="Courier New"/>
+          <w:color w:val="F05922"/>
+          <w:sz w:val="21"/>
+        </w:rPr>
+        <w:t>~/kiosk-qa-test/</w:t>
+      </w:r>
+      <w:r>
+        <w:rPr>
+          <w:sz w:val="21"/>
+        </w:rPr>
+        <w:t xml:space="preserve">), unit test watchdog + backup của nó, mọi file </w:t>
+      </w:r>
+      <w:r>
+        <w:rPr>
+          <w:rFonts w:ascii="Courier New" w:hAnsi="Courier New"/>
+          <w:color w:val="F05922"/>
+          <w:sz w:val="21"/>
+        </w:rPr>
+        <w:t>/tmp/qa-*</w:t>
+      </w:r>
+      <w:r>
+        <w:rPr>
+          <w:sz w:val="21"/>
+        </w:rPr>
+        <w:t xml:space="preserve">, </w:t>
+      </w:r>
+      <w:r>
+        <w:rPr>
+          <w:rFonts w:ascii="Courier New" w:hAnsi="Courier New"/>
+          <w:color w:val="F05922"/>
+          <w:sz w:val="21"/>
+        </w:rPr>
+        <w:t>/tmp/verify-*</w:t>
+      </w:r>
+      <w:r>
+        <w:rPr>
+          <w:sz w:val="21"/>
+        </w:rPr>
+        <w:t xml:space="preserve">, script test </w:t>
+      </w:r>
+      <w:r>
+        <w:rPr>
+          <w:rFonts w:ascii="Courier New" w:hAnsi="Courier New"/>
+          <w:color w:val="F05922"/>
+          <w:sz w:val="21"/>
+        </w:rPr>
+        <w:t>/tmp/qa-kiosk/</w:t>
+      </w:r>
+      <w:r>
+        <w:rPr>
+          <w:sz w:val="21"/>
+        </w:rPr>
+        <w:t xml:space="preserve">, các </w:t>
+      </w:r>
+      <w:r>
+        <w:rPr>
+          <w:rFonts w:ascii="Courier New" w:hAnsi="Courier New"/>
+          <w:color w:val="F05922"/>
+          <w:sz w:val="21"/>
+        </w:rPr>
+        <w:t>.bak-20260727*</w:t>
+      </w:r>
+      <w:r>
+        <w:rPr>
+          <w:sz w:val="21"/>
+        </w:rPr>
+        <w:t xml:space="preserve"> của dconf do QA tạo (đã </w:t>
+      </w:r>
+      <w:r>
+        <w:rPr>
+          <w:rFonts w:ascii="Courier New" w:hAnsi="Courier New"/>
+          <w:color w:val="F05922"/>
+          <w:sz w:val="21"/>
+        </w:rPr>
+        <w:t>dconf update</w:t>
+      </w:r>
+      <w:r>
+        <w:rPr>
+          <w:sz w:val="21"/>
+        </w:rPr>
+        <w:t xml:space="preserve"> lại). Không còn process </w:t>
+      </w:r>
+      <w:r>
+        <w:rPr>
+          <w:rFonts w:ascii="Courier New" w:hAnsi="Courier New"/>
+          <w:color w:val="F05922"/>
+          <w:sz w:val="21"/>
+        </w:rPr>
+        <w:t>fakeapp</w:t>
+      </w:r>
+      <w:r>
+        <w:rPr>
+          <w:sz w:val="21"/>
+        </w:rPr>
+        <w:t>/</w:t>
+      </w:r>
+      <w:r>
+        <w:rPr>
+          <w:rFonts w:ascii="Courier New" w:hAnsi="Courier New"/>
+          <w:color w:val="F05922"/>
+          <w:sz w:val="21"/>
+        </w:rPr>
+        <w:t>gnome-calculator</w:t>
+      </w:r>
+      <w:r>
+        <w:rPr>
+          <w:sz w:val="21"/>
+        </w:rPr>
+        <w:t xml:space="preserve"> chạy lại.</w:t>
+      </w:r>
+    </w:p>
+    <w:p>
+      <w:pPr>
+        <w:pStyle w:val="ListBullet"/>
+        <w:spacing w:after="20"/>
+        <w:ind w:left="283"/>
+      </w:pPr>
+      <w:r>
+        <w:rPr>
+          <w:b/>
+          <w:sz w:val="21"/>
+        </w:rPr>
+        <w:t>Trạng thái đích còn lại (đúng cấu hình kiosk):</w:t>
+      </w:r>
+      <w:r>
+        <w:rPr>
+          <w:sz w:val="21"/>
+        </w:rPr>
+        <w:t xml:space="preserve"> dconf lockdown F09 </w:t>
+      </w:r>
+      <w:r>
+        <w:rPr>
+          <w:b/>
+          <w:sz w:val="21"/>
+        </w:rPr>
+        <w:t>còn hiệu lực</w:t>
+      </w:r>
+      <w:r>
+        <w:rPr>
+          <w:sz w:val="21"/>
+        </w:rPr>
+        <w:t xml:space="preserve"> (overlay-key + switch-to-application-4 </w:t>
+      </w:r>
+      <w:r>
+        <w:rPr>
+          <w:rFonts w:ascii="Courier New" w:hAnsi="Courier New"/>
+          <w:color w:val="F05922"/>
+          <w:sz w:val="21"/>
+        </w:rPr>
+        <w:t>writable=false</w:t>
+      </w:r>
+      <w:r>
+        <w:rPr>
+          <w:sz w:val="21"/>
+        </w:rPr>
+        <w:t xml:space="preserve"> sau cleanup); extension </w:t>
+      </w:r>
+      <w:r>
+        <w:rPr>
+          <w:rFonts w:ascii="Courier New" w:hAnsi="Courier New"/>
+          <w:color w:val="F05922"/>
+          <w:sz w:val="21"/>
+        </w:rPr>
+        <w:t>disable-overview-gestures@kztek</w:t>
+      </w:r>
+      <w:r>
+        <w:rPr>
+          <w:sz w:val="21"/>
+        </w:rPr>
+        <w:t xml:space="preserve"> </w:t>
+      </w:r>
+      <w:r>
+        <w:rPr>
+          <w:b/>
+          <w:sz w:val="21"/>
+        </w:rPr>
+        <w:t>ENABLED</w:t>
+      </w:r>
+      <w:r>
+        <w:rPr>
+          <w:sz w:val="21"/>
+        </w:rPr>
+        <w:t xml:space="preserve">; autologin </w:t>
+      </w:r>
+      <w:r>
+        <w:rPr>
+          <w:rFonts w:ascii="Courier New" w:hAnsi="Courier New"/>
+          <w:color w:val="F05922"/>
+          <w:sz w:val="21"/>
+        </w:rPr>
+        <w:t>kztek</w:t>
+      </w:r>
+      <w:r>
+        <w:rPr>
+          <w:sz w:val="21"/>
+        </w:rPr>
+        <w:t xml:space="preserve"> + TimedLogin 5s (F08) còn; </w:t>
+      </w:r>
+      <w:r>
+        <w:rPr>
+          <w:rFonts w:ascii="Courier New" w:hAnsi="Courier New"/>
+          <w:color w:val="F05922"/>
+          <w:sz w:val="21"/>
+        </w:rPr>
+        <w:t>ipgs-remote-agent</w:t>
+      </w:r>
+      <w:r>
+        <w:rPr>
+          <w:sz w:val="21"/>
+        </w:rPr>
+        <w:t xml:space="preserve"> </w:t>
+      </w:r>
+      <w:r>
+        <w:rPr>
+          <w:b/>
+          <w:sz w:val="21"/>
+        </w:rPr>
+        <w:t>active</w:t>
+      </w:r>
+      <w:r>
+        <w:rPr>
+          <w:sz w:val="21"/>
+        </w:rPr>
+        <w:t xml:space="preserve">; SSH sống. Cấu hình cuối: </w:t>
+      </w:r>
+      <w:r>
+        <w:rPr>
+          <w:b/>
+          <w:sz w:val="21"/>
+        </w:rPr>
+        <w:t>AS=1, WD=0</w:t>
+      </w:r>
+      <w:r>
+        <w:rPr>
+          <w:sz w:val="21"/>
+        </w:rPr>
+        <w:t xml:space="preserve"> (autostart </w:t>
+      </w:r>
+      <w:r>
+        <w:rPr>
+          <w:rFonts w:ascii="Courier New" w:hAnsi="Courier New"/>
+          <w:color w:val="F05922"/>
+          <w:sz w:val="21"/>
+        </w:rPr>
+        <w:t>.desktop</w:t>
+      </w:r>
+      <w:r>
+        <w:rPr>
+          <w:sz w:val="21"/>
+        </w:rPr>
+        <w:t xml:space="preserve"> app + unclutter, không watchdog — vì máy này chạy agent, chưa deploy app kiosk thật; user chọn WD khi deploy app thật).</w:t>
+      </w:r>
+    </w:p>
+    <w:p>
+      <w:pPr>
+        <w:pStyle w:val="ListBullet"/>
+        <w:spacing w:after="20"/>
+        <w:ind w:left="283"/>
+      </w:pPr>
+      <w:r>
+        <w:rPr>
+          <w:b/>
+          <w:sz w:val="21"/>
+        </w:rPr>
+        <w:t>Còn lại 1 file cần user biết:</w:t>
+      </w:r>
+      <w:r>
+        <w:rPr>
+          <w:sz w:val="21"/>
+        </w:rPr>
+        <w:t xml:space="preserve"> </w:t>
+      </w:r>
+      <w:r>
+        <w:rPr>
+          <w:rFonts w:ascii="Courier New" w:hAnsi="Courier New"/>
+          <w:color w:val="F05922"/>
+          <w:sz w:val="21"/>
+        </w:rPr>
+        <w:t>/etc/dconf/db/local.d/00-kiosk-lockdown.bak-2026-07-26</w:t>
+      </w:r>
+      <w:r>
+        <w:rPr>
+          <w:sz w:val="21"/>
+        </w:rPr>
+        <w:t xml:space="preserve"> (+ </w:t>
+      </w:r>
+      <w:r>
+        <w:rPr>
+          <w:rFonts w:ascii="Courier New" w:hAnsi="Courier New"/>
+          <w:color w:val="F05922"/>
+          <w:sz w:val="21"/>
+        </w:rPr>
+        <w:t>locks/</w:t>
+      </w:r>
+      <w:r>
+        <w:rPr>
+          <w:sz w:val="21"/>
+        </w:rPr>
+        <w:t xml:space="preserve">) — do Senior Developer tạo từ phiên F09 trước, KHÔNG phải QA tạo; là biểu hiện của F11 (backup nằm trong thư mục db). Để nguyên vì phản ánh baseline trước test; nên dọn khi fix F11. Backup QA gốc ở </w:t>
+      </w:r>
+      <w:r>
+        <w:rPr>
+          <w:rFonts w:ascii="Courier New" w:hAnsi="Courier New"/>
+          <w:color w:val="F05922"/>
+          <w:sz w:val="21"/>
+        </w:rPr>
+        <w:t>~/kiosk-qa-backup-2026-07-27/</w:t>
+      </w:r>
+      <w:r>
+        <w:rPr>
+          <w:sz w:val="21"/>
+        </w:rPr>
+        <w:t xml:space="preserve"> (ngoài thư mục db, an toàn) — user có thể xoá sau khi xác nhận.</w:t>
+      </w:r>
+    </w:p>
+    <w:p>
+      <w:pPr>
+        <w:pStyle w:val="Heading3"/>
+        <w:spacing w:before="160" w:after="60"/>
+      </w:pPr>
+      <w:r>
+        <w:rPr>
+          <w:color w:val="4A3F8C"/>
+          <w:sz w:val="24"/>
+        </w:rPr>
+        <w:t>Kết luận</w:t>
+      </w:r>
+    </w:p>
+    <w:p>
+      <w:pPr>
+        <w:spacing w:after="80"/>
+      </w:pPr>
+      <w:r>
+        <w:rPr>
+          <w:sz w:val="21"/>
+        </w:rPr>
+        <w:t xml:space="preserve">✅ </w:t>
+      </w:r>
+      <w:r>
+        <w:rPr>
+          <w:b/>
+          <w:sz w:val="21"/>
+        </w:rPr>
+        <w:t>Đủ điều kiện SIGN-OFF cho F09/F10</w:t>
+      </w:r>
+      <w:r>
+        <w:rPr>
+          <w:sz w:val="21"/>
+        </w:rPr>
+        <w:t xml:space="preserve"> — 8/10 case PASS với bằng chứng thật trên ZCU + reboot; 2 case Q7/Q8 (cử chỉ/chạm cảm ứng) </w:t>
+      </w:r>
+      <w:r>
+        <w:rPr>
+          <w:b/>
+          <w:sz w:val="21"/>
+        </w:rPr>
+        <w:t>BẮT BUỘC user nghiệm thu tay</w:t>
+      </w:r>
+      <w:r>
+        <w:rPr>
+          <w:sz w:val="21"/>
+        </w:rPr>
+        <w:t xml:space="preserve"> theo hướng dẫn trên trước khi coi F10-A là done hoàn toàn (VM không có touchscreen — đúng như Tech Lead đã lưu ý). F11 (P2, đường gỡ khoá bảo trì hỏng do backup trong thư mục db) là lỗi mới, KHÔNG chặn mục tiêu hardening (fail an toàn về phía khoá) → giao Senior Developer xử lý vòng 3 hoặc gộp backlog. </w:t>
+      </w:r>
+      <w:r>
+        <w:rPr>
+          <w:b/>
+          <w:sz w:val="21"/>
+        </w:rPr>
+        <w:t>Bàn giao QA Lead quyết định sign-off (Bước 5 WF-BUGFIX).</w:t>
+      </w:r>
+    </w:p>
+    <w:p>
+      <w:pPr>
+        <w:spacing w:after="80"/>
+      </w:pPr>
+      <w:r>
+        <w:rPr>
+          <w:sz w:val="21"/>
+        </w:rPr>
+        <w:t>— QA Engineer, 2026-07-27 01:22</w:t>
+      </w:r>
+    </w:p>
+    <w:p>
+      <w:pPr>
+        <w:pBdr>
+          <w:bottom w:val="single" w:sz="6" w:space="1" w:color="F05922"/>
+        </w:pBdr>
+        <w:spacing w:after="120"/>
+      </w:pPr>
+    </w:p>
+    <w:p>
+      <w:pPr>
+        <w:pStyle w:val="Heading2"/>
+        <w:spacing w:before="200" w:after="80"/>
+      </w:pPr>
+      <w:r>
+        <w:rPr>
+          <w:color w:val="F05922"/>
+          <w:sz w:val="28"/>
+        </w:rPr>
+        <w:t>F11 — Backup dconf lockdown ghi trong chính thư mục db → lệnh gỡ khoá bảo trì không thực sự gỡ được khoá</w:t>
+      </w:r>
+    </w:p>
+    <w:p>
+      <w:pPr>
+        <w:spacing w:before="40" w:after="40"/>
+        <w:ind w:left="567"/>
+        <w:pBdr>
+          <w:left w:val="single" w:sz="12" w:space="10" w:color="F05922"/>
+        </w:pBdr>
+      </w:pPr>
+      <w:r>
+        <w:rPr>
+          <w:b/>
+          <w:color w:val="4A3F8C"/>
+        </w:rPr>
+        <w:t>Người phát hiện:</w:t>
+      </w:r>
+      <w:r>
+        <w:rPr>
+          <w:color w:val="4A3F8C"/>
+        </w:rPr>
+        <w:t xml:space="preserve"> QA Engineer (trong lúc verify F09/F10 vòng 2 trên ZCU thật).</w:t>
+      </w:r>
+    </w:p>
+    <w:tbl>
+      <w:tblPr>
+        <w:tblStyle w:val="TableGrid"/>
+        <w:tblW w:type="auto" w:w="0"/>
+        <w:tblLook w:firstColumn="1" w:firstRow="1" w:lastColumn="0" w:lastRow="0" w:noHBand="0" w:noVBand="1" w:val="04A0"/>
+      </w:tblPr>
+      <w:tblGrid>
+        <w:gridCol w:w="4844"/>
+        <w:gridCol w:w="4844"/>
+      </w:tblGrid>
+      <w:tr>
+        <w:tc>
+          <w:tcPr>
+            <w:tcW w:type="dxa" w:w="4844"/>
+            <w:shd w:val="clear" w:color="auto" w:fill="251C53"/>
+            <w:tcBorders>
+              <w:top w:val="single" w:sz="4" w:space="0" w:color="251C53"/>
+              <w:left w:val="single" w:sz="4" w:space="0" w:color="251C53"/>
+              <w:bottom w:val="single" w:sz="4" w:space="0" w:color="251C53"/>
+              <w:right w:val="single" w:sz="4" w:space="0" w:color="251C53"/>
+            </w:tcBorders>
+          </w:tcPr>
+          <w:p>
+            <w:r>
+              <w:rPr>
+                <w:b/>
+                <w:color w:val="FFFFFF"/>
+                <w:sz w:val="20"/>
+              </w:rPr>
+              <w:t>Trường</w:t>
+            </w:r>
+          </w:p>
+        </w:tc>
+        <w:tc>
+          <w:tcPr>
+            <w:tcW w:type="dxa" w:w="4844"/>
+            <w:shd w:val="clear" w:color="auto" w:fill="251C53"/>
+            <w:tcBorders>
+              <w:top w:val="single" w:sz="4" w:space="0" w:color="251C53"/>
+              <w:left w:val="single" w:sz="4" w:space="0" w:color="251C53"/>
+              <w:bottom w:val="single" w:sz="4" w:space="0" w:color="251C53"/>
+              <w:right w:val="single" w:sz="4" w:space="0" w:color="251C53"/>
+            </w:tcBorders>
+          </w:tcPr>
+          <w:p>
+            <w:r>
+              <w:rPr>
+                <w:b/>
+                <w:color w:val="FFFFFF"/>
+                <w:sz w:val="20"/>
+              </w:rPr>
+              <w:t>Nội dung</w:t>
+            </w:r>
+          </w:p>
+        </w:tc>
+      </w:tr>
+      <w:tr>
+        <w:tc>
+          <w:tcPr>
+            <w:tcW w:type="dxa" w:w="4844"/>
+            <w:tcBorders>
+              <w:top w:val="single" w:sz="4" w:space="0" w:color="CBCBCB"/>
+              <w:left w:val="single" w:sz="4" w:space="0" w:color="CBCBCB"/>
+              <w:bottom w:val="single" w:sz="4" w:space="0" w:color="CBCBCB"/>
+              <w:right w:val="single" w:sz="4" w:space="0" w:color="CBCBCB"/>
+            </w:tcBorders>
+          </w:tcPr>
+          <w:p>
+            <w:r>
+              <w:rPr>
+                <w:sz w:val="20"/>
+              </w:rPr>
+              <w:t>---</w:t>
+            </w:r>
+          </w:p>
+        </w:tc>
+        <w:tc>
+          <w:tcPr>
+            <w:tcW w:type="dxa" w:w="4844"/>
+            <w:tcBorders>
+              <w:top w:val="single" w:sz="4" w:space="0" w:color="CBCBCB"/>
+              <w:left w:val="single" w:sz="4" w:space="0" w:color="CBCBCB"/>
+              <w:bottom w:val="single" w:sz="4" w:space="0" w:color="CBCBCB"/>
+              <w:right w:val="single" w:sz="4" w:space="0" w:color="CBCBCB"/>
+            </w:tcBorders>
+          </w:tcPr>
+          <w:p>
+            <w:r>
+              <w:rPr>
+                <w:sz w:val="20"/>
+              </w:rPr>
+              <w:t>---</w:t>
+            </w:r>
+          </w:p>
+        </w:tc>
+      </w:tr>
+      <w:tr>
+        <w:tc>
+          <w:tcPr>
+            <w:tcW w:type="dxa" w:w="4844"/>
+            <w:shd w:val="clear" w:color="auto" w:fill="B8B3D6"/>
+            <w:tcBorders>
+              <w:top w:val="single" w:sz="4" w:space="0" w:color="CBCBCB"/>
+              <w:left w:val="single" w:sz="4" w:space="0" w:color="CBCBCB"/>
+              <w:bottom w:val="single" w:sz="4" w:space="0" w:color="CBCBCB"/>
+              <w:right w:val="single" w:sz="4" w:space="0" w:color="CBCBCB"/>
+            </w:tcBorders>
+          </w:tcPr>
+          <w:p>
+            <w:r>
+              <w:rPr>
+                <w:b/>
+                <w:sz w:val="20"/>
+              </w:rPr>
+              <w:t>Màn hình / Thành phần</w:t>
+            </w:r>
+          </w:p>
+        </w:tc>
+        <w:tc>
+          <w:tcPr>
+            <w:tcW w:type="dxa" w:w="4844"/>
+            <w:shd w:val="clear" w:color="auto" w:fill="B8B3D6"/>
+            <w:tcBorders>
+              <w:top w:val="single" w:sz="4" w:space="0" w:color="CBCBCB"/>
+              <w:left w:val="single" w:sz="4" w:space="0" w:color="CBCBCB"/>
+              <w:bottom w:val="single" w:sz="4" w:space="0" w:color="CBCBCB"/>
+              <w:right w:val="single" w:sz="4" w:space="0" w:color="CBCBCB"/>
+            </w:tcBorders>
+          </w:tcPr>
+          <w:p>
+            <w:r>
+              <w:rPr>
+                <w:rFonts w:ascii="Courier New" w:hAnsi="Courier New"/>
+                <w:color w:val="F05922"/>
+                <w:sz w:val="20"/>
+              </w:rPr>
+              <w:t>scripts/linux-kiosk/2-configure-system.sh</w:t>
+            </w:r>
+            <w:r>
+              <w:rPr>
+                <w:sz w:val="20"/>
+              </w:rPr>
+              <w:t xml:space="preserve"> mục [9/9] (F09) — dòng 500-502 và 526-527</w:t>
+            </w:r>
+          </w:p>
+        </w:tc>
+      </w:tr>
+      <w:tr>
+        <w:tc>
+          <w:tcPr>
+            <w:tcW w:type="dxa" w:w="4844"/>
+            <w:tcBorders>
+              <w:top w:val="single" w:sz="4" w:space="0" w:color="CBCBCB"/>
+              <w:left w:val="single" w:sz="4" w:space="0" w:color="CBCBCB"/>
+              <w:bottom w:val="single" w:sz="4" w:space="0" w:color="CBCBCB"/>
+              <w:right w:val="single" w:sz="4" w:space="0" w:color="CBCBCB"/>
+            </w:tcBorders>
+          </w:tcPr>
+          <w:p>
+            <w:r>
+              <w:rPr>
+                <w:b/>
+                <w:sz w:val="20"/>
+              </w:rPr>
+              <w:t>Mức độ</w:t>
+            </w:r>
+          </w:p>
+        </w:tc>
+        <w:tc>
+          <w:tcPr>
+            <w:tcW w:type="dxa" w:w="4844"/>
+            <w:tcBorders>
+              <w:top w:val="single" w:sz="4" w:space="0" w:color="CBCBCB"/>
+              <w:left w:val="single" w:sz="4" w:space="0" w:color="CBCBCB"/>
+              <w:bottom w:val="single" w:sz="4" w:space="0" w:color="CBCBCB"/>
+              <w:right w:val="single" w:sz="4" w:space="0" w:color="CBCBCB"/>
+            </w:tcBorders>
+          </w:tcPr>
+          <w:p>
+            <w:r>
+              <w:rPr>
+                <w:sz w:val="20"/>
+              </w:rPr>
+              <w:t>P2 (bảo trì / vận hành — KHÔNG phải bảo mật)</w:t>
+            </w:r>
+          </w:p>
+        </w:tc>
+      </w:tr>
+      <w:tr>
+        <w:tc>
+          <w:tcPr>
+            <w:tcW w:type="dxa" w:w="4844"/>
+            <w:shd w:val="clear" w:color="auto" w:fill="B8B3D6"/>
+            <w:tcBorders>
+              <w:top w:val="single" w:sz="4" w:space="0" w:color="CBCBCB"/>
+              <w:left w:val="single" w:sz="4" w:space="0" w:color="CBCBCB"/>
+              <w:bottom w:val="single" w:sz="4" w:space="0" w:color="CBCBCB"/>
+              <w:right w:val="single" w:sz="4" w:space="0" w:color="CBCBCB"/>
+            </w:tcBorders>
+          </w:tcPr>
+          <w:p>
+            <w:r>
+              <w:rPr>
+                <w:b/>
+                <w:sz w:val="20"/>
+              </w:rPr>
+              <w:t>Các bước tái hiện</w:t>
+            </w:r>
+          </w:p>
+        </w:tc>
+        <w:tc>
+          <w:tcPr>
+            <w:tcW w:type="dxa" w:w="4844"/>
+            <w:shd w:val="clear" w:color="auto" w:fill="B8B3D6"/>
+            <w:tcBorders>
+              <w:top w:val="single" w:sz="4" w:space="0" w:color="CBCBCB"/>
+              <w:left w:val="single" w:sz="4" w:space="0" w:color="CBCBCB"/>
+              <w:bottom w:val="single" w:sz="4" w:space="0" w:color="CBCBCB"/>
+              <w:right w:val="single" w:sz="4" w:space="0" w:color="CBCBCB"/>
+            </w:tcBorders>
+          </w:tcPr>
+          <w:p>
+            <w:r>
+              <w:rPr>
+                <w:sz w:val="20"/>
+              </w:rPr>
+              <w:t xml:space="preserve">1. Deploy kiosk (LockdownShell=1) lần 1 → tạo </w:t>
+            </w:r>
+            <w:r>
+              <w:rPr>
+                <w:rFonts w:ascii="Courier New" w:hAnsi="Courier New"/>
+                <w:color w:val="F05922"/>
+                <w:sz w:val="20"/>
+              </w:rPr>
+              <w:t>/etc/dconf/db/local.d/00-kiosk-lockdown</w:t>
+            </w:r>
+            <w:r>
+              <w:rPr>
+                <w:sz w:val="20"/>
+              </w:rPr>
+              <w:t xml:space="preserve"> + </w:t>
+            </w:r>
+            <w:r>
+              <w:rPr>
+                <w:rFonts w:ascii="Courier New" w:hAnsi="Courier New"/>
+                <w:color w:val="F05922"/>
+                <w:sz w:val="20"/>
+              </w:rPr>
+              <w:t>locks/00-kiosk-lockdown</w:t>
+            </w:r>
+            <w:r>
+              <w:rPr>
+                <w:sz w:val="20"/>
+              </w:rPr>
+              <w:t xml:space="preserve">. 2. Deploy lần 2 (bất kỳ cấu hình nào có Lockdown) → script </w:t>
+            </w:r>
+            <w:r>
+              <w:rPr>
+                <w:rFonts w:ascii="Courier New" w:hAnsi="Courier New"/>
+                <w:color w:val="F05922"/>
+                <w:sz w:val="20"/>
+              </w:rPr>
+              <w:t>cp</w:t>
+            </w:r>
+            <w:r>
+              <w:rPr>
+                <w:sz w:val="20"/>
+              </w:rPr>
+              <w:t xml:space="preserve"> file cũ thành </w:t>
+            </w:r>
+            <w:r>
+              <w:rPr>
+                <w:rFonts w:ascii="Courier New" w:hAnsi="Courier New"/>
+                <w:color w:val="F05922"/>
+                <w:sz w:val="20"/>
+              </w:rPr>
+              <w:t>00-kiosk-lockdown.bak-&lt;timestamp&gt;</w:t>
+            </w:r>
+            <w:r>
+              <w:rPr>
+                <w:sz w:val="20"/>
+              </w:rPr>
+              <w:t xml:space="preserve"> </w:t>
+            </w:r>
+            <w:r>
+              <w:rPr>
+                <w:b/>
+                <w:sz w:val="20"/>
+              </w:rPr>
+              <w:t>ngay trong `/etc/dconf/db/local.d/` và `locks/`</w:t>
+            </w:r>
+            <w:r>
+              <w:rPr>
+                <w:sz w:val="20"/>
+              </w:rPr>
+              <w:t xml:space="preserve">. 3. Quản trị viên chạy đúng lệnh gỡ khoá mà script in ra: </w:t>
+            </w:r>
+            <w:r>
+              <w:rPr>
+                <w:rFonts w:ascii="Courier New" w:hAnsi="Courier New"/>
+                <w:color w:val="F05922"/>
+                <w:sz w:val="20"/>
+              </w:rPr>
+              <w:t>sudo rm /etc/dconf/db/local.d/00-kiosk-lockdown /etc/dconf/db/local.d/locks/00-kiosk-lockdown &amp;&amp; sudo dconf update</w:t>
+            </w:r>
+            <w:r>
+              <w:rPr>
+                <w:sz w:val="20"/>
+              </w:rPr>
+              <w:t xml:space="preserve"> rồi reboot.</w:t>
+            </w:r>
+          </w:p>
+        </w:tc>
+      </w:tr>
+      <w:tr>
+        <w:tc>
+          <w:tcPr>
+            <w:tcW w:type="dxa" w:w="4844"/>
+            <w:tcBorders>
+              <w:top w:val="single" w:sz="4" w:space="0" w:color="CBCBCB"/>
+              <w:left w:val="single" w:sz="4" w:space="0" w:color="CBCBCB"/>
+              <w:bottom w:val="single" w:sz="4" w:space="0" w:color="CBCBCB"/>
+              <w:right w:val="single" w:sz="4" w:space="0" w:color="CBCBCB"/>
+            </w:tcBorders>
+          </w:tcPr>
+          <w:p>
+            <w:r>
+              <w:rPr>
+                <w:b/>
+                <w:sz w:val="20"/>
+              </w:rPr>
+              <w:t>Kết quả thực tế</w:t>
+            </w:r>
+          </w:p>
+        </w:tc>
+        <w:tc>
+          <w:tcPr>
+            <w:tcW w:type="dxa" w:w="4844"/>
+            <w:tcBorders>
+              <w:top w:val="single" w:sz="4" w:space="0" w:color="CBCBCB"/>
+              <w:left w:val="single" w:sz="4" w:space="0" w:color="CBCBCB"/>
+              <w:bottom w:val="single" w:sz="4" w:space="0" w:color="CBCBCB"/>
+              <w:right w:val="single" w:sz="4" w:space="0" w:color="CBCBCB"/>
+            </w:tcBorders>
+          </w:tcPr>
+          <w:p>
+            <w:r>
+              <w:rPr>
+                <w:rFonts w:ascii="Courier New" w:hAnsi="Courier New"/>
+                <w:color w:val="F05922"/>
+                <w:sz w:val="20"/>
+              </w:rPr>
+              <w:t>dconf update</w:t>
+            </w:r>
+            <w:r>
+              <w:rPr>
+                <w:sz w:val="20"/>
+              </w:rPr>
+              <w:t xml:space="preserve"> biên dịch </w:t>
+            </w:r>
+            <w:r>
+              <w:rPr>
+                <w:b/>
+                <w:sz w:val="20"/>
+              </w:rPr>
+              <w:t>MỌI file</w:t>
+            </w:r>
+            <w:r>
+              <w:rPr>
+                <w:sz w:val="20"/>
+              </w:rPr>
+              <w:t xml:space="preserve"> trong thư mục </w:t>
+            </w:r>
+            <w:r>
+              <w:rPr>
+                <w:rFonts w:ascii="Courier New" w:hAnsi="Courier New"/>
+                <w:color w:val="F05922"/>
+                <w:sz w:val="20"/>
+              </w:rPr>
+              <w:t>local.d/</w:t>
+            </w:r>
+            <w:r>
+              <w:rPr>
+                <w:sz w:val="20"/>
+              </w:rPr>
+              <w:t xml:space="preserve"> (và </w:t>
+            </w:r>
+            <w:r>
+              <w:rPr>
+                <w:rFonts w:ascii="Courier New" w:hAnsi="Courier New"/>
+                <w:color w:val="F05922"/>
+                <w:sz w:val="20"/>
+              </w:rPr>
+              <w:t>locks/</w:t>
+            </w:r>
+            <w:r>
+              <w:rPr>
+                <w:sz w:val="20"/>
+              </w:rPr>
+              <w:t xml:space="preserve">) vào binary db </w:t>
+            </w:r>
+            <w:r>
+              <w:rPr>
+                <w:b/>
+                <w:sz w:val="20"/>
+              </w:rPr>
+              <w:t>bất kể phần mở rộng tên file</w:t>
+            </w:r>
+            <w:r>
+              <w:rPr>
+                <w:sz w:val="20"/>
+              </w:rPr>
+              <w:t xml:space="preserve"> — nên các file </w:t>
+            </w:r>
+            <w:r>
+              <w:rPr>
+                <w:rFonts w:ascii="Courier New" w:hAnsi="Courier New"/>
+                <w:color w:val="F05922"/>
+                <w:sz w:val="20"/>
+              </w:rPr>
+              <w:t>.bak-*</w:t>
+            </w:r>
+            <w:r>
+              <w:rPr>
+                <w:sz w:val="20"/>
+              </w:rPr>
+              <w:t xml:space="preserve"> (bản sao byte-đúng của lockdown) vẫn được nạp và </w:t>
+            </w:r>
+            <w:r>
+              <w:rPr>
+                <w:b/>
+                <w:sz w:val="20"/>
+              </w:rPr>
+              <w:t>tái áp toàn bộ lock</w:t>
+            </w:r>
+            <w:r>
+              <w:rPr>
+                <w:sz w:val="20"/>
+              </w:rPr>
+              <w:t xml:space="preserve">. Sau khi "gỡ khoá" + reboot, </w:t>
+            </w:r>
+            <w:r>
+              <w:rPr>
+                <w:rFonts w:ascii="Courier New" w:hAnsi="Courier New"/>
+                <w:color w:val="F05922"/>
+                <w:sz w:val="20"/>
+              </w:rPr>
+              <w:t>gsettings writable</w:t>
+            </w:r>
+            <w:r>
+              <w:rPr>
+                <w:sz w:val="20"/>
+              </w:rPr>
+              <w:t xml:space="preserve"> các key vẫn = </w:t>
+            </w:r>
+            <w:r>
+              <w:rPr>
+                <w:rFonts w:ascii="Courier New" w:hAnsi="Courier New"/>
+                <w:color w:val="F05922"/>
+                <w:sz w:val="20"/>
+              </w:rPr>
+              <w:t>false</w:t>
+            </w:r>
+            <w:r>
+              <w:rPr>
+                <w:sz w:val="20"/>
+              </w:rPr>
+              <w:t xml:space="preserve"> → khoá KHÔNG được gỡ. Trên ZCU test đã thấy </w:t>
+            </w:r>
+            <w:r>
+              <w:rPr>
+                <w:b/>
+                <w:sz w:val="20"/>
+              </w:rPr>
+              <w:t>10 file `.bak` tích luỹ</w:t>
+            </w:r>
+            <w:r>
+              <w:rPr>
+                <w:sz w:val="20"/>
+              </w:rPr>
+              <w:t xml:space="preserve"> trong </w:t>
+            </w:r>
+            <w:r>
+              <w:rPr>
+                <w:rFonts w:ascii="Courier New" w:hAnsi="Courier New"/>
+                <w:color w:val="F05922"/>
+                <w:sz w:val="20"/>
+              </w:rPr>
+              <w:t>local.d/</w:t>
+            </w:r>
+            <w:r>
+              <w:rPr>
+                <w:sz w:val="20"/>
+              </w:rPr>
+              <w:t xml:space="preserve"> và </w:t>
+            </w:r>
+            <w:r>
+              <w:rPr>
+                <w:rFonts w:ascii="Courier New" w:hAnsi="Courier New"/>
+                <w:color w:val="F05922"/>
+                <w:sz w:val="20"/>
+              </w:rPr>
+              <w:t>locks/</w:t>
+            </w:r>
+            <w:r>
+              <w:rPr>
+                <w:sz w:val="20"/>
+              </w:rPr>
+              <w:t xml:space="preserve"> sau các lần deploy.</w:t>
+            </w:r>
+          </w:p>
+        </w:tc>
+      </w:tr>
+      <w:tr>
+        <w:tc>
+          <w:tcPr>
+            <w:tcW w:type="dxa" w:w="4844"/>
+            <w:shd w:val="clear" w:color="auto" w:fill="B8B3D6"/>
+            <w:tcBorders>
+              <w:top w:val="single" w:sz="4" w:space="0" w:color="CBCBCB"/>
+              <w:left w:val="single" w:sz="4" w:space="0" w:color="CBCBCB"/>
+              <w:bottom w:val="single" w:sz="4" w:space="0" w:color="CBCBCB"/>
+              <w:right w:val="single" w:sz="4" w:space="0" w:color="CBCBCB"/>
+            </w:tcBorders>
+          </w:tcPr>
+          <w:p>
+            <w:r>
+              <w:rPr>
+                <w:b/>
+                <w:sz w:val="20"/>
+              </w:rPr>
+              <w:t>Kết quả mong đợi</w:t>
+            </w:r>
+          </w:p>
+        </w:tc>
+        <w:tc>
+          <w:tcPr>
+            <w:tcW w:type="dxa" w:w="4844"/>
+            <w:shd w:val="clear" w:color="auto" w:fill="B8B3D6"/>
+            <w:tcBorders>
+              <w:top w:val="single" w:sz="4" w:space="0" w:color="CBCBCB"/>
+              <w:left w:val="single" w:sz="4" w:space="0" w:color="CBCBCB"/>
+              <w:bottom w:val="single" w:sz="4" w:space="0" w:color="CBCBCB"/>
+              <w:right w:val="single" w:sz="4" w:space="0" w:color="CBCBCB"/>
+            </w:tcBorders>
+          </w:tcPr>
+          <w:p>
+            <w:r>
+              <w:rPr>
+                <w:sz w:val="20"/>
+              </w:rPr>
+              <w:t xml:space="preserve">(1) Backup dconf phải ghi RA NGOÀI thư mục db (VD </w:t>
+            </w:r>
+            <w:r>
+              <w:rPr>
+                <w:rFonts w:ascii="Courier New" w:hAnsi="Courier New"/>
+                <w:color w:val="F05922"/>
+                <w:sz w:val="20"/>
+              </w:rPr>
+              <w:t>/etc/dconf/kiosk-backups/</w:t>
+            </w:r>
+            <w:r>
+              <w:rPr>
+                <w:sz w:val="20"/>
+              </w:rPr>
+              <w:t xml:space="preserve"> hoặc </w:t>
+            </w:r>
+            <w:r>
+              <w:rPr>
+                <w:rFonts w:ascii="Courier New" w:hAnsi="Courier New"/>
+                <w:color w:val="F05922"/>
+                <w:sz w:val="20"/>
+              </w:rPr>
+              <w:t>/var/backups/</w:t>
+            </w:r>
+            <w:r>
+              <w:rPr>
+                <w:sz w:val="20"/>
+              </w:rPr>
+              <w:t xml:space="preserve">), KHÔNG để trong </w:t>
+            </w:r>
+            <w:r>
+              <w:rPr>
+                <w:rFonts w:ascii="Courier New" w:hAnsi="Courier New"/>
+                <w:color w:val="F05922"/>
+                <w:sz w:val="20"/>
+              </w:rPr>
+              <w:t>local.d/</w:t>
+            </w:r>
+            <w:r>
+              <w:rPr>
+                <w:sz w:val="20"/>
+              </w:rPr>
+              <w:t>/</w:t>
+            </w:r>
+            <w:r>
+              <w:rPr>
+                <w:rFonts w:ascii="Courier New" w:hAnsi="Courier New"/>
+                <w:color w:val="F05922"/>
+                <w:sz w:val="20"/>
+              </w:rPr>
+              <w:t>locks/</w:t>
+            </w:r>
+            <w:r>
+              <w:rPr>
+                <w:sz w:val="20"/>
+              </w:rPr>
+              <w:t xml:space="preserve">. (2) Lệnh gỡ khoá bảo trì mà script in ra phải xoá cả các </w:t>
+            </w:r>
+            <w:r>
+              <w:rPr>
+                <w:rFonts w:ascii="Courier New" w:hAnsi="Courier New"/>
+                <w:color w:val="F05922"/>
+                <w:sz w:val="20"/>
+              </w:rPr>
+              <w:t>.bak</w:t>
+            </w:r>
+            <w:r>
+              <w:rPr>
+                <w:sz w:val="20"/>
+              </w:rPr>
+              <w:t xml:space="preserve"> còn sót (hoặc backup không nằm trong db thì không cần). (3) Không tích luỹ file rác trong thư mục dconf db.</w:t>
+            </w:r>
+          </w:p>
+        </w:tc>
+      </w:tr>
+      <w:tr>
+        <w:tc>
+          <w:tcPr>
+            <w:tcW w:type="dxa" w:w="4844"/>
+            <w:tcBorders>
+              <w:top w:val="single" w:sz="4" w:space="0" w:color="CBCBCB"/>
+              <w:left w:val="single" w:sz="4" w:space="0" w:color="CBCBCB"/>
+              <w:bottom w:val="single" w:sz="4" w:space="0" w:color="CBCBCB"/>
+              <w:right w:val="single" w:sz="4" w:space="0" w:color="CBCBCB"/>
+            </w:tcBorders>
+          </w:tcPr>
+          <w:p>
+            <w:r>
+              <w:rPr>
+                <w:b/>
+                <w:sz w:val="20"/>
+              </w:rPr>
+              <w:t>Ảnh hưởng phụ</w:t>
+            </w:r>
+          </w:p>
+        </w:tc>
+        <w:tc>
+          <w:tcPr>
+            <w:tcW w:type="dxa" w:w="4844"/>
+            <w:tcBorders>
+              <w:top w:val="single" w:sz="4" w:space="0" w:color="CBCBCB"/>
+              <w:left w:val="single" w:sz="4" w:space="0" w:color="CBCBCB"/>
+              <w:bottom w:val="single" w:sz="4" w:space="0" w:color="CBCBCB"/>
+              <w:right w:val="single" w:sz="4" w:space="0" w:color="CBCBCB"/>
+            </w:tcBorders>
+          </w:tcPr>
+          <w:p>
+            <w:r>
+              <w:rPr>
+                <w:sz w:val="20"/>
+              </w:rPr>
+              <w:t xml:space="preserve">Vì backup byte-đúng nên hiện tại lockdown vẫn hoạt động ĐÚNG (fail an toàn về phía "vẫn khoá") — KHÔNG hạ bảo mật. Rủi ro thực: (a) đường bảo trì gỡ khoá bị hỏng khiến kỹ thuật viên tưởng máy lỗi; (b) nếu tương lai một lần deploy GỠ BỚT 1 key khỏi lockdown, các </w:t>
+            </w:r>
+            <w:r>
+              <w:rPr>
+                <w:rFonts w:ascii="Courier New" w:hAnsi="Courier New"/>
+                <w:color w:val="F05922"/>
+                <w:sz w:val="20"/>
+              </w:rPr>
+              <w:t>.bak</w:t>
+            </w:r>
+            <w:r>
+              <w:rPr>
+                <w:sz w:val="20"/>
+              </w:rPr>
+              <w:t xml:space="preserve"> cũ vẫn chứa key đó → key bị "gỡ" vẫn bị khoá âm thầm qua backup cũ (khó chẩn đoán).</w:t>
+            </w:r>
+          </w:p>
+        </w:tc>
+      </w:tr>
+      <w:tr>
+        <w:tc>
+          <w:tcPr>
+            <w:tcW w:type="dxa" w:w="4844"/>
+            <w:shd w:val="clear" w:color="auto" w:fill="B8B3D6"/>
+            <w:tcBorders>
+              <w:top w:val="single" w:sz="4" w:space="0" w:color="CBCBCB"/>
+              <w:left w:val="single" w:sz="4" w:space="0" w:color="CBCBCB"/>
+              <w:bottom w:val="single" w:sz="4" w:space="0" w:color="CBCBCB"/>
+              <w:right w:val="single" w:sz="4" w:space="0" w:color="CBCBCB"/>
+            </w:tcBorders>
+          </w:tcPr>
+          <w:p>
+            <w:r>
+              <w:rPr>
+                <w:b/>
+                <w:sz w:val="20"/>
+              </w:rPr>
+              <w:t>Đề xuất cho Senior Developer</w:t>
+            </w:r>
+          </w:p>
+        </w:tc>
+        <w:tc>
+          <w:tcPr>
+            <w:tcW w:type="dxa" w:w="4844"/>
+            <w:shd w:val="clear" w:color="auto" w:fill="B8B3D6"/>
+            <w:tcBorders>
+              <w:top w:val="single" w:sz="4" w:space="0" w:color="CBCBCB"/>
+              <w:left w:val="single" w:sz="4" w:space="0" w:color="CBCBCB"/>
+              <w:bottom w:val="single" w:sz="4" w:space="0" w:color="CBCBCB"/>
+              <w:right w:val="single" w:sz="4" w:space="0" w:color="CBCBCB"/>
+            </w:tcBorders>
+          </w:tcPr>
+          <w:p>
+            <w:r>
+              <w:rPr>
+                <w:sz w:val="20"/>
+              </w:rPr>
+              <w:t xml:space="preserve">Đổi </w:t>
+            </w:r>
+            <w:r>
+              <w:rPr>
+                <w:rFonts w:ascii="Courier New" w:hAnsi="Courier New"/>
+                <w:color w:val="F05922"/>
+                <w:sz w:val="20"/>
+              </w:rPr>
+              <w:t>BAK_SUFFIX</w:t>
+            </w:r>
+            <w:r>
+              <w:rPr>
+                <w:sz w:val="20"/>
+              </w:rPr>
+              <w:t xml:space="preserve">/đường dẫn backup của mục [9/9] (dòng 362, 500-502, 526-527) sang thư mục NGOÀI </w:t>
+            </w:r>
+            <w:r>
+              <w:rPr>
+                <w:rFonts w:ascii="Courier New" w:hAnsi="Courier New"/>
+                <w:color w:val="F05922"/>
+                <w:sz w:val="20"/>
+              </w:rPr>
+              <w:t>/etc/dconf/db/local.d/</w:t>
+            </w:r>
+            <w:r>
+              <w:rPr>
+                <w:sz w:val="20"/>
+              </w:rPr>
+              <w:t xml:space="preserve">; hoặc dùng đuôi mà dconf bỏ qua thì vẫn KHÔNG an toàn (dconf đọc mọi file) → bắt buộc chuyển ra ngoài thư mục. Cập nhật câu lệnh gỡ khoá bảo trì tương ứng. Dọn các </w:t>
+            </w:r>
+            <w:r>
+              <w:rPr>
+                <w:rFonts w:ascii="Courier New" w:hAnsi="Courier New"/>
+                <w:color w:val="F05922"/>
+                <w:sz w:val="20"/>
+              </w:rPr>
+              <w:t>.bak</w:t>
+            </w:r>
+            <w:r>
+              <w:rPr>
+                <w:sz w:val="20"/>
+              </w:rPr>
+              <w:t xml:space="preserve"> đang tồn trong db trên máy đã deploy.</w:t>
+            </w:r>
+          </w:p>
+        </w:tc>
+      </w:tr>
+    </w:tbl>
+    <w:p/>
+    <w:tbl>
+      <w:tblPr>
+        <w:tblStyle w:val="TableGrid"/>
+        <w:tblW w:type="auto" w:w="0"/>
+        <w:tblLook w:firstColumn="1" w:firstRow="1" w:lastColumn="0" w:lastRow="0" w:noHBand="0" w:noVBand="1" w:val="04A0"/>
+      </w:tblPr>
+      <w:tblGrid>
+        <w:gridCol w:w="3230"/>
+        <w:gridCol w:w="3230"/>
+        <w:gridCol w:w="3230"/>
+      </w:tblGrid>
+      <w:tr>
+        <w:tc>
+          <w:tcPr>
+            <w:tcW w:type="dxa" w:w="3230"/>
+            <w:shd w:val="clear" w:color="auto" w:fill="251C53"/>
+            <w:tcBorders>
+              <w:top w:val="single" w:sz="4" w:space="0" w:color="251C53"/>
+              <w:left w:val="single" w:sz="4" w:space="0" w:color="251C53"/>
+              <w:bottom w:val="single" w:sz="4" w:space="0" w:color="251C53"/>
+              <w:right w:val="single" w:sz="4" w:space="0" w:color="251C53"/>
+            </w:tcBorders>
+          </w:tcPr>
+          <w:p>
+            <w:r>
+              <w:rPr>
+                <w:b/>
+                <w:color w:val="FFFFFF"/>
+                <w:sz w:val="20"/>
+              </w:rPr>
+              <w:t>Finding</w:t>
+            </w:r>
+          </w:p>
+        </w:tc>
+        <w:tc>
+          <w:tcPr>
+            <w:tcW w:type="dxa" w:w="3230"/>
+            <w:shd w:val="clear" w:color="auto" w:fill="251C53"/>
+            <w:tcBorders>
+              <w:top w:val="single" w:sz="4" w:space="0" w:color="251C53"/>
+              <w:left w:val="single" w:sz="4" w:space="0" w:color="251C53"/>
+              <w:bottom w:val="single" w:sz="4" w:space="0" w:color="251C53"/>
+              <w:right w:val="single" w:sz="4" w:space="0" w:color="251C53"/>
+            </w:tcBorders>
+          </w:tcPr>
+          <w:p>
+            <w:r>
+              <w:rPr>
+                <w:b/>
+                <w:color w:val="FFFFFF"/>
+                <w:sz w:val="20"/>
+              </w:rPr>
+              <w:t>Trạng thái</w:t>
+            </w:r>
+          </w:p>
+        </w:tc>
+        <w:tc>
+          <w:tcPr>
+            <w:tcW w:type="dxa" w:w="3230"/>
+            <w:shd w:val="clear" w:color="auto" w:fill="251C53"/>
+            <w:tcBorders>
+              <w:top w:val="single" w:sz="4" w:space="0" w:color="251C53"/>
+              <w:left w:val="single" w:sz="4" w:space="0" w:color="251C53"/>
+              <w:bottom w:val="single" w:sz="4" w:space="0" w:color="251C53"/>
+              <w:right w:val="single" w:sz="4" w:space="0" w:color="251C53"/>
+            </w:tcBorders>
+          </w:tcPr>
+          <w:p>
+            <w:r>
+              <w:rPr>
+                <w:b/>
+                <w:color w:val="FFFFFF"/>
+                <w:sz w:val="20"/>
+              </w:rPr>
+              <w:t>File chính cần sửa</w:t>
+            </w:r>
+          </w:p>
+        </w:tc>
+      </w:tr>
+      <w:tr>
+        <w:tc>
+          <w:tcPr>
+            <w:tcW w:type="dxa" w:w="3230"/>
+            <w:tcBorders>
+              <w:top w:val="single" w:sz="4" w:space="0" w:color="CBCBCB"/>
+              <w:left w:val="single" w:sz="4" w:space="0" w:color="CBCBCB"/>
+              <w:bottom w:val="single" w:sz="4" w:space="0" w:color="CBCBCB"/>
+              <w:right w:val="single" w:sz="4" w:space="0" w:color="CBCBCB"/>
+            </w:tcBorders>
+          </w:tcPr>
+          <w:p>
+            <w:r>
+              <w:rPr>
+                <w:sz w:val="20"/>
+              </w:rPr>
+              <w:t>---</w:t>
+            </w:r>
+          </w:p>
+        </w:tc>
+        <w:tc>
+          <w:tcPr>
+            <w:tcW w:type="dxa" w:w="3230"/>
+            <w:tcBorders>
+              <w:top w:val="single" w:sz="4" w:space="0" w:color="CBCBCB"/>
+              <w:left w:val="single" w:sz="4" w:space="0" w:color="CBCBCB"/>
+              <w:bottom w:val="single" w:sz="4" w:space="0" w:color="CBCBCB"/>
+              <w:right w:val="single" w:sz="4" w:space="0" w:color="CBCBCB"/>
+            </w:tcBorders>
+          </w:tcPr>
+          <w:p>
+            <w:r>
+              <w:rPr>
+                <w:sz w:val="20"/>
+              </w:rPr>
+              <w:t>---</w:t>
+            </w:r>
+          </w:p>
+        </w:tc>
+        <w:tc>
+          <w:tcPr>
+            <w:tcW w:type="dxa" w:w="3230"/>
+            <w:tcBorders>
+              <w:top w:val="single" w:sz="4" w:space="0" w:color="CBCBCB"/>
+              <w:left w:val="single" w:sz="4" w:space="0" w:color="CBCBCB"/>
+              <w:bottom w:val="single" w:sz="4" w:space="0" w:color="CBCBCB"/>
+              <w:right w:val="single" w:sz="4" w:space="0" w:color="CBCBCB"/>
+            </w:tcBorders>
+          </w:tcPr>
+          <w:p>
+            <w:r>
+              <w:rPr>
+                <w:sz w:val="20"/>
+              </w:rPr>
+              <w:t>---</w:t>
+            </w:r>
+          </w:p>
+        </w:tc>
+      </w:tr>
+      <w:tr>
+        <w:tc>
+          <w:tcPr>
+            <w:tcW w:type="dxa" w:w="3230"/>
+            <w:shd w:val="clear" w:color="auto" w:fill="B8B3D6"/>
+            <w:tcBorders>
+              <w:top w:val="single" w:sz="4" w:space="0" w:color="CBCBCB"/>
+              <w:left w:val="single" w:sz="4" w:space="0" w:color="CBCBCB"/>
+              <w:bottom w:val="single" w:sz="4" w:space="0" w:color="CBCBCB"/>
+              <w:right w:val="single" w:sz="4" w:space="0" w:color="CBCBCB"/>
+            </w:tcBorders>
+          </w:tcPr>
+          <w:p>
+            <w:r>
+              <w:rPr>
+                <w:sz w:val="20"/>
+              </w:rPr>
+              <w:t>F11 Backup dconf trong thư mục db → gỡ khoá bảo trì không hiệu lực</w:t>
+            </w:r>
+          </w:p>
+        </w:tc>
+        <w:tc>
+          <w:tcPr>
+            <w:tcW w:type="dxa" w:w="3230"/>
+            <w:shd w:val="clear" w:color="auto" w:fill="B8B3D6"/>
+            <w:tcBorders>
+              <w:top w:val="single" w:sz="4" w:space="0" w:color="CBCBCB"/>
+              <w:left w:val="single" w:sz="4" w:space="0" w:color="CBCBCB"/>
+              <w:bottom w:val="single" w:sz="4" w:space="0" w:color="CBCBCB"/>
+              <w:right w:val="single" w:sz="4" w:space="0" w:color="CBCBCB"/>
+            </w:tcBorders>
+          </w:tcPr>
+          <w:p>
+            <w:r>
+              <w:rPr>
+                <w:sz w:val="20"/>
+              </w:rPr>
+              <w:t>🆕 Mới phát hiện (QA verify F09/F10) — chờ Senior Developer</w:t>
+            </w:r>
+          </w:p>
+        </w:tc>
+        <w:tc>
+          <w:tcPr>
+            <w:tcW w:type="dxa" w:w="3230"/>
+            <w:shd w:val="clear" w:color="auto" w:fill="B8B3D6"/>
+            <w:tcBorders>
+              <w:top w:val="single" w:sz="4" w:space="0" w:color="CBCBCB"/>
+              <w:left w:val="single" w:sz="4" w:space="0" w:color="CBCBCB"/>
+              <w:bottom w:val="single" w:sz="4" w:space="0" w:color="CBCBCB"/>
+              <w:right w:val="single" w:sz="4" w:space="0" w:color="CBCBCB"/>
+            </w:tcBorders>
+          </w:tcPr>
+          <w:p>
+            <w:r>
+              <w:rPr>
+                <w:rFonts w:ascii="Courier New" w:hAnsi="Courier New"/>
+                <w:color w:val="F05922"/>
+                <w:sz w:val="20"/>
+              </w:rPr>
+              <w:t>scripts/linux-kiosk/2-configure-system.sh</w:t>
+            </w:r>
+            <w:r>
+              <w:rPr>
+                <w:sz w:val="20"/>
+              </w:rPr>
+              <w:t xml:space="preserve"> mục [9/9]</w:t>
+            </w:r>
+          </w:p>
+        </w:tc>
+      </w:tr>
+    </w:tbl>
+    <w:p/>
+    <w:p>
+      <w:pPr>
+        <w:pBdr>
+          <w:bottom w:val="single" w:sz="6" w:space="1" w:color="F05922"/>
+        </w:pBdr>
+        <w:spacing w:after="120"/>
+      </w:pPr>
     </w:p>
     <w:sectPr>
       <w:headerReference w:type="default" r:id="rId9"/>

</xml_diff>

<commit_message>
[bugfix-ccu-findings] Dọn sạch ZCU về trạng thái gốc để test lại Kiosk Deploy từ đầu
- Gỡ 12 hạng mục kiosk trên ZCU thật: 2 extension (disable-overview-gestures@kztek, Just Perfection), dconf lockdown + locks + profile/user, helper ipgs-kiosk-unlock, 3 autostart .desktop, autologin (khôi phục custom.conf gốc 24/07 + xoá 16 .bak), 4 gói apt (xdotool, gnome-screenshot, extension-manager, unclutter), kztek-demo, backup dirs, reset gsettings
- 4 hạng mục không tồn tại (watchdog unit, cron, state-backups...); 1 mục còn sót: key SSH demo trong authorized_keys (bị chặn permission — user tự xoá 1 lệnh)
- Giữ lại: ZcuAgent + SSH; sau reboot máy dừng ở màn hình đăng nhập đúng kỳ vọng; IP ZCU đổi 192.168.0.101 → 192.168.1.172 (mạng Wi-Fi host đổi dải)

Refs: docs/bugs/BUG-ccu-ui-findings-2026-07-26.md
Co-Authored-By: Claude Opus 5 (1M context) <noreply@anthropic.com>
</commit_message>
<xml_diff>
--- a/docs/bugs/BUG-ccu-ui-findings-2026-07-26.docx
+++ b/docs/bugs/BUG-ccu-ui-findings-2026-07-26.docx
@@ -28956,6 +28956,3588 @@
       </w:tr>
     </w:tbl>
     <w:p/>
+    <w:p>
+      <w:pPr>
+        <w:pBdr>
+          <w:bottom w:val="single" w:sz="6" w:space="1" w:color="F05922"/>
+        </w:pBdr>
+        <w:spacing w:after="120"/>
+      </w:pPr>
+    </w:p>
+    <w:p>
+      <w:pPr>
+        <w:pStyle w:val="Heading2"/>
+        <w:spacing w:before="200" w:after="80"/>
+      </w:pPr>
+      <w:r>
+        <w:rPr>
+          <w:color w:val="F05922"/>
+          <w:sz w:val="28"/>
+        </w:rPr>
+        <w:t>Dọn sạch ZCU về trạng thái gốc — 2026-07-27 07:01</w:t>
+      </w:r>
+    </w:p>
+    <w:p>
+      <w:pPr>
+        <w:spacing w:after="80"/>
+      </w:pPr>
+      <w:r>
+        <w:rPr>
+          <w:b/>
+          <w:sz w:val="21"/>
+        </w:rPr>
+        <w:t>Người thực hiện:</w:t>
+      </w:r>
+      <w:r>
+        <w:rPr>
+          <w:sz w:val="21"/>
+        </w:rPr>
+        <w:t xml:space="preserve"> DevOps Engineer — theo quyết định user: dọn SẠCH HOÀN TOÀN mọi dấu vết kiosk (KỂ CẢ autologin) để test lại luồng Kiosk Deploy từ đầu; chấp nhận sau reboot máy dừng ở màn hình đăng nhập.</w:t>
+      </w:r>
+    </w:p>
+    <w:p>
+      <w:pPr>
+        <w:spacing w:after="80"/>
+      </w:pPr>
+      <w:r>
+        <w:rPr>
+          <w:b/>
+          <w:sz w:val="21"/>
+        </w:rPr>
+        <w:t>Môi trường:</w:t>
+      </w:r>
+      <w:r>
+        <w:rPr>
+          <w:sz w:val="21"/>
+        </w:rPr>
+        <w:t xml:space="preserve"> ZCU thật — VM VirtualBox </w:t>
+      </w:r>
+      <w:r>
+        <w:rPr>
+          <w:rFonts w:ascii="Courier New" w:hAnsi="Courier New"/>
+          <w:color w:val="F05922"/>
+          <w:sz w:val="18"/>
+        </w:rPr>
+        <w:t>ubuntu-22.06-x64</w:t>
+      </w:r>
+      <w:r>
+        <w:rPr>
+          <w:sz w:val="21"/>
+        </w:rPr>
+        <w:t xml:space="preserve">. ⚠️ </w:t>
+      </w:r>
+      <w:r>
+        <w:rPr>
+          <w:b/>
+          <w:sz w:val="21"/>
+        </w:rPr>
+        <w:t>IP ĐỔI: `192.168.0.101` → `192.168.1.172`</w:t>
+      </w:r>
+      <w:r>
+        <w:rPr>
+          <w:sz w:val="21"/>
+        </w:rPr>
+        <w:t xml:space="preserve"> (VM bridge qua Wi-Fi, mạng Wi-Fi của host đổi sang dải </w:t>
+      </w:r>
+      <w:r>
+        <w:rPr>
+          <w:rFonts w:ascii="Courier New" w:hAnsi="Courier New"/>
+          <w:color w:val="F05922"/>
+          <w:sz w:val="18"/>
+        </w:rPr>
+        <w:t>192.168.1.x</w:t>
+      </w:r>
+      <w:r>
+        <w:rPr>
+          <w:sz w:val="21"/>
+        </w:rPr>
+        <w:t xml:space="preserve"> — xác nhận qua </w:t>
+      </w:r>
+      <w:r>
+        <w:rPr>
+          <w:rFonts w:ascii="Courier New" w:hAnsi="Courier New"/>
+          <w:color w:val="F05922"/>
+          <w:sz w:val="18"/>
+        </w:rPr>
+        <w:t>VBoxManage guestproperty</w:t>
+      </w:r>
+      <w:r>
+        <w:rPr>
+          <w:sz w:val="21"/>
+        </w:rPr>
+        <w:t>). Mọi thao tác qua SSH; KHÔNG sửa code/script trong repo.</w:t>
+      </w:r>
+    </w:p>
+    <w:p>
+      <w:pPr>
+        <w:pStyle w:val="Heading3"/>
+        <w:spacing w:before="160" w:after="60"/>
+      </w:pPr>
+      <w:r>
+        <w:rPr>
+          <w:color w:val="4A3F8C"/>
+          <w:sz w:val="24"/>
+        </w:rPr>
+        <w:t>Bảng inventory — hạng mục → kết quả → bằng chứng xác minh (sau reboot 06:57)</w:t>
+      </w:r>
+    </w:p>
+    <w:tbl>
+      <w:tblPr>
+        <w:tblStyle w:val="TableGrid"/>
+        <w:tblW w:type="auto" w:w="0"/>
+        <w:tblLook w:firstColumn="1" w:firstRow="1" w:lastColumn="0" w:lastRow="0" w:noHBand="0" w:noVBand="1" w:val="04A0"/>
+      </w:tblPr>
+      <w:tblGrid>
+        <w:gridCol w:w="1938"/>
+        <w:gridCol w:w="1938"/>
+        <w:gridCol w:w="1938"/>
+        <w:gridCol w:w="1938"/>
+        <w:gridCol w:w="1938"/>
+      </w:tblGrid>
+      <w:tr>
+        <w:tc>
+          <w:tcPr>
+            <w:tcW w:type="dxa" w:w="1938"/>
+            <w:shd w:val="clear" w:color="auto" w:fill="251C53"/>
+            <w:tcBorders>
+              <w:top w:val="single" w:sz="4" w:space="0" w:color="251C53"/>
+              <w:left w:val="single" w:sz="4" w:space="0" w:color="251C53"/>
+              <w:bottom w:val="single" w:sz="4" w:space="0" w:color="251C53"/>
+              <w:right w:val="single" w:sz="4" w:space="0" w:color="251C53"/>
+            </w:tcBorders>
+          </w:tcPr>
+          <w:p>
+            <w:r>
+              <w:rPr>
+                <w:b/>
+                <w:color w:val="FFFFFF"/>
+                <w:sz w:val="20"/>
+              </w:rPr>
+              <w:t>#</w:t>
+            </w:r>
+          </w:p>
+        </w:tc>
+        <w:tc>
+          <w:tcPr>
+            <w:tcW w:type="dxa" w:w="1938"/>
+            <w:shd w:val="clear" w:color="auto" w:fill="251C53"/>
+            <w:tcBorders>
+              <w:top w:val="single" w:sz="4" w:space="0" w:color="251C53"/>
+              <w:left w:val="single" w:sz="4" w:space="0" w:color="251C53"/>
+              <w:bottom w:val="single" w:sz="4" w:space="0" w:color="251C53"/>
+              <w:right w:val="single" w:sz="4" w:space="0" w:color="251C53"/>
+            </w:tcBorders>
+          </w:tcPr>
+          <w:p>
+            <w:r>
+              <w:rPr>
+                <w:b/>
+                <w:color w:val="FFFFFF"/>
+                <w:sz w:val="20"/>
+              </w:rPr>
+              <w:t>Hạng mục</w:t>
+            </w:r>
+          </w:p>
+        </w:tc>
+        <w:tc>
+          <w:tcPr>
+            <w:tcW w:type="dxa" w:w="1938"/>
+            <w:shd w:val="clear" w:color="auto" w:fill="251C53"/>
+            <w:tcBorders>
+              <w:top w:val="single" w:sz="4" w:space="0" w:color="251C53"/>
+              <w:left w:val="single" w:sz="4" w:space="0" w:color="251C53"/>
+              <w:bottom w:val="single" w:sz="4" w:space="0" w:color="251C53"/>
+              <w:right w:val="single" w:sz="4" w:space="0" w:color="251C53"/>
+            </w:tcBorders>
+          </w:tcPr>
+          <w:p>
+            <w:r>
+              <w:rPr>
+                <w:b/>
+                <w:color w:val="FFFFFF"/>
+                <w:sz w:val="20"/>
+              </w:rPr>
+              <w:t>Kết quả</w:t>
+            </w:r>
+          </w:p>
+        </w:tc>
+        <w:tc>
+          <w:tcPr>
+            <w:tcW w:type="dxa" w:w="1938"/>
+            <w:shd w:val="clear" w:color="auto" w:fill="251C53"/>
+            <w:tcBorders>
+              <w:top w:val="single" w:sz="4" w:space="0" w:color="251C53"/>
+              <w:left w:val="single" w:sz="4" w:space="0" w:color="251C53"/>
+              <w:bottom w:val="single" w:sz="4" w:space="0" w:color="251C53"/>
+              <w:right w:val="single" w:sz="4" w:space="0" w:color="251C53"/>
+            </w:tcBorders>
+          </w:tcPr>
+          <w:p>
+            <w:r>
+              <w:rPr>
+                <w:b/>
+                <w:color w:val="FFFFFF"/>
+                <w:sz w:val="20"/>
+              </w:rPr>
+              <w:t>Bằng chứng xác minh</w:t>
+            </w:r>
+          </w:p>
+        </w:tc>
+        <w:tc>
+          <w:tcPr>
+            <w:tcW w:type="dxa" w:w="1938"/>
+            <w:shd w:val="clear" w:color="auto" w:fill="251C53"/>
+            <w:tcBorders>
+              <w:top w:val="single" w:sz="4" w:space="0" w:color="251C53"/>
+              <w:left w:val="single" w:sz="4" w:space="0" w:color="251C53"/>
+              <w:bottom w:val="single" w:sz="4" w:space="0" w:color="251C53"/>
+              <w:right w:val="single" w:sz="4" w:space="0" w:color="251C53"/>
+            </w:tcBorders>
+          </w:tcPr>
+          <w:p>
+            <w:r>
+              <w:rPr>
+                <w:b/>
+                <w:color w:val="FFFFFF"/>
+                <w:sz w:val="20"/>
+              </w:rPr>
+            </w:r>
+          </w:p>
+        </w:tc>
+      </w:tr>
+      <w:tr>
+        <w:tc>
+          <w:tcPr>
+            <w:tcW w:type="dxa" w:w="1938"/>
+            <w:tcBorders>
+              <w:top w:val="single" w:sz="4" w:space="0" w:color="CBCBCB"/>
+              <w:left w:val="single" w:sz="4" w:space="0" w:color="CBCBCB"/>
+              <w:bottom w:val="single" w:sz="4" w:space="0" w:color="CBCBCB"/>
+              <w:right w:val="single" w:sz="4" w:space="0" w:color="CBCBCB"/>
+            </w:tcBorders>
+          </w:tcPr>
+          <w:p>
+            <w:r>
+              <w:rPr>
+                <w:sz w:val="20"/>
+              </w:rPr>
+              <w:t>---</w:t>
+            </w:r>
+          </w:p>
+        </w:tc>
+        <w:tc>
+          <w:tcPr>
+            <w:tcW w:type="dxa" w:w="1938"/>
+            <w:tcBorders>
+              <w:top w:val="single" w:sz="4" w:space="0" w:color="CBCBCB"/>
+              <w:left w:val="single" w:sz="4" w:space="0" w:color="CBCBCB"/>
+              <w:bottom w:val="single" w:sz="4" w:space="0" w:color="CBCBCB"/>
+              <w:right w:val="single" w:sz="4" w:space="0" w:color="CBCBCB"/>
+            </w:tcBorders>
+          </w:tcPr>
+          <w:p>
+            <w:r>
+              <w:rPr>
+                <w:sz w:val="20"/>
+              </w:rPr>
+              <w:t>---</w:t>
+            </w:r>
+          </w:p>
+        </w:tc>
+        <w:tc>
+          <w:tcPr>
+            <w:tcW w:type="dxa" w:w="1938"/>
+            <w:tcBorders>
+              <w:top w:val="single" w:sz="4" w:space="0" w:color="CBCBCB"/>
+              <w:left w:val="single" w:sz="4" w:space="0" w:color="CBCBCB"/>
+              <w:bottom w:val="single" w:sz="4" w:space="0" w:color="CBCBCB"/>
+              <w:right w:val="single" w:sz="4" w:space="0" w:color="CBCBCB"/>
+            </w:tcBorders>
+          </w:tcPr>
+          <w:p>
+            <w:r>
+              <w:rPr>
+                <w:sz w:val="20"/>
+              </w:rPr>
+              <w:t>---</w:t>
+            </w:r>
+          </w:p>
+        </w:tc>
+        <w:tc>
+          <w:tcPr>
+            <w:tcW w:type="dxa" w:w="1938"/>
+            <w:tcBorders>
+              <w:top w:val="single" w:sz="4" w:space="0" w:color="CBCBCB"/>
+              <w:left w:val="single" w:sz="4" w:space="0" w:color="CBCBCB"/>
+              <w:bottom w:val="single" w:sz="4" w:space="0" w:color="CBCBCB"/>
+              <w:right w:val="single" w:sz="4" w:space="0" w:color="CBCBCB"/>
+            </w:tcBorders>
+          </w:tcPr>
+          <w:p>
+            <w:r>
+              <w:rPr>
+                <w:sz w:val="20"/>
+              </w:rPr>
+              <w:t>---</w:t>
+            </w:r>
+          </w:p>
+        </w:tc>
+        <w:tc>
+          <w:tcPr>
+            <w:tcW w:type="dxa" w:w="1938"/>
+            <w:tcBorders>
+              <w:top w:val="single" w:sz="4" w:space="0" w:color="CBCBCB"/>
+              <w:left w:val="single" w:sz="4" w:space="0" w:color="CBCBCB"/>
+              <w:bottom w:val="single" w:sz="4" w:space="0" w:color="CBCBCB"/>
+              <w:right w:val="single" w:sz="4" w:space="0" w:color="CBCBCB"/>
+            </w:tcBorders>
+          </w:tcPr>
+          <w:p/>
+        </w:tc>
+      </w:tr>
+      <w:tr>
+        <w:tc>
+          <w:tcPr>
+            <w:tcW w:type="dxa" w:w="1938"/>
+            <w:shd w:val="clear" w:color="auto" w:fill="B8B3D6"/>
+            <w:tcBorders>
+              <w:top w:val="single" w:sz="4" w:space="0" w:color="CBCBCB"/>
+              <w:left w:val="single" w:sz="4" w:space="0" w:color="CBCBCB"/>
+              <w:bottom w:val="single" w:sz="4" w:space="0" w:color="CBCBCB"/>
+              <w:right w:val="single" w:sz="4" w:space="0" w:color="CBCBCB"/>
+            </w:tcBorders>
+          </w:tcPr>
+          <w:p>
+            <w:r>
+              <w:rPr>
+                <w:sz w:val="20"/>
+              </w:rPr>
+              <w:t>1</w:t>
+            </w:r>
+          </w:p>
+        </w:tc>
+        <w:tc>
+          <w:tcPr>
+            <w:tcW w:type="dxa" w:w="1938"/>
+            <w:shd w:val="clear" w:color="auto" w:fill="B8B3D6"/>
+            <w:tcBorders>
+              <w:top w:val="single" w:sz="4" w:space="0" w:color="CBCBCB"/>
+              <w:left w:val="single" w:sz="4" w:space="0" w:color="CBCBCB"/>
+              <w:bottom w:val="single" w:sz="4" w:space="0" w:color="CBCBCB"/>
+              <w:right w:val="single" w:sz="4" w:space="0" w:color="CBCBCB"/>
+            </w:tcBorders>
+          </w:tcPr>
+          <w:p>
+            <w:r>
+              <w:rPr>
+                <w:sz w:val="20"/>
+              </w:rPr>
+              <w:t xml:space="preserve">Extension </w:t>
+            </w:r>
+            <w:r>
+              <w:rPr>
+                <w:rFonts w:ascii="Courier New" w:hAnsi="Courier New"/>
+                <w:color w:val="F05922"/>
+                <w:sz w:val="20"/>
+              </w:rPr>
+              <w:t>disable-overview-gestures@kztek</w:t>
+            </w:r>
+            <w:r>
+              <w:rPr>
+                <w:sz w:val="20"/>
+              </w:rPr>
+              <w:t xml:space="preserve"> (F10)</w:t>
+            </w:r>
+          </w:p>
+        </w:tc>
+        <w:tc>
+          <w:tcPr>
+            <w:tcW w:type="dxa" w:w="1938"/>
+            <w:shd w:val="clear" w:color="auto" w:fill="B8B3D6"/>
+            <w:tcBorders>
+              <w:top w:val="single" w:sz="4" w:space="0" w:color="CBCBCB"/>
+              <w:left w:val="single" w:sz="4" w:space="0" w:color="CBCBCB"/>
+              <w:bottom w:val="single" w:sz="4" w:space="0" w:color="CBCBCB"/>
+              <w:right w:val="single" w:sz="4" w:space="0" w:color="CBCBCB"/>
+            </w:tcBorders>
+          </w:tcPr>
+          <w:p>
+            <w:r>
+              <w:rPr>
+                <w:sz w:val="20"/>
+              </w:rPr>
+              <w:t>✅ Đã disable + xoá thư mục</w:t>
+            </w:r>
+          </w:p>
+        </w:tc>
+        <w:tc>
+          <w:tcPr>
+            <w:tcW w:type="dxa" w:w="1938"/>
+            <w:shd w:val="clear" w:color="auto" w:fill="B8B3D6"/>
+            <w:tcBorders>
+              <w:top w:val="single" w:sz="4" w:space="0" w:color="CBCBCB"/>
+              <w:left w:val="single" w:sz="4" w:space="0" w:color="CBCBCB"/>
+              <w:bottom w:val="single" w:sz="4" w:space="0" w:color="CBCBCB"/>
+              <w:right w:val="single" w:sz="4" w:space="0" w:color="CBCBCB"/>
+            </w:tcBorders>
+          </w:tcPr>
+          <w:p>
+            <w:r>
+              <w:rPr>
+                <w:sz w:val="20"/>
+              </w:rPr>
+              <w:t>`gnome-extensions list \</w:t>
+            </w:r>
+          </w:p>
+        </w:tc>
+        <w:tc>
+          <w:tcPr>
+            <w:tcW w:type="dxa" w:w="1938"/>
+            <w:shd w:val="clear" w:color="auto" w:fill="B8B3D6"/>
+            <w:tcBorders>
+              <w:top w:val="single" w:sz="4" w:space="0" w:color="CBCBCB"/>
+              <w:left w:val="single" w:sz="4" w:space="0" w:color="CBCBCB"/>
+              <w:bottom w:val="single" w:sz="4" w:space="0" w:color="CBCBCB"/>
+              <w:right w:val="single" w:sz="4" w:space="0" w:color="CBCBCB"/>
+            </w:tcBorders>
+          </w:tcPr>
+          <w:p>
+            <w:r>
+              <w:rPr>
+                <w:sz w:val="20"/>
+              </w:rPr>
+              <w:t>grep kztek</w:t>
+            </w:r>
+            <w:r>
+              <w:rPr>
+                <w:rFonts w:ascii="Courier New" w:hAnsi="Courier New"/>
+                <w:color w:val="F05922"/>
+                <w:sz w:val="20"/>
+              </w:rPr>
+              <w:t xml:space="preserve"> → rỗng sau reboot; </w:t>
+            </w:r>
+            <w:r>
+              <w:rPr>
+                <w:sz w:val="20"/>
+              </w:rPr>
+              <w:t>~/.local/share/gnome-shell/extensions/` rỗng</w:t>
+            </w:r>
+          </w:p>
+        </w:tc>
+      </w:tr>
+      <w:tr>
+        <w:tc>
+          <w:tcPr>
+            <w:tcW w:type="dxa" w:w="1938"/>
+            <w:tcBorders>
+              <w:top w:val="single" w:sz="4" w:space="0" w:color="CBCBCB"/>
+              <w:left w:val="single" w:sz="4" w:space="0" w:color="CBCBCB"/>
+              <w:bottom w:val="single" w:sz="4" w:space="0" w:color="CBCBCB"/>
+              <w:right w:val="single" w:sz="4" w:space="0" w:color="CBCBCB"/>
+            </w:tcBorders>
+          </w:tcPr>
+          <w:p>
+            <w:r>
+              <w:rPr>
+                <w:sz w:val="20"/>
+              </w:rPr>
+              <w:t>2</w:t>
+            </w:r>
+          </w:p>
+        </w:tc>
+        <w:tc>
+          <w:tcPr>
+            <w:tcW w:type="dxa" w:w="1938"/>
+            <w:tcBorders>
+              <w:top w:val="single" w:sz="4" w:space="0" w:color="CBCBCB"/>
+              <w:left w:val="single" w:sz="4" w:space="0" w:color="CBCBCB"/>
+              <w:bottom w:val="single" w:sz="4" w:space="0" w:color="CBCBCB"/>
+              <w:right w:val="single" w:sz="4" w:space="0" w:color="CBCBCB"/>
+            </w:tcBorders>
+          </w:tcPr>
+          <w:p>
+            <w:r>
+              <w:rPr>
+                <w:sz w:val="20"/>
+              </w:rPr>
+              <w:t>Extension Just Perfection (kiosk script)</w:t>
+            </w:r>
+          </w:p>
+        </w:tc>
+        <w:tc>
+          <w:tcPr>
+            <w:tcW w:type="dxa" w:w="1938"/>
+            <w:tcBorders>
+              <w:top w:val="single" w:sz="4" w:space="0" w:color="CBCBCB"/>
+              <w:left w:val="single" w:sz="4" w:space="0" w:color="CBCBCB"/>
+              <w:bottom w:val="single" w:sz="4" w:space="0" w:color="CBCBCB"/>
+              <w:right w:val="single" w:sz="4" w:space="0" w:color="CBCBCB"/>
+            </w:tcBorders>
+          </w:tcPr>
+          <w:p>
+            <w:r>
+              <w:rPr>
+                <w:sz w:val="20"/>
+              </w:rPr>
+              <w:t>✅ Đã disable + xoá thư mục</w:t>
+            </w:r>
+          </w:p>
+        </w:tc>
+        <w:tc>
+          <w:tcPr>
+            <w:tcW w:type="dxa" w:w="1938"/>
+            <w:tcBorders>
+              <w:top w:val="single" w:sz="4" w:space="0" w:color="CBCBCB"/>
+              <w:left w:val="single" w:sz="4" w:space="0" w:color="CBCBCB"/>
+              <w:bottom w:val="single" w:sz="4" w:space="0" w:color="CBCBCB"/>
+              <w:right w:val="single" w:sz="4" w:space="0" w:color="CBCBCB"/>
+            </w:tcBorders>
+          </w:tcPr>
+          <w:p>
+            <w:r>
+              <w:rPr>
+                <w:sz w:val="20"/>
+              </w:rPr>
+              <w:t>Như trên (</w:t>
+            </w:r>
+            <w:r>
+              <w:rPr>
+                <w:rFonts w:ascii="Courier New" w:hAnsi="Courier New"/>
+                <w:color w:val="F05922"/>
+                <w:sz w:val="20"/>
+              </w:rPr>
+              <w:t>grep perfection</w:t>
+            </w:r>
+            <w:r>
+              <w:rPr>
+                <w:sz w:val="20"/>
+              </w:rPr>
+              <w:t xml:space="preserve"> → rỗng)</w:t>
+            </w:r>
+          </w:p>
+        </w:tc>
+        <w:tc>
+          <w:tcPr>
+            <w:tcW w:type="dxa" w:w="1938"/>
+            <w:tcBorders>
+              <w:top w:val="single" w:sz="4" w:space="0" w:color="CBCBCB"/>
+              <w:left w:val="single" w:sz="4" w:space="0" w:color="CBCBCB"/>
+              <w:bottom w:val="single" w:sz="4" w:space="0" w:color="CBCBCB"/>
+              <w:right w:val="single" w:sz="4" w:space="0" w:color="CBCBCB"/>
+            </w:tcBorders>
+          </w:tcPr>
+          <w:p/>
+        </w:tc>
+      </w:tr>
+      <w:tr>
+        <w:tc>
+          <w:tcPr>
+            <w:tcW w:type="dxa" w:w="1938"/>
+            <w:shd w:val="clear" w:color="auto" w:fill="B8B3D6"/>
+            <w:tcBorders>
+              <w:top w:val="single" w:sz="4" w:space="0" w:color="CBCBCB"/>
+              <w:left w:val="single" w:sz="4" w:space="0" w:color="CBCBCB"/>
+              <w:bottom w:val="single" w:sz="4" w:space="0" w:color="CBCBCB"/>
+              <w:right w:val="single" w:sz="4" w:space="0" w:color="CBCBCB"/>
+            </w:tcBorders>
+          </w:tcPr>
+          <w:p>
+            <w:r>
+              <w:rPr>
+                <w:sz w:val="20"/>
+              </w:rPr>
+              <w:t>3</w:t>
+            </w:r>
+          </w:p>
+        </w:tc>
+        <w:tc>
+          <w:tcPr>
+            <w:tcW w:type="dxa" w:w="1938"/>
+            <w:shd w:val="clear" w:color="auto" w:fill="B8B3D6"/>
+            <w:tcBorders>
+              <w:top w:val="single" w:sz="4" w:space="0" w:color="CBCBCB"/>
+              <w:left w:val="single" w:sz="4" w:space="0" w:color="CBCBCB"/>
+              <w:bottom w:val="single" w:sz="4" w:space="0" w:color="CBCBCB"/>
+              <w:right w:val="single" w:sz="4" w:space="0" w:color="CBCBCB"/>
+            </w:tcBorders>
+          </w:tcPr>
+          <w:p>
+            <w:r>
+              <w:rPr>
+                <w:sz w:val="20"/>
+              </w:rPr>
+              <w:t xml:space="preserve">dconf lockdown </w:t>
+            </w:r>
+            <w:r>
+              <w:rPr>
+                <w:rFonts w:ascii="Courier New" w:hAnsi="Courier New"/>
+                <w:color w:val="F05922"/>
+                <w:sz w:val="20"/>
+              </w:rPr>
+              <w:t>/etc/dconf/db/local.d/00-kiosk-lockdown</w:t>
+            </w:r>
+            <w:r>
+              <w:rPr>
+                <w:sz w:val="20"/>
+              </w:rPr>
+              <w:t xml:space="preserve"> + </w:t>
+            </w:r>
+            <w:r>
+              <w:rPr>
+                <w:rFonts w:ascii="Courier New" w:hAnsi="Courier New"/>
+                <w:color w:val="F05922"/>
+                <w:sz w:val="20"/>
+              </w:rPr>
+              <w:t>locks/</w:t>
+            </w:r>
+            <w:r>
+              <w:rPr>
+                <w:sz w:val="20"/>
+              </w:rPr>
+              <w:t xml:space="preserve"> + </w:t>
+            </w:r>
+            <w:r>
+              <w:rPr>
+                <w:rFonts w:ascii="Courier New" w:hAnsi="Courier New"/>
+                <w:color w:val="F05922"/>
+                <w:sz w:val="20"/>
+              </w:rPr>
+              <w:t>/etc/dconf/profile/user</w:t>
+            </w:r>
+            <w:r>
+              <w:rPr>
+                <w:sz w:val="20"/>
+              </w:rPr>
+              <w:t xml:space="preserve"> (F09/F11)</w:t>
+            </w:r>
+          </w:p>
+        </w:tc>
+        <w:tc>
+          <w:tcPr>
+            <w:tcW w:type="dxa" w:w="1938"/>
+            <w:shd w:val="clear" w:color="auto" w:fill="B8B3D6"/>
+            <w:tcBorders>
+              <w:top w:val="single" w:sz="4" w:space="0" w:color="CBCBCB"/>
+              <w:left w:val="single" w:sz="4" w:space="0" w:color="CBCBCB"/>
+              <w:bottom w:val="single" w:sz="4" w:space="0" w:color="CBCBCB"/>
+              <w:right w:val="single" w:sz="4" w:space="0" w:color="CBCBCB"/>
+            </w:tcBorders>
+          </w:tcPr>
+          <w:p>
+            <w:r>
+              <w:rPr>
+                <w:sz w:val="20"/>
+              </w:rPr>
+              <w:t xml:space="preserve">✅ Đã xoá + </w:t>
+            </w:r>
+            <w:r>
+              <w:rPr>
+                <w:rFonts w:ascii="Courier New" w:hAnsi="Courier New"/>
+                <w:color w:val="F05922"/>
+                <w:sz w:val="20"/>
+              </w:rPr>
+              <w:t>dconf update</w:t>
+            </w:r>
+          </w:p>
+        </w:tc>
+        <w:tc>
+          <w:tcPr>
+            <w:tcW w:type="dxa" w:w="1938"/>
+            <w:shd w:val="clear" w:color="auto" w:fill="B8B3D6"/>
+            <w:tcBorders>
+              <w:top w:val="single" w:sz="4" w:space="0" w:color="CBCBCB"/>
+              <w:left w:val="single" w:sz="4" w:space="0" w:color="CBCBCB"/>
+              <w:bottom w:val="single" w:sz="4" w:space="0" w:color="CBCBCB"/>
+              <w:right w:val="single" w:sz="4" w:space="0" w:color="CBCBCB"/>
+            </w:tcBorders>
+          </w:tcPr>
+          <w:p>
+            <w:r>
+              <w:rPr>
+                <w:rFonts w:ascii="Courier New" w:hAnsi="Courier New"/>
+                <w:color w:val="F05922"/>
+                <w:sz w:val="20"/>
+              </w:rPr>
+              <w:t>ls /etc/dconf/db/local.d/</w:t>
+            </w:r>
+            <w:r>
+              <w:rPr>
+                <w:sz w:val="20"/>
+              </w:rPr>
+              <w:t xml:space="preserve"> → "No such file or directory" (xoá cả thư mục — do ta tạo); </w:t>
+            </w:r>
+            <w:r>
+              <w:rPr>
+                <w:rFonts w:ascii="Courier New" w:hAnsi="Courier New"/>
+                <w:color w:val="F05922"/>
+                <w:sz w:val="20"/>
+              </w:rPr>
+              <w:t>/etc/dconf/profile/</w:t>
+            </w:r>
+            <w:r>
+              <w:rPr>
+                <w:sz w:val="20"/>
+              </w:rPr>
+              <w:t xml:space="preserve"> chỉ còn </w:t>
+            </w:r>
+            <w:r>
+              <w:rPr>
+                <w:rFonts w:ascii="Courier New" w:hAnsi="Courier New"/>
+                <w:color w:val="F05922"/>
+                <w:sz w:val="20"/>
+              </w:rPr>
+              <w:t>ibus</w:t>
+            </w:r>
+            <w:r>
+              <w:rPr>
+                <w:sz w:val="20"/>
+              </w:rPr>
+              <w:t xml:space="preserve"> gốc; </w:t>
+            </w:r>
+            <w:r>
+              <w:rPr>
+                <w:rFonts w:ascii="Courier New" w:hAnsi="Courier New"/>
+                <w:color w:val="F05922"/>
+                <w:sz w:val="20"/>
+              </w:rPr>
+              <w:t>dconf read /org/gnome/mutter/overlay-key</w:t>
+            </w:r>
+            <w:r>
+              <w:rPr>
+                <w:sz w:val="20"/>
+              </w:rPr>
+              <w:t xml:space="preserve"> → rỗng</w:t>
+            </w:r>
+          </w:p>
+        </w:tc>
+        <w:tc>
+          <w:tcPr>
+            <w:tcW w:type="dxa" w:w="1938"/>
+            <w:shd w:val="clear" w:color="auto" w:fill="B8B3D6"/>
+            <w:tcBorders>
+              <w:top w:val="single" w:sz="4" w:space="0" w:color="CBCBCB"/>
+              <w:left w:val="single" w:sz="4" w:space="0" w:color="CBCBCB"/>
+              <w:bottom w:val="single" w:sz="4" w:space="0" w:color="CBCBCB"/>
+              <w:right w:val="single" w:sz="4" w:space="0" w:color="CBCBCB"/>
+            </w:tcBorders>
+          </w:tcPr>
+          <w:p/>
+        </w:tc>
+      </w:tr>
+      <w:tr>
+        <w:tc>
+          <w:tcPr>
+            <w:tcW w:type="dxa" w:w="1938"/>
+            <w:tcBorders>
+              <w:top w:val="single" w:sz="4" w:space="0" w:color="CBCBCB"/>
+              <w:left w:val="single" w:sz="4" w:space="0" w:color="CBCBCB"/>
+              <w:bottom w:val="single" w:sz="4" w:space="0" w:color="CBCBCB"/>
+              <w:right w:val="single" w:sz="4" w:space="0" w:color="CBCBCB"/>
+            </w:tcBorders>
+          </w:tcPr>
+          <w:p>
+            <w:r>
+              <w:rPr>
+                <w:sz w:val="20"/>
+              </w:rPr>
+              <w:t>4</w:t>
+            </w:r>
+          </w:p>
+        </w:tc>
+        <w:tc>
+          <w:tcPr>
+            <w:tcW w:type="dxa" w:w="1938"/>
+            <w:tcBorders>
+              <w:top w:val="single" w:sz="4" w:space="0" w:color="CBCBCB"/>
+              <w:left w:val="single" w:sz="4" w:space="0" w:color="CBCBCB"/>
+              <w:bottom w:val="single" w:sz="4" w:space="0" w:color="CBCBCB"/>
+              <w:right w:val="single" w:sz="4" w:space="0" w:color="CBCBCB"/>
+            </w:tcBorders>
+          </w:tcPr>
+          <w:p>
+            <w:r>
+              <w:rPr>
+                <w:sz w:val="20"/>
+              </w:rPr>
+              <w:t>Lock đã nhả</w:t>
+            </w:r>
+          </w:p>
+        </w:tc>
+        <w:tc>
+          <w:tcPr>
+            <w:tcW w:type="dxa" w:w="1938"/>
+            <w:tcBorders>
+              <w:top w:val="single" w:sz="4" w:space="0" w:color="CBCBCB"/>
+              <w:left w:val="single" w:sz="4" w:space="0" w:color="CBCBCB"/>
+              <w:bottom w:val="single" w:sz="4" w:space="0" w:color="CBCBCB"/>
+              <w:right w:val="single" w:sz="4" w:space="0" w:color="CBCBCB"/>
+            </w:tcBorders>
+          </w:tcPr>
+          <w:p>
+            <w:r>
+              <w:rPr>
+                <w:sz w:val="20"/>
+              </w:rPr>
+              <w:t>✅</w:t>
+            </w:r>
+          </w:p>
+        </w:tc>
+        <w:tc>
+          <w:tcPr>
+            <w:tcW w:type="dxa" w:w="1938"/>
+            <w:tcBorders>
+              <w:top w:val="single" w:sz="4" w:space="0" w:color="CBCBCB"/>
+              <w:left w:val="single" w:sz="4" w:space="0" w:color="CBCBCB"/>
+              <w:bottom w:val="single" w:sz="4" w:space="0" w:color="CBCBCB"/>
+              <w:right w:val="single" w:sz="4" w:space="0" w:color="CBCBCB"/>
+            </w:tcBorders>
+          </w:tcPr>
+          <w:p>
+            <w:r>
+              <w:rPr>
+                <w:rFonts w:ascii="Courier New" w:hAnsi="Courier New"/>
+                <w:color w:val="F05922"/>
+                <w:sz w:val="20"/>
+              </w:rPr>
+              <w:t>gsettings writable org.gnome.mutter overlay-key</w:t>
+            </w:r>
+            <w:r>
+              <w:rPr>
+                <w:sz w:val="20"/>
+              </w:rPr>
+              <w:t xml:space="preserve"> = </w:t>
+            </w:r>
+            <w:r>
+              <w:rPr>
+                <w:b/>
+                <w:sz w:val="20"/>
+              </w:rPr>
+              <w:t>`true`</w:t>
+            </w:r>
+            <w:r>
+              <w:rPr>
+                <w:sz w:val="20"/>
+              </w:rPr>
+              <w:t xml:space="preserve">; </w:t>
+            </w:r>
+            <w:r>
+              <w:rPr>
+                <w:rFonts w:ascii="Courier New" w:hAnsi="Courier New"/>
+                <w:color w:val="F05922"/>
+                <w:sz w:val="20"/>
+              </w:rPr>
+              <w:t>switch-to-application-4</w:t>
+            </w:r>
+            <w:r>
+              <w:rPr>
+                <w:sz w:val="20"/>
+              </w:rPr>
+              <w:t xml:space="preserve"> = </w:t>
+            </w:r>
+            <w:r>
+              <w:rPr>
+                <w:rFonts w:ascii="Courier New" w:hAnsi="Courier New"/>
+                <w:color w:val="F05922"/>
+                <w:sz w:val="20"/>
+              </w:rPr>
+              <w:t>true</w:t>
+            </w:r>
+            <w:r>
+              <w:rPr>
+                <w:sz w:val="20"/>
+              </w:rPr>
+              <w:t xml:space="preserve">; </w:t>
+            </w:r>
+            <w:r>
+              <w:rPr>
+                <w:rFonts w:ascii="Courier New" w:hAnsi="Courier New"/>
+                <w:color w:val="F05922"/>
+                <w:sz w:val="20"/>
+              </w:rPr>
+              <w:t>wm.keybindings/close</w:t>
+            </w:r>
+            <w:r>
+              <w:rPr>
+                <w:sz w:val="20"/>
+              </w:rPr>
+              <w:t xml:space="preserve"> = </w:t>
+            </w:r>
+            <w:r>
+              <w:rPr>
+                <w:rFonts w:ascii="Courier New" w:hAnsi="Courier New"/>
+                <w:color w:val="F05922"/>
+                <w:sz w:val="20"/>
+              </w:rPr>
+              <w:t>true</w:t>
+            </w:r>
+            <w:r>
+              <w:rPr>
+                <w:sz w:val="20"/>
+              </w:rPr>
+              <w:t xml:space="preserve">; </w:t>
+            </w:r>
+            <w:r>
+              <w:rPr>
+                <w:rFonts w:ascii="Courier New" w:hAnsi="Courier New"/>
+                <w:color w:val="F05922"/>
+                <w:sz w:val="20"/>
+              </w:rPr>
+              <w:t>lockdown/disable-command-line</w:t>
+            </w:r>
+            <w:r>
+              <w:rPr>
+                <w:sz w:val="20"/>
+              </w:rPr>
+              <w:t xml:space="preserve"> = </w:t>
+            </w:r>
+            <w:r>
+              <w:rPr>
+                <w:rFonts w:ascii="Courier New" w:hAnsi="Courier New"/>
+                <w:color w:val="F05922"/>
+                <w:sz w:val="20"/>
+              </w:rPr>
+              <w:t>true</w:t>
+            </w:r>
+          </w:p>
+        </w:tc>
+        <w:tc>
+          <w:tcPr>
+            <w:tcW w:type="dxa" w:w="1938"/>
+            <w:tcBorders>
+              <w:top w:val="single" w:sz="4" w:space="0" w:color="CBCBCB"/>
+              <w:left w:val="single" w:sz="4" w:space="0" w:color="CBCBCB"/>
+              <w:bottom w:val="single" w:sz="4" w:space="0" w:color="CBCBCB"/>
+              <w:right w:val="single" w:sz="4" w:space="0" w:color="CBCBCB"/>
+            </w:tcBorders>
+          </w:tcPr>
+          <w:p/>
+        </w:tc>
+      </w:tr>
+      <w:tr>
+        <w:tc>
+          <w:tcPr>
+            <w:tcW w:type="dxa" w:w="1938"/>
+            <w:shd w:val="clear" w:color="auto" w:fill="B8B3D6"/>
+            <w:tcBorders>
+              <w:top w:val="single" w:sz="4" w:space="0" w:color="CBCBCB"/>
+              <w:left w:val="single" w:sz="4" w:space="0" w:color="CBCBCB"/>
+              <w:bottom w:val="single" w:sz="4" w:space="0" w:color="CBCBCB"/>
+              <w:right w:val="single" w:sz="4" w:space="0" w:color="CBCBCB"/>
+            </w:tcBorders>
+          </w:tcPr>
+          <w:p>
+            <w:r>
+              <w:rPr>
+                <w:sz w:val="20"/>
+              </w:rPr>
+              <w:t>5</w:t>
+            </w:r>
+          </w:p>
+        </w:tc>
+        <w:tc>
+          <w:tcPr>
+            <w:tcW w:type="dxa" w:w="1938"/>
+            <w:shd w:val="clear" w:color="auto" w:fill="B8B3D6"/>
+            <w:tcBorders>
+              <w:top w:val="single" w:sz="4" w:space="0" w:color="CBCBCB"/>
+              <w:left w:val="single" w:sz="4" w:space="0" w:color="CBCBCB"/>
+              <w:bottom w:val="single" w:sz="4" w:space="0" w:color="CBCBCB"/>
+              <w:right w:val="single" w:sz="4" w:space="0" w:color="CBCBCB"/>
+            </w:tcBorders>
+          </w:tcPr>
+          <w:p>
+            <w:r>
+              <w:rPr>
+                <w:sz w:val="20"/>
+              </w:rPr>
+              <w:t xml:space="preserve">Autologin </w:t>
+            </w:r>
+            <w:r>
+              <w:rPr>
+                <w:rFonts w:ascii="Courier New" w:hAnsi="Courier New"/>
+                <w:color w:val="F05922"/>
+                <w:sz w:val="20"/>
+              </w:rPr>
+              <w:t>/etc/gdm3/custom.conf</w:t>
+            </w:r>
+          </w:p>
+        </w:tc>
+        <w:tc>
+          <w:tcPr>
+            <w:tcW w:type="dxa" w:w="1938"/>
+            <w:shd w:val="clear" w:color="auto" w:fill="B8B3D6"/>
+            <w:tcBorders>
+              <w:top w:val="single" w:sz="4" w:space="0" w:color="CBCBCB"/>
+              <w:left w:val="single" w:sz="4" w:space="0" w:color="CBCBCB"/>
+              <w:bottom w:val="single" w:sz="4" w:space="0" w:color="CBCBCB"/>
+              <w:right w:val="single" w:sz="4" w:space="0" w:color="CBCBCB"/>
+            </w:tcBorders>
+          </w:tcPr>
+          <w:p>
+            <w:r>
+              <w:rPr>
+                <w:sz w:val="20"/>
+              </w:rPr>
+              <w:t>✅ Khôi phục bản GỐC</w:t>
+            </w:r>
+          </w:p>
+        </w:tc>
+        <w:tc>
+          <w:tcPr>
+            <w:tcW w:type="dxa" w:w="1938"/>
+            <w:shd w:val="clear" w:color="auto" w:fill="B8B3D6"/>
+            <w:tcBorders>
+              <w:top w:val="single" w:sz="4" w:space="0" w:color="CBCBCB"/>
+              <w:left w:val="single" w:sz="4" w:space="0" w:color="CBCBCB"/>
+              <w:bottom w:val="single" w:sz="4" w:space="0" w:color="CBCBCB"/>
+              <w:right w:val="single" w:sz="4" w:space="0" w:color="CBCBCB"/>
+            </w:tcBorders>
+          </w:tcPr>
+          <w:p>
+            <w:r>
+              <w:rPr>
+                <w:sz w:val="20"/>
+              </w:rPr>
+              <w:t xml:space="preserve">Khôi phục từ </w:t>
+            </w:r>
+            <w:r>
+              <w:rPr>
+                <w:rFonts w:ascii="Courier New" w:hAnsi="Courier New"/>
+                <w:color w:val="F05922"/>
+                <w:sz w:val="20"/>
+              </w:rPr>
+              <w:t>custom.conf.bak-20260724213826</w:t>
+            </w:r>
+            <w:r>
+              <w:rPr>
+                <w:sz w:val="20"/>
+              </w:rPr>
+              <w:t xml:space="preserve"> (554B, 24/07 21:38 — bản TRƯỚC lần sửa đầu tiên; lưu ý: </w:t>
+            </w:r>
+            <w:r>
+              <w:rPr>
+                <w:rFonts w:ascii="Courier New" w:hAnsi="Courier New"/>
+                <w:color w:val="F05922"/>
+                <w:sz w:val="20"/>
+              </w:rPr>
+              <w:t>.bak-2026-07-26</w:t>
+            </w:r>
+            <w:r>
+              <w:rPr>
+                <w:sz w:val="20"/>
+              </w:rPr>
+              <w:t xml:space="preserve"> nêu trong kế hoạch VẪN chứa </w:t>
+            </w:r>
+            <w:r>
+              <w:rPr>
+                <w:rFonts w:ascii="Courier New" w:hAnsi="Courier New"/>
+                <w:color w:val="F05922"/>
+                <w:sz w:val="20"/>
+              </w:rPr>
+              <w:t>AutomaticLogin</w:t>
+            </w:r>
+            <w:r>
+              <w:rPr>
+                <w:sz w:val="20"/>
+              </w:rPr>
+              <w:t xml:space="preserve"> vì autologin đã bật từ 24/07, không dùng). `grep -cE '^(Automatic\</w:t>
+            </w:r>
+          </w:p>
+        </w:tc>
+        <w:tc>
+          <w:tcPr>
+            <w:tcW w:type="dxa" w:w="1938"/>
+            <w:shd w:val="clear" w:color="auto" w:fill="B8B3D6"/>
+            <w:tcBorders>
+              <w:top w:val="single" w:sz="4" w:space="0" w:color="CBCBCB"/>
+              <w:left w:val="single" w:sz="4" w:space="0" w:color="CBCBCB"/>
+              <w:bottom w:val="single" w:sz="4" w:space="0" w:color="CBCBCB"/>
+              <w:right w:val="single" w:sz="4" w:space="0" w:color="CBCBCB"/>
+            </w:tcBorders>
+          </w:tcPr>
+          <w:p>
+            <w:r>
+              <w:rPr>
+                <w:sz w:val="20"/>
+              </w:rPr>
+              <w:t>Timed)' custom.conf</w:t>
+            </w:r>
+            <w:r>
+              <w:rPr>
+                <w:rFonts w:ascii="Courier New" w:hAnsi="Courier New"/>
+                <w:color w:val="F05922"/>
+                <w:sz w:val="20"/>
+              </w:rPr>
+              <w:t xml:space="preserve"> = **0**. Đã xoá 16 file </w:t>
+            </w:r>
+            <w:r>
+              <w:rPr>
+                <w:sz w:val="20"/>
+              </w:rPr>
+              <w:t>custom.conf.bak-*`</w:t>
+            </w:r>
+          </w:p>
+        </w:tc>
+      </w:tr>
+      <w:tr>
+        <w:tc>
+          <w:tcPr>
+            <w:tcW w:type="dxa" w:w="1938"/>
+            <w:tcBorders>
+              <w:top w:val="single" w:sz="4" w:space="0" w:color="CBCBCB"/>
+              <w:left w:val="single" w:sz="4" w:space="0" w:color="CBCBCB"/>
+              <w:bottom w:val="single" w:sz="4" w:space="0" w:color="CBCBCB"/>
+              <w:right w:val="single" w:sz="4" w:space="0" w:color="CBCBCB"/>
+            </w:tcBorders>
+          </w:tcPr>
+          <w:p>
+            <w:r>
+              <w:rPr>
+                <w:sz w:val="20"/>
+              </w:rPr>
+              <w:t>6</w:t>
+            </w:r>
+          </w:p>
+        </w:tc>
+        <w:tc>
+          <w:tcPr>
+            <w:tcW w:type="dxa" w:w="1938"/>
+            <w:tcBorders>
+              <w:top w:val="single" w:sz="4" w:space="0" w:color="CBCBCB"/>
+              <w:left w:val="single" w:sz="4" w:space="0" w:color="CBCBCB"/>
+              <w:bottom w:val="single" w:sz="4" w:space="0" w:color="CBCBCB"/>
+              <w:right w:val="single" w:sz="4" w:space="0" w:color="CBCBCB"/>
+            </w:tcBorders>
+          </w:tcPr>
+          <w:p>
+            <w:r>
+              <w:rPr>
+                <w:sz w:val="20"/>
+              </w:rPr>
+              <w:t xml:space="preserve">Watchdog </w:t>
+            </w:r>
+            <w:r>
+              <w:rPr>
+                <w:rFonts w:ascii="Courier New" w:hAnsi="Courier New"/>
+                <w:color w:val="F05922"/>
+                <w:sz w:val="20"/>
+              </w:rPr>
+              <w:t>ipgs-kiosk-app.service</w:t>
+            </w:r>
+          </w:p>
+        </w:tc>
+        <w:tc>
+          <w:tcPr>
+            <w:tcW w:type="dxa" w:w="1938"/>
+            <w:tcBorders>
+              <w:top w:val="single" w:sz="4" w:space="0" w:color="CBCBCB"/>
+              <w:left w:val="single" w:sz="4" w:space="0" w:color="CBCBCB"/>
+              <w:bottom w:val="single" w:sz="4" w:space="0" w:color="CBCBCB"/>
+              <w:right w:val="single" w:sz="4" w:space="0" w:color="CBCBCB"/>
+            </w:tcBorders>
+          </w:tcPr>
+          <w:p>
+            <w:r>
+              <w:rPr>
+                <w:sz w:val="20"/>
+              </w:rPr>
+              <w:t>➖ Không có (QA đã gỡ từ phiên trước)</w:t>
+            </w:r>
+          </w:p>
+        </w:tc>
+        <w:tc>
+          <w:tcPr>
+            <w:tcW w:type="dxa" w:w="1938"/>
+            <w:tcBorders>
+              <w:top w:val="single" w:sz="4" w:space="0" w:color="CBCBCB"/>
+              <w:left w:val="single" w:sz="4" w:space="0" w:color="CBCBCB"/>
+              <w:bottom w:val="single" w:sz="4" w:space="0" w:color="CBCBCB"/>
+              <w:right w:val="single" w:sz="4" w:space="0" w:color="CBCBCB"/>
+            </w:tcBorders>
+          </w:tcPr>
+          <w:p>
+            <w:r>
+              <w:rPr>
+                <w:sz w:val="20"/>
+              </w:rPr>
+              <w:t>`systemctl --user list-unit-files \</w:t>
+            </w:r>
+          </w:p>
+        </w:tc>
+        <w:tc>
+          <w:tcPr>
+            <w:tcW w:type="dxa" w:w="1938"/>
+            <w:tcBorders>
+              <w:top w:val="single" w:sz="4" w:space="0" w:color="CBCBCB"/>
+              <w:left w:val="single" w:sz="4" w:space="0" w:color="CBCBCB"/>
+              <w:bottom w:val="single" w:sz="4" w:space="0" w:color="CBCBCB"/>
+              <w:right w:val="single" w:sz="4" w:space="0" w:color="CBCBCB"/>
+            </w:tcBorders>
+          </w:tcPr>
+          <w:p>
+            <w:r>
+              <w:rPr>
+                <w:sz w:val="20"/>
+              </w:rPr>
+              <w:t>grep kiosk` → rỗng</w:t>
+            </w:r>
+          </w:p>
+        </w:tc>
+      </w:tr>
+      <w:tr>
+        <w:tc>
+          <w:tcPr>
+            <w:tcW w:type="dxa" w:w="1938"/>
+            <w:shd w:val="clear" w:color="auto" w:fill="B8B3D6"/>
+            <w:tcBorders>
+              <w:top w:val="single" w:sz="4" w:space="0" w:color="CBCBCB"/>
+              <w:left w:val="single" w:sz="4" w:space="0" w:color="CBCBCB"/>
+              <w:bottom w:val="single" w:sz="4" w:space="0" w:color="CBCBCB"/>
+              <w:right w:val="single" w:sz="4" w:space="0" w:color="CBCBCB"/>
+            </w:tcBorders>
+          </w:tcPr>
+          <w:p>
+            <w:r>
+              <w:rPr>
+                <w:sz w:val="20"/>
+              </w:rPr>
+              <w:t>7</w:t>
+            </w:r>
+          </w:p>
+        </w:tc>
+        <w:tc>
+          <w:tcPr>
+            <w:tcW w:type="dxa" w:w="1938"/>
+            <w:shd w:val="clear" w:color="auto" w:fill="B8B3D6"/>
+            <w:tcBorders>
+              <w:top w:val="single" w:sz="4" w:space="0" w:color="CBCBCB"/>
+              <w:left w:val="single" w:sz="4" w:space="0" w:color="CBCBCB"/>
+              <w:bottom w:val="single" w:sz="4" w:space="0" w:color="CBCBCB"/>
+              <w:right w:val="single" w:sz="4" w:space="0" w:color="CBCBCB"/>
+            </w:tcBorders>
+          </w:tcPr>
+          <w:p>
+            <w:r>
+              <w:rPr>
+                <w:sz w:val="20"/>
+              </w:rPr>
+              <w:t xml:space="preserve">Helper </w:t>
+            </w:r>
+            <w:r>
+              <w:rPr>
+                <w:rFonts w:ascii="Courier New" w:hAnsi="Courier New"/>
+                <w:color w:val="F05922"/>
+                <w:sz w:val="20"/>
+              </w:rPr>
+              <w:t>/usr/local/sbin/ipgs-kiosk-unlock</w:t>
+            </w:r>
+            <w:r>
+              <w:rPr>
+                <w:sz w:val="20"/>
+              </w:rPr>
+              <w:t xml:space="preserve"> (F11)</w:t>
+            </w:r>
+          </w:p>
+        </w:tc>
+        <w:tc>
+          <w:tcPr>
+            <w:tcW w:type="dxa" w:w="1938"/>
+            <w:shd w:val="clear" w:color="auto" w:fill="B8B3D6"/>
+            <w:tcBorders>
+              <w:top w:val="single" w:sz="4" w:space="0" w:color="CBCBCB"/>
+              <w:left w:val="single" w:sz="4" w:space="0" w:color="CBCBCB"/>
+              <w:bottom w:val="single" w:sz="4" w:space="0" w:color="CBCBCB"/>
+              <w:right w:val="single" w:sz="4" w:space="0" w:color="CBCBCB"/>
+            </w:tcBorders>
+          </w:tcPr>
+          <w:p>
+            <w:r>
+              <w:rPr>
+                <w:sz w:val="20"/>
+              </w:rPr>
+              <w:t>✅ Đã xoá</w:t>
+            </w:r>
+          </w:p>
+        </w:tc>
+        <w:tc>
+          <w:tcPr>
+            <w:tcW w:type="dxa" w:w="1938"/>
+            <w:shd w:val="clear" w:color="auto" w:fill="B8B3D6"/>
+            <w:tcBorders>
+              <w:top w:val="single" w:sz="4" w:space="0" w:color="CBCBCB"/>
+              <w:left w:val="single" w:sz="4" w:space="0" w:color="CBCBCB"/>
+              <w:bottom w:val="single" w:sz="4" w:space="0" w:color="CBCBCB"/>
+              <w:right w:val="single" w:sz="4" w:space="0" w:color="CBCBCB"/>
+            </w:tcBorders>
+          </w:tcPr>
+          <w:p>
+            <w:r>
+              <w:rPr>
+                <w:rFonts w:ascii="Courier New" w:hAnsi="Courier New"/>
+                <w:color w:val="F05922"/>
+                <w:sz w:val="20"/>
+              </w:rPr>
+              <w:t>ls</w:t>
+            </w:r>
+            <w:r>
+              <w:rPr>
+                <w:sz w:val="20"/>
+              </w:rPr>
+              <w:t xml:space="preserve"> → "No such file or directory"</w:t>
+            </w:r>
+          </w:p>
+        </w:tc>
+        <w:tc>
+          <w:tcPr>
+            <w:tcW w:type="dxa" w:w="1938"/>
+            <w:shd w:val="clear" w:color="auto" w:fill="B8B3D6"/>
+            <w:tcBorders>
+              <w:top w:val="single" w:sz="4" w:space="0" w:color="CBCBCB"/>
+              <w:left w:val="single" w:sz="4" w:space="0" w:color="CBCBCB"/>
+              <w:bottom w:val="single" w:sz="4" w:space="0" w:color="CBCBCB"/>
+              <w:right w:val="single" w:sz="4" w:space="0" w:color="CBCBCB"/>
+            </w:tcBorders>
+          </w:tcPr>
+          <w:p/>
+        </w:tc>
+      </w:tr>
+      <w:tr>
+        <w:tc>
+          <w:tcPr>
+            <w:tcW w:type="dxa" w:w="1938"/>
+            <w:tcBorders>
+              <w:top w:val="single" w:sz="4" w:space="0" w:color="CBCBCB"/>
+              <w:left w:val="single" w:sz="4" w:space="0" w:color="CBCBCB"/>
+              <w:bottom w:val="single" w:sz="4" w:space="0" w:color="CBCBCB"/>
+              <w:right w:val="single" w:sz="4" w:space="0" w:color="CBCBCB"/>
+            </w:tcBorders>
+          </w:tcPr>
+          <w:p>
+            <w:r>
+              <w:rPr>
+                <w:sz w:val="20"/>
+              </w:rPr>
+              <w:t>8</w:t>
+            </w:r>
+          </w:p>
+        </w:tc>
+        <w:tc>
+          <w:tcPr>
+            <w:tcW w:type="dxa" w:w="1938"/>
+            <w:tcBorders>
+              <w:top w:val="single" w:sz="4" w:space="0" w:color="CBCBCB"/>
+              <w:left w:val="single" w:sz="4" w:space="0" w:color="CBCBCB"/>
+              <w:bottom w:val="single" w:sz="4" w:space="0" w:color="CBCBCB"/>
+              <w:right w:val="single" w:sz="4" w:space="0" w:color="CBCBCB"/>
+            </w:tcBorders>
+          </w:tcPr>
+          <w:p>
+            <w:r>
+              <w:rPr>
+                <w:sz w:val="20"/>
+              </w:rPr>
+              <w:t xml:space="preserve">Autostart </w:t>
+            </w:r>
+            <w:r>
+              <w:rPr>
+                <w:rFonts w:ascii="Courier New" w:hAnsi="Courier New"/>
+                <w:color w:val="F05922"/>
+                <w:sz w:val="20"/>
+              </w:rPr>
+              <w:t>ipgs-kiosk.desktop</w:t>
+            </w:r>
+            <w:r>
+              <w:rPr>
+                <w:sz w:val="20"/>
+              </w:rPr>
+              <w:t xml:space="preserve">, </w:t>
+            </w:r>
+            <w:r>
+              <w:rPr>
+                <w:rFonts w:ascii="Courier New" w:hAnsi="Courier New"/>
+                <w:color w:val="F05922"/>
+                <w:sz w:val="20"/>
+              </w:rPr>
+              <w:t>unclutter.desktop</w:t>
+            </w:r>
+            <w:r>
+              <w:rPr>
+                <w:sz w:val="20"/>
+              </w:rPr>
+              <w:t xml:space="preserve">, </w:t>
+            </w:r>
+            <w:r>
+              <w:rPr>
+                <w:rFonts w:ascii="Courier New" w:hAnsi="Courier New"/>
+                <w:color w:val="F05922"/>
+                <w:sz w:val="20"/>
+              </w:rPr>
+              <w:t>update-notifier.desktop</w:t>
+            </w:r>
+            <w:r>
+              <w:rPr>
+                <w:sz w:val="20"/>
+              </w:rPr>
+              <w:t xml:space="preserve"> (override Hidden)</w:t>
+            </w:r>
+          </w:p>
+        </w:tc>
+        <w:tc>
+          <w:tcPr>
+            <w:tcW w:type="dxa" w:w="1938"/>
+            <w:tcBorders>
+              <w:top w:val="single" w:sz="4" w:space="0" w:color="CBCBCB"/>
+              <w:left w:val="single" w:sz="4" w:space="0" w:color="CBCBCB"/>
+              <w:bottom w:val="single" w:sz="4" w:space="0" w:color="CBCBCB"/>
+              <w:right w:val="single" w:sz="4" w:space="0" w:color="CBCBCB"/>
+            </w:tcBorders>
+          </w:tcPr>
+          <w:p>
+            <w:r>
+              <w:rPr>
+                <w:sz w:val="20"/>
+              </w:rPr>
+              <w:t>✅ Đã xoá cả 3</w:t>
+            </w:r>
+          </w:p>
+        </w:tc>
+        <w:tc>
+          <w:tcPr>
+            <w:tcW w:type="dxa" w:w="1938"/>
+            <w:tcBorders>
+              <w:top w:val="single" w:sz="4" w:space="0" w:color="CBCBCB"/>
+              <w:left w:val="single" w:sz="4" w:space="0" w:color="CBCBCB"/>
+              <w:bottom w:val="single" w:sz="4" w:space="0" w:color="CBCBCB"/>
+              <w:right w:val="single" w:sz="4" w:space="0" w:color="CBCBCB"/>
+            </w:tcBorders>
+          </w:tcPr>
+          <w:p>
+            <w:r>
+              <w:rPr>
+                <w:rFonts w:ascii="Courier New" w:hAnsi="Courier New"/>
+                <w:color w:val="F05922"/>
+                <w:sz w:val="20"/>
+              </w:rPr>
+              <w:t>ls ~/.config/autostart/</w:t>
+            </w:r>
+            <w:r>
+              <w:rPr>
+                <w:sz w:val="20"/>
+              </w:rPr>
+              <w:t xml:space="preserve"> → rỗng</w:t>
+            </w:r>
+          </w:p>
+        </w:tc>
+        <w:tc>
+          <w:tcPr>
+            <w:tcW w:type="dxa" w:w="1938"/>
+            <w:tcBorders>
+              <w:top w:val="single" w:sz="4" w:space="0" w:color="CBCBCB"/>
+              <w:left w:val="single" w:sz="4" w:space="0" w:color="CBCBCB"/>
+              <w:bottom w:val="single" w:sz="4" w:space="0" w:color="CBCBCB"/>
+              <w:right w:val="single" w:sz="4" w:space="0" w:color="CBCBCB"/>
+            </w:tcBorders>
+          </w:tcPr>
+          <w:p/>
+        </w:tc>
+      </w:tr>
+      <w:tr>
+        <w:tc>
+          <w:tcPr>
+            <w:tcW w:type="dxa" w:w="1938"/>
+            <w:shd w:val="clear" w:color="auto" w:fill="B8B3D6"/>
+            <w:tcBorders>
+              <w:top w:val="single" w:sz="4" w:space="0" w:color="CBCBCB"/>
+              <w:left w:val="single" w:sz="4" w:space="0" w:color="CBCBCB"/>
+              <w:bottom w:val="single" w:sz="4" w:space="0" w:color="CBCBCB"/>
+              <w:right w:val="single" w:sz="4" w:space="0" w:color="CBCBCB"/>
+            </w:tcBorders>
+          </w:tcPr>
+          <w:p>
+            <w:r>
+              <w:rPr>
+                <w:sz w:val="20"/>
+              </w:rPr>
+              <w:t>9</w:t>
+            </w:r>
+          </w:p>
+        </w:tc>
+        <w:tc>
+          <w:tcPr>
+            <w:tcW w:type="dxa" w:w="1938"/>
+            <w:shd w:val="clear" w:color="auto" w:fill="B8B3D6"/>
+            <w:tcBorders>
+              <w:top w:val="single" w:sz="4" w:space="0" w:color="CBCBCB"/>
+              <w:left w:val="single" w:sz="4" w:space="0" w:color="CBCBCB"/>
+              <w:bottom w:val="single" w:sz="4" w:space="0" w:color="CBCBCB"/>
+              <w:right w:val="single" w:sz="4" w:space="0" w:color="CBCBCB"/>
+            </w:tcBorders>
+          </w:tcPr>
+          <w:p>
+            <w:r>
+              <w:rPr>
+                <w:rFonts w:ascii="Courier New" w:hAnsi="Courier New"/>
+                <w:color w:val="F05922"/>
+                <w:sz w:val="20"/>
+              </w:rPr>
+              <w:t>/var/backups/kztek-kiosk/</w:t>
+            </w:r>
+            <w:r>
+              <w:rPr>
+                <w:sz w:val="20"/>
+              </w:rPr>
+              <w:t xml:space="preserve"> (14 file)</w:t>
+            </w:r>
+          </w:p>
+        </w:tc>
+        <w:tc>
+          <w:tcPr>
+            <w:tcW w:type="dxa" w:w="1938"/>
+            <w:shd w:val="clear" w:color="auto" w:fill="B8B3D6"/>
+            <w:tcBorders>
+              <w:top w:val="single" w:sz="4" w:space="0" w:color="CBCBCB"/>
+              <w:left w:val="single" w:sz="4" w:space="0" w:color="CBCBCB"/>
+              <w:bottom w:val="single" w:sz="4" w:space="0" w:color="CBCBCB"/>
+              <w:right w:val="single" w:sz="4" w:space="0" w:color="CBCBCB"/>
+            </w:tcBorders>
+          </w:tcPr>
+          <w:p>
+            <w:r>
+              <w:rPr>
+                <w:sz w:val="20"/>
+              </w:rPr>
+              <w:t>✅ Đã xoá</w:t>
+            </w:r>
+          </w:p>
+        </w:tc>
+        <w:tc>
+          <w:tcPr>
+            <w:tcW w:type="dxa" w:w="1938"/>
+            <w:shd w:val="clear" w:color="auto" w:fill="B8B3D6"/>
+            <w:tcBorders>
+              <w:top w:val="single" w:sz="4" w:space="0" w:color="CBCBCB"/>
+              <w:left w:val="single" w:sz="4" w:space="0" w:color="CBCBCB"/>
+              <w:bottom w:val="single" w:sz="4" w:space="0" w:color="CBCBCB"/>
+              <w:right w:val="single" w:sz="4" w:space="0" w:color="CBCBCB"/>
+            </w:tcBorders>
+          </w:tcPr>
+          <w:p>
+            <w:r>
+              <w:rPr>
+                <w:rFonts w:ascii="Courier New" w:hAnsi="Courier New"/>
+                <w:color w:val="F05922"/>
+                <w:sz w:val="20"/>
+              </w:rPr>
+              <w:t>ls -d</w:t>
+            </w:r>
+            <w:r>
+              <w:rPr>
+                <w:sz w:val="20"/>
+              </w:rPr>
+              <w:t xml:space="preserve"> → "No such file or directory"</w:t>
+            </w:r>
+          </w:p>
+        </w:tc>
+        <w:tc>
+          <w:tcPr>
+            <w:tcW w:type="dxa" w:w="1938"/>
+            <w:shd w:val="clear" w:color="auto" w:fill="B8B3D6"/>
+            <w:tcBorders>
+              <w:top w:val="single" w:sz="4" w:space="0" w:color="CBCBCB"/>
+              <w:left w:val="single" w:sz="4" w:space="0" w:color="CBCBCB"/>
+              <w:bottom w:val="single" w:sz="4" w:space="0" w:color="CBCBCB"/>
+              <w:right w:val="single" w:sz="4" w:space="0" w:color="CBCBCB"/>
+            </w:tcBorders>
+          </w:tcPr>
+          <w:p/>
+        </w:tc>
+      </w:tr>
+      <w:tr>
+        <w:tc>
+          <w:tcPr>
+            <w:tcW w:type="dxa" w:w="1938"/>
+            <w:tcBorders>
+              <w:top w:val="single" w:sz="4" w:space="0" w:color="CBCBCB"/>
+              <w:left w:val="single" w:sz="4" w:space="0" w:color="CBCBCB"/>
+              <w:bottom w:val="single" w:sz="4" w:space="0" w:color="CBCBCB"/>
+              <w:right w:val="single" w:sz="4" w:space="0" w:color="CBCBCB"/>
+            </w:tcBorders>
+          </w:tcPr>
+          <w:p>
+            <w:r>
+              <w:rPr>
+                <w:sz w:val="20"/>
+              </w:rPr>
+              <w:t>10</w:t>
+            </w:r>
+          </w:p>
+        </w:tc>
+        <w:tc>
+          <w:tcPr>
+            <w:tcW w:type="dxa" w:w="1938"/>
+            <w:tcBorders>
+              <w:top w:val="single" w:sz="4" w:space="0" w:color="CBCBCB"/>
+              <w:left w:val="single" w:sz="4" w:space="0" w:color="CBCBCB"/>
+              <w:bottom w:val="single" w:sz="4" w:space="0" w:color="CBCBCB"/>
+              <w:right w:val="single" w:sz="4" w:space="0" w:color="CBCBCB"/>
+            </w:tcBorders>
+          </w:tcPr>
+          <w:p>
+            <w:r>
+              <w:rPr>
+                <w:rFonts w:ascii="Courier New" w:hAnsi="Courier New"/>
+                <w:color w:val="F05922"/>
+                <w:sz w:val="20"/>
+              </w:rPr>
+              <w:t>~/.local/state/kztek-kiosk-backups/</w:t>
+            </w:r>
+          </w:p>
+        </w:tc>
+        <w:tc>
+          <w:tcPr>
+            <w:tcW w:type="dxa" w:w="1938"/>
+            <w:tcBorders>
+              <w:top w:val="single" w:sz="4" w:space="0" w:color="CBCBCB"/>
+              <w:left w:val="single" w:sz="4" w:space="0" w:color="CBCBCB"/>
+              <w:bottom w:val="single" w:sz="4" w:space="0" w:color="CBCBCB"/>
+              <w:right w:val="single" w:sz="4" w:space="0" w:color="CBCBCB"/>
+            </w:tcBorders>
+          </w:tcPr>
+          <w:p>
+            <w:r>
+              <w:rPr>
+                <w:sz w:val="20"/>
+              </w:rPr>
+              <w:t>➖ Không tồn tại</w:t>
+            </w:r>
+          </w:p>
+        </w:tc>
+        <w:tc>
+          <w:tcPr>
+            <w:tcW w:type="dxa" w:w="1938"/>
+            <w:tcBorders>
+              <w:top w:val="single" w:sz="4" w:space="0" w:color="CBCBCB"/>
+              <w:left w:val="single" w:sz="4" w:space="0" w:color="CBCBCB"/>
+              <w:bottom w:val="single" w:sz="4" w:space="0" w:color="CBCBCB"/>
+              <w:right w:val="single" w:sz="4" w:space="0" w:color="CBCBCB"/>
+            </w:tcBorders>
+          </w:tcPr>
+          <w:p>
+            <w:r>
+              <w:rPr>
+                <w:sz w:val="20"/>
+              </w:rPr>
+              <w:t>—</w:t>
+            </w:r>
+          </w:p>
+        </w:tc>
+        <w:tc>
+          <w:tcPr>
+            <w:tcW w:type="dxa" w:w="1938"/>
+            <w:tcBorders>
+              <w:top w:val="single" w:sz="4" w:space="0" w:color="CBCBCB"/>
+              <w:left w:val="single" w:sz="4" w:space="0" w:color="CBCBCB"/>
+              <w:bottom w:val="single" w:sz="4" w:space="0" w:color="CBCBCB"/>
+              <w:right w:val="single" w:sz="4" w:space="0" w:color="CBCBCB"/>
+            </w:tcBorders>
+          </w:tcPr>
+          <w:p/>
+        </w:tc>
+      </w:tr>
+      <w:tr>
+        <w:tc>
+          <w:tcPr>
+            <w:tcW w:type="dxa" w:w="1938"/>
+            <w:shd w:val="clear" w:color="auto" w:fill="B8B3D6"/>
+            <w:tcBorders>
+              <w:top w:val="single" w:sz="4" w:space="0" w:color="CBCBCB"/>
+              <w:left w:val="single" w:sz="4" w:space="0" w:color="CBCBCB"/>
+              <w:bottom w:val="single" w:sz="4" w:space="0" w:color="CBCBCB"/>
+              <w:right w:val="single" w:sz="4" w:space="0" w:color="CBCBCB"/>
+            </w:tcBorders>
+          </w:tcPr>
+          <w:p>
+            <w:r>
+              <w:rPr>
+                <w:sz w:val="20"/>
+              </w:rPr>
+              <w:t>11</w:t>
+            </w:r>
+          </w:p>
+        </w:tc>
+        <w:tc>
+          <w:tcPr>
+            <w:tcW w:type="dxa" w:w="1938"/>
+            <w:shd w:val="clear" w:color="auto" w:fill="B8B3D6"/>
+            <w:tcBorders>
+              <w:top w:val="single" w:sz="4" w:space="0" w:color="CBCBCB"/>
+              <w:left w:val="single" w:sz="4" w:space="0" w:color="CBCBCB"/>
+              <w:bottom w:val="single" w:sz="4" w:space="0" w:color="CBCBCB"/>
+              <w:right w:val="single" w:sz="4" w:space="0" w:color="CBCBCB"/>
+            </w:tcBorders>
+          </w:tcPr>
+          <w:p>
+            <w:r>
+              <w:rPr>
+                <w:rFonts w:ascii="Courier New" w:hAnsi="Courier New"/>
+                <w:color w:val="F05922"/>
+                <w:sz w:val="20"/>
+              </w:rPr>
+              <w:t>~/kiosk-qa-backup-2026-07-27/</w:t>
+            </w:r>
+            <w:r>
+              <w:rPr>
+                <w:sz w:val="20"/>
+              </w:rPr>
+              <w:t xml:space="preserve"> (QA tạo)</w:t>
+            </w:r>
+          </w:p>
+        </w:tc>
+        <w:tc>
+          <w:tcPr>
+            <w:tcW w:type="dxa" w:w="1938"/>
+            <w:shd w:val="clear" w:color="auto" w:fill="B8B3D6"/>
+            <w:tcBorders>
+              <w:top w:val="single" w:sz="4" w:space="0" w:color="CBCBCB"/>
+              <w:left w:val="single" w:sz="4" w:space="0" w:color="CBCBCB"/>
+              <w:bottom w:val="single" w:sz="4" w:space="0" w:color="CBCBCB"/>
+              <w:right w:val="single" w:sz="4" w:space="0" w:color="CBCBCB"/>
+            </w:tcBorders>
+          </w:tcPr>
+          <w:p>
+            <w:r>
+              <w:rPr>
+                <w:sz w:val="20"/>
+              </w:rPr>
+              <w:t>✅ Đã xoá</w:t>
+            </w:r>
+          </w:p>
+        </w:tc>
+        <w:tc>
+          <w:tcPr>
+            <w:tcW w:type="dxa" w:w="1938"/>
+            <w:shd w:val="clear" w:color="auto" w:fill="B8B3D6"/>
+            <w:tcBorders>
+              <w:top w:val="single" w:sz="4" w:space="0" w:color="CBCBCB"/>
+              <w:left w:val="single" w:sz="4" w:space="0" w:color="CBCBCB"/>
+              <w:bottom w:val="single" w:sz="4" w:space="0" w:color="CBCBCB"/>
+              <w:right w:val="single" w:sz="4" w:space="0" w:color="CBCBCB"/>
+            </w:tcBorders>
+          </w:tcPr>
+          <w:p>
+            <w:r>
+              <w:rPr>
+                <w:rFonts w:ascii="Courier New" w:hAnsi="Courier New"/>
+                <w:color w:val="F05922"/>
+                <w:sz w:val="20"/>
+              </w:rPr>
+              <w:t>ls -d</w:t>
+            </w:r>
+            <w:r>
+              <w:rPr>
+                <w:sz w:val="20"/>
+              </w:rPr>
+              <w:t xml:space="preserve"> → "No such file or directory"</w:t>
+            </w:r>
+          </w:p>
+        </w:tc>
+        <w:tc>
+          <w:tcPr>
+            <w:tcW w:type="dxa" w:w="1938"/>
+            <w:shd w:val="clear" w:color="auto" w:fill="B8B3D6"/>
+            <w:tcBorders>
+              <w:top w:val="single" w:sz="4" w:space="0" w:color="CBCBCB"/>
+              <w:left w:val="single" w:sz="4" w:space="0" w:color="CBCBCB"/>
+              <w:bottom w:val="single" w:sz="4" w:space="0" w:color="CBCBCB"/>
+              <w:right w:val="single" w:sz="4" w:space="0" w:color="CBCBCB"/>
+            </w:tcBorders>
+          </w:tcPr>
+          <w:p/>
+        </w:tc>
+      </w:tr>
+      <w:tr>
+        <w:tc>
+          <w:tcPr>
+            <w:tcW w:type="dxa" w:w="1938"/>
+            <w:tcBorders>
+              <w:top w:val="single" w:sz="4" w:space="0" w:color="CBCBCB"/>
+              <w:left w:val="single" w:sz="4" w:space="0" w:color="CBCBCB"/>
+              <w:bottom w:val="single" w:sz="4" w:space="0" w:color="CBCBCB"/>
+              <w:right w:val="single" w:sz="4" w:space="0" w:color="CBCBCB"/>
+            </w:tcBorders>
+          </w:tcPr>
+          <w:p>
+            <w:r>
+              <w:rPr>
+                <w:sz w:val="20"/>
+              </w:rPr>
+              <w:t>12</w:t>
+            </w:r>
+          </w:p>
+        </w:tc>
+        <w:tc>
+          <w:tcPr>
+            <w:tcW w:type="dxa" w:w="1938"/>
+            <w:tcBorders>
+              <w:top w:val="single" w:sz="4" w:space="0" w:color="CBCBCB"/>
+              <w:left w:val="single" w:sz="4" w:space="0" w:color="CBCBCB"/>
+              <w:bottom w:val="single" w:sz="4" w:space="0" w:color="CBCBCB"/>
+              <w:right w:val="single" w:sz="4" w:space="0" w:color="CBCBCB"/>
+            </w:tcBorders>
+          </w:tcPr>
+          <w:p>
+            <w:r>
+              <w:rPr>
+                <w:rFonts w:ascii="Courier New" w:hAnsi="Courier New"/>
+                <w:color w:val="F05922"/>
+                <w:sz w:val="20"/>
+              </w:rPr>
+              <w:t>/home/kztek/kztek-demo/</w:t>
+            </w:r>
+            <w:r>
+              <w:rPr>
+                <w:sz w:val="20"/>
+              </w:rPr>
+              <w:t xml:space="preserve"> (dữ liệu demo chụp tài liệu)</w:t>
+            </w:r>
+          </w:p>
+        </w:tc>
+        <w:tc>
+          <w:tcPr>
+            <w:tcW w:type="dxa" w:w="1938"/>
+            <w:tcBorders>
+              <w:top w:val="single" w:sz="4" w:space="0" w:color="CBCBCB"/>
+              <w:left w:val="single" w:sz="4" w:space="0" w:color="CBCBCB"/>
+              <w:bottom w:val="single" w:sz="4" w:space="0" w:color="CBCBCB"/>
+              <w:right w:val="single" w:sz="4" w:space="0" w:color="CBCBCB"/>
+            </w:tcBorders>
+          </w:tcPr>
+          <w:p>
+            <w:r>
+              <w:rPr>
+                <w:sz w:val="20"/>
+              </w:rPr>
+              <w:t>✅ Đã xoá</w:t>
+            </w:r>
+          </w:p>
+        </w:tc>
+        <w:tc>
+          <w:tcPr>
+            <w:tcW w:type="dxa" w:w="1938"/>
+            <w:tcBorders>
+              <w:top w:val="single" w:sz="4" w:space="0" w:color="CBCBCB"/>
+              <w:left w:val="single" w:sz="4" w:space="0" w:color="CBCBCB"/>
+              <w:bottom w:val="single" w:sz="4" w:space="0" w:color="CBCBCB"/>
+              <w:right w:val="single" w:sz="4" w:space="0" w:color="CBCBCB"/>
+            </w:tcBorders>
+          </w:tcPr>
+          <w:p>
+            <w:r>
+              <w:rPr>
+                <w:rFonts w:ascii="Courier New" w:hAnsi="Courier New"/>
+                <w:color w:val="F05922"/>
+                <w:sz w:val="20"/>
+              </w:rPr>
+              <w:t>ls -d</w:t>
+            </w:r>
+            <w:r>
+              <w:rPr>
+                <w:sz w:val="20"/>
+              </w:rPr>
+              <w:t xml:space="preserve"> → "No such file or directory"</w:t>
+            </w:r>
+          </w:p>
+        </w:tc>
+        <w:tc>
+          <w:tcPr>
+            <w:tcW w:type="dxa" w:w="1938"/>
+            <w:tcBorders>
+              <w:top w:val="single" w:sz="4" w:space="0" w:color="CBCBCB"/>
+              <w:left w:val="single" w:sz="4" w:space="0" w:color="CBCBCB"/>
+              <w:bottom w:val="single" w:sz="4" w:space="0" w:color="CBCBCB"/>
+              <w:right w:val="single" w:sz="4" w:space="0" w:color="CBCBCB"/>
+            </w:tcBorders>
+          </w:tcPr>
+          <w:p/>
+        </w:tc>
+      </w:tr>
+      <w:tr>
+        <w:tc>
+          <w:tcPr>
+            <w:tcW w:type="dxa" w:w="1938"/>
+            <w:shd w:val="clear" w:color="auto" w:fill="B8B3D6"/>
+            <w:tcBorders>
+              <w:top w:val="single" w:sz="4" w:space="0" w:color="CBCBCB"/>
+              <w:left w:val="single" w:sz="4" w:space="0" w:color="CBCBCB"/>
+              <w:bottom w:val="single" w:sz="4" w:space="0" w:color="CBCBCB"/>
+              <w:right w:val="single" w:sz="4" w:space="0" w:color="CBCBCB"/>
+            </w:tcBorders>
+          </w:tcPr>
+          <w:p>
+            <w:r>
+              <w:rPr>
+                <w:sz w:val="20"/>
+              </w:rPr>
+              <w:t>13</w:t>
+            </w:r>
+          </w:p>
+        </w:tc>
+        <w:tc>
+          <w:tcPr>
+            <w:tcW w:type="dxa" w:w="1938"/>
+            <w:shd w:val="clear" w:color="auto" w:fill="B8B3D6"/>
+            <w:tcBorders>
+              <w:top w:val="single" w:sz="4" w:space="0" w:color="CBCBCB"/>
+              <w:left w:val="single" w:sz="4" w:space="0" w:color="CBCBCB"/>
+              <w:bottom w:val="single" w:sz="4" w:space="0" w:color="CBCBCB"/>
+              <w:right w:val="single" w:sz="4" w:space="0" w:color="CBCBCB"/>
+            </w:tcBorders>
+          </w:tcPr>
+          <w:p>
+            <w:r>
+              <w:rPr>
+                <w:sz w:val="20"/>
+              </w:rPr>
+              <w:t>Cron job demo</w:t>
+            </w:r>
+          </w:p>
+        </w:tc>
+        <w:tc>
+          <w:tcPr>
+            <w:tcW w:type="dxa" w:w="1938"/>
+            <w:shd w:val="clear" w:color="auto" w:fill="B8B3D6"/>
+            <w:tcBorders>
+              <w:top w:val="single" w:sz="4" w:space="0" w:color="CBCBCB"/>
+              <w:left w:val="single" w:sz="4" w:space="0" w:color="CBCBCB"/>
+              <w:bottom w:val="single" w:sz="4" w:space="0" w:color="CBCBCB"/>
+              <w:right w:val="single" w:sz="4" w:space="0" w:color="CBCBCB"/>
+            </w:tcBorders>
+          </w:tcPr>
+          <w:p>
+            <w:r>
+              <w:rPr>
+                <w:sz w:val="20"/>
+              </w:rPr>
+              <w:t>➖ Không có</w:t>
+            </w:r>
+          </w:p>
+        </w:tc>
+        <w:tc>
+          <w:tcPr>
+            <w:tcW w:type="dxa" w:w="1938"/>
+            <w:shd w:val="clear" w:color="auto" w:fill="B8B3D6"/>
+            <w:tcBorders>
+              <w:top w:val="single" w:sz="4" w:space="0" w:color="CBCBCB"/>
+              <w:left w:val="single" w:sz="4" w:space="0" w:color="CBCBCB"/>
+              <w:bottom w:val="single" w:sz="4" w:space="0" w:color="CBCBCB"/>
+              <w:right w:val="single" w:sz="4" w:space="0" w:color="CBCBCB"/>
+            </w:tcBorders>
+          </w:tcPr>
+          <w:p>
+            <w:r>
+              <w:rPr>
+                <w:rFonts w:ascii="Courier New" w:hAnsi="Courier New"/>
+                <w:color w:val="F05922"/>
+                <w:sz w:val="20"/>
+              </w:rPr>
+              <w:t>crontab -l</w:t>
+            </w:r>
+            <w:r>
+              <w:rPr>
+                <w:sz w:val="20"/>
+              </w:rPr>
+              <w:t xml:space="preserve"> → "no crontab for kztek"</w:t>
+            </w:r>
+          </w:p>
+        </w:tc>
+        <w:tc>
+          <w:tcPr>
+            <w:tcW w:type="dxa" w:w="1938"/>
+            <w:shd w:val="clear" w:color="auto" w:fill="B8B3D6"/>
+            <w:tcBorders>
+              <w:top w:val="single" w:sz="4" w:space="0" w:color="CBCBCB"/>
+              <w:left w:val="single" w:sz="4" w:space="0" w:color="CBCBCB"/>
+              <w:bottom w:val="single" w:sz="4" w:space="0" w:color="CBCBCB"/>
+              <w:right w:val="single" w:sz="4" w:space="0" w:color="CBCBCB"/>
+            </w:tcBorders>
+          </w:tcPr>
+          <w:p/>
+        </w:tc>
+      </w:tr>
+      <w:tr>
+        <w:tc>
+          <w:tcPr>
+            <w:tcW w:type="dxa" w:w="1938"/>
+            <w:tcBorders>
+              <w:top w:val="single" w:sz="4" w:space="0" w:color="CBCBCB"/>
+              <w:left w:val="single" w:sz="4" w:space="0" w:color="CBCBCB"/>
+              <w:bottom w:val="single" w:sz="4" w:space="0" w:color="CBCBCB"/>
+              <w:right w:val="single" w:sz="4" w:space="0" w:color="CBCBCB"/>
+            </w:tcBorders>
+          </w:tcPr>
+          <w:p>
+            <w:r>
+              <w:rPr>
+                <w:sz w:val="20"/>
+              </w:rPr>
+              <w:t>14</w:t>
+            </w:r>
+          </w:p>
+        </w:tc>
+        <w:tc>
+          <w:tcPr>
+            <w:tcW w:type="dxa" w:w="1938"/>
+            <w:tcBorders>
+              <w:top w:val="single" w:sz="4" w:space="0" w:color="CBCBCB"/>
+              <w:left w:val="single" w:sz="4" w:space="0" w:color="CBCBCB"/>
+              <w:bottom w:val="single" w:sz="4" w:space="0" w:color="CBCBCB"/>
+              <w:right w:val="single" w:sz="4" w:space="0" w:color="CBCBCB"/>
+            </w:tcBorders>
+          </w:tcPr>
+          <w:p>
+            <w:r>
+              <w:rPr>
+                <w:sz w:val="20"/>
+              </w:rPr>
+              <w:t xml:space="preserve">gsettings user-level script đã set (hot-corners, show-banners, screensaver lock, idle-delay, num-workspaces, screen-keyboard) + </w:t>
+            </w:r>
+            <w:r>
+              <w:rPr>
+                <w:rFonts w:ascii="Courier New" w:hAnsi="Courier New"/>
+                <w:color w:val="F05922"/>
+                <w:sz w:val="20"/>
+              </w:rPr>
+              <w:t>enabled-extensions</w:t>
+            </w:r>
+          </w:p>
+        </w:tc>
+        <w:tc>
+          <w:tcPr>
+            <w:tcW w:type="dxa" w:w="1938"/>
+            <w:tcBorders>
+              <w:top w:val="single" w:sz="4" w:space="0" w:color="CBCBCB"/>
+              <w:left w:val="single" w:sz="4" w:space="0" w:color="CBCBCB"/>
+              <w:bottom w:val="single" w:sz="4" w:space="0" w:color="CBCBCB"/>
+              <w:right w:val="single" w:sz="4" w:space="0" w:color="CBCBCB"/>
+            </w:tcBorders>
+          </w:tcPr>
+          <w:p>
+            <w:r>
+              <w:rPr>
+                <w:sz w:val="20"/>
+              </w:rPr>
+              <w:t xml:space="preserve">✅ Đã </w:t>
+            </w:r>
+            <w:r>
+              <w:rPr>
+                <w:rFonts w:ascii="Courier New" w:hAnsi="Courier New"/>
+                <w:color w:val="F05922"/>
+                <w:sz w:val="20"/>
+              </w:rPr>
+              <w:t>gsettings reset</w:t>
+            </w:r>
+            <w:r>
+              <w:rPr>
+                <w:sz w:val="20"/>
+              </w:rPr>
+              <w:t xml:space="preserve"> về mặc định</w:t>
+            </w:r>
+          </w:p>
+        </w:tc>
+        <w:tc>
+          <w:tcPr>
+            <w:tcW w:type="dxa" w:w="1938"/>
+            <w:tcBorders>
+              <w:top w:val="single" w:sz="4" w:space="0" w:color="CBCBCB"/>
+              <w:left w:val="single" w:sz="4" w:space="0" w:color="CBCBCB"/>
+              <w:bottom w:val="single" w:sz="4" w:space="0" w:color="CBCBCB"/>
+              <w:right w:val="single" w:sz="4" w:space="0" w:color="CBCBCB"/>
+            </w:tcBorders>
+          </w:tcPr>
+          <w:p>
+            <w:r>
+              <w:rPr>
+                <w:sz w:val="20"/>
+              </w:rPr>
+              <w:t xml:space="preserve">Reset sau khi gỡ lock; </w:t>
+            </w:r>
+            <w:r>
+              <w:rPr>
+                <w:rFonts w:ascii="Courier New" w:hAnsi="Courier New"/>
+                <w:color w:val="F05922"/>
+                <w:sz w:val="20"/>
+              </w:rPr>
+              <w:t>enabled-extensions</w:t>
+            </w:r>
+            <w:r>
+              <w:rPr>
+                <w:sz w:val="20"/>
+              </w:rPr>
+              <w:t xml:space="preserve"> = </w:t>
+            </w:r>
+            <w:r>
+              <w:rPr>
+                <w:rFonts w:ascii="Courier New" w:hAnsi="Courier New"/>
+                <w:color w:val="F05922"/>
+                <w:sz w:val="20"/>
+              </w:rPr>
+              <w:t>@as []</w:t>
+            </w:r>
+            <w:r>
+              <w:rPr>
+                <w:sz w:val="20"/>
+              </w:rPr>
+              <w:t xml:space="preserve"> (mặc định)</w:t>
+            </w:r>
+          </w:p>
+        </w:tc>
+        <w:tc>
+          <w:tcPr>
+            <w:tcW w:type="dxa" w:w="1938"/>
+            <w:tcBorders>
+              <w:top w:val="single" w:sz="4" w:space="0" w:color="CBCBCB"/>
+              <w:left w:val="single" w:sz="4" w:space="0" w:color="CBCBCB"/>
+              <w:bottom w:val="single" w:sz="4" w:space="0" w:color="CBCBCB"/>
+              <w:right w:val="single" w:sz="4" w:space="0" w:color="CBCBCB"/>
+            </w:tcBorders>
+          </w:tcPr>
+          <w:p/>
+        </w:tc>
+      </w:tr>
+      <w:tr>
+        <w:tc>
+          <w:tcPr>
+            <w:tcW w:type="dxa" w:w="1938"/>
+            <w:shd w:val="clear" w:color="auto" w:fill="B8B3D6"/>
+            <w:tcBorders>
+              <w:top w:val="single" w:sz="4" w:space="0" w:color="CBCBCB"/>
+              <w:left w:val="single" w:sz="4" w:space="0" w:color="CBCBCB"/>
+              <w:bottom w:val="single" w:sz="4" w:space="0" w:color="CBCBCB"/>
+              <w:right w:val="single" w:sz="4" w:space="0" w:color="CBCBCB"/>
+            </w:tcBorders>
+          </w:tcPr>
+          <w:p>
+            <w:r>
+              <w:rPr>
+                <w:sz w:val="20"/>
+              </w:rPr>
+              <w:t>15</w:t>
+            </w:r>
+          </w:p>
+        </w:tc>
+        <w:tc>
+          <w:tcPr>
+            <w:tcW w:type="dxa" w:w="1938"/>
+            <w:shd w:val="clear" w:color="auto" w:fill="B8B3D6"/>
+            <w:tcBorders>
+              <w:top w:val="single" w:sz="4" w:space="0" w:color="CBCBCB"/>
+              <w:left w:val="single" w:sz="4" w:space="0" w:color="CBCBCB"/>
+              <w:bottom w:val="single" w:sz="4" w:space="0" w:color="CBCBCB"/>
+              <w:right w:val="single" w:sz="4" w:space="0" w:color="CBCBCB"/>
+            </w:tcBorders>
+          </w:tcPr>
+          <w:p>
+            <w:r>
+              <w:rPr>
+                <w:sz w:val="20"/>
+              </w:rPr>
+              <w:t xml:space="preserve">apt </w:t>
+            </w:r>
+            <w:r>
+              <w:rPr>
+                <w:rFonts w:ascii="Courier New" w:hAnsi="Courier New"/>
+                <w:color w:val="F05922"/>
+                <w:sz w:val="20"/>
+              </w:rPr>
+              <w:t>xdotool</w:t>
+            </w:r>
+            <w:r>
+              <w:rPr>
+                <w:sz w:val="20"/>
+              </w:rPr>
+              <w:t xml:space="preserve"> + </w:t>
+            </w:r>
+            <w:r>
+              <w:rPr>
+                <w:rFonts w:ascii="Courier New" w:hAnsi="Courier New"/>
+                <w:color w:val="F05922"/>
+                <w:sz w:val="20"/>
+              </w:rPr>
+              <w:t>gnome-screenshot</w:t>
+            </w:r>
+            <w:r>
+              <w:rPr>
+                <w:sz w:val="20"/>
+              </w:rPr>
+              <w:t xml:space="preserve"> (ta cài 26/07 23:48)</w:t>
+            </w:r>
+          </w:p>
+        </w:tc>
+        <w:tc>
+          <w:tcPr>
+            <w:tcW w:type="dxa" w:w="1938"/>
+            <w:shd w:val="clear" w:color="auto" w:fill="B8B3D6"/>
+            <w:tcBorders>
+              <w:top w:val="single" w:sz="4" w:space="0" w:color="CBCBCB"/>
+              <w:left w:val="single" w:sz="4" w:space="0" w:color="CBCBCB"/>
+              <w:bottom w:val="single" w:sz="4" w:space="0" w:color="CBCBCB"/>
+              <w:right w:val="single" w:sz="4" w:space="0" w:color="CBCBCB"/>
+            </w:tcBorders>
+          </w:tcPr>
+          <w:p>
+            <w:r>
+              <w:rPr>
+                <w:sz w:val="20"/>
+              </w:rPr>
+              <w:t>✅ Purge + autoremove</w:t>
+            </w:r>
+          </w:p>
+        </w:tc>
+        <w:tc>
+          <w:tcPr>
+            <w:tcW w:type="dxa" w:w="1938"/>
+            <w:shd w:val="clear" w:color="auto" w:fill="B8B3D6"/>
+            <w:tcBorders>
+              <w:top w:val="single" w:sz="4" w:space="0" w:color="CBCBCB"/>
+              <w:left w:val="single" w:sz="4" w:space="0" w:color="CBCBCB"/>
+              <w:bottom w:val="single" w:sz="4" w:space="0" w:color="CBCBCB"/>
+              <w:right w:val="single" w:sz="4" w:space="0" w:color="CBCBCB"/>
+            </w:tcBorders>
+          </w:tcPr>
+          <w:p>
+            <w:r>
+              <w:rPr>
+                <w:rFonts w:ascii="Courier New" w:hAnsi="Courier New"/>
+                <w:color w:val="F05922"/>
+                <w:sz w:val="20"/>
+              </w:rPr>
+              <w:t>which</w:t>
+            </w:r>
+            <w:r>
+              <w:rPr>
+                <w:sz w:val="20"/>
+              </w:rPr>
+              <w:t xml:space="preserve"> → rỗng; đối chiếu </w:t>
+            </w:r>
+            <w:r>
+              <w:rPr>
+                <w:rFonts w:ascii="Courier New" w:hAnsi="Courier New"/>
+                <w:color w:val="F05922"/>
+                <w:sz w:val="20"/>
+              </w:rPr>
+              <w:t>/var/log/apt/history.log</w:t>
+            </w:r>
+            <w:r>
+              <w:rPr>
+                <w:sz w:val="20"/>
+              </w:rPr>
+              <w:t xml:space="preserve">: </w:t>
+            </w:r>
+            <w:r>
+              <w:rPr>
+                <w:rFonts w:ascii="Courier New" w:hAnsi="Courier New"/>
+                <w:color w:val="F05922"/>
+                <w:sz w:val="20"/>
+              </w:rPr>
+              <w:t>apt-get install -y xdotool gnome-screenshot</w:t>
+            </w:r>
+            <w:r>
+              <w:rPr>
+                <w:sz w:val="20"/>
+              </w:rPr>
+              <w:t xml:space="preserve"> đúng lệnh của ta</w:t>
+            </w:r>
+          </w:p>
+        </w:tc>
+        <w:tc>
+          <w:tcPr>
+            <w:tcW w:type="dxa" w:w="1938"/>
+            <w:shd w:val="clear" w:color="auto" w:fill="B8B3D6"/>
+            <w:tcBorders>
+              <w:top w:val="single" w:sz="4" w:space="0" w:color="CBCBCB"/>
+              <w:left w:val="single" w:sz="4" w:space="0" w:color="CBCBCB"/>
+              <w:bottom w:val="single" w:sz="4" w:space="0" w:color="CBCBCB"/>
+              <w:right w:val="single" w:sz="4" w:space="0" w:color="CBCBCB"/>
+            </w:tcBorders>
+          </w:tcPr>
+          <w:p/>
+        </w:tc>
+      </w:tr>
+      <w:tr>
+        <w:tc>
+          <w:tcPr>
+            <w:tcW w:type="dxa" w:w="1938"/>
+            <w:tcBorders>
+              <w:top w:val="single" w:sz="4" w:space="0" w:color="CBCBCB"/>
+              <w:left w:val="single" w:sz="4" w:space="0" w:color="CBCBCB"/>
+              <w:bottom w:val="single" w:sz="4" w:space="0" w:color="CBCBCB"/>
+              <w:right w:val="single" w:sz="4" w:space="0" w:color="CBCBCB"/>
+            </w:tcBorders>
+          </w:tcPr>
+          <w:p>
+            <w:r>
+              <w:rPr>
+                <w:sz w:val="20"/>
+              </w:rPr>
+              <w:t>16</w:t>
+            </w:r>
+          </w:p>
+        </w:tc>
+        <w:tc>
+          <w:tcPr>
+            <w:tcW w:type="dxa" w:w="1938"/>
+            <w:tcBorders>
+              <w:top w:val="single" w:sz="4" w:space="0" w:color="CBCBCB"/>
+              <w:left w:val="single" w:sz="4" w:space="0" w:color="CBCBCB"/>
+              <w:bottom w:val="single" w:sz="4" w:space="0" w:color="CBCBCB"/>
+              <w:right w:val="single" w:sz="4" w:space="0" w:color="CBCBCB"/>
+            </w:tcBorders>
+          </w:tcPr>
+          <w:p>
+            <w:r>
+              <w:rPr>
+                <w:sz w:val="20"/>
+              </w:rPr>
+              <w:t xml:space="preserve">apt </w:t>
+            </w:r>
+            <w:r>
+              <w:rPr>
+                <w:rFonts w:ascii="Courier New" w:hAnsi="Courier New"/>
+                <w:color w:val="F05922"/>
+                <w:sz w:val="20"/>
+              </w:rPr>
+              <w:t>unclutter</w:t>
+            </w:r>
+            <w:r>
+              <w:rPr>
+                <w:sz w:val="20"/>
+              </w:rPr>
+              <w:t xml:space="preserve"> (kiosk script cài 23/07, </w:t>
+            </w:r>
+            <w:r>
+              <w:rPr>
+                <w:rFonts w:ascii="Courier New" w:hAnsi="Courier New"/>
+                <w:color w:val="F05922"/>
+                <w:sz w:val="20"/>
+              </w:rPr>
+              <w:t>apt install -y</w:t>
+            </w:r>
+            <w:r>
+              <w:rPr>
+                <w:sz w:val="20"/>
+              </w:rPr>
+              <w:t>)</w:t>
+            </w:r>
+          </w:p>
+        </w:tc>
+        <w:tc>
+          <w:tcPr>
+            <w:tcW w:type="dxa" w:w="1938"/>
+            <w:tcBorders>
+              <w:top w:val="single" w:sz="4" w:space="0" w:color="CBCBCB"/>
+              <w:left w:val="single" w:sz="4" w:space="0" w:color="CBCBCB"/>
+              <w:bottom w:val="single" w:sz="4" w:space="0" w:color="CBCBCB"/>
+              <w:right w:val="single" w:sz="4" w:space="0" w:color="CBCBCB"/>
+            </w:tcBorders>
+          </w:tcPr>
+          <w:p>
+            <w:r>
+              <w:rPr>
+                <w:sz w:val="20"/>
+              </w:rPr>
+              <w:t>✅ Purge</w:t>
+            </w:r>
+          </w:p>
+        </w:tc>
+        <w:tc>
+          <w:tcPr>
+            <w:tcW w:type="dxa" w:w="1938"/>
+            <w:tcBorders>
+              <w:top w:val="single" w:sz="4" w:space="0" w:color="CBCBCB"/>
+              <w:left w:val="single" w:sz="4" w:space="0" w:color="CBCBCB"/>
+              <w:bottom w:val="single" w:sz="4" w:space="0" w:color="CBCBCB"/>
+              <w:right w:val="single" w:sz="4" w:space="0" w:color="CBCBCB"/>
+            </w:tcBorders>
+          </w:tcPr>
+          <w:p>
+            <w:r>
+              <w:rPr>
+                <w:rFonts w:ascii="Courier New" w:hAnsi="Courier New"/>
+                <w:color w:val="F05922"/>
+                <w:sz w:val="20"/>
+              </w:rPr>
+              <w:t>which unclutter</w:t>
+            </w:r>
+            <w:r>
+              <w:rPr>
+                <w:sz w:val="20"/>
+              </w:rPr>
+              <w:t xml:space="preserve"> → rỗng</w:t>
+            </w:r>
+          </w:p>
+        </w:tc>
+        <w:tc>
+          <w:tcPr>
+            <w:tcW w:type="dxa" w:w="1938"/>
+            <w:tcBorders>
+              <w:top w:val="single" w:sz="4" w:space="0" w:color="CBCBCB"/>
+              <w:left w:val="single" w:sz="4" w:space="0" w:color="CBCBCB"/>
+              <w:bottom w:val="single" w:sz="4" w:space="0" w:color="CBCBCB"/>
+              <w:right w:val="single" w:sz="4" w:space="0" w:color="CBCBCB"/>
+            </w:tcBorders>
+          </w:tcPr>
+          <w:p/>
+        </w:tc>
+      </w:tr>
+      <w:tr>
+        <w:tc>
+          <w:tcPr>
+            <w:tcW w:type="dxa" w:w="1938"/>
+            <w:shd w:val="clear" w:color="auto" w:fill="B8B3D6"/>
+            <w:tcBorders>
+              <w:top w:val="single" w:sz="4" w:space="0" w:color="CBCBCB"/>
+              <w:left w:val="single" w:sz="4" w:space="0" w:color="CBCBCB"/>
+              <w:bottom w:val="single" w:sz="4" w:space="0" w:color="CBCBCB"/>
+              <w:right w:val="single" w:sz="4" w:space="0" w:color="CBCBCB"/>
+            </w:tcBorders>
+          </w:tcPr>
+          <w:p>
+            <w:r>
+              <w:rPr>
+                <w:sz w:val="20"/>
+              </w:rPr>
+              <w:t>17</w:t>
+            </w:r>
+          </w:p>
+        </w:tc>
+        <w:tc>
+          <w:tcPr>
+            <w:tcW w:type="dxa" w:w="1938"/>
+            <w:shd w:val="clear" w:color="auto" w:fill="B8B3D6"/>
+            <w:tcBorders>
+              <w:top w:val="single" w:sz="4" w:space="0" w:color="CBCBCB"/>
+              <w:left w:val="single" w:sz="4" w:space="0" w:color="CBCBCB"/>
+              <w:bottom w:val="single" w:sz="4" w:space="0" w:color="CBCBCB"/>
+              <w:right w:val="single" w:sz="4" w:space="0" w:color="CBCBCB"/>
+            </w:tcBorders>
+          </w:tcPr>
+          <w:p>
+            <w:r>
+              <w:rPr>
+                <w:sz w:val="20"/>
+              </w:rPr>
+              <w:t xml:space="preserve">apt </w:t>
+            </w:r>
+            <w:r>
+              <w:rPr>
+                <w:rFonts w:ascii="Courier New" w:hAnsi="Courier New"/>
+                <w:color w:val="F05922"/>
+                <w:sz w:val="20"/>
+              </w:rPr>
+              <w:t>gnome-shell-extension-manager</w:t>
+            </w:r>
+            <w:r>
+              <w:rPr>
+                <w:sz w:val="20"/>
+              </w:rPr>
+              <w:t xml:space="preserve"> (user chỉ định đích danh gỡ)</w:t>
+            </w:r>
+          </w:p>
+        </w:tc>
+        <w:tc>
+          <w:tcPr>
+            <w:tcW w:type="dxa" w:w="1938"/>
+            <w:shd w:val="clear" w:color="auto" w:fill="B8B3D6"/>
+            <w:tcBorders>
+              <w:top w:val="single" w:sz="4" w:space="0" w:color="CBCBCB"/>
+              <w:left w:val="single" w:sz="4" w:space="0" w:color="CBCBCB"/>
+              <w:bottom w:val="single" w:sz="4" w:space="0" w:color="CBCBCB"/>
+              <w:right w:val="single" w:sz="4" w:space="0" w:color="CBCBCB"/>
+            </w:tcBorders>
+          </w:tcPr>
+          <w:p>
+            <w:r>
+              <w:rPr>
+                <w:sz w:val="20"/>
+              </w:rPr>
+              <w:t>✅ Purge</w:t>
+            </w:r>
+          </w:p>
+        </w:tc>
+        <w:tc>
+          <w:tcPr>
+            <w:tcW w:type="dxa" w:w="1938"/>
+            <w:shd w:val="clear" w:color="auto" w:fill="B8B3D6"/>
+            <w:tcBorders>
+              <w:top w:val="single" w:sz="4" w:space="0" w:color="CBCBCB"/>
+              <w:left w:val="single" w:sz="4" w:space="0" w:color="CBCBCB"/>
+              <w:bottom w:val="single" w:sz="4" w:space="0" w:color="CBCBCB"/>
+              <w:right w:val="single" w:sz="4" w:space="0" w:color="CBCBCB"/>
+            </w:tcBorders>
+          </w:tcPr>
+          <w:p>
+            <w:r>
+              <w:rPr>
+                <w:rFonts w:ascii="Courier New" w:hAnsi="Courier New"/>
+                <w:color w:val="F05922"/>
+                <w:sz w:val="20"/>
+              </w:rPr>
+              <w:t>which extension-manager</w:t>
+            </w:r>
+            <w:r>
+              <w:rPr>
+                <w:sz w:val="20"/>
+              </w:rPr>
+              <w:t xml:space="preserve"> → rỗng. </w:t>
+            </w:r>
+            <w:r>
+              <w:rPr>
+                <w:b/>
+                <w:sz w:val="20"/>
+              </w:rPr>
+              <w:t>GIỮ</w:t>
+            </w:r>
+            <w:r>
+              <w:rPr>
+                <w:sz w:val="20"/>
+              </w:rPr>
+              <w:t xml:space="preserve"> </w:t>
+            </w:r>
+            <w:r>
+              <w:rPr>
+                <w:rFonts w:ascii="Courier New" w:hAnsi="Courier New"/>
+                <w:color w:val="F05922"/>
+                <w:sz w:val="20"/>
+              </w:rPr>
+              <w:t>gnome-shell-extensions</w:t>
+            </w:r>
+            <w:r>
+              <w:rPr>
+                <w:sz w:val="20"/>
+              </w:rPr>
+              <w:t xml:space="preserve"> (cài cùng lệnh tay 23/07 nhưng không thuộc danh sách gỡ, là bundle extension mặc định)</w:t>
+            </w:r>
+          </w:p>
+        </w:tc>
+        <w:tc>
+          <w:tcPr>
+            <w:tcW w:type="dxa" w:w="1938"/>
+            <w:shd w:val="clear" w:color="auto" w:fill="B8B3D6"/>
+            <w:tcBorders>
+              <w:top w:val="single" w:sz="4" w:space="0" w:color="CBCBCB"/>
+              <w:left w:val="single" w:sz="4" w:space="0" w:color="CBCBCB"/>
+              <w:bottom w:val="single" w:sz="4" w:space="0" w:color="CBCBCB"/>
+              <w:right w:val="single" w:sz="4" w:space="0" w:color="CBCBCB"/>
+            </w:tcBorders>
+          </w:tcPr>
+          <w:p/>
+        </w:tc>
+      </w:tr>
+      <w:tr>
+        <w:tc>
+          <w:tcPr>
+            <w:tcW w:type="dxa" w:w="1938"/>
+            <w:tcBorders>
+              <w:top w:val="single" w:sz="4" w:space="0" w:color="CBCBCB"/>
+              <w:left w:val="single" w:sz="4" w:space="0" w:color="CBCBCB"/>
+              <w:bottom w:val="single" w:sz="4" w:space="0" w:color="CBCBCB"/>
+              <w:right w:val="single" w:sz="4" w:space="0" w:color="CBCBCB"/>
+            </w:tcBorders>
+          </w:tcPr>
+          <w:p>
+            <w:r>
+              <w:rPr>
+                <w:sz w:val="20"/>
+              </w:rPr>
+              <w:t>18</w:t>
+            </w:r>
+          </w:p>
+        </w:tc>
+        <w:tc>
+          <w:tcPr>
+            <w:tcW w:type="dxa" w:w="1938"/>
+            <w:tcBorders>
+              <w:top w:val="single" w:sz="4" w:space="0" w:color="CBCBCB"/>
+              <w:left w:val="single" w:sz="4" w:space="0" w:color="CBCBCB"/>
+              <w:bottom w:val="single" w:sz="4" w:space="0" w:color="CBCBCB"/>
+              <w:right w:val="single" w:sz="4" w:space="0" w:color="CBCBCB"/>
+            </w:tcBorders>
+          </w:tcPr>
+          <w:p>
+            <w:r>
+              <w:rPr>
+                <w:sz w:val="20"/>
+              </w:rPr>
+              <w:t xml:space="preserve">apt có sẵn/của user: </w:t>
+            </w:r>
+            <w:r>
+              <w:rPr>
+                <w:rFonts w:ascii="Courier New" w:hAnsi="Courier New"/>
+                <w:color w:val="F05922"/>
+                <w:sz w:val="20"/>
+              </w:rPr>
+              <w:t>python3-pip</w:t>
+            </w:r>
+            <w:r>
+              <w:rPr>
+                <w:sz w:val="20"/>
+              </w:rPr>
+              <w:t xml:space="preserve"> (cài tay, không </w:t>
+            </w:r>
+            <w:r>
+              <w:rPr>
+                <w:rFonts w:ascii="Courier New" w:hAnsi="Courier New"/>
+                <w:color w:val="F05922"/>
+                <w:sz w:val="20"/>
+              </w:rPr>
+              <w:t>-y</w:t>
+            </w:r>
+            <w:r>
+              <w:rPr>
+                <w:sz w:val="20"/>
+              </w:rPr>
+              <w:t xml:space="preserve">), </w:t>
+            </w:r>
+            <w:r>
+              <w:rPr>
+                <w:rFonts w:ascii="Courier New" w:hAnsi="Courier New"/>
+                <w:color w:val="F05922"/>
+                <w:sz w:val="20"/>
+              </w:rPr>
+              <w:t>git</w:t>
+            </w:r>
+            <w:r>
+              <w:rPr>
+                <w:sz w:val="20"/>
+              </w:rPr>
+              <w:t xml:space="preserve">, </w:t>
+            </w:r>
+            <w:r>
+              <w:rPr>
+                <w:rFonts w:ascii="Courier New" w:hAnsi="Courier New"/>
+                <w:color w:val="F05922"/>
+                <w:sz w:val="20"/>
+              </w:rPr>
+              <w:t>terminator</w:t>
+            </w:r>
+            <w:r>
+              <w:rPr>
+                <w:sz w:val="20"/>
+              </w:rPr>
+              <w:t xml:space="preserve">, </w:t>
+            </w:r>
+            <w:r>
+              <w:rPr>
+                <w:rFonts w:ascii="Courier New" w:hAnsi="Courier New"/>
+                <w:color w:val="F05922"/>
+                <w:sz w:val="20"/>
+              </w:rPr>
+              <w:t>openssh-server</w:t>
+            </w:r>
+            <w:r>
+              <w:rPr>
+                <w:sz w:val="20"/>
+              </w:rPr>
+              <w:t xml:space="preserve">, </w:t>
+            </w:r>
+            <w:r>
+              <w:rPr>
+                <w:rFonts w:ascii="Courier New" w:hAnsi="Courier New"/>
+                <w:color w:val="F05922"/>
+                <w:sz w:val="20"/>
+              </w:rPr>
+              <w:t>kztek-parkingv8</w:t>
+            </w:r>
+            <w:r>
+              <w:rPr>
+                <w:sz w:val="20"/>
+              </w:rPr>
+              <w:t xml:space="preserve">, </w:t>
+            </w:r>
+            <w:r>
+              <w:rPr>
+                <w:rFonts w:ascii="Courier New" w:hAnsi="Courier New"/>
+                <w:color w:val="F05922"/>
+                <w:sz w:val="20"/>
+              </w:rPr>
+              <w:t>build-essential</w:t>
+            </w:r>
+            <w:r>
+              <w:rPr>
+                <w:sz w:val="20"/>
+              </w:rPr>
+              <w:t>…</w:t>
+            </w:r>
+          </w:p>
+        </w:tc>
+        <w:tc>
+          <w:tcPr>
+            <w:tcW w:type="dxa" w:w="1938"/>
+            <w:tcBorders>
+              <w:top w:val="single" w:sz="4" w:space="0" w:color="CBCBCB"/>
+              <w:left w:val="single" w:sz="4" w:space="0" w:color="CBCBCB"/>
+              <w:bottom w:val="single" w:sz="4" w:space="0" w:color="CBCBCB"/>
+              <w:right w:val="single" w:sz="4" w:space="0" w:color="CBCBCB"/>
+            </w:tcBorders>
+          </w:tcPr>
+          <w:p>
+            <w:r>
+              <w:rPr>
+                <w:sz w:val="20"/>
+              </w:rPr>
+              <w:t>➖ GIỮ NGUYÊN</w:t>
+            </w:r>
+          </w:p>
+        </w:tc>
+        <w:tc>
+          <w:tcPr>
+            <w:tcW w:type="dxa" w:w="1938"/>
+            <w:tcBorders>
+              <w:top w:val="single" w:sz="4" w:space="0" w:color="CBCBCB"/>
+              <w:left w:val="single" w:sz="4" w:space="0" w:color="CBCBCB"/>
+              <w:bottom w:val="single" w:sz="4" w:space="0" w:color="CBCBCB"/>
+              <w:right w:val="single" w:sz="4" w:space="0" w:color="CBCBCB"/>
+            </w:tcBorders>
+          </w:tcPr>
+          <w:p>
+            <w:r>
+              <w:rPr>
+                <w:sz w:val="20"/>
+              </w:rPr>
+              <w:t>Đối chiếu apt history: không phải script ta cài / thuộc ngoại lệ</w:t>
+            </w:r>
+          </w:p>
+        </w:tc>
+        <w:tc>
+          <w:tcPr>
+            <w:tcW w:type="dxa" w:w="1938"/>
+            <w:tcBorders>
+              <w:top w:val="single" w:sz="4" w:space="0" w:color="CBCBCB"/>
+              <w:left w:val="single" w:sz="4" w:space="0" w:color="CBCBCB"/>
+              <w:bottom w:val="single" w:sz="4" w:space="0" w:color="CBCBCB"/>
+              <w:right w:val="single" w:sz="4" w:space="0" w:color="CBCBCB"/>
+            </w:tcBorders>
+          </w:tcPr>
+          <w:p/>
+        </w:tc>
+      </w:tr>
+      <w:tr>
+        <w:tc>
+          <w:tcPr>
+            <w:tcW w:type="dxa" w:w="1938"/>
+            <w:shd w:val="clear" w:color="auto" w:fill="B8B3D6"/>
+            <w:tcBorders>
+              <w:top w:val="single" w:sz="4" w:space="0" w:color="CBCBCB"/>
+              <w:left w:val="single" w:sz="4" w:space="0" w:color="CBCBCB"/>
+              <w:bottom w:val="single" w:sz="4" w:space="0" w:color="CBCBCB"/>
+              <w:right w:val="single" w:sz="4" w:space="0" w:color="CBCBCB"/>
+            </w:tcBorders>
+          </w:tcPr>
+          <w:p>
+            <w:r>
+              <w:rPr>
+                <w:sz w:val="20"/>
+              </w:rPr>
+              <w:t>19</w:t>
+            </w:r>
+          </w:p>
+        </w:tc>
+        <w:tc>
+          <w:tcPr>
+            <w:tcW w:type="dxa" w:w="1938"/>
+            <w:shd w:val="clear" w:color="auto" w:fill="B8B3D6"/>
+            <w:tcBorders>
+              <w:top w:val="single" w:sz="4" w:space="0" w:color="CBCBCB"/>
+              <w:left w:val="single" w:sz="4" w:space="0" w:color="CBCBCB"/>
+              <w:bottom w:val="single" w:sz="4" w:space="0" w:color="CBCBCB"/>
+              <w:right w:val="single" w:sz="4" w:space="0" w:color="CBCBCB"/>
+            </w:tcBorders>
+          </w:tcPr>
+          <w:p>
+            <w:r>
+              <w:rPr>
+                <w:sz w:val="20"/>
+              </w:rPr>
+              <w:t xml:space="preserve">Khóa SSH demo </w:t>
+            </w:r>
+            <w:r>
+              <w:rPr>
+                <w:rFonts w:ascii="Courier New" w:hAnsi="Courier New"/>
+                <w:color w:val="F05922"/>
+                <w:sz w:val="20"/>
+              </w:rPr>
+              <w:t>kztek-remote-control-agent</w:t>
+            </w:r>
+            <w:r>
+              <w:rPr>
+                <w:sz w:val="20"/>
+              </w:rPr>
+              <w:t xml:space="preserve"> trong </w:t>
+            </w:r>
+            <w:r>
+              <w:rPr>
+                <w:rFonts w:ascii="Courier New" w:hAnsi="Courier New"/>
+                <w:color w:val="F05922"/>
+                <w:sz w:val="20"/>
+              </w:rPr>
+              <w:t>~/.ssh/authorized_keys</w:t>
+            </w:r>
+            <w:r>
+              <w:rPr>
+                <w:sz w:val="20"/>
+              </w:rPr>
+              <w:t xml:space="preserve"> (tạo 26/07 21:24, demo Hình 74)</w:t>
+            </w:r>
+          </w:p>
+        </w:tc>
+        <w:tc>
+          <w:tcPr>
+            <w:tcW w:type="dxa" w:w="1938"/>
+            <w:shd w:val="clear" w:color="auto" w:fill="B8B3D6"/>
+            <w:tcBorders>
+              <w:top w:val="single" w:sz="4" w:space="0" w:color="CBCBCB"/>
+              <w:left w:val="single" w:sz="4" w:space="0" w:color="CBCBCB"/>
+              <w:bottom w:val="single" w:sz="4" w:space="0" w:color="CBCBCB"/>
+              <w:right w:val="single" w:sz="4" w:space="0" w:color="CBCBCB"/>
+            </w:tcBorders>
+          </w:tcPr>
+          <w:p>
+            <w:r>
+              <w:rPr>
+                <w:sz w:val="20"/>
+              </w:rPr>
+              <w:t xml:space="preserve">⚠️ </w:t>
+            </w:r>
+            <w:r>
+              <w:rPr>
+                <w:b/>
+                <w:sz w:val="20"/>
+              </w:rPr>
+              <w:t>CHƯA xoá được</w:t>
+            </w:r>
+          </w:p>
+        </w:tc>
+        <w:tc>
+          <w:tcPr>
+            <w:tcW w:type="dxa" w:w="1938"/>
+            <w:shd w:val="clear" w:color="auto" w:fill="B8B3D6"/>
+            <w:tcBorders>
+              <w:top w:val="single" w:sz="4" w:space="0" w:color="CBCBCB"/>
+              <w:left w:val="single" w:sz="4" w:space="0" w:color="CBCBCB"/>
+              <w:bottom w:val="single" w:sz="4" w:space="0" w:color="CBCBCB"/>
+              <w:right w:val="single" w:sz="4" w:space="0" w:color="CBCBCB"/>
+            </w:tcBorders>
+          </w:tcPr>
+          <w:p>
+            <w:r>
+              <w:rPr>
+                <w:sz w:val="20"/>
+              </w:rPr>
+              <w:t xml:space="preserve">Sandbox permission của phiên làm việc chặn thao tác sửa </w:t>
+            </w:r>
+            <w:r>
+              <w:rPr>
+                <w:rFonts w:ascii="Courier New" w:hAnsi="Courier New"/>
+                <w:color w:val="F05922"/>
+                <w:sz w:val="20"/>
+              </w:rPr>
+              <w:t>authorized_keys</w:t>
+            </w:r>
+            <w:r>
+              <w:rPr>
+                <w:sz w:val="20"/>
+              </w:rPr>
+              <w:t xml:space="preserve"> (2 lần). Key vô hại (khóa công khai demo do ta sinh); user tự xoá bằng 1 lệnh: </w:t>
+            </w:r>
+            <w:r>
+              <w:rPr>
+                <w:rFonts w:ascii="Courier New" w:hAnsi="Courier New"/>
+                <w:color w:val="F05922"/>
+                <w:sz w:val="20"/>
+              </w:rPr>
+              <w:t>rm ~/.ssh/authorized_keys</w:t>
+            </w:r>
+            <w:r>
+              <w:rPr>
+                <w:sz w:val="20"/>
+              </w:rPr>
+              <w:t xml:space="preserve"> (file chỉ chứa đúng 1 key demo này). SSH mật khẩu KHÔNG bị ảnh hưởng</w:t>
+            </w:r>
+          </w:p>
+        </w:tc>
+        <w:tc>
+          <w:tcPr>
+            <w:tcW w:type="dxa" w:w="1938"/>
+            <w:shd w:val="clear" w:color="auto" w:fill="B8B3D6"/>
+            <w:tcBorders>
+              <w:top w:val="single" w:sz="4" w:space="0" w:color="CBCBCB"/>
+              <w:left w:val="single" w:sz="4" w:space="0" w:color="CBCBCB"/>
+              <w:bottom w:val="single" w:sz="4" w:space="0" w:color="CBCBCB"/>
+              <w:right w:val="single" w:sz="4" w:space="0" w:color="CBCBCB"/>
+            </w:tcBorders>
+          </w:tcPr>
+          <w:p/>
+        </w:tc>
+      </w:tr>
+    </w:tbl>
+    <w:p/>
+    <w:p>
+      <w:pPr>
+        <w:pStyle w:val="Heading3"/>
+        <w:spacing w:before="160" w:after="60"/>
+      </w:pPr>
+      <w:r>
+        <w:rPr>
+          <w:color w:val="4A3F8C"/>
+          <w:sz w:val="24"/>
+        </w:rPr>
+        <w:t>Cố ý GIỮ LẠI (theo phạm vi đã chốt)</w:t>
+      </w:r>
+    </w:p>
+    <w:p>
+      <w:pPr>
+        <w:pStyle w:val="ListBullet"/>
+        <w:spacing w:after="20"/>
+        <w:ind w:left="283"/>
+      </w:pPr>
+      <w:r>
+        <w:rPr>
+          <w:b/>
+          <w:sz w:val="21"/>
+        </w:rPr>
+        <w:t>`ipgs-remote-agent.service` (ZcuAgent)</w:t>
+      </w:r>
+      <w:r>
+        <w:rPr>
+          <w:sz w:val="21"/>
+        </w:rPr>
+        <w:t xml:space="preserve"> — đường quản trị từ CCU; unit enabled + linger bật (chạy từ boot).</w:t>
+      </w:r>
+    </w:p>
+    <w:p>
+      <w:pPr>
+        <w:pStyle w:val="ListBullet"/>
+        <w:spacing w:after="20"/>
+        <w:ind w:left="283"/>
+      </w:pPr>
+      <w:r>
+        <w:rPr>
+          <w:b/>
+          <w:sz w:val="21"/>
+        </w:rPr>
+        <w:t>SSH (`openssh-server`)</w:t>
+      </w:r>
+      <w:r>
+        <w:rPr>
+          <w:sz w:val="21"/>
+        </w:rPr>
+        <w:t xml:space="preserve"> — đường quản trị duy nhất còn lại khi chưa đăng nhập desktop.</w:t>
+      </w:r>
+    </w:p>
+    <w:p>
+      <w:pPr>
+        <w:pStyle w:val="ListBullet"/>
+        <w:spacing w:after="20"/>
+        <w:ind w:left="283"/>
+      </w:pPr>
+      <w:r>
+        <w:rPr>
+          <w:rFonts w:ascii="Courier New" w:hAnsi="Courier New"/>
+          <w:color w:val="F05922"/>
+          <w:sz w:val="21"/>
+        </w:rPr>
+        <w:t>gnome-shell-extensions</w:t>
+      </w:r>
+      <w:r>
+        <w:rPr>
+          <w:sz w:val="21"/>
+        </w:rPr>
+        <w:t xml:space="preserve">, </w:t>
+      </w:r>
+      <w:r>
+        <w:rPr>
+          <w:rFonts w:ascii="Courier New" w:hAnsi="Courier New"/>
+          <w:color w:val="F05922"/>
+          <w:sz w:val="21"/>
+        </w:rPr>
+        <w:t>python3-pip</w:t>
+      </w:r>
+      <w:r>
+        <w:rPr>
+          <w:sz w:val="21"/>
+        </w:rPr>
+        <w:t xml:space="preserve">, </w:t>
+      </w:r>
+      <w:r>
+        <w:rPr>
+          <w:rFonts w:ascii="Courier New" w:hAnsi="Courier New"/>
+          <w:color w:val="F05922"/>
+          <w:sz w:val="21"/>
+        </w:rPr>
+        <w:t>git</w:t>
+      </w:r>
+      <w:r>
+        <w:rPr>
+          <w:sz w:val="21"/>
+        </w:rPr>
+        <w:t xml:space="preserve">, </w:t>
+      </w:r>
+      <w:r>
+        <w:rPr>
+          <w:rFonts w:ascii="Courier New" w:hAnsi="Courier New"/>
+          <w:color w:val="F05922"/>
+          <w:sz w:val="21"/>
+        </w:rPr>
+        <w:t>terminator</w:t>
+      </w:r>
+      <w:r>
+        <w:rPr>
+          <w:sz w:val="21"/>
+        </w:rPr>
+        <w:t xml:space="preserve">, các gói </w:t>
+      </w:r>
+      <w:r>
+        <w:rPr>
+          <w:rFonts w:ascii="Courier New" w:hAnsi="Courier New"/>
+          <w:color w:val="F05922"/>
+          <w:sz w:val="21"/>
+        </w:rPr>
+        <w:t>kztek-parkingv8</w:t>
+      </w:r>
+      <w:r>
+        <w:rPr>
+          <w:sz w:val="21"/>
+        </w:rPr>
+        <w:t>/</w:t>
+      </w:r>
+      <w:r>
+        <w:rPr>
+          <w:rFonts w:ascii="Courier New" w:hAnsi="Courier New"/>
+          <w:color w:val="F05922"/>
+          <w:sz w:val="21"/>
+        </w:rPr>
+        <w:t>ipgsusecam</w:t>
+      </w:r>
+      <w:r>
+        <w:rPr>
+          <w:sz w:val="21"/>
+        </w:rPr>
+        <w:t xml:space="preserve"> — không do ta cài trong lúc test.</w:t>
+      </w:r>
+    </w:p>
+    <w:p>
+      <w:pPr>
+        <w:pStyle w:val="Heading3"/>
+        <w:spacing w:before="160" w:after="60"/>
+      </w:pPr>
+      <w:r>
+        <w:rPr>
+          <w:color w:val="4A3F8C"/>
+          <w:sz w:val="24"/>
+        </w:rPr>
+        <w:t>Trạng thái sau reboot (06:57 — bằng chứng thật)</w:t>
+      </w:r>
+    </w:p>
+    <w:p>
+      <w:pPr>
+        <w:pStyle w:val="ListBullet"/>
+        <w:spacing w:after="20"/>
+        <w:ind w:left="283"/>
+      </w:pPr>
+      <w:r>
+        <w:rPr>
+          <w:b/>
+          <w:sz w:val="21"/>
+        </w:rPr>
+        <w:t>SSH:</w:t>
+      </w:r>
+      <w:r>
+        <w:rPr>
+          <w:sz w:val="21"/>
+        </w:rPr>
+        <w:t xml:space="preserve"> vào được bình thường (kiểm tra ngay sau boot).</w:t>
+      </w:r>
+    </w:p>
+    <w:p>
+      <w:pPr>
+        <w:pStyle w:val="ListBullet"/>
+        <w:spacing w:after="20"/>
+        <w:ind w:left="283"/>
+      </w:pPr>
+      <w:r>
+        <w:rPr>
+          <w:b/>
+          <w:sz w:val="21"/>
+        </w:rPr>
+        <w:t>Màn hình đăng nhập:</w:t>
+      </w:r>
+      <w:r>
+        <w:rPr>
+          <w:sz w:val="21"/>
+        </w:rPr>
+        <w:t xml:space="preserve"> máy DỪNG ở greeter đúng kỳ vọng — </w:t>
+      </w:r>
+      <w:r>
+        <w:rPr>
+          <w:rFonts w:ascii="Courier New" w:hAnsi="Courier New"/>
+          <w:color w:val="F05922"/>
+          <w:sz w:val="21"/>
+        </w:rPr>
+        <w:t>loginctl list-sessions</w:t>
+      </w:r>
+      <w:r>
+        <w:rPr>
+          <w:sz w:val="21"/>
+        </w:rPr>
+        <w:t xml:space="preserve"> chỉ có session </w:t>
+      </w:r>
+      <w:r>
+        <w:rPr>
+          <w:rFonts w:ascii="Courier New" w:hAnsi="Courier New"/>
+          <w:color w:val="F05922"/>
+          <w:sz w:val="21"/>
+        </w:rPr>
+        <w:t>gdm</w:t>
+      </w:r>
+      <w:r>
+        <w:rPr>
+          <w:sz w:val="21"/>
+        </w:rPr>
+        <w:t xml:space="preserve"> trên seat0 (greeter </w:t>
+      </w:r>
+      <w:r>
+        <w:rPr>
+          <w:rFonts w:ascii="Courier New" w:hAnsi="Courier New"/>
+          <w:color w:val="F05922"/>
+          <w:sz w:val="21"/>
+        </w:rPr>
+        <w:t>gnome-shell</w:t>
+      </w:r>
+      <w:r>
+        <w:rPr>
+          <w:sz w:val="21"/>
+        </w:rPr>
+        <w:t xml:space="preserve"> chạy dưới user </w:t>
+      </w:r>
+      <w:r>
+        <w:rPr>
+          <w:rFonts w:ascii="Courier New" w:hAnsi="Courier New"/>
+          <w:color w:val="F05922"/>
+          <w:sz w:val="21"/>
+        </w:rPr>
+        <w:t>gdm</w:t>
+      </w:r>
+      <w:r>
+        <w:rPr>
+          <w:sz w:val="21"/>
+        </w:rPr>
+        <w:t xml:space="preserve">), </w:t>
+      </w:r>
+      <w:r>
+        <w:rPr>
+          <w:rFonts w:ascii="Courier New" w:hAnsi="Courier New"/>
+          <w:color w:val="F05922"/>
+          <w:sz w:val="21"/>
+        </w:rPr>
+        <w:t>who</w:t>
+      </w:r>
+      <w:r>
+        <w:rPr>
+          <w:sz w:val="21"/>
+        </w:rPr>
+        <w:t xml:space="preserve"> → không có session đồ họa </w:t>
+      </w:r>
+      <w:r>
+        <w:rPr>
+          <w:rFonts w:ascii="Courier New" w:hAnsi="Courier New"/>
+          <w:color w:val="F05922"/>
+          <w:sz w:val="21"/>
+        </w:rPr>
+        <w:t>kztek</w:t>
+      </w:r>
+      <w:r>
+        <w:rPr>
+          <w:sz w:val="21"/>
+        </w:rPr>
+        <w:t>.</w:t>
+      </w:r>
+    </w:p>
+    <w:p>
+      <w:pPr>
+        <w:pStyle w:val="ListBullet"/>
+        <w:spacing w:after="20"/>
+        <w:ind w:left="283"/>
+      </w:pPr>
+      <w:r>
+        <w:rPr>
+          <w:b/>
+          <w:sz w:val="21"/>
+        </w:rPr>
+        <w:t>Agent:</w:t>
+      </w:r>
+      <w:r>
+        <w:rPr>
+          <w:sz w:val="21"/>
+        </w:rPr>
+        <w:t xml:space="preserve"> unit enabled, đang </w:t>
+      </w:r>
+      <w:r>
+        <w:rPr>
+          <w:b/>
+          <w:sz w:val="21"/>
+        </w:rPr>
+        <w:t>`activating` (auto-restart mỗi 5s)</w:t>
+      </w:r>
+      <w:r>
+        <w:rPr>
+          <w:sz w:val="21"/>
+        </w:rPr>
+        <w:t xml:space="preserve"> với lỗi </w:t>
+      </w:r>
+      <w:r>
+        <w:rPr>
+          <w:rFonts w:ascii="Courier New" w:hAnsi="Courier New"/>
+          <w:color w:val="F05922"/>
+          <w:sz w:val="21"/>
+        </w:rPr>
+        <w:t>XOpenDisplay failed</w:t>
+      </w:r>
+      <w:r>
+        <w:rPr>
+          <w:sz w:val="21"/>
+        </w:rPr>
+        <w:t xml:space="preserve"> — hệ quả TẤT YẾU của việc gỡ autologin: agent cần phiên X </w:t>
+      </w:r>
+      <w:r>
+        <w:rPr>
+          <w:rFonts w:ascii="Courier New" w:hAnsi="Courier New"/>
+          <w:color w:val="F05922"/>
+          <w:sz w:val="21"/>
+        </w:rPr>
+        <w:t>:0</w:t>
+      </w:r>
+      <w:r>
+        <w:rPr>
+          <w:sz w:val="21"/>
+        </w:rPr>
+        <w:t xml:space="preserve"> của kztek để capture màn hình, chưa ai đăng nhập thì chưa có </w:t>
+      </w:r>
+      <w:r>
+        <w:rPr>
+          <w:rFonts w:ascii="Courier New" w:hAnsi="Courier New"/>
+          <w:color w:val="F05922"/>
+          <w:sz w:val="21"/>
+        </w:rPr>
+        <w:t>:0</w:t>
+      </w:r>
+      <w:r>
+        <w:rPr>
+          <w:sz w:val="21"/>
+        </w:rPr>
+        <w:t xml:space="preserve">. </w:t>
+      </w:r>
+      <w:r>
+        <w:rPr>
+          <w:b/>
+          <w:sz w:val="21"/>
+        </w:rPr>
+        <w:t>KHÔNG phải hư hỏng:</w:t>
+      </w:r>
+      <w:r>
+        <w:rPr>
+          <w:sz w:val="21"/>
+        </w:rPr>
+        <w:t xml:space="preserve"> ngay khi user đăng nhập ở console VM, agent tự </w:t>
+      </w:r>
+      <w:r>
+        <w:rPr>
+          <w:rFonts w:ascii="Courier New" w:hAnsi="Courier New"/>
+          <w:color w:val="F05922"/>
+          <w:sz w:val="21"/>
+        </w:rPr>
+        <w:t>active</w:t>
+      </w:r>
+      <w:r>
+        <w:rPr>
+          <w:sz w:val="21"/>
+        </w:rPr>
+        <w:t xml:space="preserve"> trong ≤ 10 giây (Restart=on-failure/5s — không bị StartLimit chặn: 2 lần start/10s &lt; burst 5). Đã xác nhận unit + linger còn nguyên.</w:t>
+      </w:r>
+    </w:p>
+    <w:p>
+      <w:pPr>
+        <w:pStyle w:val="Heading3"/>
+        <w:spacing w:before="160" w:after="60"/>
+      </w:pPr>
+      <w:r>
+        <w:rPr>
+          <w:color w:val="4A3F8C"/>
+          <w:sz w:val="24"/>
+        </w:rPr>
+        <w:t>Việc user cần làm để test lại Kiosk Deploy từ đầu</w:t>
+      </w:r>
+    </w:p>
+    <w:p>
+      <w:pPr>
+        <w:spacing w:after="20"/>
+        <w:ind w:left="567" w:hanging="283"/>
+      </w:pPr>
+      <w:r>
+        <w:rPr>
+          <w:sz w:val="21"/>
+        </w:rPr>
+        <w:t>1.</w:t>
+        <w:tab/>
+      </w:r>
+      <w:r>
+        <w:rPr>
+          <w:sz w:val="21"/>
+        </w:rPr>
+        <w:t>Mở console VM VirtualBox (</w:t>
+      </w:r>
+      <w:r>
+        <w:rPr>
+          <w:rFonts w:ascii="Courier New" w:hAnsi="Courier New"/>
+          <w:color w:val="F05922"/>
+          <w:sz w:val="21"/>
+        </w:rPr>
+        <w:t>ubuntu-22.06-x64</w:t>
+      </w:r>
+      <w:r>
+        <w:rPr>
+          <w:sz w:val="21"/>
+        </w:rPr>
+        <w:t xml:space="preserve">) → đăng nhập user </w:t>
+      </w:r>
+      <w:r>
+        <w:rPr>
+          <w:rFonts w:ascii="Courier New" w:hAnsi="Courier New"/>
+          <w:color w:val="F05922"/>
+          <w:sz w:val="21"/>
+        </w:rPr>
+        <w:t>kztek</w:t>
+      </w:r>
+      <w:r>
+        <w:rPr>
+          <w:sz w:val="21"/>
+        </w:rPr>
+        <w:t xml:space="preserve"> bằng mật khẩu → agent tự </w:t>
+      </w:r>
+      <w:r>
+        <w:rPr>
+          <w:rFonts w:ascii="Courier New" w:hAnsi="Courier New"/>
+          <w:color w:val="F05922"/>
+          <w:sz w:val="21"/>
+        </w:rPr>
+        <w:t>active</w:t>
+      </w:r>
+      <w:r>
+        <w:rPr>
+          <w:sz w:val="21"/>
+        </w:rPr>
+        <w:t xml:space="preserve"> sau vài giây.</w:t>
+      </w:r>
+    </w:p>
+    <w:p>
+      <w:pPr>
+        <w:spacing w:after="20"/>
+        <w:ind w:left="567" w:hanging="283"/>
+      </w:pPr>
+      <w:r>
+        <w:rPr>
+          <w:sz w:val="21"/>
+        </w:rPr>
+        <w:t>2.</w:t>
+        <w:tab/>
+      </w:r>
+      <w:r>
+        <w:rPr>
+          <w:b/>
+          <w:sz w:val="21"/>
+        </w:rPr>
+        <w:t>Cập nhật IP mới `192.168.1.172`</w:t>
+      </w:r>
+      <w:r>
+        <w:rPr>
+          <w:sz w:val="21"/>
+        </w:rPr>
+        <w:t xml:space="preserve"> vào profile máy ZCU trong app CCU (IP cũ </w:t>
+      </w:r>
+      <w:r>
+        <w:rPr>
+          <w:rFonts w:ascii="Courier New" w:hAnsi="Courier New"/>
+          <w:color w:val="F05922"/>
+          <w:sz w:val="21"/>
+        </w:rPr>
+        <w:t>192.168.0.101</w:t>
+      </w:r>
+      <w:r>
+        <w:rPr>
+          <w:sz w:val="21"/>
+        </w:rPr>
+        <w:t xml:space="preserve"> không còn — mạng Wi-Fi host đã đổi dải; nếu muốn IP cố định, cân nhắc đặt static IP trong VM).</w:t>
+      </w:r>
+    </w:p>
+    <w:p>
+      <w:pPr>
+        <w:spacing w:after="20"/>
+        <w:ind w:left="567" w:hanging="283"/>
+      </w:pPr>
+      <w:r>
+        <w:rPr>
+          <w:sz w:val="21"/>
+        </w:rPr>
+        <w:t>3.</w:t>
+        <w:tab/>
+      </w:r>
+      <w:r>
+        <w:rPr>
+          <w:sz w:val="21"/>
+        </w:rPr>
+        <w:t xml:space="preserve">(Tuỳ chọn) Xoá key demo còn sót: SSH vào ZCU chạy </w:t>
+      </w:r>
+      <w:r>
+        <w:rPr>
+          <w:rFonts w:ascii="Courier New" w:hAnsi="Courier New"/>
+          <w:color w:val="F05922"/>
+          <w:sz w:val="21"/>
+        </w:rPr>
+        <w:t>rm ~/.ssh/authorized_keys</w:t>
+      </w:r>
+      <w:r>
+        <w:rPr>
+          <w:sz w:val="21"/>
+        </w:rPr>
+        <w:t xml:space="preserve"> (mục 19).</w:t>
+      </w:r>
+    </w:p>
+    <w:p>
+      <w:pPr>
+        <w:spacing w:after="20"/>
+        <w:ind w:left="567" w:hanging="283"/>
+      </w:pPr>
+      <w:r>
+        <w:rPr>
+          <w:sz w:val="21"/>
+        </w:rPr>
+        <w:t>4.</w:t>
+        <w:tab/>
+      </w:r>
+      <w:r>
+        <w:rPr>
+          <w:sz w:val="21"/>
+        </w:rPr>
+        <w:t xml:space="preserve">Chạy </w:t>
+      </w:r>
+      <w:r>
+        <w:rPr>
+          <w:b/>
+          <w:sz w:val="21"/>
+        </w:rPr>
+        <w:t>Kiosk Deploy</w:t>
+      </w:r>
+      <w:r>
+        <w:rPr>
+          <w:sz w:val="21"/>
+        </w:rPr>
+        <w:t xml:space="preserve"> từ app CCU (KioskDeployWindow) với các tuỳ chọn cần test: tab Config phần mềm — Ẩn Top Bar / </w:t>
+      </w:r>
+      <w:r>
+        <w:rPr>
+          <w:b/>
+          <w:sz w:val="21"/>
+        </w:rPr>
+        <w:t>Ẩn nút Activities</w:t>
+      </w:r>
+      <w:r>
+        <w:rPr>
+          <w:sz w:val="21"/>
+        </w:rPr>
+        <w:t xml:space="preserve"> (cài extension chặn overview) / Ẩn Workspace / Ẩn Dash / Autostart / </w:t>
+      </w:r>
+      <w:r>
+        <w:rPr>
+          <w:b/>
+          <w:sz w:val="21"/>
+        </w:rPr>
+        <w:t>Watchdog</w:t>
+      </w:r>
+      <w:r>
+        <w:rPr>
+          <w:sz w:val="21"/>
+        </w:rPr>
+        <w:t xml:space="preserve"> (mặc định tick); tab Config máy tính — </w:t>
+      </w:r>
+      <w:r>
+        <w:rPr>
+          <w:b/>
+          <w:sz w:val="21"/>
+        </w:rPr>
+        <w:t>Autologin</w:t>
+      </w:r>
+      <w:r>
+        <w:rPr>
+          <w:sz w:val="21"/>
+        </w:rPr>
+        <w:t xml:space="preserve"> / Tắt notification / Tắt screensaver-lock / </w:t>
+      </w:r>
+      <w:r>
+        <w:rPr>
+          <w:b/>
+          <w:sz w:val="21"/>
+        </w:rPr>
+        <w:t>Khoá lối thoát kiosk (dconf lock)</w:t>
+      </w:r>
+      <w:r>
+        <w:rPr>
+          <w:sz w:val="21"/>
+        </w:rPr>
+        <w:t xml:space="preserve"> (mặc định tick).</w:t>
+      </w:r>
+    </w:p>
+    <w:p>
+      <w:pPr>
+        <w:spacing w:after="20"/>
+        <w:ind w:left="567" w:hanging="283"/>
+      </w:pPr>
+      <w:r>
+        <w:rPr>
+          <w:sz w:val="21"/>
+        </w:rPr>
+        <w:t>5.</w:t>
+        <w:tab/>
+      </w:r>
+      <w:r>
+        <w:rPr>
+          <w:sz w:val="21"/>
+        </w:rPr>
+        <w:t xml:space="preserve">Sau deploy: </w:t>
+      </w:r>
+      <w:r>
+        <w:rPr>
+          <w:b/>
+          <w:sz w:val="21"/>
+        </w:rPr>
+        <w:t>khởi động lại ZCU</w:t>
+      </w:r>
+      <w:r>
+        <w:rPr>
+          <w:sz w:val="21"/>
+        </w:rPr>
+        <w:t xml:space="preserve"> (bắt buộc để extension + dconf profile + autologin có hiệu lực), rồi nghiệm thu theo checklist Q1–Q10 (mục QA verify F09/F10 ở trên), đặc biệt Q7/Q8 thử tay trên màn cảm ứng thật.</w:t>
+      </w:r>
+    </w:p>
+    <w:p>
+      <w:pPr>
+        <w:spacing w:after="80"/>
+      </w:pPr>
+      <w:r>
+        <w:rPr>
+          <w:sz w:val="21"/>
+        </w:rPr>
+        <w:t>— DevOps Engineer, 2026-07-27 07:01</w:t>
+      </w:r>
+    </w:p>
     <w:p>
       <w:pPr>
         <w:pBdr>

</xml_diff>